<commit_message>
Enhance DOCX inspection and privacy scrubbing scripts
- Added functionality to inspect DOCX templates for various integrity issues, including sensitive hits, tracked changes, hidden text, and external relationships.
- Implemented strict mode in inspection scripts to exit with a non-zero status if privacy or package-integrity issues are detected.
- Improved privacy scrubbing to remove embedded objects and external relationships based on user-defined flags.
- Updated documentation to reflect changes in usage and added examples for running inspection and scrubbing scripts.
- Introduced unit tests for key functionalities, ensuring that citation formatting and relationship handling work as expected.
- Added installer tests to verify local modifications protection and backup creation during forced updates.
</commit_message>
<xml_diff>
--- a/skills/thesis-literature-review-builder/assets/base-templates/literature-review-template.docx
+++ b/skills/thesis-literature-review-builder/assets/base-templates/literature-review-template.docx
@@ -1,6 +1,6 @@
 
 <file path=word/document.xml><?xml version="1.0" encoding="utf-8"?>
-<w:document xmlns:ns1="http://schemas.openxmlformats.org/markup-compatibility/2006" xmlns:ns10="urn:schemas-microsoft-com:office:word" xmlns:ns11="http://schemas.openxmlformats.org/drawingml/2006/picture" xmlns:ns12="http://schemas.microsoft.com/office/drawing/2010/main" xmlns:ns2="http://schemas.microsoft.com/office/word/2010/wordml" xmlns:ns3="urn:schemas-microsoft-com:vml" xmlns:ns4="urn:schemas-microsoft-com:office:office" xmlns:ns5="http://schemas.openxmlformats.org/officeDocument/2006/relationships" xmlns:ns6="http://schemas.openxmlformats.org/drawingml/2006/wordprocessingDrawing" xmlns:ns7="http://schemas.microsoft.com/office/word/2010/wordprocessingDrawing" xmlns:ns8="http://schemas.openxmlformats.org/drawingml/2006/main" xmlns:ns9="http://schemas.microsoft.com/office/word/2010/wordprocessingShape" xmlns:w="http://schemas.openxmlformats.org/wordprocessingml/2006/main" ns1:Ignorable="w14 w15 w16se w16cid w16 w16cex w16sdtdh w16sdtfl w16du wp14">
+<w:document xmlns:ns1="http://schemas.openxmlformats.org/markup-compatibility/2006" xmlns:ns10="http://schemas.openxmlformats.org/officeDocument/2006/relationships" xmlns:ns11="http://schemas.openxmlformats.org/drawingml/2006/picture" xmlns:ns12="http://schemas.microsoft.com/office/drawing/2010/main" xmlns:ns2="http://schemas.microsoft.com/office/word/2010/wordml" xmlns:ns3="http://schemas.openxmlformats.org/drawingml/2006/wordprocessingDrawing" xmlns:ns4="http://schemas.microsoft.com/office/word/2010/wordprocessingDrawing" xmlns:ns5="http://schemas.openxmlformats.org/drawingml/2006/main" xmlns:ns6="http://schemas.microsoft.com/office/word/2010/wordprocessingShape" xmlns:ns7="urn:schemas-microsoft-com:vml" xmlns:ns8="urn:schemas-microsoft-com:office:office" xmlns:ns9="urn:schemas-microsoft-com:office:word" xmlns:w="http://schemas.openxmlformats.org/wordprocessingml/2006/main" ns1:Ignorable="w14 w15 w16se w16cid w16 w16cex w16sdtdh w16sdtfl w16du wp14">
   <w:body>
     <w:p ns2:paraId="73C7D99C" ns2:textId="77777777">
       <w:pPr>
@@ -15,31 +15,6 @@
         <w:rPr>
           <w:position w:val="-4"/>
         </w:rPr>
-        <w:object w:dxaOrig="180" w:dyaOrig="279" ns2:anchorId="0881C4FE">
-          <ns3:shapetype id="_x0000_t75" coordsize="21600,21600" ns4:spt="75" ns4:preferrelative="t" path="m@4@5l@4@11@9@11@9@5xe" filled="f" stroked="f">
-            <ns3:stroke joinstyle="miter"/>
-            <ns3:formulas>
-              <ns3:f eqn="if lineDrawn pixelLineWidth 0"/>
-              <ns3:f eqn="sum @0 1 0"/>
-              <ns3:f eqn="sum 0 0 @1"/>
-              <ns3:f eqn="prod @2 1 2"/>
-              <ns3:f eqn="prod @3 21600 pixelWidth"/>
-              <ns3:f eqn="prod @3 21600 pixelHeight"/>
-              <ns3:f eqn="sum @0 0 1"/>
-              <ns3:f eqn="prod @6 1 2"/>
-              <ns3:f eqn="prod @7 21600 pixelWidth"/>
-              <ns3:f eqn="sum @8 21600 0"/>
-              <ns3:f eqn="prod @7 21600 pixelHeight"/>
-              <ns3:f eqn="sum @10 21600 0"/>
-            </ns3:formulas>
-            <ns3:path ns4:extrusionok="f" gradientshapeok="t" ns4:connecttype="rect"/>
-            <ns4:lock ns3:ext="edit" aspectratio="t"/>
-          </ns3:shapetype>
-          <ns3:shape id="_x0000_i1025" type="#_x0000_t75" style="width:8.95pt;height:13.55pt" ns4:ole="">
-            <ns3:imagedata ns5:id="rId8" ns4:title=""/>
-          </ns3:shape>
-          <ns4:OLEObject Type="Embed" ProgID="Equation.DSMT4" ShapeID="_x0000_i1025" DrawAspect="Content" ObjectID="_1845135654" ns5:id="rId9"/>
-        </w:object>
       </w:r>
       <w:bookmarkStart w:id="0" w:name="_Hlk213750326"/>
     </w:p>
@@ -96,41 +71,41 @@
         <ns1:AlternateContent>
           <ns1:Choice Requires="wps">
             <w:drawing>
-              <ns6:anchor distT="0" distB="0" distL="114300" distR="114300" simplePos="0" relativeHeight="251659264" behindDoc="0" locked="0" layoutInCell="1" allowOverlap="1" ns7:anchorId="2BC5EAE0" ns7:editId="3E11505C">
-                <ns6:simplePos x="0" y="0"/>
-                <ns6:positionH relativeFrom="page">
-                  <ns6:align>right</ns6:align>
-                </ns6:positionH>
-                <ns6:positionV relativeFrom="page">
-                  <ns6:posOffset>2705100</ns6:posOffset>
-                </ns6:positionV>
-                <ns6:extent cx="7553325" cy="1038225"/>
-                <ns6:effectExtent l="0" t="0" r="0" b="9525"/>
-                <ns6:wrapNone/>
-                <ns6:docPr id="4" name="文本框 4"/>
-                <ns6:cNvGraphicFramePr>
-                  <ns8:graphicFrameLocks/>
-                </ns6:cNvGraphicFramePr>
-                <ns8:graphic>
-                  <ns8:graphicData uri="http://schemas.microsoft.com/office/word/2010/wordprocessingShape">
-                    <ns9:wsp>
-                      <ns9:cNvSpPr txBox="1">
-                        <ns8:spLocks noChangeArrowheads="1"/>
-                      </ns9:cNvSpPr>
-                      <ns9:spPr bwMode="auto">
-                        <ns8:xfrm>
-                          <ns8:off x="0" y="0"/>
-                          <ns8:ext cx="7553325" cy="1038225"/>
-                        </ns8:xfrm>
-                        <ns8:prstGeom prst="rect">
-                          <ns8:avLst/>
-                        </ns8:prstGeom>
-                        <ns8:noFill/>
-                        <ns8:ln>
-                          <ns8:noFill/>
-                        </ns8:ln>
-                      </ns9:spPr>
-                      <ns9:txbx>
+              <ns3:anchor distT="0" distB="0" distL="114300" distR="114300" simplePos="0" relativeHeight="251659264" behindDoc="0" locked="0" layoutInCell="1" allowOverlap="1" ns4:anchorId="2BC5EAE0" ns4:editId="3E11505C">
+                <ns3:simplePos x="0" y="0"/>
+                <ns3:positionH relativeFrom="page">
+                  <ns3:align>right</ns3:align>
+                </ns3:positionH>
+                <ns3:positionV relativeFrom="page">
+                  <ns3:posOffset>2705100</ns3:posOffset>
+                </ns3:positionV>
+                <ns3:extent cx="7553325" cy="1038225"/>
+                <ns3:effectExtent l="0" t="0" r="0" b="9525"/>
+                <ns3:wrapNone/>
+                <ns3:docPr id="4" name="文本框 4"/>
+                <ns3:cNvGraphicFramePr>
+                  <ns5:graphicFrameLocks/>
+                </ns3:cNvGraphicFramePr>
+                <ns5:graphic>
+                  <ns5:graphicData uri="http://schemas.microsoft.com/office/word/2010/wordprocessingShape">
+                    <ns6:wsp>
+                      <ns6:cNvSpPr txBox="1">
+                        <ns5:spLocks noChangeArrowheads="1"/>
+                      </ns6:cNvSpPr>
+                      <ns6:spPr bwMode="auto">
+                        <ns5:xfrm>
+                          <ns5:off x="0" y="0"/>
+                          <ns5:ext cx="7553325" cy="1038225"/>
+                        </ns5:xfrm>
+                        <ns5:prstGeom prst="rect">
+                          <ns5:avLst/>
+                        </ns5:prstGeom>
+                        <ns5:noFill/>
+                        <ns5:ln>
+                          <ns5:noFill/>
+                        </ns5:ln>
+                      </ns6:spPr>
+                      <ns6:txbx>
                         <w:txbxContent>
                           <w:p ns2:paraId="756EEE9B" ns2:textId="4A18C0AB">
                             <w:pPr>
@@ -177,30 +152,30 @@
                             </w:r>
                           </w:p>
                         </w:txbxContent>
-                      </ns9:txbx>
-                      <ns9:bodyPr rot="0" vert="horz" wrap="square" lIns="91440" tIns="45720" rIns="91440" bIns="45720" anchor="t" anchorCtr="0" upright="1">
-                        <ns8:noAutofit/>
-                      </ns9:bodyPr>
-                    </ns9:wsp>
-                  </ns8:graphicData>
-                </ns8:graphic>
-                <ns7:sizeRelH relativeFrom="margin">
-                  <ns7:pctWidth>0</ns7:pctWidth>
-                </ns7:sizeRelH>
-                <ns7:sizeRelV relativeFrom="margin">
-                  <ns7:pctHeight>0</ns7:pctHeight>
-                </ns7:sizeRelV>
-              </ns6:anchor>
+                      </ns6:txbx>
+                      <ns6:bodyPr rot="0" vert="horz" wrap="square" lIns="91440" tIns="45720" rIns="91440" bIns="45720" anchor="t" anchorCtr="0" upright="1">
+                        <ns5:noAutofit/>
+                      </ns6:bodyPr>
+                    </ns6:wsp>
+                  </ns5:graphicData>
+                </ns5:graphic>
+                <ns4:sizeRelH relativeFrom="margin">
+                  <ns4:pctWidth>0</ns4:pctWidth>
+                </ns4:sizeRelH>
+                <ns4:sizeRelV relativeFrom="margin">
+                  <ns4:pctHeight>0</ns4:pctHeight>
+                </ns4:sizeRelV>
+              </ns3:anchor>
             </w:drawing>
           </ns1:Choice>
           <ns1:Fallback>
             <w:pict>
-              <ns3:shapetype ns2:anchorId="2BC5EAE0" id="_x0000_t202" coordsize="21600,21600" ns4:spt="202" path="m,l,21600r21600,l21600,xe">
-                <ns3:stroke joinstyle="miter"/>
-                <ns3:path gradientshapeok="t" ns4:connecttype="rect"/>
-              </ns3:shapetype>
-              <ns3:shape id="文本框 4" ns4:spid="_x0000_s1026" type="#_x0000_t202" style="position:absolute;left:0;text-align:left;margin-left:543.55pt;margin-top:213pt;width:594.75pt;height:81.75pt;z-index:251659264;visibility:visible;mso-wrap-style:square;mso-width-percent:0;mso-height-percent:0;mso-wrap-distance-left:9pt;mso-wrap-distance-top:0;mso-wrap-distance-right:9pt;mso-wrap-distance-bottom:0;mso-position-horizontal:right;mso-position-horizontal-relative:page;mso-position-vertical:absolute;mso-position-vertical-relative:page;mso-width-percent:0;mso-height-percent:0;mso-width-relative:margin;mso-height-relative:margin;v-text-anchor:top" ns4:gfxdata="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" filled="f" stroked="f">
-                <ns3:textbox>
+              <ns7:shapetype ns2:anchorId="2BC5EAE0" id="_x0000_t202" coordsize="21600,21600" ns8:spt="202" path="m,l,21600r21600,l21600,xe">
+                <ns7:stroke joinstyle="miter"/>
+                <ns7:path gradientshapeok="t" ns8:connecttype="rect"/>
+              </ns7:shapetype>
+              <ns7:shape id="文本框 4" ns8:spid="_x0000_s1026" type="#_x0000_t202" style="position:absolute;left:0;text-align:left;margin-left:543.55pt;margin-top:213pt;width:594.75pt;height:81.75pt;z-index:251659264;visibility:visible;mso-wrap-style:square;mso-width-percent:0;mso-height-percent:0;mso-wrap-distance-left:9pt;mso-wrap-distance-top:0;mso-wrap-distance-right:9pt;mso-wrap-distance-bottom:0;mso-position-horizontal:right;mso-position-horizontal-relative:page;mso-position-vertical:absolute;mso-position-vertical-relative:page;mso-width-percent:0;mso-height-percent:0;mso-width-relative:margin;mso-height-relative:margin;v-text-anchor:top" ns8:gfxdata="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" filled="f" stroked="f">
+                <ns7:textbox>
                   <w:txbxContent>
                     <w:p ns2:paraId="756EEE9B" ns2:textId="4A18C0AB">
                       <w:pPr>
@@ -247,9 +222,9 @@
                       </w:r>
                     </w:p>
                   </w:txbxContent>
-                </ns3:textbox>
-                <ns10:wrap anchorx="page" anchory="page"/>
-              </ns3:shape>
+                </ns7:textbox>
+                <ns9:wrap anchorx="page" anchory="page"/>
+              </ns7:shape>
             </w:pict>
           </ns1:Fallback>
         </ns1:AlternateContent>
@@ -495,8 +470,8 @@
           <w:szCs w:val="36"/>
         </w:rPr>
         <w:sectPr>
-          <w:headerReference w:type="even" ns5:id="rId10"/>
-          <w:headerReference w:type="default" ns5:id="rId11"/>
+          <w:headerReference w:type="even" ns10:id="rId10"/>
+          <w:headerReference w:type="default" ns10:id="rId11"/>
           <w:pgSz w:w="11906" w:h="16838"/>
           <w:pgMar w:top="1418" w:right="1418" w:bottom="1701" w:left="1418" w:header="851" w:footer="851" w:gutter="0"/>
           <w:pgNumType w:fmt="numberInDash"/>
@@ -1106,10 +1081,10 @@
     <w:p ns2:paraId="4546CBCB" ns2:textId="77777777">
       <w:pPr>
         <w:sectPr>
-          <w:headerReference w:type="default" ns5:id="rId12"/>
-          <w:footerReference w:type="default" ns5:id="rId13"/>
-          <w:headerReference w:type="first" ns5:id="rId14"/>
-          <w:footerReference w:type="first" ns5:id="rId15"/>
+          <w:headerReference w:type="default" ns10:id="rId12"/>
+          <w:footerReference w:type="default" ns10:id="rId13"/>
+          <w:headerReference w:type="first" ns10:id="rId14"/>
+          <w:footerReference w:type="first" ns10:id="rId15"/>
           <w:pgSz w:w="11906" w:h="16838" w:code="9"/>
           <w:pgMar w:top="1928" w:right="1797" w:bottom="1928" w:left="1797" w:header="1588" w:footer="1588" w:gutter="0"/>
           <w:pgNumType w:fmt="lowerRoman" w:start="1"/>
@@ -1233,49 +1208,49 @@
           <w:sz w:val="20"/>
         </w:rPr>
         <w:drawing>
-          <ns6:inline distT="0" distB="0" distL="0" distR="0" ns7:anchorId="6C99C650" ns7:editId="6259E8F1">
-            <ns6:extent cx="5279390" cy="2176145"/>
-            <ns6:effectExtent l="0" t="0" r="0" b="0"/>
-            <ns6:docPr id="1" name="图片 1"/>
-            <ns6:cNvGraphicFramePr>
-              <ns8:graphicFrameLocks noChangeAspect="1"/>
-            </ns6:cNvGraphicFramePr>
-            <ns8:graphic>
-              <ns8:graphicData uri="http://schemas.openxmlformats.org/drawingml/2006/picture">
+          <ns3:inline distT="0" distB="0" distL="0" distR="0" ns4:anchorId="6C99C650" ns4:editId="6259E8F1">
+            <ns3:extent cx="5279390" cy="2176145"/>
+            <ns3:effectExtent l="0" t="0" r="0" b="0"/>
+            <ns3:docPr id="1" name="图片 1"/>
+            <ns3:cNvGraphicFramePr>
+              <ns5:graphicFrameLocks noChangeAspect="1"/>
+            </ns3:cNvGraphicFramePr>
+            <ns5:graphic>
+              <ns5:graphicData uri="http://schemas.openxmlformats.org/drawingml/2006/picture">
                 <ns11:pic>
                   <ns11:nvPicPr>
                     <ns11:cNvPr id="0" name="Picture 4"/>
                     <ns11:cNvPicPr>
-                      <ns8:picLocks noChangeAspect="1" noChangeArrowheads="1"/>
+                      <ns5:picLocks noChangeAspect="1" noChangeArrowheads="1"/>
                     </ns11:cNvPicPr>
                   </ns11:nvPicPr>
                   <ns11:blipFill>
-                    <ns8:blip ns5:embed="rId16">
-                      <ns8:extLst>
-                        <ns8:ext uri="{28A0092B-C50C-407E-A947-70E740481C1C}">
+                    <ns5:blip ns10:embed="rId16">
+                      <ns5:extLst>
+                        <ns5:ext uri="{28A0092B-C50C-407E-A947-70E740481C1C}">
                           <ns12:useLocalDpi val="0"/>
-                        </ns8:ext>
-                      </ns8:extLst>
-                    </ns8:blip>
-                    <ns8:srcRect/>
-                    <ns8:stretch>
-                      <ns8:fillRect/>
-                    </ns8:stretch>
+                        </ns5:ext>
+                      </ns5:extLst>
+                    </ns5:blip>
+                    <ns5:srcRect/>
+                    <ns5:stretch>
+                      <ns5:fillRect/>
+                    </ns5:stretch>
                   </ns11:blipFill>
                   <ns11:spPr bwMode="auto">
-                    <ns8:xfrm>
-                      <ns8:off x="0" y="0"/>
-                      <ns8:ext cx="5279390" cy="2176145"/>
-                    </ns8:xfrm>
-                    <ns8:prstGeom prst="rect">
-                      <ns8:avLst/>
-                    </ns8:prstGeom>
-                    <ns8:noFill/>
+                    <ns5:xfrm>
+                      <ns5:off x="0" y="0"/>
+                      <ns5:ext cx="5279390" cy="2176145"/>
+                    </ns5:xfrm>
+                    <ns5:prstGeom prst="rect">
+                      <ns5:avLst/>
+                    </ns5:prstGeom>
+                    <ns5:noFill/>
                   </ns11:spPr>
                 </ns11:pic>
-              </ns8:graphicData>
-            </ns8:graphic>
-          </ns6:inline>
+              </ns5:graphicData>
+            </ns5:graphic>
+          </ns3:inline>
         </w:drawing>
       </w:r>
     </w:p>
@@ -2041,10 +2016,10 @@
       </w:pPr>
     </w:p>
     <w:sectPr>
-      <w:headerReference w:type="default" ns5:id="rId17"/>
-      <w:footerReference w:type="default" ns5:id="rId18"/>
-      <w:headerReference w:type="first" ns5:id="rId19"/>
-      <w:footerReference w:type="first" ns5:id="rId20"/>
+      <w:headerReference w:type="default" ns10:id="rId17"/>
+      <w:footerReference w:type="default" ns10:id="rId18"/>
+      <w:headerReference w:type="first" ns10:id="rId19"/>
+      <w:footerReference w:type="first" ns10:id="rId20"/>
       <w:pgSz w:w="11906" w:h="16838"/>
       <w:pgMar w:top="1440" w:right="1800" w:bottom="1440" w:left="1800" w:header="851" w:footer="992" w:gutter="0"/>
       <w:pgNumType w:start="1"/>

</xml_diff>

<commit_message>
Fix Word-safe template scrubbing
</commit_message>
<xml_diff>
--- a/skills/thesis-literature-review-builder/assets/base-templates/literature-review-template.docx
+++ b/skills/thesis-literature-review-builder/assets/base-templates/literature-review-template.docx
@@ -1,13 +1,13 @@
 
 <file path=word/document.xml><?xml version="1.0" encoding="utf-8"?>
-<w:document xmlns:ns1="http://schemas.openxmlformats.org/markup-compatibility/2006" xmlns:ns10="http://schemas.openxmlformats.org/officeDocument/2006/relationships" xmlns:ns11="http://schemas.openxmlformats.org/drawingml/2006/picture" xmlns:ns12="http://schemas.microsoft.com/office/drawing/2010/main" xmlns:ns2="http://schemas.microsoft.com/office/word/2010/wordml" xmlns:ns3="http://schemas.openxmlformats.org/drawingml/2006/wordprocessingDrawing" xmlns:ns4="http://schemas.microsoft.com/office/word/2010/wordprocessingDrawing" xmlns:ns5="http://schemas.openxmlformats.org/drawingml/2006/main" xmlns:ns6="http://schemas.microsoft.com/office/word/2010/wordprocessingShape" xmlns:ns7="urn:schemas-microsoft-com:vml" xmlns:ns8="urn:schemas-microsoft-com:office:office" xmlns:ns9="urn:schemas-microsoft-com:office:word" xmlns:w="http://schemas.openxmlformats.org/wordprocessingml/2006/main" ns1:Ignorable="w14 w15 w16se w16cid w16 w16cex w16sdtdh w16sdtfl w16du wp14">
+<w:document xmlns:wpc="http://schemas.microsoft.com/office/word/2010/wordprocessingCanvas" xmlns:cx="http://schemas.microsoft.com/office/drawing/2014/chartex" xmlns:cx1="http://schemas.microsoft.com/office/drawing/2015/9/8/chartex" xmlns:cx2="http://schemas.microsoft.com/office/drawing/2015/10/21/chartex" xmlns:cx3="http://schemas.microsoft.com/office/drawing/2016/5/9/chartex" xmlns:cx4="http://schemas.microsoft.com/office/drawing/2016/5/10/chartex" xmlns:cx5="http://schemas.microsoft.com/office/drawing/2016/5/11/chartex" xmlns:cx6="http://schemas.microsoft.com/office/drawing/2016/5/12/chartex" xmlns:cx7="http://schemas.microsoft.com/office/drawing/2016/5/13/chartex" xmlns:cx8="http://schemas.microsoft.com/office/drawing/2016/5/14/chartex" xmlns:mc="http://schemas.openxmlformats.org/markup-compatibility/2006" xmlns:aink="http://schemas.microsoft.com/office/drawing/2016/ink" xmlns:am3d="http://schemas.microsoft.com/office/drawing/2017/model3d" xmlns:o="urn:schemas-microsoft-com:office:office" xmlns:r="http://schemas.openxmlformats.org/officeDocument/2006/relationships" xmlns:m="http://schemas.openxmlformats.org/officeDocument/2006/math" xmlns:v="urn:schemas-microsoft-com:vml" xmlns:wp14="http://schemas.microsoft.com/office/word/2010/wordprocessingDrawing" xmlns:wp="http://schemas.openxmlformats.org/drawingml/2006/wordprocessingDrawing" xmlns:w10="urn:schemas-microsoft-com:office:word" xmlns:w="http://schemas.openxmlformats.org/wordprocessingml/2006/main" xmlns:w14="http://schemas.microsoft.com/office/word/2010/wordml" xmlns:w15="http://schemas.microsoft.com/office/word/2012/wordml" xmlns:w16cex="http://schemas.microsoft.com/office/word/2018/wordml/cex" xmlns:w16cid="http://schemas.microsoft.com/office/word/2016/wordml/cid" xmlns:w16="http://schemas.microsoft.com/office/word/2018/wordml" xmlns:w16sdtdh="http://schemas.microsoft.com/office/word/2020/wordml/sdtdatahash" xmlns:w16se="http://schemas.microsoft.com/office/word/2015/wordml/symex" xmlns:wpg="http://schemas.microsoft.com/office/word/2010/wordprocessingGroup" xmlns:wpi="http://schemas.microsoft.com/office/word/2010/wordprocessingInk" xmlns:wne="http://schemas.microsoft.com/office/word/2006/wordml" xmlns:wps="http://schemas.microsoft.com/office/word/2010/wordprocessingShape" mc:Ignorable="w14 w15 w16se w16cid w16 w16cex w16sdtdh wp14">
   <w:body>
-    <w:p ns2:paraId="73C7D99C" ns2:textId="77777777">
+    <w:p>
       <w:pPr>
         <w:spacing w:before="50" w:after="50" w:line="360" w:lineRule="auto"/>
         <w:jc w:val="left"/>
         <w:rPr>
-          <w:rFonts w:ascii="黑体" w:eastAsia="黑体" w:hAnsi="黑体" w:hint="eastAsia"/>
+          <w:rFonts w:ascii="黑体" w:eastAsia="黑体" w:hAnsi="黑体"/>
           <w:b/>
         </w:rPr>
       </w:pPr>
@@ -15,10 +15,34 @@
         <w:rPr>
           <w:position w:val="-4"/>
         </w:rPr>
+        <w:object w:dxaOrig="180" w:dyaOrig="279" w14:anchorId="350CDB52">
+          <v:shapetype id="_x0000_t75" coordsize="21600,21600" o:spt="75" o:preferrelative="t" path="m@4@5l@4@11@9@11@9@5xe" filled="f" stroked="f">
+            <v:stroke joinstyle="miter"/>
+            <v:formulas>
+              <v:f eqn="if lineDrawn pixelLineWidth 0"/>
+              <v:f eqn="sum @0 1 0"/>
+              <v:f eqn="sum 0 0 @1"/>
+              <v:f eqn="prod @2 1 2"/>
+              <v:f eqn="prod @3 21600 pixelWidth"/>
+              <v:f eqn="prod @3 21600 pixelHeight"/>
+              <v:f eqn="sum @0 0 1"/>
+              <v:f eqn="prod @6 1 2"/>
+              <v:f eqn="prod @7 21600 pixelWidth"/>
+              <v:f eqn="sum @8 21600 0"/>
+              <v:f eqn="prod @7 21600 pixelHeight"/>
+              <v:f eqn="sum @10 21600 0"/>
+            </v:formulas>
+            <v:path o:extrusionok="f" gradientshapeok="t" o:connecttype="rect"/>
+            <o:lock v:ext="edit" aspectratio="t"/>
+          </v:shapetype>
+          <v:shape id="_x0000_i1025" type="#_x0000_t75" style="width:9pt;height:13.5pt" o:ole="">
+            <v:imagedata r:id="rId8" o:title=""/>
+          </v:shape>
+        </w:object>
       </w:r>
       <w:bookmarkStart w:id="0" w:name="_Hlk213750326"/>
     </w:p>
-    <w:p ns2:paraId="54F42F6E" ns2:textId="77777777">
+    <w:p>
       <w:pPr>
         <w:tabs>
           <w:tab w:val="left" w:pos="3240"/>
@@ -26,12 +50,12 @@
         <w:spacing w:before="50" w:after="50" w:line="360" w:lineRule="auto"/>
         <w:jc w:val="left"/>
         <w:rPr>
-          <w:rFonts w:ascii="黑体" w:eastAsia="黑体" w:hAnsi="黑体" w:hint="eastAsia"/>
+          <w:rFonts w:ascii="黑体" w:eastAsia="黑体" w:hAnsi="黑体"/>
           <w:b/>
         </w:rPr>
       </w:pPr>
     </w:p>
-    <w:p ns2:paraId="36CC7AC9" ns2:textId="77777777">
+    <w:p>
       <w:pPr>
         <w:tabs>
           <w:tab w:val="left" w:pos="3240"/>
@@ -42,7 +66,7 @@
         </w:rPr>
       </w:pPr>
     </w:p>
-    <w:p ns2:paraId="5D8F331B" ns2:textId="77777777">
+    <w:p>
       <w:pPr>
         <w:tabs>
           <w:tab w:val="left" w:pos="3240"/>
@@ -53,7 +77,7 @@
         <w:t> </w:t>
       </w:r>
     </w:p>
-    <w:p ns2:paraId="59A87497" ns2:textId="104D52F2">
+    <w:p>
       <w:pPr>
         <w:tabs>
           <w:tab w:val="left" w:pos="3240"/>
@@ -68,46 +92,46 @@
         <w:rPr>
           <w:noProof/>
         </w:rPr>
-        <ns1:AlternateContent>
-          <ns1:Choice Requires="wps">
+        <mc:AlternateContent>
+          <mc:Choice Requires="wps">
             <w:drawing>
-              <ns3:anchor distT="0" distB="0" distL="114300" distR="114300" simplePos="0" relativeHeight="251659264" behindDoc="0" locked="0" layoutInCell="1" allowOverlap="1" ns4:anchorId="2BC5EAE0" ns4:editId="3E11505C">
-                <ns3:simplePos x="0" y="0"/>
-                <ns3:positionH relativeFrom="page">
-                  <ns3:align>right</ns3:align>
-                </ns3:positionH>
-                <ns3:positionV relativeFrom="page">
-                  <ns3:posOffset>2705100</ns3:posOffset>
-                </ns3:positionV>
-                <ns3:extent cx="7553325" cy="1038225"/>
-                <ns3:effectExtent l="0" t="0" r="0" b="9525"/>
-                <ns3:wrapNone/>
-                <ns3:docPr id="4" name="文本框 4"/>
-                <ns3:cNvGraphicFramePr>
-                  <ns5:graphicFrameLocks/>
-                </ns3:cNvGraphicFramePr>
-                <ns5:graphic>
-                  <ns5:graphicData uri="http://schemas.microsoft.com/office/word/2010/wordprocessingShape">
-                    <ns6:wsp>
-                      <ns6:cNvSpPr txBox="1">
-                        <ns5:spLocks noChangeArrowheads="1"/>
-                      </ns6:cNvSpPr>
-                      <ns6:spPr bwMode="auto">
-                        <ns5:xfrm>
-                          <ns5:off x="0" y="0"/>
-                          <ns5:ext cx="7553325" cy="1038225"/>
-                        </ns5:xfrm>
-                        <ns5:prstGeom prst="rect">
-                          <ns5:avLst/>
-                        </ns5:prstGeom>
-                        <ns5:noFill/>
-                        <ns5:ln>
-                          <ns5:noFill/>
-                        </ns5:ln>
-                      </ns6:spPr>
-                      <ns6:txbx>
+              <wp:anchor distT="0" distB="0" distL="114300" distR="114300" simplePos="0" relativeHeight="251659264" behindDoc="0" locked="0" layoutInCell="1" allowOverlap="1" wp14:anchorId="4599B238" wp14:editId="5E60069E">
+                <wp:simplePos x="0" y="0"/>
+                <wp:positionH relativeFrom="page">
+                  <wp:posOffset>-9525</wp:posOffset>
+                </wp:positionH>
+                <wp:positionV relativeFrom="page">
+                  <wp:posOffset>2705100</wp:posOffset>
+                </wp:positionV>
+                <wp:extent cx="7534275" cy="1038225"/>
+                <wp:effectExtent l="0" t="0" r="0" b="9525"/>
+                <wp:wrapNone/>
+                <wp:docPr id="4" name="文本框 4"/>
+                <wp:cNvGraphicFramePr>
+                  <a:graphicFrameLocks xmlns:a="http://schemas.openxmlformats.org/drawingml/2006/main"/>
+                </wp:cNvGraphicFramePr>
+                <a:graphic xmlns:a="http://schemas.openxmlformats.org/drawingml/2006/main">
+                  <a:graphicData uri="http://schemas.microsoft.com/office/word/2010/wordprocessingShape">
+                    <wps:wsp>
+                      <wps:cNvSpPr txBox="1">
+                        <a:spLocks noChangeArrowheads="1"/>
+                      </wps:cNvSpPr>
+                      <wps:spPr bwMode="auto">
+                        <a:xfrm>
+                          <a:off x="0" y="0"/>
+                          <a:ext cx="7534275" cy="1038225"/>
+                        </a:xfrm>
+                        <a:prstGeom prst="rect">
+                          <a:avLst/>
+                        </a:prstGeom>
+                        <a:noFill/>
+                        <a:ln>
+                          <a:noFill/>
+                        </a:ln>
+                      </wps:spPr>
+                      <wps:txbx>
                         <w:txbxContent>
-                          <w:p ns2:paraId="756EEE9B" ns2:textId="4A18C0AB">
+                          <w:p>
                             <w:pPr>
                               <w:tabs>
                                 <w:tab w:val="left" w:pos="3240"/>
@@ -129,7 +153,7 @@
                                 <w:sz w:val="96"/>
                                 <w:szCs w:val="96"/>
                               </w:rPr>
-                              <w:t>XX</w:t>
+                              <w:t>专业</w:t>
                             </w:r>
                             <w:r>
                               <w:rPr>
@@ -139,10 +163,10 @@
                                 <w:sz w:val="96"/>
                                 <w:szCs w:val="96"/>
                               </w:rPr>
-                              <w:t>学位论文文献综述</w:t>
+                              <w:t>博士学位论文开题报告</w:t>
                             </w:r>
                           </w:p>
-                          <w:p ns2:paraId="3BC4A233" ns2:textId="77777777">
+                          <w:p>
                             <w:pPr>
                               <w:ind w:firstLine="480"/>
                               <w:jc w:val="center"/>
@@ -152,32 +176,32 @@
                             </w:r>
                           </w:p>
                         </w:txbxContent>
-                      </ns6:txbx>
-                      <ns6:bodyPr rot="0" vert="horz" wrap="square" lIns="91440" tIns="45720" rIns="91440" bIns="45720" anchor="t" anchorCtr="0" upright="1">
-                        <ns5:noAutofit/>
-                      </ns6:bodyPr>
-                    </ns6:wsp>
-                  </ns5:graphicData>
-                </ns5:graphic>
-                <ns4:sizeRelH relativeFrom="margin">
-                  <ns4:pctWidth>0</ns4:pctWidth>
-                </ns4:sizeRelH>
-                <ns4:sizeRelV relativeFrom="margin">
-                  <ns4:pctHeight>0</ns4:pctHeight>
-                </ns4:sizeRelV>
-              </ns3:anchor>
+                      </wps:txbx>
+                      <wps:bodyPr rot="0" vert="horz" wrap="square" lIns="91440" tIns="45720" rIns="91440" bIns="45720" anchor="t" anchorCtr="0" upright="1">
+                        <a:noAutofit/>
+                      </wps:bodyPr>
+                    </wps:wsp>
+                  </a:graphicData>
+                </a:graphic>
+                <wp14:sizeRelH relativeFrom="margin">
+                  <wp14:pctWidth>0</wp14:pctWidth>
+                </wp14:sizeRelH>
+                <wp14:sizeRelV relativeFrom="margin">
+                  <wp14:pctHeight>0</wp14:pctHeight>
+                </wp14:sizeRelV>
+              </wp:anchor>
             </w:drawing>
-          </ns1:Choice>
-          <ns1:Fallback>
+          </mc:Choice>
+          <mc:Fallback>
             <w:pict>
-              <ns7:shapetype ns2:anchorId="2BC5EAE0" id="_x0000_t202" coordsize="21600,21600" ns8:spt="202" path="m,l,21600r21600,l21600,xe">
-                <ns7:stroke joinstyle="miter"/>
-                <ns7:path gradientshapeok="t" ns8:connecttype="rect"/>
-              </ns7:shapetype>
-              <ns7:shape id="文本框 4" ns8:spid="_x0000_s1026" type="#_x0000_t202" style="position:absolute;left:0;text-align:left;margin-left:543.55pt;margin-top:213pt;width:594.75pt;height:81.75pt;z-index:251659264;visibility:visible;mso-wrap-style:square;mso-width-percent:0;mso-height-percent:0;mso-wrap-distance-left:9pt;mso-wrap-distance-top:0;mso-wrap-distance-right:9pt;mso-wrap-distance-bottom:0;mso-position-horizontal:right;mso-position-horizontal-relative:page;mso-position-vertical:absolute;mso-position-vertical-relative:page;mso-width-percent:0;mso-height-percent:0;mso-width-relative:margin;mso-height-relative:margin;v-text-anchor:top" ns8:gfxdata="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" filled="f" stroked="f">
-                <ns7:textbox>
+              <v:shapetype w14:anchorId="4599B238" id="_x0000_t202" coordsize="21600,21600" o:spt="202" path="m,l,21600r21600,l21600,xe">
+                <v:stroke joinstyle="miter"/>
+                <v:path gradientshapeok="t" o:connecttype="rect"/>
+              </v:shapetype>
+              <v:shape id="文本框 4" o:spid="_x0000_s1026" type="#_x0000_t202" style="position:absolute;left:0;text-align:left;margin-left:-.75pt;margin-top:213pt;width:593.25pt;height:81.75pt;z-index:251659264;visibility:visible;mso-wrap-style:square;mso-width-percent:0;mso-height-percent:0;mso-wrap-distance-left:9pt;mso-wrap-distance-top:0;mso-wrap-distance-right:9pt;mso-wrap-distance-bottom:0;mso-position-horizontal:absolute;mso-position-horizontal-relative:page;mso-position-vertical:absolute;mso-position-vertical-relative:page;mso-width-percent:0;mso-height-percent:0;mso-width-relative:margin;mso-height-relative:margin;v-text-anchor:top" o:gfxdata="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" filled="f" stroked="f">
+                <v:textbox>
                   <w:txbxContent>
-                    <w:p ns2:paraId="756EEE9B" ns2:textId="4A18C0AB">
+                    <w:p>
                       <w:pPr>
                         <w:tabs>
                           <w:tab w:val="left" w:pos="3240"/>
@@ -199,7 +223,7 @@
                           <w:sz w:val="96"/>
                           <w:szCs w:val="96"/>
                         </w:rPr>
-                        <w:t>XX</w:t>
+                        <w:t>专业</w:t>
                       </w:r>
                       <w:r>
                         <w:rPr>
@@ -209,10 +233,10 @@
                           <w:sz w:val="96"/>
                           <w:szCs w:val="96"/>
                         </w:rPr>
-                        <w:t>学位论文文献综述</w:t>
+                        <w:t>博士学位论文开题报告</w:t>
                       </w:r>
                     </w:p>
-                    <w:p ns2:paraId="3BC4A233" ns2:textId="77777777">
+                    <w:p>
                       <w:pPr>
                         <w:ind w:firstLine="480"/>
                         <w:jc w:val="center"/>
@@ -222,50 +246,68 @@
                       </w:r>
                     </w:p>
                   </w:txbxContent>
-                </ns7:textbox>
-                <ns9:wrap anchorx="page" anchory="page"/>
-              </ns7:shape>
+                </v:textbox>
+                <w10:wrap anchorx="page" anchory="page"/>
+              </v:shape>
             </w:pict>
-          </ns1:Fallback>
-        </ns1:AlternateContent>
-      </w:r>
-      <w:r>
-        <w:rPr>
-          <w:rFonts w:hint="eastAsia"/>
+          </mc:Fallback>
+        </mc:AlternateContent>
+      </w:r>
+      <w:r>
+        <w:rPr>
           <w:noProof/>
         </w:rPr>
-        <w:t>（</w:t>
-      </w:r>
-      <w:r>
-        <w:rPr>
-          <w:rFonts w:hint="eastAsia"/>
-          <w:noProof/>
-        </w:rPr>
-        <w:t>XX</w:t>
-      </w:r>
-      <w:r>
-        <w:rPr>
-          <w:rFonts w:hint="eastAsia"/>
-          <w:noProof/>
-        </w:rPr>
-        <w:t>大学图片</w:t>
-      </w:r>
-      <w:r>
-        <w:rPr>
-          <w:rFonts w:hint="eastAsia"/>
-          <w:noProof/>
-        </w:rPr>
-        <w:t>LOGO</w:t>
-      </w:r>
-      <w:r>
-        <w:rPr>
-          <w:rFonts w:hint="eastAsia"/>
-          <w:noProof/>
-        </w:rPr>
-        <w:t>）</w:t>
-      </w:r>
-    </w:p>
-    <w:p ns2:paraId="2E8DA045" ns2:textId="77777777">
+        <w:drawing>
+          <wp:inline distT="0" distB="0" distL="0" distR="0" wp14:anchorId="04B74905" wp14:editId="0678E663">
+            <wp:extent cx="2726055" cy="363855"/>
+            <wp:effectExtent l="0" t="0" r="0" b="0"/>
+            <wp:docPr id="1" name="图片 1" descr="1"/>
+            <wp:cNvGraphicFramePr>
+              <a:graphicFrameLocks xmlns:a="http://schemas.openxmlformats.org/drawingml/2006/main" noChangeAspect="1"/>
+            </wp:cNvGraphicFramePr>
+            <a:graphic xmlns:a="http://schemas.openxmlformats.org/drawingml/2006/main">
+              <a:graphicData uri="http://schemas.openxmlformats.org/drawingml/2006/picture">
+                <pic:pic xmlns:pic="http://schemas.openxmlformats.org/drawingml/2006/picture">
+                  <pic:nvPicPr>
+                    <pic:cNvPr id="1" name="图片 1" descr="1"/>
+                    <pic:cNvPicPr>
+                      <a:picLocks noChangeAspect="1" noChangeArrowheads="1"/>
+                    </pic:cNvPicPr>
+                  </pic:nvPicPr>
+                  <pic:blipFill>
+                    <a:blip r:embed="rId10" cstate="print">
+                      <a:extLst>
+                        <a:ext uri="{28A0092B-C50C-407E-A947-70E740481C1C}">
+                          <a14:useLocalDpi xmlns:a14="http://schemas.microsoft.com/office/drawing/2010/main" val="0"/>
+                        </a:ext>
+                      </a:extLst>
+                    </a:blip>
+                    <a:srcRect/>
+                    <a:stretch>
+                      <a:fillRect/>
+                    </a:stretch>
+                  </pic:blipFill>
+                  <pic:spPr>
+                    <a:xfrm>
+                      <a:off x="0" y="0"/>
+                      <a:ext cx="2726055" cy="363855"/>
+                    </a:xfrm>
+                    <a:prstGeom prst="rect">
+                      <a:avLst/>
+                    </a:prstGeom>
+                    <a:noFill/>
+                    <a:ln>
+                      <a:noFill/>
+                    </a:ln>
+                  </pic:spPr>
+                </pic:pic>
+              </a:graphicData>
+            </a:graphic>
+          </wp:inline>
+        </w:drawing>
+      </w:r>
+    </w:p>
+    <w:p>
       <w:pPr>
         <w:tabs>
           <w:tab w:val="left" w:pos="3240"/>
@@ -289,7 +331,7 @@
         <w:t> </w:t>
       </w:r>
     </w:p>
-    <w:p ns2:paraId="0A4A41A0" ns2:textId="77777777">
+    <w:p>
       <w:pPr>
         <w:tabs>
           <w:tab w:val="left" w:pos="3240"/>
@@ -315,7 +357,7 @@
         <w:t>论文题目</w:t>
       </w:r>
     </w:p>
-    <w:p ns2:paraId="5DC44056" ns2:textId="77777777">
+    <w:p>
       <w:pPr>
         <w:tabs>
           <w:tab w:val="left" w:pos="4200"/>
@@ -324,18 +366,34 @@
         <w:ind w:firstLineChars="800" w:firstLine="2240"/>
         <w:jc w:val="left"/>
         <w:rPr>
+          <w:rFonts w:ascii="黑体" w:eastAsia="黑体" w:hAnsi="黑体"/>
+          <w:sz w:val="28"/>
+          <w:szCs w:val="28"/>
+        </w:rPr>
+      </w:pPr>
+      <w:r>
+        <w:rPr>
           <w:rFonts w:ascii="黑体" w:eastAsia="黑体" w:hAnsi="黑体" w:hint="eastAsia"/>
           <w:sz w:val="28"/>
           <w:szCs w:val="28"/>
         </w:rPr>
-      </w:pPr>
+        <w:t>作者姓名</w:t>
+      </w:r>
+      <w:r>
+        <w:rPr>
+          <w:rFonts w:ascii="黑体" w:eastAsia="黑体" w:hAnsi="黑体"/>
+          <w:sz w:val="28"/>
+          <w:szCs w:val="28"/>
+        </w:rPr>
+        <w:tab/>
+      </w:r>
       <w:r>
         <w:rPr>
           <w:rFonts w:ascii="黑体" w:eastAsia="黑体" w:hAnsi="黑体" w:hint="eastAsia"/>
           <w:sz w:val="28"/>
           <w:szCs w:val="28"/>
         </w:rPr>
-        <w:t>作者姓名</w:t>
+        <w:t>xx</w:t>
       </w:r>
       <w:r>
         <w:rPr>
@@ -343,26 +401,10 @@
           <w:sz w:val="28"/>
           <w:szCs w:val="28"/>
         </w:rPr>
-        <w:tab/>
-      </w:r>
-      <w:r>
-        <w:rPr>
-          <w:rFonts w:ascii="黑体" w:eastAsia="黑体" w:hAnsi="黑体" w:hint="eastAsia"/>
-          <w:sz w:val="28"/>
-          <w:szCs w:val="28"/>
-        </w:rPr>
-        <w:t>xx</w:t>
-      </w:r>
-      <w:r>
-        <w:rPr>
-          <w:rFonts w:ascii="黑体" w:eastAsia="黑体" w:hAnsi="黑体"/>
-          <w:sz w:val="28"/>
-          <w:szCs w:val="28"/>
-        </w:rPr>
         <w:t>x</w:t>
       </w:r>
     </w:p>
-    <w:p ns2:paraId="4CE4F956" ns2:textId="77777777">
+    <w:p>
       <w:pPr>
         <w:tabs>
           <w:tab w:val="left" w:pos="4200"/>
@@ -371,17 +413,17 @@
         <w:ind w:firstLineChars="800" w:firstLine="2240"/>
         <w:jc w:val="left"/>
         <w:rPr>
+          <w:rFonts w:ascii="黑体" w:eastAsia="黑体" w:hAnsi="黑体"/>
+          <w:sz w:val="28"/>
+          <w:szCs w:val="28"/>
+        </w:rPr>
+      </w:pPr>
+      <w:r>
+        <w:rPr>
           <w:rFonts w:ascii="黑体" w:eastAsia="黑体" w:hAnsi="黑体" w:hint="eastAsia"/>
           <w:sz w:val="28"/>
           <w:szCs w:val="28"/>
         </w:rPr>
-      </w:pPr>
-      <w:r>
-        <w:rPr>
-          <w:rFonts w:ascii="黑体" w:eastAsia="黑体" w:hAnsi="黑体" w:hint="eastAsia"/>
-          <w:sz w:val="28"/>
-          <w:szCs w:val="28"/>
-        </w:rPr>
         <w:t>学科专业</w:t>
       </w:r>
       <w:r>
@@ -401,7 +443,7 @@
         <w:t>xxxxxx</w:t>
       </w:r>
     </w:p>
-    <w:p ns2:paraId="073E26C5" ns2:textId="77777777">
+    <w:p>
       <w:pPr>
         <w:tabs>
           <w:tab w:val="left" w:pos="4200"/>
@@ -410,17 +452,17 @@
         <w:ind w:firstLineChars="800" w:firstLine="2240"/>
         <w:jc w:val="left"/>
         <w:rPr>
+          <w:rFonts w:ascii="黑体" w:eastAsia="黑体" w:hAnsi="黑体"/>
+          <w:sz w:val="28"/>
+          <w:szCs w:val="28"/>
+        </w:rPr>
+      </w:pPr>
+      <w:r>
+        <w:rPr>
           <w:rFonts w:ascii="黑体" w:eastAsia="黑体" w:hAnsi="黑体" w:hint="eastAsia"/>
           <w:sz w:val="28"/>
           <w:szCs w:val="28"/>
         </w:rPr>
-      </w:pPr>
-      <w:r>
-        <w:rPr>
-          <w:rFonts w:ascii="黑体" w:eastAsia="黑体" w:hAnsi="黑体" w:hint="eastAsia"/>
-          <w:sz w:val="28"/>
-          <w:szCs w:val="28"/>
-        </w:rPr>
         <w:t>指导教师</w:t>
       </w:r>
       <w:r>
@@ -456,7 +498,7 @@
         <w:t>教授</w:t>
       </w:r>
     </w:p>
-    <w:p ns2:paraId="766214D3" ns2:textId="60FC0EE9">
+    <w:p>
       <w:pPr>
         <w:tabs>
           <w:tab w:val="left" w:pos="4200"/>
@@ -470,8 +512,8 @@
           <w:szCs w:val="36"/>
         </w:rPr>
         <w:sectPr>
-          <w:headerReference w:type="even" ns10:id="rId10"/>
-          <w:headerReference w:type="default" ns10:id="rId11"/>
+          <w:headerReference w:type="even" r:id="rId11"/>
+          <w:headerReference w:type="default" r:id="rId12"/>
           <w:pgSz w:w="11906" w:h="16838"/>
           <w:pgMar w:top="1418" w:right="1418" w:bottom="1701" w:left="1418" w:header="851" w:footer="851" w:gutter="0"/>
           <w:pgNumType w:fmt="numberInDash"/>
@@ -503,17 +545,9 @@
         </w:rPr>
         <w:t>XX</w:t>
       </w:r>
-      <w:r>
-        <w:rPr>
-          <w:rFonts w:eastAsia="黑体" w:hint="eastAsia"/>
-          <w:sz w:val="28"/>
-          <w:szCs w:val="28"/>
-        </w:rPr>
-        <w:t>学院</w:t>
-      </w:r>
       <w:bookmarkEnd w:id="0"/>
     </w:p>
-    <w:p ns2:paraId="2EE58C87" ns2:textId="77777777">
+    <w:p>
       <w:pPr>
         <w:spacing w:before="240" w:after="360"/>
         <w:jc w:val="center"/>
@@ -522,6 +556,7 @@
           <w:sz w:val="36"/>
         </w:rPr>
       </w:pPr>
+      <w:bookmarkStart w:id="1" w:name="_Hlk213750301"/>
       <w:r>
         <w:rPr>
           <w:rFonts w:eastAsia="黑体" w:hint="eastAsia"/>
@@ -545,40 +580,9 @@
         <w:t>录</w:t>
       </w:r>
     </w:p>
-    <w:p ns2:paraId="65AAE1D0" ns2:textId="7B355A7B">
+    <w:p>
       <w:pPr>
         <w:pStyle w:val="TOC1"/>
-        <w:rPr>
-          <w:rFonts w:asciiTheme="minorHAnsi" w:eastAsiaTheme="minorEastAsia" w:hAnsiTheme="minorHAnsi" w:cstheme="minorBidi" w:hint="eastAsia"/>
-          <w:b w:val="0"/>
-          <w:bCs w:val="0"/>
-          <w:caps w:val="0"/>
-          <w:sz w:val="21"/>
-          <w:szCs w:val="22"/>
-        </w:rPr>
-      </w:pPr>
-      <w:r>
-        <w:rPr>
-          <w:szCs w:val="24"/>
-        </w:rPr>
-        <w:fldChar w:fldCharType="begin"/>
-      </w:r>
-      <w:r>
-        <w:rPr>
-          <w:szCs w:val="24"/>
-        </w:rPr>
-        <w:instrText xml:space="preserve"> TOC \o "1-4" </w:instrText>
-      </w:r>
-      <w:r>
-        <w:rPr>
-          <w:szCs w:val="24"/>
-        </w:rPr>
-        <w:fldChar w:fldCharType="separate"/>
-      </w:r>
-      <w:r>
-        <w:t>1</w:t>
-      </w:r>
-      <w:r>
         <w:rPr>
           <w:rFonts w:asciiTheme="minorHAnsi" w:eastAsiaTheme="minorEastAsia" w:hAnsiTheme="minorHAnsi" w:cstheme="minorBidi"/>
           <w:b w:val="0"/>
@@ -587,44 +591,27 @@
           <w:sz w:val="21"/>
           <w:szCs w:val="22"/>
         </w:rPr>
-        <w:tab/>
-      </w:r>
-      <w:r>
-        <w:t>研究方向概述</w:t>
-      </w:r>
-      <w:r>
-        <w:tab/>
-      </w:r>
-      <w:r>
+      </w:pPr>
+      <w:r>
+        <w:rPr>
+          <w:szCs w:val="24"/>
+        </w:rPr>
         <w:fldChar w:fldCharType="begin"/>
       </w:r>
       <w:r>
-        <w:instrText xml:space="preserve"> PAGEREF _Toc213753474 \h </w:instrText>
-      </w:r>
-      <w:r>
+        <w:rPr>
+          <w:szCs w:val="24"/>
+        </w:rPr>
+        <w:instrText xml:space="preserve"> TOC \o "1-4" </w:instrText>
+      </w:r>
+      <w:r>
+        <w:rPr>
+          <w:szCs w:val="24"/>
+        </w:rPr>
         <w:fldChar w:fldCharType="separate"/>
       </w:r>
       <w:r>
         <w:t>1</w:t>
-      </w:r>
-      <w:r>
-        <w:fldChar w:fldCharType="end"/>
-      </w:r>
-    </w:p>
-    <w:p ns2:paraId="67A5C6BF" ns2:textId="3567410A">
-      <w:pPr>
-        <w:pStyle w:val="TOC1"/>
-        <w:rPr>
-          <w:rFonts w:asciiTheme="minorHAnsi" w:eastAsiaTheme="minorEastAsia" w:hAnsiTheme="minorHAnsi" w:cstheme="minorBidi" w:hint="eastAsia"/>
-          <w:b w:val="0"/>
-          <w:bCs w:val="0"/>
-          <w:caps w:val="0"/>
-          <w:sz w:val="21"/>
-          <w:szCs w:val="22"/>
-        </w:rPr>
-      </w:pPr>
-      <w:r>
-        <w:t>2</w:t>
       </w:r>
       <w:r>
         <w:rPr>
@@ -638,7 +625,7 @@
         <w:tab/>
       </w:r>
       <w:r>
-        <w:t>国内外研究现状</w:t>
+        <w:t>论文选题依据</w:t>
       </w:r>
       <w:r>
         <w:tab/>
@@ -647,7 +634,7 @@
         <w:fldChar w:fldCharType="begin"/>
       </w:r>
       <w:r>
-        <w:instrText xml:space="preserve"> PAGEREF _Toc213753475 \h </w:instrText>
+        <w:instrText xml:space="preserve"> PAGEREF _Toc213752070 \h </w:instrText>
       </w:r>
       <w:r>
         <w:fldChar w:fldCharType="separate"/>
@@ -659,65 +646,18 @@
         <w:fldChar w:fldCharType="end"/>
       </w:r>
     </w:p>
-    <w:p ns2:paraId="5DC68A97" ns2:textId="4EF5A125">
+    <w:p>
       <w:pPr>
         <w:pStyle w:val="TOC2"/>
-        <w:rPr>
-          <w:rFonts w:asciiTheme="minorHAnsi" w:eastAsiaTheme="minorEastAsia" w:hAnsiTheme="minorHAnsi" w:cstheme="minorBidi" w:hint="eastAsia"/>
-          <w:smallCaps w:val="0"/>
-          <w:sz w:val="21"/>
-          <w:szCs w:val="22"/>
-        </w:rPr>
-      </w:pPr>
-      <w:r>
-        <w:t>2.1</w:t>
-      </w:r>
-      <w:r>
         <w:rPr>
           <w:rFonts w:asciiTheme="minorHAnsi" w:eastAsiaTheme="minorEastAsia" w:hAnsiTheme="minorHAnsi" w:cstheme="minorBidi"/>
           <w:smallCaps w:val="0"/>
           <w:sz w:val="21"/>
           <w:szCs w:val="22"/>
         </w:rPr>
-        <w:tab/>
-      </w:r>
-      <w:r>
-        <w:t>XXX</w:t>
-      </w:r>
-      <w:r>
-        <w:t>研究现状</w:t>
-      </w:r>
-      <w:r>
-        <w:tab/>
-      </w:r>
-      <w:r>
-        <w:fldChar w:fldCharType="begin"/>
-      </w:r>
-      <w:r>
-        <w:instrText xml:space="preserve"> PAGEREF _Toc213753476 \h </w:instrText>
-      </w:r>
-      <w:r>
-        <w:fldChar w:fldCharType="separate"/>
-      </w:r>
-      <w:r>
-        <w:t>1</w:t>
-      </w:r>
-      <w:r>
-        <w:fldChar w:fldCharType="end"/>
-      </w:r>
-    </w:p>
-    <w:p ns2:paraId="24BFB0B4" ns2:textId="61AD85C5">
-      <w:pPr>
-        <w:pStyle w:val="TOC2"/>
-        <w:rPr>
-          <w:rFonts w:asciiTheme="minorHAnsi" w:eastAsiaTheme="minorEastAsia" w:hAnsiTheme="minorHAnsi" w:cstheme="minorBidi" w:hint="eastAsia"/>
-          <w:smallCaps w:val="0"/>
-          <w:sz w:val="21"/>
-          <w:szCs w:val="22"/>
-        </w:rPr>
-      </w:pPr>
-      <w:r>
-        <w:t>2.2</w:t>
+      </w:pPr>
+      <w:r>
+        <w:t>1.1</w:t>
       </w:r>
       <w:r>
         <w:rPr>
@@ -729,10 +669,7 @@
         <w:tab/>
       </w:r>
       <w:r>
-        <w:t>XXX</w:t>
-      </w:r>
-      <w:r>
-        <w:t>研究现状</w:t>
+        <w:t>论文选题背景与意义</w:t>
       </w:r>
       <w:r>
         <w:tab/>
@@ -741,7 +678,7 @@
         <w:fldChar w:fldCharType="begin"/>
       </w:r>
       <w:r>
-        <w:instrText xml:space="preserve"> PAGEREF _Toc213753477 \h </w:instrText>
+        <w:instrText xml:space="preserve"> PAGEREF _Toc213752071 \h </w:instrText>
       </w:r>
       <w:r>
         <w:fldChar w:fldCharType="separate"/>
@@ -753,69 +690,97 @@
         <w:fldChar w:fldCharType="end"/>
       </w:r>
     </w:p>
-    <w:p ns2:paraId="68EAA7CE" ns2:textId="6DA0B148">
+    <w:p>
       <w:pPr>
         <w:pStyle w:val="TOC2"/>
-        <w:rPr>
-          <w:rFonts w:asciiTheme="minorHAnsi" w:eastAsiaTheme="minorEastAsia" w:hAnsiTheme="minorHAnsi" w:cstheme="minorBidi" w:hint="eastAsia"/>
-          <w:smallCaps w:val="0"/>
-          <w:sz w:val="21"/>
-          <w:szCs w:val="22"/>
-        </w:rPr>
-      </w:pPr>
-      <w:r>
-        <w:t>2.3</w:t>
-      </w:r>
-      <w:r>
         <w:rPr>
           <w:rFonts w:asciiTheme="minorHAnsi" w:eastAsiaTheme="minorEastAsia" w:hAnsiTheme="minorHAnsi" w:cstheme="minorBidi"/>
           <w:smallCaps w:val="0"/>
           <w:sz w:val="21"/>
           <w:szCs w:val="22"/>
         </w:rPr>
-        <w:tab/>
-      </w:r>
-      <w:r>
-        <w:t>XXX</w:t>
-      </w:r>
-      <w:r>
-        <w:t>研究现状</w:t>
-      </w:r>
-      <w:r>
-        <w:tab/>
-      </w:r>
-      <w:r>
-        <w:fldChar w:fldCharType="begin"/>
-      </w:r>
-      <w:r>
-        <w:instrText xml:space="preserve"> PAGEREF _Toc213753478 \h </w:instrText>
-      </w:r>
-      <w:r>
-        <w:fldChar w:fldCharType="separate"/>
-      </w:r>
-      <w:r>
-        <w:t>1</w:t>
-      </w:r>
-      <w:r>
-        <w:fldChar w:fldCharType="end"/>
-      </w:r>
-    </w:p>
-    <w:p ns2:paraId="0D346F71" ns2:textId="148530CC">
-      <w:pPr>
-        <w:pStyle w:val="TOC1"/>
-        <w:rPr>
-          <w:rFonts w:asciiTheme="minorHAnsi" w:eastAsiaTheme="minorEastAsia" w:hAnsiTheme="minorHAnsi" w:cstheme="minorBidi" w:hint="eastAsia"/>
-          <w:b w:val="0"/>
-          <w:bCs w:val="0"/>
-          <w:caps w:val="0"/>
+      </w:pPr>
+      <w:r>
+        <w:t>1.2</w:t>
+      </w:r>
+      <w:r>
+        <w:rPr>
+          <w:rFonts w:asciiTheme="minorHAnsi" w:eastAsiaTheme="minorEastAsia" w:hAnsiTheme="minorHAnsi" w:cstheme="minorBidi"/>
+          <w:smallCaps w:val="0"/>
           <w:sz w:val="21"/>
           <w:szCs w:val="22"/>
         </w:rPr>
-      </w:pPr>
-      <w:r>
-        <w:t>3</w:t>
-      </w:r>
-      <w:r>
+        <w:tab/>
+      </w:r>
+      <w:r>
+        <w:t>国内外发展现状</w:t>
+      </w:r>
+      <w:r>
+        <w:tab/>
+      </w:r>
+      <w:r>
+        <w:fldChar w:fldCharType="begin"/>
+      </w:r>
+      <w:r>
+        <w:instrText xml:space="preserve"> PAGEREF _Toc213752072 \h </w:instrText>
+      </w:r>
+      <w:r>
+        <w:fldChar w:fldCharType="separate"/>
+      </w:r>
+      <w:r>
+        <w:t>1</w:t>
+      </w:r>
+      <w:r>
+        <w:fldChar w:fldCharType="end"/>
+      </w:r>
+    </w:p>
+    <w:p>
+      <w:pPr>
+        <w:pStyle w:val="TOC2"/>
+        <w:rPr>
+          <w:rFonts w:asciiTheme="minorHAnsi" w:eastAsiaTheme="minorEastAsia" w:hAnsiTheme="minorHAnsi" w:cstheme="minorBidi"/>
+          <w:smallCaps w:val="0"/>
+          <w:sz w:val="21"/>
+          <w:szCs w:val="22"/>
+        </w:rPr>
+      </w:pPr>
+      <w:r>
+        <w:t>1.3</w:t>
+      </w:r>
+      <w:r>
+        <w:rPr>
+          <w:rFonts w:asciiTheme="minorHAnsi" w:eastAsiaTheme="minorEastAsia" w:hAnsiTheme="minorHAnsi" w:cstheme="minorBidi"/>
+          <w:smallCaps w:val="0"/>
+          <w:sz w:val="21"/>
+          <w:szCs w:val="22"/>
+        </w:rPr>
+        <w:tab/>
+      </w:r>
+      <w:r>
+        <w:t>存在的问题</w:t>
+      </w:r>
+      <w:r>
+        <w:tab/>
+      </w:r>
+      <w:r>
+        <w:fldChar w:fldCharType="begin"/>
+      </w:r>
+      <w:r>
+        <w:instrText xml:space="preserve"> PAGEREF _Toc213752073 \h </w:instrText>
+      </w:r>
+      <w:r>
+        <w:fldChar w:fldCharType="separate"/>
+      </w:r>
+      <w:r>
+        <w:t>1</w:t>
+      </w:r>
+      <w:r>
+        <w:fldChar w:fldCharType="end"/>
+      </w:r>
+    </w:p>
+    <w:p>
+      <w:pPr>
+        <w:pStyle w:val="TOC1"/>
         <w:rPr>
           <w:rFonts w:asciiTheme="minorHAnsi" w:eastAsiaTheme="minorEastAsia" w:hAnsiTheme="minorHAnsi" w:cstheme="minorBidi"/>
           <w:b w:val="0"/>
@@ -824,173 +789,515 @@
           <w:sz w:val="21"/>
           <w:szCs w:val="22"/>
         </w:rPr>
-        <w:tab/>
-      </w:r>
-      <w:r>
-        <w:t>研究现状总结与分析</w:t>
-      </w:r>
-      <w:r>
-        <w:tab/>
-      </w:r>
-      <w:r>
-        <w:fldChar w:fldCharType="begin"/>
-      </w:r>
-      <w:r>
-        <w:instrText xml:space="preserve"> PAGEREF _Toc213753479 \h </w:instrText>
-      </w:r>
-      <w:r>
-        <w:fldChar w:fldCharType="separate"/>
-      </w:r>
-      <w:r>
-        <w:t>1</w:t>
-      </w:r>
-      <w:r>
-        <w:fldChar w:fldCharType="end"/>
-      </w:r>
-    </w:p>
-    <w:p ns2:paraId="2FA40137" ns2:textId="48758C20">
-      <w:pPr>
-        <w:pStyle w:val="TOC2"/>
-        <w:rPr>
-          <w:rFonts w:asciiTheme="minorHAnsi" w:eastAsiaTheme="minorEastAsia" w:hAnsiTheme="minorHAnsi" w:cstheme="minorBidi" w:hint="eastAsia"/>
-          <w:smallCaps w:val="0"/>
-          <w:sz w:val="21"/>
-          <w:szCs w:val="22"/>
-        </w:rPr>
-      </w:pPr>
-      <w:r>
-        <w:t>3.1</w:t>
+      </w:pPr>
+      <w:r>
+        <w:t>2</w:t>
       </w:r>
       <w:r>
         <w:rPr>
           <w:rFonts w:asciiTheme="minorHAnsi" w:eastAsiaTheme="minorEastAsia" w:hAnsiTheme="minorHAnsi" w:cstheme="minorBidi"/>
-          <w:smallCaps w:val="0"/>
-          <w:sz w:val="21"/>
-          <w:szCs w:val="22"/>
-        </w:rPr>
-        <w:tab/>
-      </w:r>
-      <w:r>
-        <w:t>论文研究领域存在的问题</w:t>
-      </w:r>
-      <w:r>
-        <w:tab/>
-      </w:r>
-      <w:r>
-        <w:fldChar w:fldCharType="begin"/>
-      </w:r>
-      <w:r>
-        <w:instrText xml:space="preserve"> PAGEREF _Toc213753480 \h </w:instrText>
-      </w:r>
-      <w:r>
-        <w:fldChar w:fldCharType="separate"/>
-      </w:r>
-      <w:r>
-        <w:t>1</w:t>
-      </w:r>
-      <w:r>
-        <w:fldChar w:fldCharType="end"/>
-      </w:r>
-    </w:p>
-    <w:p ns2:paraId="41CF798A" ns2:textId="3155C99D">
-      <w:pPr>
-        <w:pStyle w:val="TOC2"/>
-        <w:rPr>
-          <w:rFonts w:asciiTheme="minorHAnsi" w:eastAsiaTheme="minorEastAsia" w:hAnsiTheme="minorHAnsi" w:cstheme="minorBidi" w:hint="eastAsia"/>
-          <w:smallCaps w:val="0"/>
-          <w:sz w:val="21"/>
-          <w:szCs w:val="22"/>
-        </w:rPr>
-      </w:pPr>
-      <w:r>
-        <w:t>3.2</w:t>
-      </w:r>
-      <w:r>
-        <w:rPr>
-          <w:rFonts w:asciiTheme="minorHAnsi" w:eastAsiaTheme="minorEastAsia" w:hAnsiTheme="minorHAnsi" w:cstheme="minorBidi"/>
-          <w:smallCaps w:val="0"/>
-          <w:sz w:val="21"/>
-          <w:szCs w:val="22"/>
-        </w:rPr>
-        <w:tab/>
-      </w:r>
-      <w:r>
-        <w:t>论文研究领域的发展趋势</w:t>
-      </w:r>
-      <w:r>
-        <w:tab/>
-      </w:r>
-      <w:r>
-        <w:fldChar w:fldCharType="begin"/>
-      </w:r>
-      <w:r>
-        <w:instrText xml:space="preserve"> PAGEREF _Toc213753481 \h </w:instrText>
-      </w:r>
-      <w:r>
-        <w:fldChar w:fldCharType="separate"/>
-      </w:r>
-      <w:r>
-        <w:t>1</w:t>
-      </w:r>
-      <w:r>
-        <w:fldChar w:fldCharType="end"/>
-      </w:r>
-    </w:p>
-    <w:p ns2:paraId="4F7685D0" ns2:textId="3DA0E52D">
-      <w:pPr>
-        <w:pStyle w:val="TOC2"/>
-        <w:rPr>
-          <w:rFonts w:asciiTheme="minorHAnsi" w:eastAsiaTheme="minorEastAsia" w:hAnsiTheme="minorHAnsi" w:cstheme="minorBidi" w:hint="eastAsia"/>
-          <w:smallCaps w:val="0"/>
-          <w:sz w:val="21"/>
-          <w:szCs w:val="22"/>
-        </w:rPr>
-      </w:pPr>
-      <w:r>
-        <w:t>3.3</w:t>
-      </w:r>
-      <w:r>
-        <w:rPr>
-          <w:rFonts w:asciiTheme="minorHAnsi" w:eastAsiaTheme="minorEastAsia" w:hAnsiTheme="minorHAnsi" w:cstheme="minorBidi"/>
-          <w:smallCaps w:val="0"/>
-          <w:sz w:val="21"/>
-          <w:szCs w:val="22"/>
-        </w:rPr>
-        <w:tab/>
-      </w:r>
-      <w:r>
-        <w:t>研究现状分析结论</w:t>
-      </w:r>
-      <w:r>
-        <w:tab/>
-      </w:r>
-      <w:r>
-        <w:fldChar w:fldCharType="begin"/>
-      </w:r>
-      <w:r>
-        <w:instrText xml:space="preserve"> PAGEREF _Toc213753482 \h </w:instrText>
-      </w:r>
-      <w:r>
-        <w:fldChar w:fldCharType="separate"/>
-      </w:r>
-      <w:r>
-        <w:t>1</w:t>
-      </w:r>
-      <w:r>
-        <w:fldChar w:fldCharType="end"/>
-      </w:r>
-    </w:p>
-    <w:p ns2:paraId="10F85EDF" ns2:textId="3DB217B1">
-      <w:pPr>
-        <w:pStyle w:val="TOC1"/>
-        <w:rPr>
-          <w:rFonts w:asciiTheme="minorHAnsi" w:eastAsiaTheme="minorEastAsia" w:hAnsiTheme="minorHAnsi" w:cstheme="minorBidi" w:hint="eastAsia"/>
           <w:b w:val="0"/>
           <w:bCs w:val="0"/>
           <w:caps w:val="0"/>
           <w:sz w:val="21"/>
           <w:szCs w:val="22"/>
         </w:rPr>
+        <w:tab/>
+      </w:r>
+      <w:r>
+        <w:t>研究目标与研究内容、关键技术问题</w:t>
+      </w:r>
+      <w:r>
+        <w:tab/>
+      </w:r>
+      <w:r>
+        <w:fldChar w:fldCharType="begin"/>
+      </w:r>
+      <w:r>
+        <w:instrText xml:space="preserve"> PAGEREF _Toc213752074 \h </w:instrText>
+      </w:r>
+      <w:r>
+        <w:fldChar w:fldCharType="separate"/>
+      </w:r>
+      <w:r>
+        <w:t>1</w:t>
+      </w:r>
+      <w:r>
+        <w:fldChar w:fldCharType="end"/>
+      </w:r>
+    </w:p>
+    <w:p>
+      <w:pPr>
+        <w:pStyle w:val="TOC2"/>
+        <w:rPr>
+          <w:rFonts w:asciiTheme="minorHAnsi" w:eastAsiaTheme="minorEastAsia" w:hAnsiTheme="minorHAnsi" w:cstheme="minorBidi"/>
+          <w:smallCaps w:val="0"/>
+          <w:sz w:val="21"/>
+          <w:szCs w:val="22"/>
+        </w:rPr>
+      </w:pPr>
+      <w:r>
+        <w:t>2.1</w:t>
+      </w:r>
+      <w:r>
+        <w:rPr>
+          <w:rFonts w:asciiTheme="minorHAnsi" w:eastAsiaTheme="minorEastAsia" w:hAnsiTheme="minorHAnsi" w:cstheme="minorBidi"/>
+          <w:smallCaps w:val="0"/>
+          <w:sz w:val="21"/>
+          <w:szCs w:val="22"/>
+        </w:rPr>
+        <w:tab/>
+      </w:r>
+      <w:r>
+        <w:t>研究目标：</w:t>
+      </w:r>
+      <w:r>
+        <w:t>xxxxxxxxx</w:t>
+      </w:r>
+      <w:r>
+        <w:tab/>
+      </w:r>
+      <w:r>
+        <w:fldChar w:fldCharType="begin"/>
+      </w:r>
+      <w:r>
+        <w:instrText xml:space="preserve"> PAGEREF _Toc213752075 \h </w:instrText>
+      </w:r>
+      <w:r>
+        <w:fldChar w:fldCharType="separate"/>
+      </w:r>
+      <w:r>
+        <w:t>1</w:t>
+      </w:r>
+      <w:r>
+        <w:fldChar w:fldCharType="end"/>
+      </w:r>
+    </w:p>
+    <w:p>
+      <w:pPr>
+        <w:pStyle w:val="TOC2"/>
+        <w:rPr>
+          <w:rFonts w:asciiTheme="minorHAnsi" w:eastAsiaTheme="minorEastAsia" w:hAnsiTheme="minorHAnsi" w:cstheme="minorBidi"/>
+          <w:smallCaps w:val="0"/>
+          <w:sz w:val="21"/>
+          <w:szCs w:val="22"/>
+        </w:rPr>
+      </w:pPr>
+      <w:r>
+        <w:t>2.2</w:t>
+      </w:r>
+      <w:r>
+        <w:rPr>
+          <w:rFonts w:asciiTheme="minorHAnsi" w:eastAsiaTheme="minorEastAsia" w:hAnsiTheme="minorHAnsi" w:cstheme="minorBidi"/>
+          <w:smallCaps w:val="0"/>
+          <w:sz w:val="21"/>
+          <w:szCs w:val="22"/>
+        </w:rPr>
+        <w:tab/>
+      </w:r>
+      <w:r>
+        <w:t>研究内容：</w:t>
+      </w:r>
+      <w:r>
+        <w:t>xxxxxxxxx</w:t>
+      </w:r>
+      <w:r>
+        <w:tab/>
+      </w:r>
+      <w:r>
+        <w:fldChar w:fldCharType="begin"/>
+      </w:r>
+      <w:r>
+        <w:instrText xml:space="preserve"> PAGEREF _Toc213752076 \h </w:instrText>
+      </w:r>
+      <w:r>
+        <w:fldChar w:fldCharType="separate"/>
+      </w:r>
+      <w:r>
+        <w:t>1</w:t>
+      </w:r>
+      <w:r>
+        <w:fldChar w:fldCharType="end"/>
+      </w:r>
+    </w:p>
+    <w:p>
+      <w:pPr>
+        <w:pStyle w:val="TOC2"/>
+        <w:rPr>
+          <w:rFonts w:asciiTheme="minorHAnsi" w:eastAsiaTheme="minorEastAsia" w:hAnsiTheme="minorHAnsi" w:cstheme="minorBidi"/>
+          <w:smallCaps w:val="0"/>
+          <w:sz w:val="21"/>
+          <w:szCs w:val="22"/>
+        </w:rPr>
+      </w:pPr>
+      <w:r>
+        <w:t>2.3</w:t>
+      </w:r>
+      <w:r>
+        <w:rPr>
+          <w:rFonts w:asciiTheme="minorHAnsi" w:eastAsiaTheme="minorEastAsia" w:hAnsiTheme="minorHAnsi" w:cstheme="minorBidi"/>
+          <w:smallCaps w:val="0"/>
+          <w:sz w:val="21"/>
+          <w:szCs w:val="22"/>
+        </w:rPr>
+        <w:tab/>
+      </w:r>
+      <w:r>
+        <w:t>关键技术问题：</w:t>
+      </w:r>
+      <w:r>
+        <w:t>xxxxxxxxx</w:t>
+      </w:r>
+      <w:r>
+        <w:tab/>
+      </w:r>
+      <w:r>
+        <w:fldChar w:fldCharType="begin"/>
+      </w:r>
+      <w:r>
+        <w:instrText xml:space="preserve"> PAGEREF _Toc213752077 \h </w:instrText>
+      </w:r>
+      <w:r>
+        <w:fldChar w:fldCharType="separate"/>
+      </w:r>
+      <w:r>
+        <w:t>1</w:t>
+      </w:r>
+      <w:r>
+        <w:fldChar w:fldCharType="end"/>
+      </w:r>
+    </w:p>
+    <w:p>
+      <w:pPr>
+        <w:pStyle w:val="TOC1"/>
+        <w:rPr>
+          <w:rFonts w:asciiTheme="minorHAnsi" w:eastAsiaTheme="minorEastAsia" w:hAnsiTheme="minorHAnsi" w:cstheme="minorBidi"/>
+          <w:b w:val="0"/>
+          <w:bCs w:val="0"/>
+          <w:caps w:val="0"/>
+          <w:sz w:val="21"/>
+          <w:szCs w:val="22"/>
+        </w:rPr>
+      </w:pPr>
+      <w:r>
+        <w:t>3</w:t>
+      </w:r>
+      <w:r>
+        <w:rPr>
+          <w:rFonts w:asciiTheme="minorHAnsi" w:eastAsiaTheme="minorEastAsia" w:hAnsiTheme="minorHAnsi" w:cstheme="minorBidi"/>
+          <w:b w:val="0"/>
+          <w:bCs w:val="0"/>
+          <w:caps w:val="0"/>
+          <w:sz w:val="21"/>
+          <w:szCs w:val="22"/>
+        </w:rPr>
+        <w:tab/>
+      </w:r>
+      <w:r>
+        <w:t>研究方案与技术路线以及可能的创新点</w:t>
+      </w:r>
+      <w:r>
+        <w:tab/>
+      </w:r>
+      <w:r>
+        <w:fldChar w:fldCharType="begin"/>
+      </w:r>
+      <w:r>
+        <w:instrText xml:space="preserve"> PAGEREF _Toc213752078 \h </w:instrText>
+      </w:r>
+      <w:r>
+        <w:fldChar w:fldCharType="separate"/>
+      </w:r>
+      <w:r>
+        <w:t>1</w:t>
+      </w:r>
+      <w:r>
+        <w:fldChar w:fldCharType="end"/>
+      </w:r>
+    </w:p>
+    <w:p>
+      <w:pPr>
+        <w:pStyle w:val="TOC2"/>
+        <w:rPr>
+          <w:rFonts w:asciiTheme="minorHAnsi" w:eastAsiaTheme="minorEastAsia" w:hAnsiTheme="minorHAnsi" w:cstheme="minorBidi"/>
+          <w:smallCaps w:val="0"/>
+          <w:sz w:val="21"/>
+          <w:szCs w:val="22"/>
+        </w:rPr>
+      </w:pPr>
+      <w:r>
+        <w:t>3.1</w:t>
+      </w:r>
+      <w:r>
+        <w:rPr>
+          <w:rFonts w:asciiTheme="minorHAnsi" w:eastAsiaTheme="minorEastAsia" w:hAnsiTheme="minorHAnsi" w:cstheme="minorBidi"/>
+          <w:smallCaps w:val="0"/>
+          <w:sz w:val="21"/>
+          <w:szCs w:val="22"/>
+        </w:rPr>
+        <w:tab/>
+      </w:r>
+      <w:r>
+        <w:t>研究方案与技术路线</w:t>
+      </w:r>
+      <w:r>
+        <w:tab/>
+      </w:r>
+      <w:r>
+        <w:fldChar w:fldCharType="begin"/>
+      </w:r>
+      <w:r>
+        <w:instrText xml:space="preserve"> PAGEREF _Toc213752079 \h </w:instrText>
+      </w:r>
+      <w:r>
+        <w:fldChar w:fldCharType="separate"/>
+      </w:r>
+      <w:r>
+        <w:t>1</w:t>
+      </w:r>
+      <w:r>
+        <w:fldChar w:fldCharType="end"/>
+      </w:r>
+    </w:p>
+    <w:p>
+      <w:pPr>
+        <w:pStyle w:val="TOC2"/>
+        <w:rPr>
+          <w:rFonts w:asciiTheme="minorHAnsi" w:eastAsiaTheme="minorEastAsia" w:hAnsiTheme="minorHAnsi" w:cstheme="minorBidi"/>
+          <w:smallCaps w:val="0"/>
+          <w:sz w:val="21"/>
+          <w:szCs w:val="22"/>
+        </w:rPr>
+      </w:pPr>
+      <w:r>
+        <w:t>3.2</w:t>
+      </w:r>
+      <w:r>
+        <w:rPr>
+          <w:rFonts w:asciiTheme="minorHAnsi" w:eastAsiaTheme="minorEastAsia" w:hAnsiTheme="minorHAnsi" w:cstheme="minorBidi"/>
+          <w:smallCaps w:val="0"/>
+          <w:sz w:val="21"/>
+          <w:szCs w:val="22"/>
+        </w:rPr>
+        <w:tab/>
+      </w:r>
+      <w:r>
+        <w:t>创新点</w:t>
+      </w:r>
+      <w:r>
+        <w:tab/>
+      </w:r>
+      <w:r>
+        <w:fldChar w:fldCharType="begin"/>
+      </w:r>
+      <w:r>
+        <w:instrText xml:space="preserve"> PAGEREF _Toc213752080 \h </w:instrText>
+      </w:r>
+      <w:r>
+        <w:fldChar w:fldCharType="separate"/>
+      </w:r>
+      <w:r>
+        <w:t>1</w:t>
+      </w:r>
+      <w:r>
+        <w:fldChar w:fldCharType="end"/>
+      </w:r>
+    </w:p>
+    <w:p>
+      <w:pPr>
+        <w:pStyle w:val="TOC1"/>
+        <w:rPr>
+          <w:rFonts w:asciiTheme="minorHAnsi" w:eastAsiaTheme="minorEastAsia" w:hAnsiTheme="minorHAnsi" w:cstheme="minorBidi"/>
+          <w:b w:val="0"/>
+          <w:bCs w:val="0"/>
+          <w:caps w:val="0"/>
+          <w:sz w:val="21"/>
+          <w:szCs w:val="22"/>
+        </w:rPr>
+      </w:pPr>
+      <w:r>
+        <w:t>4</w:t>
+      </w:r>
+      <w:r>
+        <w:rPr>
+          <w:rFonts w:asciiTheme="minorHAnsi" w:eastAsiaTheme="minorEastAsia" w:hAnsiTheme="minorHAnsi" w:cstheme="minorBidi"/>
+          <w:b w:val="0"/>
+          <w:bCs w:val="0"/>
+          <w:caps w:val="0"/>
+          <w:sz w:val="21"/>
+          <w:szCs w:val="22"/>
+        </w:rPr>
+        <w:tab/>
+      </w:r>
+      <w:r>
+        <w:t>可行性分析</w:t>
+      </w:r>
+      <w:r>
+        <w:tab/>
+      </w:r>
+      <w:r>
+        <w:fldChar w:fldCharType="begin"/>
+      </w:r>
+      <w:r>
+        <w:instrText xml:space="preserve"> PAGEREF _Toc213752081 \h </w:instrText>
+      </w:r>
+      <w:r>
+        <w:fldChar w:fldCharType="separate"/>
+      </w:r>
+      <w:r>
+        <w:t>1</w:t>
+      </w:r>
+      <w:r>
+        <w:fldChar w:fldCharType="end"/>
+      </w:r>
+    </w:p>
+    <w:p>
+      <w:pPr>
+        <w:pStyle w:val="TOC1"/>
+        <w:rPr>
+          <w:rFonts w:asciiTheme="minorHAnsi" w:eastAsiaTheme="minorEastAsia" w:hAnsiTheme="minorHAnsi" w:cstheme="minorBidi"/>
+          <w:b w:val="0"/>
+          <w:bCs w:val="0"/>
+          <w:caps w:val="0"/>
+          <w:sz w:val="21"/>
+          <w:szCs w:val="22"/>
+        </w:rPr>
+      </w:pPr>
+      <w:r>
+        <w:t>5</w:t>
+      </w:r>
+      <w:r>
+        <w:rPr>
+          <w:rFonts w:asciiTheme="minorHAnsi" w:eastAsiaTheme="minorEastAsia" w:hAnsiTheme="minorHAnsi" w:cstheme="minorBidi"/>
+          <w:b w:val="0"/>
+          <w:bCs w:val="0"/>
+          <w:caps w:val="0"/>
+          <w:sz w:val="21"/>
+          <w:szCs w:val="22"/>
+        </w:rPr>
+        <w:tab/>
+      </w:r>
+      <w:r>
+        <w:t>论文预期成果与计划安排</w:t>
+      </w:r>
+      <w:r>
+        <w:tab/>
+      </w:r>
+      <w:r>
+        <w:fldChar w:fldCharType="begin"/>
+      </w:r>
+      <w:r>
+        <w:instrText xml:space="preserve"> PAGEREF _Toc213752082 \h </w:instrText>
+      </w:r>
+      <w:r>
+        <w:fldChar w:fldCharType="separate"/>
+      </w:r>
+      <w:r>
+        <w:t>1</w:t>
+      </w:r>
+      <w:r>
+        <w:fldChar w:fldCharType="end"/>
+      </w:r>
+    </w:p>
+    <w:p>
+      <w:pPr>
+        <w:pStyle w:val="TOC2"/>
+        <w:rPr>
+          <w:rFonts w:asciiTheme="minorHAnsi" w:eastAsiaTheme="minorEastAsia" w:hAnsiTheme="minorHAnsi" w:cstheme="minorBidi"/>
+          <w:smallCaps w:val="0"/>
+          <w:sz w:val="21"/>
+          <w:szCs w:val="22"/>
+        </w:rPr>
+      </w:pPr>
+      <w:r>
+        <w:t>5.1</w:t>
+      </w:r>
+      <w:r>
+        <w:rPr>
+          <w:rFonts w:asciiTheme="minorHAnsi" w:eastAsiaTheme="minorEastAsia" w:hAnsiTheme="minorHAnsi" w:cstheme="minorBidi"/>
+          <w:smallCaps w:val="0"/>
+          <w:sz w:val="21"/>
+          <w:szCs w:val="22"/>
+        </w:rPr>
+        <w:tab/>
+      </w:r>
+      <w:r>
+        <w:t>论文预期成果</w:t>
+      </w:r>
+      <w:r>
+        <w:tab/>
+      </w:r>
+      <w:r>
+        <w:fldChar w:fldCharType="begin"/>
+      </w:r>
+      <w:r>
+        <w:instrText xml:space="preserve"> PAGEREF _Toc213752083 \h </w:instrText>
+      </w:r>
+      <w:r>
+        <w:fldChar w:fldCharType="separate"/>
+      </w:r>
+      <w:r>
+        <w:t>2</w:t>
+      </w:r>
+      <w:r>
+        <w:fldChar w:fldCharType="end"/>
+      </w:r>
+    </w:p>
+    <w:p>
+      <w:pPr>
+        <w:pStyle w:val="TOC2"/>
+        <w:rPr>
+          <w:rFonts w:asciiTheme="minorHAnsi" w:eastAsiaTheme="minorEastAsia" w:hAnsiTheme="minorHAnsi" w:cstheme="minorBidi"/>
+          <w:smallCaps w:val="0"/>
+          <w:sz w:val="21"/>
+          <w:szCs w:val="22"/>
+        </w:rPr>
+      </w:pPr>
+      <w:r>
+        <w:t>5.2</w:t>
+      </w:r>
+      <w:r>
+        <w:rPr>
+          <w:rFonts w:asciiTheme="minorHAnsi" w:eastAsiaTheme="minorEastAsia" w:hAnsiTheme="minorHAnsi" w:cstheme="minorBidi"/>
+          <w:smallCaps w:val="0"/>
+          <w:sz w:val="21"/>
+          <w:szCs w:val="22"/>
+        </w:rPr>
+        <w:tab/>
+      </w:r>
+      <w:r>
+        <w:t>论文计划安排</w:t>
+      </w:r>
+      <w:r>
+        <w:tab/>
+      </w:r>
+      <w:r>
+        <w:fldChar w:fldCharType="begin"/>
+      </w:r>
+      <w:r>
+        <w:instrText xml:space="preserve"> PAGEREF _Toc213752084 \h </w:instrText>
+      </w:r>
+      <w:r>
+        <w:fldChar w:fldCharType="separate"/>
+      </w:r>
+      <w:r>
+        <w:t>2</w:t>
+      </w:r>
+      <w:r>
+        <w:fldChar w:fldCharType="end"/>
+      </w:r>
+    </w:p>
+    <w:p>
+      <w:pPr>
+        <w:pStyle w:val="TOC1"/>
+        <w:rPr>
+          <w:rFonts w:asciiTheme="minorHAnsi" w:eastAsiaTheme="minorEastAsia" w:hAnsiTheme="minorHAnsi" w:cstheme="minorBidi"/>
+          <w:b w:val="0"/>
+          <w:bCs w:val="0"/>
+          <w:caps w:val="0"/>
+          <w:sz w:val="21"/>
+          <w:szCs w:val="22"/>
+        </w:rPr>
       </w:pPr>
       <w:r>
         <w:t>参考文献</w:t>
@@ -1002,36 +1309,33 @@
         <w:fldChar w:fldCharType="begin"/>
       </w:r>
       <w:r>
-        <w:instrText xml:space="preserve"> PAGEREF _Toc213753483 \h </w:instrText>
+        <w:instrText xml:space="preserve"> PAGEREF _Toc213752085 \h </w:instrText>
       </w:r>
       <w:r>
         <w:fldChar w:fldCharType="separate"/>
       </w:r>
       <w:r>
-        <w:t>2</w:t>
+        <w:t>3</w:t>
       </w:r>
       <w:r>
         <w:fldChar w:fldCharType="end"/>
       </w:r>
     </w:p>
-    <w:p ns2:paraId="689CA38D" ns2:textId="235C507A">
+    <w:p>
       <w:pPr>
         <w:pStyle w:val="TOC1"/>
-        <w:rPr>
-          <w:rFonts w:hint="eastAsia"/>
-        </w:rPr>
       </w:pPr>
       <w:r>
         <w:fldChar w:fldCharType="end"/>
       </w:r>
     </w:p>
-    <w:p ns2:paraId="5C3B343C" ns2:textId="77777777">
+    <w:p>
       <w:pPr>
         <w:widowControl/>
         <w:spacing w:line="240" w:lineRule="auto"/>
         <w:jc w:val="left"/>
         <w:rPr>
-          <w:rFonts w:ascii="宋体" w:hAnsi="宋体" w:hint="eastAsia"/>
+          <w:rFonts w:ascii="宋体" w:hAnsi="宋体"/>
           <w:b/>
           <w:bCs/>
           <w:caps/>
@@ -1042,49 +1346,165 @@
         <w:br w:type="page"/>
       </w:r>
     </w:p>
-    <w:p ns2:paraId="664FBDBB" ns2:textId="77777777">
+    <w:p>
       <w:pPr>
         <w:pStyle w:val="TOC1"/>
+        <w:rPr>
+          <w:rFonts w:ascii="黑体" w:eastAsia="黑体" w:hAnsi="黑体"/>
+          <w:sz w:val="36"/>
+          <w:szCs w:val="36"/>
+        </w:rPr>
+      </w:pPr>
+      <w:r>
         <w:rPr>
           <w:rFonts w:ascii="黑体" w:eastAsia="黑体" w:hAnsi="黑体" w:hint="eastAsia"/>
           <w:sz w:val="36"/>
           <w:szCs w:val="36"/>
         </w:rPr>
-      </w:pPr>
+        <w:lastRenderedPageBreak/>
+        <w:t xml:space="preserve">图 </w:t>
+      </w:r>
+      <w:r>
+        <w:rPr>
+          <w:rFonts w:ascii="黑体" w:eastAsia="黑体" w:hAnsi="黑体"/>
+          <w:sz w:val="36"/>
+          <w:szCs w:val="36"/>
+        </w:rPr>
+        <w:t xml:space="preserve">     </w:t>
+      </w:r>
       <w:r>
         <w:rPr>
           <w:rFonts w:ascii="黑体" w:eastAsia="黑体" w:hAnsi="黑体" w:hint="eastAsia"/>
           <w:sz w:val="36"/>
           <w:szCs w:val="36"/>
         </w:rPr>
-        <w:lastRenderedPageBreak/>
-        <w:t xml:space="preserve">图 </w:t>
-      </w:r>
-      <w:r>
-        <w:rPr>
-          <w:rFonts w:ascii="黑体" w:eastAsia="黑体" w:hAnsi="黑体"/>
-          <w:sz w:val="36"/>
-          <w:szCs w:val="36"/>
-        </w:rPr>
-        <w:t xml:space="preserve">     </w:t>
-      </w:r>
-      <w:r>
-        <w:rPr>
-          <w:rFonts w:ascii="黑体" w:eastAsia="黑体" w:hAnsi="黑体" w:hint="eastAsia"/>
-          <w:sz w:val="36"/>
-          <w:szCs w:val="36"/>
-        </w:rPr>
         <w:t>目</w:t>
       </w:r>
     </w:p>
-    <w:p ns2:paraId="1C2EAA45" ns2:textId="77777777"/>
-    <w:p ns2:paraId="4546CBCB" ns2:textId="77777777">
+    <w:p/>
+    <w:p>
+      <w:pPr>
+        <w:pStyle w:val="aff1"/>
+        <w:tabs>
+          <w:tab w:val="right" w:leader="dot" w:pos="8302"/>
+        </w:tabs>
+        <w:rPr>
+          <w:rFonts w:asciiTheme="minorHAnsi" w:eastAsiaTheme="minorEastAsia" w:hAnsiTheme="minorHAnsi" w:cstheme="minorBidi"/>
+          <w:noProof/>
+          <w:sz w:val="21"/>
+          <w:szCs w:val="22"/>
+        </w:rPr>
+      </w:pPr>
+      <w:r>
+        <w:fldChar w:fldCharType="begin"/>
+      </w:r>
+      <w:r>
+        <w:instrText xml:space="preserve"> </w:instrText>
+      </w:r>
+      <w:r>
+        <w:rPr>
+          <w:rFonts w:hint="eastAsia"/>
+        </w:rPr>
+        <w:instrText>TOC \h \z \c "</w:instrText>
+      </w:r>
+      <w:r>
+        <w:rPr>
+          <w:rFonts w:hint="eastAsia"/>
+        </w:rPr>
+        <w:instrText>图</w:instrText>
+      </w:r>
+      <w:r>
+        <w:rPr>
+          <w:rFonts w:hint="eastAsia"/>
+        </w:rPr>
+        <w:instrText>"</w:instrText>
+      </w:r>
+      <w:r>
+        <w:instrText xml:space="preserve"> </w:instrText>
+      </w:r>
+      <w:r>
+        <w:fldChar w:fldCharType="separate"/>
+      </w:r>
+      <w:hyperlink w:anchor="_Toc213752086" w:history="1">
+        <w:r>
+          <w:rPr>
+            <w:rStyle w:val="afb"/>
+            <w:noProof/>
+          </w:rPr>
+          <w:t>图</w:t>
+        </w:r>
+        <w:r>
+          <w:rPr>
+            <w:rStyle w:val="afb"/>
+            <w:noProof/>
+          </w:rPr>
+          <w:t>1</w:t>
+        </w:r>
+        <w:r>
+          <w:rPr>
+            <w:rStyle w:val="afb"/>
+            <w:rFonts w:ascii="黑体" w:eastAsia="黑体" w:hAnsi="黑体"/>
+            <w:noProof/>
+          </w:rPr>
+          <w:t xml:space="preserve">  研究内容关系示意图</w:t>
+        </w:r>
+        <w:r>
+          <w:rPr>
+            <w:noProof/>
+            <w:webHidden/>
+          </w:rPr>
+          <w:tab/>
+        </w:r>
+        <w:r>
+          <w:rPr>
+            <w:noProof/>
+            <w:webHidden/>
+          </w:rPr>
+          <w:fldChar w:fldCharType="begin"/>
+        </w:r>
+        <w:r>
+          <w:rPr>
+            <w:noProof/>
+            <w:webHidden/>
+          </w:rPr>
+          <w:instrText xml:space="preserve"> PAGEREF _Toc213752086 \h </w:instrText>
+        </w:r>
+        <w:r>
+          <w:rPr>
+            <w:noProof/>
+            <w:webHidden/>
+          </w:rPr>
+        </w:r>
+        <w:r>
+          <w:rPr>
+            <w:noProof/>
+            <w:webHidden/>
+          </w:rPr>
+          <w:fldChar w:fldCharType="separate"/>
+        </w:r>
+        <w:r>
+          <w:rPr>
+            <w:noProof/>
+            <w:webHidden/>
+          </w:rPr>
+          <w:t>1</w:t>
+        </w:r>
+        <w:r>
+          <w:rPr>
+            <w:noProof/>
+            <w:webHidden/>
+          </w:rPr>
+          <w:fldChar w:fldCharType="end"/>
+        </w:r>
+      </w:hyperlink>
+    </w:p>
+    <w:p>
       <w:pPr>
         <w:sectPr>
-          <w:headerReference w:type="default" ns10:id="rId12"/>
-          <w:footerReference w:type="default" ns10:id="rId13"/>
-          <w:headerReference w:type="first" ns10:id="rId14"/>
-          <w:footerReference w:type="first" ns10:id="rId15"/>
+          <w:headerReference w:type="default" r:id="rId13"/>
+          <w:footerReference w:type="default" r:id="rId14"/>
+          <w:headerReference w:type="first" r:id="rId15"/>
+          <w:footerReference w:type="first" r:id="rId16"/>
           <w:pgSz w:w="11906" w:h="16838" w:code="9"/>
           <w:pgMar w:top="1928" w:right="1797" w:bottom="1928" w:left="1797" w:header="1588" w:footer="1588" w:gutter="0"/>
           <w:pgNumType w:fmt="lowerRoman" w:start="1"/>
@@ -1093,107 +1513,99 @@
         </w:sectPr>
       </w:pPr>
       <w:r>
-        <w:fldChar w:fldCharType="begin"/>
-      </w:r>
-      <w:r>
-        <w:instrText xml:space="preserve"> </w:instrText>
-      </w:r>
-      <w:r>
-        <w:rPr>
-          <w:rFonts w:hint="eastAsia"/>
-        </w:rPr>
-        <w:instrText>TOC \h \z \c "</w:instrText>
-      </w:r>
-      <w:r>
-        <w:rPr>
-          <w:rFonts w:hint="eastAsia"/>
-        </w:rPr>
-        <w:instrText>图</w:instrText>
-      </w:r>
-      <w:r>
-        <w:rPr>
-          <w:rFonts w:hint="eastAsia"/>
-        </w:rPr>
-        <w:instrText>"</w:instrText>
-      </w:r>
-      <w:r>
-        <w:instrText xml:space="preserve"> </w:instrText>
-      </w:r>
-      <w:r>
-        <w:fldChar w:fldCharType="separate"/>
-      </w:r>
-      <w:r>
-        <w:rPr>
-          <w:rFonts w:hint="eastAsia"/>
-          <w:b/>
-          <w:bCs/>
-          <w:noProof/>
-        </w:rPr>
-        <w:t>未找到图形项目表。</w:t>
-      </w:r>
-      <w:r>
         <w:fldChar w:fldCharType="end"/>
       </w:r>
     </w:p>
-    <w:p ns2:paraId="48050376" ns2:textId="77777777">
+    <w:p>
+      <w:pPr>
+        <w:pStyle w:val="1"/>
+        <w:spacing w:before="240" w:after="240" w:line="400" w:lineRule="exact"/>
+      </w:pPr>
+      <w:bookmarkStart w:id="2" w:name="_Toc213752070"/>
+      <w:bookmarkStart w:id="3" w:name="OLE_LINK12"/>
+      <w:r>
+        <w:rPr>
+          <w:rFonts w:hint="eastAsia"/>
+        </w:rPr>
+        <w:lastRenderedPageBreak/>
+        <w:t>论文选题依据</w:t>
+      </w:r>
+      <w:bookmarkEnd w:id="2"/>
+    </w:p>
+    <w:p>
+      <w:pPr>
+        <w:pStyle w:val="2"/>
+        <w:spacing w:line="400" w:lineRule="exact"/>
+        <w:ind w:left="567"/>
+      </w:pPr>
+      <w:bookmarkStart w:id="4" w:name="_Toc213752071"/>
+      <w:bookmarkEnd w:id="3"/>
+      <w:r>
+        <w:rPr>
+          <w:rFonts w:hint="eastAsia"/>
+        </w:rPr>
+        <w:t>论文选题背景与意义</w:t>
+      </w:r>
+      <w:bookmarkEnd w:id="4"/>
+    </w:p>
+    <w:p>
+      <w:pPr>
+        <w:pStyle w:val="2"/>
+        <w:spacing w:line="400" w:lineRule="exact"/>
+        <w:ind w:left="567"/>
+      </w:pPr>
+      <w:bookmarkStart w:id="5" w:name="_Toc213752072"/>
+      <w:r>
+        <w:rPr>
+          <w:rFonts w:hint="eastAsia"/>
+        </w:rPr>
+        <w:t>国内外发展现状</w:t>
+      </w:r>
+      <w:bookmarkEnd w:id="5"/>
+    </w:p>
+    <w:p>
+      <w:pPr>
+        <w:pStyle w:val="2"/>
+        <w:spacing w:line="400" w:lineRule="exact"/>
+        <w:ind w:left="567"/>
+      </w:pPr>
+      <w:bookmarkStart w:id="6" w:name="_Toc213752073"/>
+      <w:r>
+        <w:rPr>
+          <w:rFonts w:hint="eastAsia"/>
+        </w:rPr>
+        <w:t>存在的问题</w:t>
+      </w:r>
+      <w:bookmarkEnd w:id="6"/>
+    </w:p>
+    <w:p>
       <w:pPr>
         <w:pStyle w:val="1"/>
         <w:numPr>
           <w:ilvl w:val="0"/>
           <w:numId w:val="1"/>
         </w:numPr>
-      </w:pPr>
-      <w:bookmarkStart w:id="1" w:name="_Toc213753474"/>
-      <w:bookmarkStart w:id="2" w:name="OLE_LINK12"/>
-      <w:r>
-        <w:rPr>
-          <w:rFonts w:hint="eastAsia"/>
-        </w:rPr>
-        <w:lastRenderedPageBreak/>
+        <w:spacing w:before="240" w:after="240" w:line="400" w:lineRule="exact"/>
+      </w:pPr>
+      <w:bookmarkStart w:id="7" w:name="_Toc213752074"/>
+      <w:r>
+        <w:rPr>
+          <w:rFonts w:hint="eastAsia"/>
+        </w:rPr>
         <w:t>研究</w:t>
       </w:r>
       <w:r>
         <w:rPr>
           <w:rFonts w:hint="eastAsia"/>
         </w:rPr>
-        <w:t>方向概述</w:t>
-      </w:r>
-      <w:bookmarkEnd w:id="1"/>
-    </w:p>
-    <w:bookmarkEnd w:id="2"/>
-    <w:p ns2:paraId="0362A21C" ns2:textId="77777777">
-      <w:pPr>
-        <w:ind w:firstLineChars="200" w:firstLine="480"/>
-      </w:pPr>
-      <w:r>
-        <w:rPr>
-          <w:rFonts w:hint="eastAsia"/>
-        </w:rPr>
-        <w:t>简要</w:t>
-      </w:r>
-      <w:r>
-        <w:rPr>
-          <w:rFonts w:hint="eastAsia"/>
-        </w:rPr>
-        <w:t>介绍论文研究方向</w:t>
-      </w:r>
-      <w:r>
-        <w:rPr>
-          <w:rFonts w:hint="eastAsia"/>
-        </w:rPr>
-        <w:t>主要研究分支</w:t>
-      </w:r>
-      <w:r>
-        <w:rPr>
-          <w:rFonts w:hint="eastAsia"/>
-        </w:rPr>
-        <w:t>，每个分支做了哪方面的研究</w:t>
-      </w:r>
-    </w:p>
-    <w:p ns2:paraId="79F1B049" ns2:textId="77777777">
-      <w:pPr>
-        <w:spacing w:line="240" w:lineRule="auto"/>
-        <w:jc w:val="center"/>
+        <w:t>目标与研究内容、关键技术问题</w:t>
+      </w:r>
+      <w:bookmarkEnd w:id="7"/>
+    </w:p>
+    <w:p>
+      <w:pPr>
+        <w:spacing w:before="240" w:after="240" w:line="400" w:lineRule="exact"/>
+        <w:ind w:firstLineChars="200" w:firstLine="402"/>
         <w:rPr>
           <w:b/>
           <w:color w:val="FF0000"/>
@@ -1202,489 +1614,590 @@
       </w:pPr>
       <w:r>
         <w:rPr>
+          <w:rFonts w:hint="eastAsia"/>
           <w:b/>
-          <w:noProof/>
           <w:color w:val="FF0000"/>
           <w:sz w:val="20"/>
         </w:rPr>
+        <w:t>（</w:t>
+      </w:r>
+      <w:r>
+        <w:rPr>
+          <w:rFonts w:hint="eastAsia"/>
+          <w:b/>
+          <w:color w:val="FF0000"/>
+          <w:sz w:val="20"/>
+        </w:rPr>
+        <w:t>用一段文字</w:t>
+      </w:r>
+      <w:r>
+        <w:rPr>
+          <w:rFonts w:hint="eastAsia"/>
+          <w:b/>
+          <w:color w:val="FF0000"/>
+          <w:sz w:val="20"/>
+        </w:rPr>
+        <w:t>+</w:t>
+      </w:r>
+      <w:r>
+        <w:rPr>
+          <w:rFonts w:hint="eastAsia"/>
+          <w:b/>
+          <w:color w:val="FF0000"/>
+          <w:sz w:val="20"/>
+        </w:rPr>
+        <w:t>图说明论文研究内容的设置情况，以及研究内容间的逻辑关系。</w:t>
+      </w:r>
+      <w:r>
+        <w:rPr>
+          <w:rFonts w:hint="eastAsia"/>
+          <w:b/>
+          <w:color w:val="FF0000"/>
+          <w:sz w:val="20"/>
+        </w:rPr>
+        <w:t>逻辑关系可以是并列、先后，总分等</w:t>
+      </w:r>
+      <w:r>
+        <w:rPr>
+          <w:rFonts w:hint="eastAsia"/>
+          <w:b/>
+          <w:color w:val="FF0000"/>
+          <w:sz w:val="20"/>
+        </w:rPr>
+        <w:t>）</w:t>
+      </w:r>
+    </w:p>
+    <w:p>
+      <w:pPr>
+        <w:spacing w:before="240" w:after="240" w:line="400" w:lineRule="exact"/>
+        <w:ind w:firstLineChars="200" w:firstLine="480"/>
+      </w:pPr>
+      <w:r>
+        <w:rPr>
+          <w:rFonts w:hint="eastAsia"/>
+        </w:rPr>
+        <w:t>针对上述问题，本论文的工作分为如下几个方面，如</w:t>
+      </w:r>
+      <w:r>
+        <w:fldChar w:fldCharType="begin"/>
+      </w:r>
+      <w:r>
+        <w:instrText xml:space="preserve"> </w:instrText>
+      </w:r>
+      <w:r>
+        <w:rPr>
+          <w:rFonts w:hint="eastAsia"/>
+        </w:rPr>
+        <w:instrText>REF _Ref90039899 \h</w:instrText>
+      </w:r>
+      <w:r>
+        <w:instrText xml:space="preserve">  \* MERGEFORMAT </w:instrText>
+      </w:r>
+      <w:r>
+        <w:fldChar w:fldCharType="separate"/>
+      </w:r>
+      <w:r>
+        <w:rPr>
+          <w:rFonts w:hint="eastAsia"/>
+        </w:rPr>
+        <w:t>图</w:t>
+      </w:r>
+      <w:r>
+        <w:t>1</w:t>
+      </w:r>
+      <w:r>
+        <w:fldChar w:fldCharType="end"/>
+      </w:r>
+      <w:r>
+        <w:rPr>
+          <w:rFonts w:hint="eastAsia"/>
+        </w:rPr>
+        <w:t>所示。</w:t>
+      </w:r>
+      <w:r>
+        <w:rPr>
+          <w:rFonts w:hint="eastAsia"/>
+        </w:rPr>
+        <w:t>首先研究</w:t>
+      </w:r>
+      <w:r>
+        <w:rPr>
+          <w:rFonts w:hint="eastAsia"/>
+        </w:rPr>
+        <w:t>X</w:t>
+      </w:r>
+      <w:r>
+        <w:t>XX</w:t>
+      </w:r>
+      <w:r>
+        <w:rPr>
+          <w:rFonts w:hint="eastAsia"/>
+        </w:rPr>
+        <w:t>，在此基础上研究</w:t>
+      </w:r>
+      <w:r>
+        <w:rPr>
+          <w:rFonts w:hint="eastAsia"/>
+        </w:rPr>
+        <w:t>X</w:t>
+      </w:r>
+      <w:r>
+        <w:t>XX</w:t>
+      </w:r>
+      <w:r>
+        <w:rPr>
+          <w:rFonts w:hint="eastAsia"/>
+        </w:rPr>
+        <w:t>，基于上述研究成果实现</w:t>
+      </w:r>
+      <w:r>
+        <w:rPr>
+          <w:rFonts w:hint="eastAsia"/>
+        </w:rPr>
+        <w:t>X</w:t>
+      </w:r>
+      <w:r>
+        <w:t>XX</w:t>
+      </w:r>
+      <w:r>
+        <w:rPr>
+          <w:rFonts w:hint="eastAsia"/>
+        </w:rPr>
+        <w:t>。</w:t>
+      </w:r>
+    </w:p>
+    <w:p>
+      <w:pPr>
+        <w:spacing w:line="360" w:lineRule="auto"/>
+        <w:jc w:val="center"/>
+      </w:pPr>
+      <w:r>
+        <w:rPr>
+          <w:noProof/>
+        </w:rPr>
         <w:drawing>
-          <ns3:inline distT="0" distB="0" distL="0" distR="0" ns4:anchorId="6C99C650" ns4:editId="6259E8F1">
-            <ns3:extent cx="5279390" cy="2176145"/>
-            <ns3:effectExtent l="0" t="0" r="0" b="0"/>
-            <ns3:docPr id="1" name="图片 1"/>
-            <ns3:cNvGraphicFramePr>
-              <ns5:graphicFrameLocks noChangeAspect="1"/>
-            </ns3:cNvGraphicFramePr>
-            <ns5:graphic>
-              <ns5:graphicData uri="http://schemas.openxmlformats.org/drawingml/2006/picture">
-                <ns11:pic>
-                  <ns11:nvPicPr>
-                    <ns11:cNvPr id="0" name="Picture 4"/>
-                    <ns11:cNvPicPr>
-                      <ns5:picLocks noChangeAspect="1" noChangeArrowheads="1"/>
-                    </ns11:cNvPicPr>
-                  </ns11:nvPicPr>
-                  <ns11:blipFill>
-                    <ns5:blip ns10:embed="rId16">
-                      <ns5:extLst>
-                        <ns5:ext uri="{28A0092B-C50C-407E-A947-70E740481C1C}">
-                          <ns12:useLocalDpi val="0"/>
-                        </ns5:ext>
-                      </ns5:extLst>
-                    </ns5:blip>
-                    <ns5:srcRect/>
-                    <ns5:stretch>
-                      <ns5:fillRect/>
-                    </ns5:stretch>
-                  </ns11:blipFill>
-                  <ns11:spPr bwMode="auto">
-                    <ns5:xfrm>
-                      <ns5:off x="0" y="0"/>
-                      <ns5:ext cx="5279390" cy="2176145"/>
-                    </ns5:xfrm>
-                    <ns5:prstGeom prst="rect">
-                      <ns5:avLst/>
-                    </ns5:prstGeom>
-                    <ns5:noFill/>
-                  </ns11:spPr>
-                </ns11:pic>
-              </ns5:graphicData>
-            </ns5:graphic>
-          </ns3:inline>
+          <wp:inline distT="0" distB="0" distL="0" distR="0" wp14:anchorId="4946AFEE" wp14:editId="37D820D1">
+            <wp:extent cx="2286000" cy="850900"/>
+            <wp:effectExtent l="0" t="0" r="0" b="0"/>
+            <wp:docPr id="2" name="图片 22"/>
+            <wp:cNvGraphicFramePr>
+              <a:graphicFrameLocks xmlns:a="http://schemas.openxmlformats.org/drawingml/2006/main" noChangeAspect="1"/>
+            </wp:cNvGraphicFramePr>
+            <a:graphic xmlns:a="http://schemas.openxmlformats.org/drawingml/2006/main">
+              <a:graphicData uri="http://schemas.openxmlformats.org/drawingml/2006/picture">
+                <pic:pic xmlns:pic="http://schemas.openxmlformats.org/drawingml/2006/picture">
+                  <pic:nvPicPr>
+                    <pic:cNvPr id="0" name="图片 22"/>
+                    <pic:cNvPicPr>
+                      <a:picLocks noChangeAspect="1" noChangeArrowheads="1"/>
+                    </pic:cNvPicPr>
+                  </pic:nvPicPr>
+                  <pic:blipFill>
+                    <a:blip r:embed="rId17" cstate="print">
+                      <a:extLst>
+                        <a:ext uri="{28A0092B-C50C-407E-A947-70E740481C1C}">
+                          <a14:useLocalDpi xmlns:a14="http://schemas.microsoft.com/office/drawing/2010/main" val="0"/>
+                        </a:ext>
+                      </a:extLst>
+                    </a:blip>
+                    <a:srcRect/>
+                    <a:stretch>
+                      <a:fillRect/>
+                    </a:stretch>
+                  </pic:blipFill>
+                  <pic:spPr bwMode="auto">
+                    <a:xfrm>
+                      <a:off x="0" y="0"/>
+                      <a:ext cx="2286000" cy="850900"/>
+                    </a:xfrm>
+                    <a:prstGeom prst="rect">
+                      <a:avLst/>
+                    </a:prstGeom>
+                    <a:noFill/>
+                    <a:ln>
+                      <a:noFill/>
+                    </a:ln>
+                  </pic:spPr>
+                </pic:pic>
+              </a:graphicData>
+            </a:graphic>
+          </wp:inline>
         </w:drawing>
       </w:r>
     </w:p>
-    <w:p ns2:paraId="4804CF7D" ns2:textId="77777777">
-      <w:pPr>
-        <w:spacing w:line="240" w:lineRule="auto"/>
-        <w:jc w:val="center"/>
+    <w:p>
+      <w:pPr>
+        <w:pStyle w:val="ac"/>
+        <w:rPr>
+          <w:rFonts w:ascii="黑体" w:eastAsia="黑体" w:hAnsi="黑体"/>
+          <w:sz w:val="20"/>
+        </w:rPr>
+      </w:pPr>
+      <w:bookmarkStart w:id="8" w:name="_Ref90039899"/>
+      <w:bookmarkStart w:id="9" w:name="_Toc213752086"/>
+      <w:r>
+        <w:rPr>
+          <w:rFonts w:hint="eastAsia"/>
+        </w:rPr>
+        <w:t>图</w:t>
+      </w:r>
+      <w:r>
+        <w:fldChar w:fldCharType="begin"/>
+      </w:r>
+      <w:r>
+        <w:instrText xml:space="preserve"> </w:instrText>
+      </w:r>
+      <w:r>
+        <w:rPr>
+          <w:rFonts w:hint="eastAsia"/>
+        </w:rPr>
+        <w:instrText xml:space="preserve">SEQ </w:instrText>
+      </w:r>
+      <w:r>
+        <w:rPr>
+          <w:rFonts w:hint="eastAsia"/>
+        </w:rPr>
+        <w:instrText>图</w:instrText>
+      </w:r>
+      <w:r>
+        <w:rPr>
+          <w:rFonts w:hint="eastAsia"/>
+        </w:rPr>
+        <w:instrText xml:space="preserve"> \* ARABIC</w:instrText>
+      </w:r>
+      <w:r>
+        <w:instrText xml:space="preserve"> </w:instrText>
+      </w:r>
+      <w:r>
+        <w:fldChar w:fldCharType="separate"/>
+      </w:r>
+      <w:r>
+        <w:rPr>
+          <w:noProof/>
+        </w:rPr>
+        <w:t>1</w:t>
+      </w:r>
+      <w:r>
+        <w:fldChar w:fldCharType="end"/>
+      </w:r>
+      <w:bookmarkEnd w:id="8"/>
+      <w:r>
+        <w:rPr>
+          <w:rFonts w:ascii="黑体" w:eastAsia="黑体" w:hAnsi="黑体"/>
+          <w:sz w:val="20"/>
+        </w:rPr>
+        <w:t xml:space="preserve"> </w:t>
+      </w:r>
+      <w:r>
+        <w:rPr>
+          <w:rFonts w:ascii="黑体" w:eastAsia="黑体" w:hAnsi="黑体"/>
+          <w:sz w:val="20"/>
+        </w:rPr>
+        <w:t xml:space="preserve"> </w:t>
+      </w:r>
+      <w:r>
+        <w:rPr>
+          <w:rFonts w:ascii="黑体" w:eastAsia="黑体" w:hAnsi="黑体" w:hint="eastAsia"/>
+          <w:sz w:val="20"/>
+        </w:rPr>
+        <w:t>研究内容关系示意图</w:t>
+      </w:r>
+      <w:bookmarkEnd w:id="9"/>
+    </w:p>
+    <w:p>
+      <w:pPr>
+        <w:spacing w:before="240" w:after="240" w:line="400" w:lineRule="exact"/>
+        <w:ind w:firstLineChars="200" w:firstLine="402"/>
         <w:rPr>
           <w:b/>
-          <w:sz w:val="21"/>
-        </w:rPr>
-      </w:pPr>
-      <w:bookmarkStart w:id="3" w:name="_Ref90039899"/>
+          <w:color w:val="FF0000"/>
+          <w:sz w:val="20"/>
+        </w:rPr>
+      </w:pPr>
       <w:r>
         <w:rPr>
           <w:rFonts w:hint="eastAsia"/>
           <w:b/>
-          <w:sz w:val="21"/>
-        </w:rPr>
-        <w:t>图</w:t>
-      </w:r>
-      <w:r>
-        <w:rPr>
+          <w:color w:val="FF0000"/>
+          <w:sz w:val="20"/>
+        </w:rPr>
+        <w:t>（</w:t>
+      </w:r>
+      <w:r>
+        <w:rPr>
+          <w:rFonts w:hint="eastAsia"/>
           <w:b/>
-          <w:sz w:val="21"/>
-        </w:rPr>
-        <w:fldChar w:fldCharType="begin"/>
-      </w:r>
-      <w:r>
-        <w:rPr>
+          <w:color w:val="FF0000"/>
+          <w:sz w:val="20"/>
+        </w:rPr>
+        <w:t>下面分别介绍每个研究内容</w:t>
+      </w:r>
+      <w:r>
+        <w:rPr>
+          <w:rFonts w:hint="eastAsia"/>
           <w:b/>
-          <w:sz w:val="21"/>
-        </w:rPr>
-        <w:instrText xml:space="preserve"> </w:instrText>
-      </w:r>
-      <w:r>
-        <w:rPr>
-          <w:rFonts w:hint="eastAsia"/>
-          <w:b/>
-          <w:sz w:val="21"/>
-        </w:rPr>
-        <w:instrText xml:space="preserve">SEQ </w:instrText>
-      </w:r>
-      <w:r>
-        <w:rPr>
-          <w:rFonts w:hint="eastAsia"/>
-          <w:b/>
-          <w:sz w:val="21"/>
-        </w:rPr>
-        <w:instrText>图</w:instrText>
-      </w:r>
-      <w:r>
-        <w:rPr>
-          <w:rFonts w:hint="eastAsia"/>
-          <w:b/>
-          <w:sz w:val="21"/>
-        </w:rPr>
-        <w:instrText xml:space="preserve"> \* ARABIC</w:instrText>
-      </w:r>
-      <w:r>
-        <w:rPr>
-          <w:b/>
-          <w:sz w:val="21"/>
-        </w:rPr>
-        <w:instrText xml:space="preserve"> </w:instrText>
-      </w:r>
-      <w:r>
-        <w:rPr>
-          <w:b/>
-          <w:sz w:val="21"/>
-        </w:rPr>
-        <w:fldChar w:fldCharType="separate"/>
-      </w:r>
-      <w:r>
-        <w:rPr>
-          <w:b/>
-          <w:sz w:val="21"/>
-        </w:rPr>
-        <w:t>1</w:t>
-      </w:r>
-      <w:r>
-        <w:rPr>
-          <w:b/>
-          <w:sz w:val="21"/>
-        </w:rPr>
-        <w:fldChar w:fldCharType="end"/>
-      </w:r>
-      <w:bookmarkEnd w:id="3"/>
-      <w:r>
-        <w:rPr>
-          <w:b/>
-          <w:sz w:val="21"/>
-        </w:rPr>
-        <w:t xml:space="preserve"> </w:t>
-      </w:r>
-      <w:r>
-        <w:rPr>
-          <w:rFonts w:hint="eastAsia"/>
-          <w:b/>
-          <w:sz w:val="21"/>
-        </w:rPr>
-        <w:t>碰撞检测算法分类</w:t>
-      </w:r>
-    </w:p>
-    <w:p ns2:paraId="7B98C8B2" ns2:textId="77777777">
+          <w:color w:val="FF0000"/>
+          <w:sz w:val="20"/>
+        </w:rPr>
+        <w:t>）</w:t>
+      </w:r>
+    </w:p>
+    <w:p>
+      <w:pPr>
+        <w:pStyle w:val="2"/>
+        <w:spacing w:line="400" w:lineRule="exact"/>
+        <w:ind w:left="567"/>
+      </w:pPr>
+      <w:bookmarkStart w:id="10" w:name="_Toc213752075"/>
+      <w:r>
+        <w:rPr>
+          <w:rFonts w:hint="eastAsia"/>
+        </w:rPr>
+        <w:t>研究</w:t>
+      </w:r>
+      <w:r>
+        <w:rPr>
+          <w:rFonts w:hint="eastAsia"/>
+        </w:rPr>
+        <w:t>目标</w:t>
+      </w:r>
+      <w:r>
+        <w:rPr>
+          <w:rFonts w:hint="eastAsia"/>
+        </w:rPr>
+        <w:t>：</w:t>
+      </w:r>
+      <w:r>
+        <w:rPr>
+          <w:rFonts w:hint="eastAsia"/>
+        </w:rPr>
+        <w:t>xxxxxxxxx</w:t>
+      </w:r>
+      <w:bookmarkEnd w:id="10"/>
+    </w:p>
+    <w:p>
+      <w:pPr>
+        <w:pStyle w:val="2"/>
+        <w:spacing w:line="400" w:lineRule="exact"/>
+        <w:ind w:left="567"/>
+      </w:pPr>
+      <w:bookmarkStart w:id="11" w:name="_Toc213752076"/>
+      <w:r>
+        <w:rPr>
+          <w:rFonts w:hint="eastAsia"/>
+        </w:rPr>
+        <w:t>研究内容：</w:t>
+      </w:r>
+      <w:r>
+        <w:rPr>
+          <w:rFonts w:hint="eastAsia"/>
+        </w:rPr>
+        <w:t>xxxxxxxxx</w:t>
+      </w:r>
+      <w:bookmarkEnd w:id="11"/>
+    </w:p>
+    <w:p>
+      <w:pPr>
+        <w:pStyle w:val="2"/>
+        <w:spacing w:line="400" w:lineRule="exact"/>
+        <w:ind w:left="567"/>
+      </w:pPr>
+      <w:bookmarkStart w:id="12" w:name="_Toc213752077"/>
+      <w:r>
+        <w:rPr>
+          <w:rFonts w:hint="eastAsia"/>
+        </w:rPr>
+        <w:t>关键技术问题</w:t>
+      </w:r>
+      <w:r>
+        <w:rPr>
+          <w:rFonts w:hint="eastAsia"/>
+        </w:rPr>
+        <w:t>：</w:t>
+      </w:r>
+      <w:r>
+        <w:rPr>
+          <w:rFonts w:hint="eastAsia"/>
+        </w:rPr>
+        <w:t>xxxxxxxxx</w:t>
+      </w:r>
+      <w:bookmarkEnd w:id="12"/>
+    </w:p>
+    <w:p>
       <w:pPr>
         <w:pStyle w:val="1"/>
-        <w:numPr>
-          <w:ilvl w:val="0"/>
-          <w:numId w:val="1"/>
-        </w:numPr>
-      </w:pPr>
-      <w:bookmarkStart w:id="4" w:name="_Toc213753475"/>
-      <w:r>
-        <w:rPr>
-          <w:rFonts w:hint="eastAsia"/>
-        </w:rPr>
-        <w:t>国内外研究现状</w:t>
-      </w:r>
-      <w:bookmarkEnd w:id="4"/>
-    </w:p>
-    <w:p ns2:paraId="2F585026" ns2:textId="77777777">
-      <w:pPr>
-        <w:ind w:firstLineChars="200" w:firstLine="480"/>
-      </w:pPr>
-      <w:r>
-        <w:rPr>
-          <w:rFonts w:hint="eastAsia"/>
-        </w:rPr>
-        <w:t>详细介绍</w:t>
-      </w:r>
-      <w:r>
-        <w:rPr>
-          <w:rFonts w:hint="eastAsia"/>
-        </w:rPr>
-        <w:t>各分支的理论、方法或技术研究现状</w:t>
-      </w:r>
-    </w:p>
-    <w:p ns2:paraId="6A078277" ns2:textId="77777777">
+        <w:spacing w:before="240" w:after="240" w:line="400" w:lineRule="exact"/>
+      </w:pPr>
+      <w:bookmarkStart w:id="13" w:name="_Toc213752078"/>
+      <w:bookmarkStart w:id="14" w:name="OLE_LINK1"/>
+      <w:bookmarkStart w:id="15" w:name="OLE_LINK2"/>
+      <w:bookmarkStart w:id="16" w:name="OLE_LINK4"/>
+      <w:bookmarkStart w:id="17" w:name="OLE_LINK5"/>
+      <w:bookmarkStart w:id="18" w:name="OLE_LINK6"/>
+      <w:bookmarkStart w:id="19" w:name="OLE_LINK7"/>
+      <w:bookmarkStart w:id="20" w:name="OLE_LINK8"/>
+      <w:bookmarkStart w:id="21" w:name="OLE_LINK9"/>
+      <w:bookmarkStart w:id="22" w:name="OLE_LINK10"/>
+      <w:bookmarkStart w:id="23" w:name="OLE_LINK11"/>
+      <w:r>
+        <w:rPr>
+          <w:rFonts w:hint="eastAsia"/>
+        </w:rPr>
+        <w:t>研究方案与技术路线以及可能的创新点</w:t>
+      </w:r>
+      <w:bookmarkEnd w:id="13"/>
+    </w:p>
+    <w:p>
       <w:pPr>
         <w:pStyle w:val="2"/>
-        <w:spacing w:before="120" w:after="0"/>
+        <w:spacing w:line="400" w:lineRule="exact"/>
         <w:ind w:left="567"/>
       </w:pPr>
-      <w:bookmarkStart w:id="5" w:name="_Toc213753476"/>
-      <w:r>
-        <w:rPr>
-          <w:rFonts w:hint="eastAsia"/>
-        </w:rPr>
-        <w:t>X</w:t>
-      </w:r>
-      <w:r>
-        <w:t>XX</w:t>
-      </w:r>
-      <w:r>
-        <w:rPr>
-          <w:rFonts w:hint="eastAsia"/>
-        </w:rPr>
-        <w:t>研究现状</w:t>
-      </w:r>
-      <w:bookmarkEnd w:id="5"/>
-    </w:p>
-    <w:p ns2:paraId="3D250611" ns2:textId="77777777">
-      <w:pPr>
-        <w:pStyle w:val="a0"/>
-      </w:pPr>
-      <w:r>
-        <w:rPr>
-          <w:rFonts w:hint="eastAsia"/>
-        </w:rPr>
-        <w:t>XXX研究现状</w:t>
-      </w:r>
-    </w:p>
-    <w:p ns2:paraId="50669729" ns2:textId="77777777">
+      <w:bookmarkStart w:id="24" w:name="_Toc213752079"/>
+      <w:r>
+        <w:rPr>
+          <w:rFonts w:hint="eastAsia"/>
+        </w:rPr>
+        <w:t>研究方案与技术路线</w:t>
+      </w:r>
+      <w:bookmarkEnd w:id="24"/>
+    </w:p>
+    <w:p>
       <w:pPr>
         <w:pStyle w:val="2"/>
-        <w:spacing w:before="120" w:after="0"/>
+        <w:spacing w:line="400" w:lineRule="exact"/>
         <w:ind w:left="567"/>
       </w:pPr>
-      <w:bookmarkStart w:id="6" w:name="_Toc213753477"/>
-      <w:r>
-        <w:rPr>
-          <w:rFonts w:hint="eastAsia"/>
-        </w:rPr>
-        <w:t>X</w:t>
-      </w:r>
-      <w:r>
-        <w:t>XX</w:t>
-      </w:r>
-      <w:r>
-        <w:rPr>
-          <w:rFonts w:hint="eastAsia"/>
-        </w:rPr>
-        <w:t>研究现状</w:t>
-      </w:r>
-      <w:bookmarkEnd w:id="6"/>
-    </w:p>
-    <w:p ns2:paraId="0AC1E9B2" ns2:textId="77777777">
-      <w:pPr>
-        <w:pStyle w:val="a0"/>
-      </w:pPr>
-      <w:r>
-        <w:rPr>
-          <w:rFonts w:hint="eastAsia"/>
-        </w:rPr>
-        <w:t>XXX研究现状</w:t>
-      </w:r>
-    </w:p>
-    <w:p ns2:paraId="4C2F176C" ns2:textId="77777777">
-      <w:pPr>
-        <w:pStyle w:val="2"/>
-        <w:spacing w:before="120" w:after="0"/>
-        <w:ind w:left="567"/>
-      </w:pPr>
-      <w:bookmarkStart w:id="7" w:name="_Toc213753478"/>
-      <w:r>
-        <w:rPr>
-          <w:rFonts w:hint="eastAsia"/>
-        </w:rPr>
-        <w:t>X</w:t>
-      </w:r>
-      <w:r>
-        <w:t>XX</w:t>
-      </w:r>
-      <w:r>
-        <w:rPr>
-          <w:rFonts w:hint="eastAsia"/>
-        </w:rPr>
-        <w:t>研究现状</w:t>
-      </w:r>
-      <w:bookmarkEnd w:id="7"/>
-    </w:p>
-    <w:p ns2:paraId="45A26832" ns2:textId="77777777">
-      <w:pPr>
-        <w:pStyle w:val="a0"/>
-      </w:pPr>
-      <w:r>
-        <w:rPr>
-          <w:rFonts w:hint="eastAsia"/>
-        </w:rPr>
-        <w:t>XXX研究现状</w:t>
-      </w:r>
-    </w:p>
-    <w:p ns2:paraId="02841777" ns2:textId="77777777">
-      <w:pPr>
-        <w:pStyle w:val="1"/>
-        <w:numPr>
-          <w:ilvl w:val="0"/>
-          <w:numId w:val="1"/>
-        </w:numPr>
-      </w:pPr>
-      <w:bookmarkStart w:id="8" w:name="_Toc213753479"/>
-      <w:bookmarkStart w:id="9" w:name="OLE_LINK1"/>
-      <w:bookmarkStart w:id="10" w:name="OLE_LINK2"/>
-      <w:bookmarkStart w:id="11" w:name="OLE_LINK4"/>
-      <w:bookmarkStart w:id="12" w:name="OLE_LINK5"/>
-      <w:bookmarkStart w:id="13" w:name="OLE_LINK6"/>
-      <w:bookmarkStart w:id="14" w:name="OLE_LINK7"/>
-      <w:bookmarkStart w:id="15" w:name="OLE_LINK8"/>
-      <w:bookmarkStart w:id="16" w:name="OLE_LINK9"/>
-      <w:bookmarkStart w:id="17" w:name="OLE_LINK10"/>
-      <w:bookmarkStart w:id="18" w:name="OLE_LINK11"/>
-      <w:r>
-        <w:rPr>
-          <w:rFonts w:hint="eastAsia"/>
-        </w:rPr>
-        <w:t>研究现状</w:t>
-      </w:r>
-      <w:r>
-        <w:rPr>
-          <w:rFonts w:hint="eastAsia"/>
-        </w:rPr>
-        <w:t>总结与</w:t>
-      </w:r>
-      <w:r>
-        <w:rPr>
-          <w:rFonts w:hint="eastAsia"/>
-        </w:rPr>
-        <w:t>分析</w:t>
-      </w:r>
-      <w:bookmarkEnd w:id="8"/>
-    </w:p>
-    <w:p ns2:paraId="2084E6C8" ns2:textId="77777777">
-      <w:pPr>
-        <w:pStyle w:val="2"/>
-        <w:spacing w:before="120" w:after="0"/>
-        <w:ind w:left="567"/>
-      </w:pPr>
-      <w:bookmarkStart w:id="19" w:name="_Toc213753480"/>
-      <w:r>
-        <w:rPr>
-          <w:rFonts w:hint="eastAsia"/>
-        </w:rPr>
-        <w:t>论文研究领域</w:t>
-      </w:r>
-      <w:r>
-        <w:rPr>
-          <w:rFonts w:hint="eastAsia"/>
-        </w:rPr>
-        <w:t>存在的问题</w:t>
-      </w:r>
-      <w:bookmarkEnd w:id="19"/>
-    </w:p>
-    <w:p ns2:paraId="25964321" ns2:textId="77777777">
-      <w:pPr>
-        <w:pStyle w:val="a0"/>
-      </w:pPr>
-      <w:r>
-        <w:rPr>
-          <w:rFonts w:hint="eastAsia"/>
-        </w:rPr>
-        <w:t>论文研究领域存在哪些尚未解决的</w:t>
-      </w:r>
-      <w:r>
-        <w:rPr>
-          <w:rFonts w:hint="eastAsia"/>
-        </w:rPr>
-        <w:t>问题</w:t>
-      </w:r>
-      <w:r>
-        <w:rPr>
-          <w:rFonts w:hint="eastAsia"/>
-        </w:rPr>
-        <w:t xml:space="preserve"> </w:t>
-      </w:r>
-      <w:r>
-        <w:t xml:space="preserve">  </w:t>
-      </w:r>
-    </w:p>
-    <w:p ns2:paraId="109A0383" ns2:textId="77777777">
-      <w:pPr>
-        <w:pStyle w:val="2"/>
-        <w:spacing w:before="120" w:after="0"/>
-        <w:ind w:left="567"/>
-      </w:pPr>
-      <w:bookmarkStart w:id="20" w:name="_Toc213753481"/>
-      <w:r>
-        <w:rPr>
-          <w:rFonts w:hint="eastAsia"/>
-        </w:rPr>
-        <w:t>论文研究领域的</w:t>
-      </w:r>
-      <w:r>
-        <w:rPr>
-          <w:rFonts w:hint="eastAsia"/>
-        </w:rPr>
-        <w:t>发展趋势</w:t>
-      </w:r>
-      <w:bookmarkEnd w:id="20"/>
-    </w:p>
-    <w:p ns2:paraId="7F8566BE" ns2:textId="77777777">
-      <w:pPr>
-        <w:pStyle w:val="a0"/>
-      </w:pPr>
-      <w:r>
-        <w:rPr>
-          <w:rFonts w:hint="eastAsia"/>
-        </w:rPr>
-        <w:t>论文研究方向的未来发展趋势</w:t>
-      </w:r>
-    </w:p>
-    <w:p ns2:paraId="3BC38308" ns2:textId="77777777">
-      <w:pPr>
-        <w:pStyle w:val="2"/>
-        <w:spacing w:before="120" w:after="0"/>
-        <w:ind w:left="567"/>
-      </w:pPr>
-      <w:bookmarkStart w:id="21" w:name="_Toc213753482"/>
-      <w:r>
-        <w:rPr>
-          <w:rFonts w:hint="eastAsia"/>
-        </w:rPr>
-        <w:t>研究现状分析</w:t>
-      </w:r>
-      <w:r>
-        <w:rPr>
-          <w:rFonts w:hint="eastAsia"/>
-        </w:rPr>
-        <w:t>结论</w:t>
-      </w:r>
-      <w:bookmarkEnd w:id="9"/>
-      <w:bookmarkEnd w:id="10"/>
-      <w:bookmarkEnd w:id="11"/>
-      <w:bookmarkEnd w:id="12"/>
-      <w:bookmarkEnd w:id="13"/>
+      <w:bookmarkStart w:id="25" w:name="_Toc213752080"/>
       <w:bookmarkEnd w:id="14"/>
       <w:bookmarkEnd w:id="15"/>
       <w:bookmarkEnd w:id="16"/>
       <w:bookmarkEnd w:id="17"/>
       <w:bookmarkEnd w:id="18"/>
+      <w:bookmarkEnd w:id="19"/>
+      <w:bookmarkEnd w:id="20"/>
       <w:bookmarkEnd w:id="21"/>
-    </w:p>
-    <w:p ns2:paraId="5686950F" ns2:textId="77777777">
+      <w:bookmarkEnd w:id="22"/>
+      <w:bookmarkEnd w:id="23"/>
+      <w:r>
+        <w:rPr>
+          <w:rFonts w:hint="eastAsia"/>
+        </w:rPr>
+        <w:t>创新点</w:t>
+      </w:r>
+      <w:bookmarkEnd w:id="25"/>
+    </w:p>
+    <w:p>
+      <w:pPr>
+        <w:pStyle w:val="1"/>
+        <w:spacing w:before="240" w:after="240" w:line="400" w:lineRule="exact"/>
+      </w:pPr>
+      <w:bookmarkStart w:id="26" w:name="_Toc213752081"/>
+      <w:r>
+        <w:rPr>
+          <w:rFonts w:hint="eastAsia"/>
+        </w:rPr>
+        <w:t>可行性分析</w:t>
+      </w:r>
+      <w:bookmarkEnd w:id="26"/>
+    </w:p>
+    <w:p>
+      <w:pPr>
+        <w:pStyle w:val="1"/>
+        <w:spacing w:before="240" w:after="240" w:line="400" w:lineRule="exact"/>
+      </w:pPr>
+      <w:bookmarkStart w:id="27" w:name="_Toc213752082"/>
+      <w:r>
+        <w:rPr>
+          <w:rFonts w:hint="eastAsia"/>
+        </w:rPr>
+        <w:t>论文预期成果与计划安排</w:t>
+      </w:r>
+      <w:bookmarkEnd w:id="27"/>
+    </w:p>
+    <w:p>
+      <w:pPr>
+        <w:pStyle w:val="2"/>
+        <w:spacing w:line="400" w:lineRule="exact"/>
+        <w:ind w:left="567"/>
+        <w:jc w:val="left"/>
+      </w:pPr>
+      <w:bookmarkStart w:id="28" w:name="_Toc213752083"/>
+      <w:r>
+        <w:rPr>
+          <w:rFonts w:hint="eastAsia"/>
+        </w:rPr>
+        <w:lastRenderedPageBreak/>
+        <w:t>论文预期成果</w:t>
+      </w:r>
+      <w:bookmarkEnd w:id="28"/>
+    </w:p>
+    <w:p>
+      <w:pPr>
+        <w:pStyle w:val="2"/>
+        <w:spacing w:line="400" w:lineRule="exact"/>
+        <w:ind w:left="567"/>
+        <w:jc w:val="left"/>
+      </w:pPr>
+      <w:bookmarkStart w:id="29" w:name="_Toc213752084"/>
+      <w:r>
+        <w:rPr>
+          <w:rFonts w:hint="eastAsia"/>
+        </w:rPr>
+        <w:t>论文计划安排</w:t>
+      </w:r>
+      <w:bookmarkEnd w:id="1"/>
+      <w:bookmarkEnd w:id="29"/>
+    </w:p>
+    <w:p>
       <w:pPr>
         <w:pStyle w:val="a0"/>
-      </w:pPr>
-      <w:r>
-        <w:rPr>
-          <w:rFonts w:hint="eastAsia"/>
-        </w:rPr>
-        <w:t>描述哪些问题是本论文需要解决的</w:t>
-      </w:r>
-    </w:p>
-    <w:p ns2:paraId="04114169" ns2:textId="0545E647">
+        <w:ind w:firstLine="0"/>
+        <w:rPr>
+          <w:rFonts w:ascii="Times New Roman" w:eastAsia="黑体"/>
+          <w:kern w:val="44"/>
+          <w:sz w:val="30"/>
+        </w:rPr>
+      </w:pPr>
+    </w:p>
+    <w:p>
+      <w:pPr>
+        <w:pStyle w:val="a0"/>
+        <w:ind w:firstLine="0"/>
+      </w:pPr>
+    </w:p>
+    <w:p>
       <w:pPr>
         <w:widowControl/>
         <w:spacing w:line="240" w:lineRule="auto"/>
         <w:jc w:val="left"/>
       </w:pPr>
-    </w:p>
-    <w:p ns2:paraId="7B7AF252" ns2:textId="77777777">
+      <w:r>
+        <w:br w:type="page"/>
+      </w:r>
+    </w:p>
+    <w:p>
       <w:pPr>
         <w:pStyle w:val="affd"/>
         <w:adjustRightInd w:val="0"/>
         <w:snapToGrid w:val="0"/>
         <w:spacing w:before="156" w:after="156"/>
         <w:rPr>
-          <w:rFonts w:hint="eastAsia"/>
           <w:b/>
           <w:bCs/>
         </w:rPr>
       </w:pPr>
-      <w:bookmarkStart w:id="22" w:name="_Toc213752050"/>
-      <w:bookmarkStart w:id="23" w:name="_Toc213753483"/>
-      <w:r>
-        <w:rPr>
-          <w:rFonts w:hint="eastAsia"/>
-        </w:rPr>
+      <w:bookmarkStart w:id="30" w:name="_Toc213752085"/>
+      <w:r>
+        <w:rPr>
+          <w:rFonts w:hint="eastAsia"/>
+        </w:rPr>
+        <w:lastRenderedPageBreak/>
         <w:t>参考文献</w:t>
       </w:r>
-      <w:bookmarkEnd w:id="22"/>
-      <w:bookmarkEnd w:id="23"/>
-    </w:p>
-    <w:p ns2:paraId="36AF1E73" ns2:textId="77777777">
+      <w:bookmarkEnd w:id="30"/>
+    </w:p>
+    <w:p>
       <w:pPr>
         <w:adjustRightInd w:val="0"/>
         <w:snapToGrid w:val="0"/>
@@ -1779,7 +2292,7 @@
         <w:t>,2000:29.</w:t>
       </w:r>
     </w:p>
-    <w:p ns2:paraId="772FFE29" ns2:textId="77777777">
+    <w:p>
       <w:pPr>
         <w:adjustRightInd w:val="0"/>
         <w:snapToGrid w:val="0"/>
@@ -1832,7 +2345,7 @@
         <w:t>: Saunders, 1974: 745-772.</w:t>
       </w:r>
     </w:p>
-    <w:p ns2:paraId="073669AD" ns2:textId="77777777">
+    <w:p>
       <w:pPr>
         <w:adjustRightInd w:val="0"/>
         <w:snapToGrid w:val="0"/>
@@ -1878,7 +2391,7 @@
         <w:t>: 92214985.2[P]. 1993-04-14.</w:t>
       </w:r>
     </w:p>
-    <w:p ns2:paraId="4D80D236" ns2:textId="77777777">
+    <w:p>
       <w:pPr>
         <w:adjustRightInd w:val="0"/>
         <w:snapToGrid w:val="0"/>
@@ -2002,7 +2515,7 @@
         <w:t>), 2002,38(4):478-481.</w:t>
       </w:r>
     </w:p>
-    <w:p ns2:paraId="46A05B64" ns2:textId="08BDFC0B">
+    <w:p>
       <w:pPr>
         <w:pStyle w:val="1"/>
         <w:numPr>
@@ -2016,10 +2529,10 @@
       </w:pPr>
     </w:p>
     <w:sectPr>
-      <w:headerReference w:type="default" ns10:id="rId17"/>
-      <w:footerReference w:type="default" ns10:id="rId18"/>
-      <w:headerReference w:type="first" ns10:id="rId19"/>
-      <w:footerReference w:type="first" ns10:id="rId20"/>
+      <w:headerReference w:type="default" r:id="rId18"/>
+      <w:footerReference w:type="default" r:id="rId19"/>
+      <w:headerReference w:type="first" r:id="rId20"/>
+      <w:footerReference w:type="first" r:id="rId21"/>
       <w:pgSz w:w="11906" w:h="16838"/>
       <w:pgMar w:top="1440" w:right="1800" w:bottom="1440" w:left="1800" w:header="851" w:footer="992" w:gutter="0"/>
       <w:pgNumType w:start="1"/>
@@ -2031,9 +2544,9 @@
 </file>
 
 <file path=word/endnotes.xml><?xml version="1.0" encoding="utf-8"?>
-<w:endnotes xmlns:ns1="http://schemas.openxmlformats.org/markup-compatibility/2006" xmlns:ns2="http://schemas.microsoft.com/office/word/2010/wordml" xmlns:w="http://schemas.openxmlformats.org/wordprocessingml/2006/main" ns1:Ignorable="w14 w15 w16se w16cid w16 w16cex w16sdtdh w16sdtfl w16du wp14">
+<w:endnotes xmlns:wpc="http://schemas.microsoft.com/office/word/2010/wordprocessingCanvas" xmlns:cx="http://schemas.microsoft.com/office/drawing/2014/chartex" xmlns:cx1="http://schemas.microsoft.com/office/drawing/2015/9/8/chartex" xmlns:cx2="http://schemas.microsoft.com/office/drawing/2015/10/21/chartex" xmlns:cx3="http://schemas.microsoft.com/office/drawing/2016/5/9/chartex" xmlns:cx4="http://schemas.microsoft.com/office/drawing/2016/5/10/chartex" xmlns:cx5="http://schemas.microsoft.com/office/drawing/2016/5/11/chartex" xmlns:cx6="http://schemas.microsoft.com/office/drawing/2016/5/12/chartex" xmlns:cx7="http://schemas.microsoft.com/office/drawing/2016/5/13/chartex" xmlns:cx8="http://schemas.microsoft.com/office/drawing/2016/5/14/chartex" xmlns:mc="http://schemas.openxmlformats.org/markup-compatibility/2006" xmlns:aink="http://schemas.microsoft.com/office/drawing/2016/ink" xmlns:am3d="http://schemas.microsoft.com/office/drawing/2017/model3d" xmlns:o="urn:schemas-microsoft-com:office:office" xmlns:r="http://schemas.openxmlformats.org/officeDocument/2006/relationships" xmlns:m="http://schemas.openxmlformats.org/officeDocument/2006/math" xmlns:v="urn:schemas-microsoft-com:vml" xmlns:wp14="http://schemas.microsoft.com/office/word/2010/wordprocessingDrawing" xmlns:wp="http://schemas.openxmlformats.org/drawingml/2006/wordprocessingDrawing" xmlns:w10="urn:schemas-microsoft-com:office:word" xmlns:w="http://schemas.openxmlformats.org/wordprocessingml/2006/main" xmlns:w14="http://schemas.microsoft.com/office/word/2010/wordml" xmlns:w15="http://schemas.microsoft.com/office/word/2012/wordml" xmlns:w16cex="http://schemas.microsoft.com/office/word/2018/wordml/cex" xmlns:w16cid="http://schemas.microsoft.com/office/word/2016/wordml/cid" xmlns:w16="http://schemas.microsoft.com/office/word/2018/wordml" xmlns:w16sdtdh="http://schemas.microsoft.com/office/word/2020/wordml/sdtdatahash" xmlns:w16se="http://schemas.microsoft.com/office/word/2015/wordml/symex" xmlns:wpg="http://schemas.microsoft.com/office/word/2010/wordprocessingGroup" xmlns:wpi="http://schemas.microsoft.com/office/word/2010/wordprocessingInk" xmlns:wne="http://schemas.microsoft.com/office/word/2006/wordml" xmlns:wps="http://schemas.microsoft.com/office/word/2010/wordprocessingShape" mc:Ignorable="w14 w15 w16se w16cid w16 w16cex w16sdtdh wp14">
   <w:endnote w:type="separator" w:id="-1">
-    <w:p ns2:paraId="1927BB51" ns2:textId="77777777">
+    <w:p>
       <w:pPr>
         <w:spacing w:line="240" w:lineRule="auto"/>
       </w:pPr>
@@ -2043,7 +2556,7 @@
     </w:p>
   </w:endnote>
   <w:endnote w:type="continuationSeparator" w:id="0">
-    <w:p ns2:paraId="3CB2E6AB" ns2:textId="77777777">
+    <w:p>
       <w:pPr>
         <w:spacing w:line="240" w:lineRule="auto"/>
       </w:pPr>
@@ -2056,20 +2569,23 @@
 </file>
 
 <file path=word/footer1.xml><?xml version="1.0" encoding="utf-8"?>
-<w:ftr xmlns:ns1="http://schemas.openxmlformats.org/markup-compatibility/2006" xmlns:ns2="http://schemas.microsoft.com/office/word/2010/wordml" xmlns:w="http://schemas.openxmlformats.org/wordprocessingml/2006/main" ns1:Ignorable="w14 w15 w16se w16cid w16 w16cex w16sdtdh w16sdtfl w16du wp14">
+<w:ftr xmlns:wpc="http://schemas.microsoft.com/office/word/2010/wordprocessingCanvas" xmlns:cx="http://schemas.microsoft.com/office/drawing/2014/chartex" xmlns:cx1="http://schemas.microsoft.com/office/drawing/2015/9/8/chartex" xmlns:cx2="http://schemas.microsoft.com/office/drawing/2015/10/21/chartex" xmlns:cx3="http://schemas.microsoft.com/office/drawing/2016/5/9/chartex" xmlns:cx4="http://schemas.microsoft.com/office/drawing/2016/5/10/chartex" xmlns:cx5="http://schemas.microsoft.com/office/drawing/2016/5/11/chartex" xmlns:cx6="http://schemas.microsoft.com/office/drawing/2016/5/12/chartex" xmlns:cx7="http://schemas.microsoft.com/office/drawing/2016/5/13/chartex" xmlns:cx8="http://schemas.microsoft.com/office/drawing/2016/5/14/chartex" xmlns:mc="http://schemas.openxmlformats.org/markup-compatibility/2006" xmlns:aink="http://schemas.microsoft.com/office/drawing/2016/ink" xmlns:am3d="http://schemas.microsoft.com/office/drawing/2017/model3d" xmlns:o="urn:schemas-microsoft-com:office:office" xmlns:r="http://schemas.openxmlformats.org/officeDocument/2006/relationships" xmlns:m="http://schemas.openxmlformats.org/officeDocument/2006/math" xmlns:v="urn:schemas-microsoft-com:vml" xmlns:wp14="http://schemas.microsoft.com/office/word/2010/wordprocessingDrawing" xmlns:wp="http://schemas.openxmlformats.org/drawingml/2006/wordprocessingDrawing" xmlns:w10="urn:schemas-microsoft-com:office:word" xmlns:w="http://schemas.openxmlformats.org/wordprocessingml/2006/main" xmlns:w14="http://schemas.microsoft.com/office/word/2010/wordml" xmlns:w15="http://schemas.microsoft.com/office/word/2012/wordml" xmlns:w16cex="http://schemas.microsoft.com/office/word/2018/wordml/cex" xmlns:w16cid="http://schemas.microsoft.com/office/word/2016/wordml/cid" xmlns:w16="http://schemas.microsoft.com/office/word/2018/wordml" xmlns:w16sdtdh="http://schemas.microsoft.com/office/word/2020/wordml/sdtdatahash" xmlns:w16se="http://schemas.microsoft.com/office/word/2015/wordml/symex" xmlns:wpg="http://schemas.microsoft.com/office/word/2010/wordprocessingGroup" xmlns:wpi="http://schemas.microsoft.com/office/word/2010/wordprocessingInk" xmlns:wne="http://schemas.microsoft.com/office/word/2006/wordml" xmlns:wps="http://schemas.microsoft.com/office/word/2010/wordprocessingShape" mc:Ignorable="w14 w15 w16se w16cid w16 w16cex w16sdtdh wp14">
   <w:sdt>
     <w:sdtPr>
-      <w:id w:val="1227728724"/>
+      <w:id w:val="457071166"/>
       <w:docPartObj>
         <w:docPartGallery w:val="Page Numbers (Bottom of Page)"/>
         <w:docPartUnique/>
       </w:docPartObj>
     </w:sdtPr>
     <w:sdtContent>
-      <w:p ns2:paraId="7DBEB443" ns2:textId="2A5D8912">
+      <w:p>
         <w:pPr>
           <w:pStyle w:val="af4"/>
           <w:jc w:val="center"/>
+          <w:rPr>
+            <w:rFonts w:hint="eastAsia"/>
+          </w:rPr>
         </w:pPr>
         <w:r>
           <w:fldChar w:fldCharType="begin"/>
@@ -2096,8 +2612,8 @@
 </file>
 
 <file path=word/footer2.xml><?xml version="1.0" encoding="utf-8"?>
-<w:ftr xmlns:ns1="http://schemas.openxmlformats.org/markup-compatibility/2006" xmlns:ns2="http://schemas.microsoft.com/office/word/2010/wordml" xmlns:w="http://schemas.openxmlformats.org/wordprocessingml/2006/main" ns1:Ignorable="w14 w15 w16se w16cid w16 w16cex w16sdtdh w16sdtfl w16du wp14">
-  <w:p ns2:paraId="0360DFC2" ns2:textId="77777777">
+<w:ftr xmlns:wpc="http://schemas.microsoft.com/office/word/2010/wordprocessingCanvas" xmlns:cx="http://schemas.microsoft.com/office/drawing/2014/chartex" xmlns:cx1="http://schemas.microsoft.com/office/drawing/2015/9/8/chartex" xmlns:cx2="http://schemas.microsoft.com/office/drawing/2015/10/21/chartex" xmlns:cx3="http://schemas.microsoft.com/office/drawing/2016/5/9/chartex" xmlns:cx4="http://schemas.microsoft.com/office/drawing/2016/5/10/chartex" xmlns:cx5="http://schemas.microsoft.com/office/drawing/2016/5/11/chartex" xmlns:cx6="http://schemas.microsoft.com/office/drawing/2016/5/12/chartex" xmlns:cx7="http://schemas.microsoft.com/office/drawing/2016/5/13/chartex" xmlns:cx8="http://schemas.microsoft.com/office/drawing/2016/5/14/chartex" xmlns:mc="http://schemas.openxmlformats.org/markup-compatibility/2006" xmlns:aink="http://schemas.microsoft.com/office/drawing/2016/ink" xmlns:am3d="http://schemas.microsoft.com/office/drawing/2017/model3d" xmlns:o="urn:schemas-microsoft-com:office:office" xmlns:r="http://schemas.openxmlformats.org/officeDocument/2006/relationships" xmlns:m="http://schemas.openxmlformats.org/officeDocument/2006/math" xmlns:v="urn:schemas-microsoft-com:vml" xmlns:wp14="http://schemas.microsoft.com/office/word/2010/wordprocessingDrawing" xmlns:wp="http://schemas.openxmlformats.org/drawingml/2006/wordprocessingDrawing" xmlns:w10="urn:schemas-microsoft-com:office:word" xmlns:w="http://schemas.openxmlformats.org/wordprocessingml/2006/main" xmlns:w14="http://schemas.microsoft.com/office/word/2010/wordml" xmlns:w15="http://schemas.microsoft.com/office/word/2012/wordml" xmlns:w16cex="http://schemas.microsoft.com/office/word/2018/wordml/cex" xmlns:w16cid="http://schemas.microsoft.com/office/word/2016/wordml/cid" xmlns:w16="http://schemas.microsoft.com/office/word/2018/wordml" xmlns:w16sdtdh="http://schemas.microsoft.com/office/word/2020/wordml/sdtdatahash" xmlns:w16se="http://schemas.microsoft.com/office/word/2015/wordml/symex" xmlns:wpg="http://schemas.microsoft.com/office/word/2010/wordprocessingGroup" xmlns:wpi="http://schemas.microsoft.com/office/word/2010/wordprocessingInk" xmlns:wne="http://schemas.microsoft.com/office/word/2006/wordml" xmlns:wps="http://schemas.microsoft.com/office/word/2010/wordprocessingShape" mc:Ignorable="w14 w15 w16se w16cid w16 w16cex w16sdtdh wp14">
+  <w:p>
     <w:pPr>
       <w:pStyle w:val="af4"/>
       <w:jc w:val="center"/>
@@ -2107,20 +2623,23 @@
 </file>
 
 <file path=word/footer3.xml><?xml version="1.0" encoding="utf-8"?>
-<w:ftr xmlns:ns1="http://schemas.openxmlformats.org/markup-compatibility/2006" xmlns:ns2="http://schemas.microsoft.com/office/word/2010/wordml" xmlns:w="http://schemas.openxmlformats.org/wordprocessingml/2006/main" ns1:Ignorable="w14 w15 w16se w16cid w16 w16cex w16sdtdh w16sdtfl w16du wp14">
+<w:ftr xmlns:wpc="http://schemas.microsoft.com/office/word/2010/wordprocessingCanvas" xmlns:cx="http://schemas.microsoft.com/office/drawing/2014/chartex" xmlns:cx1="http://schemas.microsoft.com/office/drawing/2015/9/8/chartex" xmlns:cx2="http://schemas.microsoft.com/office/drawing/2015/10/21/chartex" xmlns:cx3="http://schemas.microsoft.com/office/drawing/2016/5/9/chartex" xmlns:cx4="http://schemas.microsoft.com/office/drawing/2016/5/10/chartex" xmlns:cx5="http://schemas.microsoft.com/office/drawing/2016/5/11/chartex" xmlns:cx6="http://schemas.microsoft.com/office/drawing/2016/5/12/chartex" xmlns:cx7="http://schemas.microsoft.com/office/drawing/2016/5/13/chartex" xmlns:cx8="http://schemas.microsoft.com/office/drawing/2016/5/14/chartex" xmlns:mc="http://schemas.openxmlformats.org/markup-compatibility/2006" xmlns:aink="http://schemas.microsoft.com/office/drawing/2016/ink" xmlns:am3d="http://schemas.microsoft.com/office/drawing/2017/model3d" xmlns:o="urn:schemas-microsoft-com:office:office" xmlns:r="http://schemas.openxmlformats.org/officeDocument/2006/relationships" xmlns:m="http://schemas.openxmlformats.org/officeDocument/2006/math" xmlns:v="urn:schemas-microsoft-com:vml" xmlns:wp14="http://schemas.microsoft.com/office/word/2010/wordprocessingDrawing" xmlns:wp="http://schemas.openxmlformats.org/drawingml/2006/wordprocessingDrawing" xmlns:w10="urn:schemas-microsoft-com:office:word" xmlns:w="http://schemas.openxmlformats.org/wordprocessingml/2006/main" xmlns:w14="http://schemas.microsoft.com/office/word/2010/wordml" xmlns:w15="http://schemas.microsoft.com/office/word/2012/wordml" xmlns:w16cex="http://schemas.microsoft.com/office/word/2018/wordml/cex" xmlns:w16cid="http://schemas.microsoft.com/office/word/2016/wordml/cid" xmlns:w16="http://schemas.microsoft.com/office/word/2018/wordml" xmlns:w16sdtdh="http://schemas.microsoft.com/office/word/2020/wordml/sdtdatahash" xmlns:w16se="http://schemas.microsoft.com/office/word/2015/wordml/symex" xmlns:wpg="http://schemas.microsoft.com/office/word/2010/wordprocessingGroup" xmlns:wpi="http://schemas.microsoft.com/office/word/2010/wordprocessingInk" xmlns:wne="http://schemas.microsoft.com/office/word/2006/wordml" xmlns:wps="http://schemas.microsoft.com/office/word/2010/wordprocessingShape" mc:Ignorable="w14 w15 w16se w16cid w16 w16cex w16sdtdh wp14">
   <w:sdt>
     <w:sdtPr>
-      <w:id w:val="-1075114195"/>
+      <w:id w:val="-921403694"/>
       <w:docPartObj>
         <w:docPartGallery w:val="Page Numbers (Bottom of Page)"/>
         <w:docPartUnique/>
       </w:docPartObj>
     </w:sdtPr>
     <w:sdtContent>
-      <w:p ns2:paraId="35300046" ns2:textId="42EC1B81">
+      <w:p>
         <w:pPr>
           <w:pStyle w:val="af4"/>
           <w:jc w:val="center"/>
+          <w:rPr>
+            <w:rFonts w:hint="eastAsia"/>
+          </w:rPr>
         </w:pPr>
         <w:r>
           <w:fldChar w:fldCharType="begin"/>
@@ -2147,8 +2666,8 @@
 </file>
 
 <file path=word/footer4.xml><?xml version="1.0" encoding="utf-8"?>
-<w:ftr xmlns:ns1="http://schemas.openxmlformats.org/markup-compatibility/2006" xmlns:ns2="http://schemas.microsoft.com/office/word/2010/wordml" xmlns:w="http://schemas.openxmlformats.org/wordprocessingml/2006/main" ns1:Ignorable="w14 w15 w16se w16cid w16 w16cex w16sdtdh w16sdtfl w16du wp14">
-  <w:p ns2:paraId="58EB4D6C" ns2:textId="77777777">
+<w:ftr xmlns:wpc="http://schemas.microsoft.com/office/word/2010/wordprocessingCanvas" xmlns:cx="http://schemas.microsoft.com/office/drawing/2014/chartex" xmlns:cx1="http://schemas.microsoft.com/office/drawing/2015/9/8/chartex" xmlns:cx2="http://schemas.microsoft.com/office/drawing/2015/10/21/chartex" xmlns:cx3="http://schemas.microsoft.com/office/drawing/2016/5/9/chartex" xmlns:cx4="http://schemas.microsoft.com/office/drawing/2016/5/10/chartex" xmlns:cx5="http://schemas.microsoft.com/office/drawing/2016/5/11/chartex" xmlns:cx6="http://schemas.microsoft.com/office/drawing/2016/5/12/chartex" xmlns:cx7="http://schemas.microsoft.com/office/drawing/2016/5/13/chartex" xmlns:cx8="http://schemas.microsoft.com/office/drawing/2016/5/14/chartex" xmlns:mc="http://schemas.openxmlformats.org/markup-compatibility/2006" xmlns:aink="http://schemas.microsoft.com/office/drawing/2016/ink" xmlns:am3d="http://schemas.microsoft.com/office/drawing/2017/model3d" xmlns:o="urn:schemas-microsoft-com:office:office" xmlns:r="http://schemas.openxmlformats.org/officeDocument/2006/relationships" xmlns:m="http://schemas.openxmlformats.org/officeDocument/2006/math" xmlns:v="urn:schemas-microsoft-com:vml" xmlns:wp14="http://schemas.microsoft.com/office/word/2010/wordprocessingDrawing" xmlns:wp="http://schemas.openxmlformats.org/drawingml/2006/wordprocessingDrawing" xmlns:w10="urn:schemas-microsoft-com:office:word" xmlns:w="http://schemas.openxmlformats.org/wordprocessingml/2006/main" xmlns:w14="http://schemas.microsoft.com/office/word/2010/wordml" xmlns:w15="http://schemas.microsoft.com/office/word/2012/wordml" xmlns:w16cex="http://schemas.microsoft.com/office/word/2018/wordml/cex" xmlns:w16cid="http://schemas.microsoft.com/office/word/2016/wordml/cid" xmlns:w16="http://schemas.microsoft.com/office/word/2018/wordml" xmlns:w16sdtdh="http://schemas.microsoft.com/office/word/2020/wordml/sdtdatahash" xmlns:w16se="http://schemas.microsoft.com/office/word/2015/wordml/symex" xmlns:wpg="http://schemas.microsoft.com/office/word/2010/wordprocessingGroup" xmlns:wpi="http://schemas.microsoft.com/office/word/2010/wordprocessingInk" xmlns:wne="http://schemas.microsoft.com/office/word/2006/wordml" xmlns:wps="http://schemas.microsoft.com/office/word/2010/wordprocessingShape" mc:Ignorable="w14 w15 w16se w16cid w16 w16cex w16sdtdh wp14">
+  <w:p>
     <w:pPr>
       <w:pStyle w:val="af4"/>
       <w:jc w:val="center"/>
@@ -2158,9 +2677,9 @@
 </file>
 
 <file path=word/footnotes.xml><?xml version="1.0" encoding="utf-8"?>
-<w:footnotes xmlns:ns1="http://schemas.openxmlformats.org/markup-compatibility/2006" xmlns:ns2="http://schemas.microsoft.com/office/word/2010/wordml" xmlns:w="http://schemas.openxmlformats.org/wordprocessingml/2006/main" ns1:Ignorable="w14 w15 w16se w16cid w16 w16cex w16sdtdh w16sdtfl w16du wp14">
+<w:footnotes xmlns:wpc="http://schemas.microsoft.com/office/word/2010/wordprocessingCanvas" xmlns:cx="http://schemas.microsoft.com/office/drawing/2014/chartex" xmlns:cx1="http://schemas.microsoft.com/office/drawing/2015/9/8/chartex" xmlns:cx2="http://schemas.microsoft.com/office/drawing/2015/10/21/chartex" xmlns:cx3="http://schemas.microsoft.com/office/drawing/2016/5/9/chartex" xmlns:cx4="http://schemas.microsoft.com/office/drawing/2016/5/10/chartex" xmlns:cx5="http://schemas.microsoft.com/office/drawing/2016/5/11/chartex" xmlns:cx6="http://schemas.microsoft.com/office/drawing/2016/5/12/chartex" xmlns:cx7="http://schemas.microsoft.com/office/drawing/2016/5/13/chartex" xmlns:cx8="http://schemas.microsoft.com/office/drawing/2016/5/14/chartex" xmlns:mc="http://schemas.openxmlformats.org/markup-compatibility/2006" xmlns:aink="http://schemas.microsoft.com/office/drawing/2016/ink" xmlns:am3d="http://schemas.microsoft.com/office/drawing/2017/model3d" xmlns:o="urn:schemas-microsoft-com:office:office" xmlns:r="http://schemas.openxmlformats.org/officeDocument/2006/relationships" xmlns:m="http://schemas.openxmlformats.org/officeDocument/2006/math" xmlns:v="urn:schemas-microsoft-com:vml" xmlns:wp14="http://schemas.microsoft.com/office/word/2010/wordprocessingDrawing" xmlns:wp="http://schemas.openxmlformats.org/drawingml/2006/wordprocessingDrawing" xmlns:w10="urn:schemas-microsoft-com:office:word" xmlns:w="http://schemas.openxmlformats.org/wordprocessingml/2006/main" xmlns:w14="http://schemas.microsoft.com/office/word/2010/wordml" xmlns:w15="http://schemas.microsoft.com/office/word/2012/wordml" xmlns:w16cex="http://schemas.microsoft.com/office/word/2018/wordml/cex" xmlns:w16cid="http://schemas.microsoft.com/office/word/2016/wordml/cid" xmlns:w16="http://schemas.microsoft.com/office/word/2018/wordml" xmlns:w16sdtdh="http://schemas.microsoft.com/office/word/2020/wordml/sdtdatahash" xmlns:w16se="http://schemas.microsoft.com/office/word/2015/wordml/symex" xmlns:wpg="http://schemas.microsoft.com/office/word/2010/wordprocessingGroup" xmlns:wpi="http://schemas.microsoft.com/office/word/2010/wordprocessingInk" xmlns:wne="http://schemas.microsoft.com/office/word/2006/wordml" xmlns:wps="http://schemas.microsoft.com/office/word/2010/wordprocessingShape" mc:Ignorable="w14 w15 w16se w16cid w16 w16cex w16sdtdh wp14">
   <w:footnote w:type="separator" w:id="-1">
-    <w:p ns2:paraId="68043B0C" ns2:textId="77777777">
+    <w:p>
       <w:pPr>
         <w:spacing w:line="240" w:lineRule="auto"/>
       </w:pPr>
@@ -2170,7 +2689,7 @@
     </w:p>
   </w:footnote>
   <w:footnote w:type="continuationSeparator" w:id="0">
-    <w:p ns2:paraId="6F55EFE2" ns2:textId="77777777">
+    <w:p>
       <w:pPr>
         <w:spacing w:line="240" w:lineRule="auto"/>
       </w:pPr>
@@ -2183,8 +2702,8 @@
 </file>
 
 <file path=word/header1.xml><?xml version="1.0" encoding="utf-8"?>
-<w:hdr xmlns:ns1="http://schemas.openxmlformats.org/markup-compatibility/2006" xmlns:ns2="http://schemas.microsoft.com/office/word/2010/wordml" xmlns:w="http://schemas.openxmlformats.org/wordprocessingml/2006/main" ns1:Ignorable="w14 w15 w16se w16cid w16 w16cex w16sdtdh w16sdtfl w16du wp14">
-  <w:p ns2:paraId="17DB4575" ns2:textId="77777777">
+<w:hdr xmlns:wpc="http://schemas.microsoft.com/office/word/2010/wordprocessingCanvas" xmlns:cx="http://schemas.microsoft.com/office/drawing/2014/chartex" xmlns:cx1="http://schemas.microsoft.com/office/drawing/2015/9/8/chartex" xmlns:cx2="http://schemas.microsoft.com/office/drawing/2015/10/21/chartex" xmlns:cx3="http://schemas.microsoft.com/office/drawing/2016/5/9/chartex" xmlns:cx4="http://schemas.microsoft.com/office/drawing/2016/5/10/chartex" xmlns:cx5="http://schemas.microsoft.com/office/drawing/2016/5/11/chartex" xmlns:cx6="http://schemas.microsoft.com/office/drawing/2016/5/12/chartex" xmlns:cx7="http://schemas.microsoft.com/office/drawing/2016/5/13/chartex" xmlns:cx8="http://schemas.microsoft.com/office/drawing/2016/5/14/chartex" xmlns:mc="http://schemas.openxmlformats.org/markup-compatibility/2006" xmlns:aink="http://schemas.microsoft.com/office/drawing/2016/ink" xmlns:am3d="http://schemas.microsoft.com/office/drawing/2017/model3d" xmlns:o="urn:schemas-microsoft-com:office:office" xmlns:r="http://schemas.openxmlformats.org/officeDocument/2006/relationships" xmlns:m="http://schemas.openxmlformats.org/officeDocument/2006/math" xmlns:v="urn:schemas-microsoft-com:vml" xmlns:wp14="http://schemas.microsoft.com/office/word/2010/wordprocessingDrawing" xmlns:wp="http://schemas.openxmlformats.org/drawingml/2006/wordprocessingDrawing" xmlns:w10="urn:schemas-microsoft-com:office:word" xmlns:w="http://schemas.openxmlformats.org/wordprocessingml/2006/main" xmlns:w14="http://schemas.microsoft.com/office/word/2010/wordml" xmlns:w15="http://schemas.microsoft.com/office/word/2012/wordml" xmlns:w16cex="http://schemas.microsoft.com/office/word/2018/wordml/cex" xmlns:w16cid="http://schemas.microsoft.com/office/word/2016/wordml/cid" xmlns:w16="http://schemas.microsoft.com/office/word/2018/wordml" xmlns:w16sdtdh="http://schemas.microsoft.com/office/word/2020/wordml/sdtdatahash" xmlns:w16se="http://schemas.microsoft.com/office/word/2015/wordml/symex" xmlns:wpg="http://schemas.microsoft.com/office/word/2010/wordprocessingGroup" xmlns:wpi="http://schemas.microsoft.com/office/word/2010/wordprocessingInk" xmlns:wne="http://schemas.microsoft.com/office/word/2006/wordml" xmlns:wps="http://schemas.microsoft.com/office/word/2010/wordprocessingShape" mc:Ignorable="w14 w15 w16se w16cid w16 w16cex w16sdtdh wp14">
+  <w:p>
     <w:pPr>
       <w:pStyle w:val="af9"/>
       <w:pBdr>
@@ -2196,8 +2715,8 @@
 </file>
 
 <file path=word/header2.xml><?xml version="1.0" encoding="utf-8"?>
-<w:hdr xmlns:ns1="http://schemas.openxmlformats.org/markup-compatibility/2006" xmlns:ns2="http://schemas.microsoft.com/office/word/2010/wordml" xmlns:w="http://schemas.openxmlformats.org/wordprocessingml/2006/main" ns1:Ignorable="w14 w15 w16se w16cid w16 w16cex w16sdtdh w16sdtfl w16du wp14">
-  <w:p ns2:paraId="0AFE5FDE" ns2:textId="77777777">
+<w:hdr xmlns:wpc="http://schemas.microsoft.com/office/word/2010/wordprocessingCanvas" xmlns:cx="http://schemas.microsoft.com/office/drawing/2014/chartex" xmlns:cx1="http://schemas.microsoft.com/office/drawing/2015/9/8/chartex" xmlns:cx2="http://schemas.microsoft.com/office/drawing/2015/10/21/chartex" xmlns:cx3="http://schemas.microsoft.com/office/drawing/2016/5/9/chartex" xmlns:cx4="http://schemas.microsoft.com/office/drawing/2016/5/10/chartex" xmlns:cx5="http://schemas.microsoft.com/office/drawing/2016/5/11/chartex" xmlns:cx6="http://schemas.microsoft.com/office/drawing/2016/5/12/chartex" xmlns:cx7="http://schemas.microsoft.com/office/drawing/2016/5/13/chartex" xmlns:cx8="http://schemas.microsoft.com/office/drawing/2016/5/14/chartex" xmlns:mc="http://schemas.openxmlformats.org/markup-compatibility/2006" xmlns:aink="http://schemas.microsoft.com/office/drawing/2016/ink" xmlns:am3d="http://schemas.microsoft.com/office/drawing/2017/model3d" xmlns:o="urn:schemas-microsoft-com:office:office" xmlns:r="http://schemas.openxmlformats.org/officeDocument/2006/relationships" xmlns:m="http://schemas.openxmlformats.org/officeDocument/2006/math" xmlns:v="urn:schemas-microsoft-com:vml" xmlns:wp14="http://schemas.microsoft.com/office/word/2010/wordprocessingDrawing" xmlns:wp="http://schemas.openxmlformats.org/drawingml/2006/wordprocessingDrawing" xmlns:w10="urn:schemas-microsoft-com:office:word" xmlns:w="http://schemas.openxmlformats.org/wordprocessingml/2006/main" xmlns:w14="http://schemas.microsoft.com/office/word/2010/wordml" xmlns:w15="http://schemas.microsoft.com/office/word/2012/wordml" xmlns:w16cex="http://schemas.microsoft.com/office/word/2018/wordml/cex" xmlns:w16cid="http://schemas.microsoft.com/office/word/2016/wordml/cid" xmlns:w16="http://schemas.microsoft.com/office/word/2018/wordml" xmlns:w16sdtdh="http://schemas.microsoft.com/office/word/2020/wordml/sdtdatahash" xmlns:w16se="http://schemas.microsoft.com/office/word/2015/wordml/symex" xmlns:wpg="http://schemas.microsoft.com/office/word/2010/wordprocessingGroup" xmlns:wpi="http://schemas.microsoft.com/office/word/2010/wordprocessingInk" xmlns:wne="http://schemas.microsoft.com/office/word/2006/wordml" xmlns:wps="http://schemas.microsoft.com/office/word/2010/wordprocessingShape" mc:Ignorable="w14 w15 w16se w16cid w16 w16cex w16sdtdh wp14">
+  <w:p>
     <w:pPr>
       <w:pStyle w:val="af9"/>
       <w:pBdr>
@@ -2209,22 +2728,26 @@
 </file>
 
 <file path=word/header3.xml><?xml version="1.0" encoding="utf-8"?>
-<w:hdr xmlns:ns1="http://schemas.openxmlformats.org/markup-compatibility/2006" xmlns:ns2="http://schemas.microsoft.com/office/word/2010/wordml" xmlns:w="http://schemas.openxmlformats.org/wordprocessingml/2006/main" ns1:Ignorable="w14 w15 w16se w16cid w16 w16cex w16sdtdh w16sdtfl w16du wp14">
-  <w:p ns2:paraId="3B6B150C" ns2:textId="13AC94F5">
+<w:hdr xmlns:wpc="http://schemas.microsoft.com/office/word/2010/wordprocessingCanvas" xmlns:cx="http://schemas.microsoft.com/office/drawing/2014/chartex" xmlns:cx1="http://schemas.microsoft.com/office/drawing/2015/9/8/chartex" xmlns:cx2="http://schemas.microsoft.com/office/drawing/2015/10/21/chartex" xmlns:cx3="http://schemas.microsoft.com/office/drawing/2016/5/9/chartex" xmlns:cx4="http://schemas.microsoft.com/office/drawing/2016/5/10/chartex" xmlns:cx5="http://schemas.microsoft.com/office/drawing/2016/5/11/chartex" xmlns:cx6="http://schemas.microsoft.com/office/drawing/2016/5/12/chartex" xmlns:cx7="http://schemas.microsoft.com/office/drawing/2016/5/13/chartex" xmlns:cx8="http://schemas.microsoft.com/office/drawing/2016/5/14/chartex" xmlns:mc="http://schemas.openxmlformats.org/markup-compatibility/2006" xmlns:aink="http://schemas.microsoft.com/office/drawing/2016/ink" xmlns:am3d="http://schemas.microsoft.com/office/drawing/2017/model3d" xmlns:o="urn:schemas-microsoft-com:office:office" xmlns:r="http://schemas.openxmlformats.org/officeDocument/2006/relationships" xmlns:m="http://schemas.openxmlformats.org/officeDocument/2006/math" xmlns:v="urn:schemas-microsoft-com:vml" xmlns:wp14="http://schemas.microsoft.com/office/word/2010/wordprocessingDrawing" xmlns:wp="http://schemas.openxmlformats.org/drawingml/2006/wordprocessingDrawing" xmlns:w10="urn:schemas-microsoft-com:office:word" xmlns:w="http://schemas.openxmlformats.org/wordprocessingml/2006/main" xmlns:w14="http://schemas.microsoft.com/office/word/2010/wordml" xmlns:w15="http://schemas.microsoft.com/office/word/2012/wordml" xmlns:w16cex="http://schemas.microsoft.com/office/word/2018/wordml/cex" xmlns:w16cid="http://schemas.microsoft.com/office/word/2016/wordml/cid" xmlns:w16="http://schemas.microsoft.com/office/word/2018/wordml" xmlns:w16sdtdh="http://schemas.microsoft.com/office/word/2020/wordml/sdtdatahash" xmlns:w16se="http://schemas.microsoft.com/office/word/2015/wordml/symex" xmlns:wpg="http://schemas.microsoft.com/office/word/2010/wordprocessingGroup" xmlns:wpi="http://schemas.microsoft.com/office/word/2010/wordprocessingInk" xmlns:wne="http://schemas.microsoft.com/office/word/2006/wordml" xmlns:wps="http://schemas.microsoft.com/office/word/2010/wordprocessingShape" mc:Ignorable="w14 w15 w16se w16cid w16 w16cex w16sdtdh wp14">
+  <w:p>
     <w:pPr>
       <w:pStyle w:val="af9"/>
       <w:pBdr>
         <w:bottom w:val="none" w:sz="0" w:space="0" w:color="auto"/>
       </w:pBdr>
       <w:jc w:val="left"/>
+      <w:rPr>
+        <w:rFonts w:ascii="楷体_GB2312" w:eastAsia="楷体_GB2312"/>
+        <w:szCs w:val="18"/>
+      </w:rPr>
     </w:pPr>
   </w:p>
 </w:hdr>
 </file>
 
 <file path=word/header4.xml><?xml version="1.0" encoding="utf-8"?>
-<w:hdr xmlns:ns1="http://schemas.openxmlformats.org/markup-compatibility/2006" xmlns:ns2="http://schemas.microsoft.com/office/word/2010/wordml" xmlns:w="http://schemas.openxmlformats.org/wordprocessingml/2006/main" ns1:Ignorable="w14 w15 w16se w16cid w16 w16cex w16sdtdh w16sdtfl w16du wp14">
-  <w:p ns2:paraId="3105CBF3" ns2:textId="46872145">
+<w:hdr xmlns:wpc="http://schemas.microsoft.com/office/word/2010/wordprocessingCanvas" xmlns:cx="http://schemas.microsoft.com/office/drawing/2014/chartex" xmlns:cx1="http://schemas.microsoft.com/office/drawing/2015/9/8/chartex" xmlns:cx2="http://schemas.microsoft.com/office/drawing/2015/10/21/chartex" xmlns:cx3="http://schemas.microsoft.com/office/drawing/2016/5/9/chartex" xmlns:cx4="http://schemas.microsoft.com/office/drawing/2016/5/10/chartex" xmlns:cx5="http://schemas.microsoft.com/office/drawing/2016/5/11/chartex" xmlns:cx6="http://schemas.microsoft.com/office/drawing/2016/5/12/chartex" xmlns:cx7="http://schemas.microsoft.com/office/drawing/2016/5/13/chartex" xmlns:cx8="http://schemas.microsoft.com/office/drawing/2016/5/14/chartex" xmlns:mc="http://schemas.openxmlformats.org/markup-compatibility/2006" xmlns:aink="http://schemas.microsoft.com/office/drawing/2016/ink" xmlns:am3d="http://schemas.microsoft.com/office/drawing/2017/model3d" xmlns:o="urn:schemas-microsoft-com:office:office" xmlns:r="http://schemas.openxmlformats.org/officeDocument/2006/relationships" xmlns:m="http://schemas.openxmlformats.org/officeDocument/2006/math" xmlns:v="urn:schemas-microsoft-com:vml" xmlns:wp14="http://schemas.microsoft.com/office/word/2010/wordprocessingDrawing" xmlns:wp="http://schemas.openxmlformats.org/drawingml/2006/wordprocessingDrawing" xmlns:w10="urn:schemas-microsoft-com:office:word" xmlns:w="http://schemas.openxmlformats.org/wordprocessingml/2006/main" xmlns:w14="http://schemas.microsoft.com/office/word/2010/wordml" xmlns:w15="http://schemas.microsoft.com/office/word/2012/wordml" xmlns:w16cex="http://schemas.microsoft.com/office/word/2018/wordml/cex" xmlns:w16cid="http://schemas.microsoft.com/office/word/2016/wordml/cid" xmlns:w16="http://schemas.microsoft.com/office/word/2018/wordml" xmlns:w16sdtdh="http://schemas.microsoft.com/office/word/2020/wordml/sdtdatahash" xmlns:w16se="http://schemas.microsoft.com/office/word/2015/wordml/symex" xmlns:wpg="http://schemas.microsoft.com/office/word/2010/wordprocessingGroup" xmlns:wpi="http://schemas.microsoft.com/office/word/2010/wordprocessingInk" xmlns:wne="http://schemas.microsoft.com/office/word/2006/wordml" xmlns:wps="http://schemas.microsoft.com/office/word/2010/wordprocessingShape" mc:Ignorable="w14 w15 w16se w16cid w16 w16cex w16sdtdh wp14">
+  <w:p>
     <w:pPr>
       <w:jc w:val="center"/>
     </w:pPr>
@@ -2233,14 +2756,10 @@
 </file>
 
 <file path=word/header5.xml><?xml version="1.0" encoding="utf-8"?>
-<w:hdr xmlns:ns1="http://schemas.openxmlformats.org/markup-compatibility/2006" xmlns:ns2="http://schemas.microsoft.com/office/word/2010/wordml" xmlns:w="http://schemas.openxmlformats.org/wordprocessingml/2006/main" ns1:Ignorable="w14 w15 w16se w16cid w16 w16cex w16sdtdh w16sdtfl w16du wp14">
-  <w:p ns2:paraId="463C184C" ns2:textId="2DADCE4B">
+<w:hdr xmlns:wpc="http://schemas.microsoft.com/office/word/2010/wordprocessingCanvas" xmlns:cx="http://schemas.microsoft.com/office/drawing/2014/chartex" xmlns:cx1="http://schemas.microsoft.com/office/drawing/2015/9/8/chartex" xmlns:cx2="http://schemas.microsoft.com/office/drawing/2015/10/21/chartex" xmlns:cx3="http://schemas.microsoft.com/office/drawing/2016/5/9/chartex" xmlns:cx4="http://schemas.microsoft.com/office/drawing/2016/5/10/chartex" xmlns:cx5="http://schemas.microsoft.com/office/drawing/2016/5/11/chartex" xmlns:cx6="http://schemas.microsoft.com/office/drawing/2016/5/12/chartex" xmlns:cx7="http://schemas.microsoft.com/office/drawing/2016/5/13/chartex" xmlns:cx8="http://schemas.microsoft.com/office/drawing/2016/5/14/chartex" xmlns:mc="http://schemas.openxmlformats.org/markup-compatibility/2006" xmlns:aink="http://schemas.microsoft.com/office/drawing/2016/ink" xmlns:am3d="http://schemas.microsoft.com/office/drawing/2017/model3d" xmlns:o="urn:schemas-microsoft-com:office:office" xmlns:r="http://schemas.openxmlformats.org/officeDocument/2006/relationships" xmlns:m="http://schemas.openxmlformats.org/officeDocument/2006/math" xmlns:v="urn:schemas-microsoft-com:vml" xmlns:wp14="http://schemas.microsoft.com/office/word/2010/wordprocessingDrawing" xmlns:wp="http://schemas.openxmlformats.org/drawingml/2006/wordprocessingDrawing" xmlns:w10="urn:schemas-microsoft-com:office:word" xmlns:w="http://schemas.openxmlformats.org/wordprocessingml/2006/main" xmlns:w14="http://schemas.microsoft.com/office/word/2010/wordml" xmlns:w15="http://schemas.microsoft.com/office/word/2012/wordml" xmlns:w16cex="http://schemas.microsoft.com/office/word/2018/wordml/cex" xmlns:w16cid="http://schemas.microsoft.com/office/word/2016/wordml/cid" xmlns:w16="http://schemas.microsoft.com/office/word/2018/wordml" xmlns:w16sdtdh="http://schemas.microsoft.com/office/word/2020/wordml/sdtdatahash" xmlns:w16se="http://schemas.microsoft.com/office/word/2015/wordml/symex" xmlns:wpg="http://schemas.microsoft.com/office/word/2010/wordprocessingGroup" xmlns:wpi="http://schemas.microsoft.com/office/word/2010/wordprocessingInk" xmlns:wne="http://schemas.microsoft.com/office/word/2006/wordml" xmlns:wps="http://schemas.microsoft.com/office/word/2010/wordprocessingShape" mc:Ignorable="w14 w15 w16se w16cid w16 w16cex w16sdtdh wp14">
+  <w:p>
     <w:pPr>
       <w:pStyle w:val="af9"/>
-      <w:rPr>
-        <w:rFonts w:ascii="楷体_GB2312" w:eastAsia="楷体_GB2312"/>
-        <w:szCs w:val="18"/>
-      </w:rPr>
     </w:pPr>
     <w:r>
       <w:rPr>
@@ -2254,29 +2773,15 @@
         <w:rFonts w:ascii="楷体_GB2312" w:eastAsia="楷体_GB2312" w:hint="eastAsia"/>
         <w:szCs w:val="18"/>
       </w:rPr>
-      <w:t>大学</w:t>
-    </w:r>
-    <w:r>
-      <w:rPr>
-        <w:rFonts w:ascii="楷体_GB2312" w:eastAsia="楷体_GB2312" w:hint="eastAsia"/>
-        <w:szCs w:val="18"/>
-      </w:rPr>
-      <w:t>xx</w:t>
-    </w:r>
-    <w:r>
-      <w:rPr>
-        <w:rFonts w:ascii="楷体_GB2312" w:eastAsia="楷体_GB2312" w:hint="eastAsia"/>
-        <w:szCs w:val="18"/>
-      </w:rPr>
-      <w:t>学位论文文献综述</w:t>
+      <w:t>博士学位论文开题报告</w:t>
     </w:r>
   </w:p>
 </w:hdr>
 </file>
 
 <file path=word/header6.xml><?xml version="1.0" encoding="utf-8"?>
-<w:hdr xmlns:ns1="http://schemas.openxmlformats.org/markup-compatibility/2006" xmlns:ns2="http://schemas.microsoft.com/office/word/2010/wordml" xmlns:w="http://schemas.openxmlformats.org/wordprocessingml/2006/main" ns1:Ignorable="w14 w15 w16se w16cid w16 w16cex w16sdtdh w16sdtfl w16du wp14">
-  <w:p ns2:paraId="1C796040" ns2:textId="49143BD8">
+<w:hdr xmlns:wpc="http://schemas.microsoft.com/office/word/2010/wordprocessingCanvas" xmlns:cx="http://schemas.microsoft.com/office/drawing/2014/chartex" xmlns:cx1="http://schemas.microsoft.com/office/drawing/2015/9/8/chartex" xmlns:cx2="http://schemas.microsoft.com/office/drawing/2015/10/21/chartex" xmlns:cx3="http://schemas.microsoft.com/office/drawing/2016/5/9/chartex" xmlns:cx4="http://schemas.microsoft.com/office/drawing/2016/5/10/chartex" xmlns:cx5="http://schemas.microsoft.com/office/drawing/2016/5/11/chartex" xmlns:cx6="http://schemas.microsoft.com/office/drawing/2016/5/12/chartex" xmlns:cx7="http://schemas.microsoft.com/office/drawing/2016/5/13/chartex" xmlns:cx8="http://schemas.microsoft.com/office/drawing/2016/5/14/chartex" xmlns:mc="http://schemas.openxmlformats.org/markup-compatibility/2006" xmlns:aink="http://schemas.microsoft.com/office/drawing/2016/ink" xmlns:am3d="http://schemas.microsoft.com/office/drawing/2017/model3d" xmlns:o="urn:schemas-microsoft-com:office:office" xmlns:r="http://schemas.openxmlformats.org/officeDocument/2006/relationships" xmlns:m="http://schemas.openxmlformats.org/officeDocument/2006/math" xmlns:v="urn:schemas-microsoft-com:vml" xmlns:wp14="http://schemas.microsoft.com/office/word/2010/wordprocessingDrawing" xmlns:wp="http://schemas.openxmlformats.org/drawingml/2006/wordprocessingDrawing" xmlns:w10="urn:schemas-microsoft-com:office:word" xmlns:w="http://schemas.openxmlformats.org/wordprocessingml/2006/main" xmlns:w14="http://schemas.microsoft.com/office/word/2010/wordml" xmlns:w15="http://schemas.microsoft.com/office/word/2012/wordml" xmlns:w16cex="http://schemas.microsoft.com/office/word/2018/wordml/cex" xmlns:w16cid="http://schemas.microsoft.com/office/word/2016/wordml/cid" xmlns:w16="http://schemas.microsoft.com/office/word/2018/wordml" xmlns:w16sdtdh="http://schemas.microsoft.com/office/word/2020/wordml/sdtdatahash" xmlns:w16se="http://schemas.microsoft.com/office/word/2015/wordml/symex" xmlns:wpg="http://schemas.microsoft.com/office/word/2010/wordprocessingGroup" xmlns:wpi="http://schemas.microsoft.com/office/word/2010/wordprocessingInk" xmlns:wne="http://schemas.microsoft.com/office/word/2006/wordml" xmlns:wps="http://schemas.microsoft.com/office/word/2010/wordprocessingShape" mc:Ignorable="w14 w15 w16se w16cid w16 w16cex w16sdtdh wp14">
+  <w:p>
     <w:pPr>
       <w:jc w:val="center"/>
     </w:pPr>
@@ -2285,8 +2790,8 @@
 </file>
 
 <file path=word/numbering.xml><?xml version="1.0" encoding="utf-8"?>
-<w:numbering xmlns:ns1="http://schemas.openxmlformats.org/markup-compatibility/2006" xmlns:ns2="http://schemas.microsoft.com/office/word/2012/wordml" xmlns:ns3="http://schemas.microsoft.com/office/word/2016/wordml/cid" xmlns:w="http://schemas.openxmlformats.org/wordprocessingml/2006/main" ns1:Ignorable="w14 w15 w16se w16cid w16 w16cex w16sdtdh w16sdtfl w16du wp14">
-  <w:abstractNum w:abstractNumId="0" ns2:restartNumberingAfterBreak="0">
+<w:numbering xmlns:wpc="http://schemas.microsoft.com/office/word/2010/wordprocessingCanvas" xmlns:cx="http://schemas.microsoft.com/office/drawing/2014/chartex" xmlns:cx1="http://schemas.microsoft.com/office/drawing/2015/9/8/chartex" xmlns:cx2="http://schemas.microsoft.com/office/drawing/2015/10/21/chartex" xmlns:cx3="http://schemas.microsoft.com/office/drawing/2016/5/9/chartex" xmlns:cx4="http://schemas.microsoft.com/office/drawing/2016/5/10/chartex" xmlns:cx5="http://schemas.microsoft.com/office/drawing/2016/5/11/chartex" xmlns:cx6="http://schemas.microsoft.com/office/drawing/2016/5/12/chartex" xmlns:cx7="http://schemas.microsoft.com/office/drawing/2016/5/13/chartex" xmlns:cx8="http://schemas.microsoft.com/office/drawing/2016/5/14/chartex" xmlns:mc="http://schemas.openxmlformats.org/markup-compatibility/2006" xmlns:aink="http://schemas.microsoft.com/office/drawing/2016/ink" xmlns:am3d="http://schemas.microsoft.com/office/drawing/2017/model3d" xmlns:o="urn:schemas-microsoft-com:office:office" xmlns:r="http://schemas.openxmlformats.org/officeDocument/2006/relationships" xmlns:m="http://schemas.openxmlformats.org/officeDocument/2006/math" xmlns:v="urn:schemas-microsoft-com:vml" xmlns:wp14="http://schemas.microsoft.com/office/word/2010/wordprocessingDrawing" xmlns:wp="http://schemas.openxmlformats.org/drawingml/2006/wordprocessingDrawing" xmlns:w10="urn:schemas-microsoft-com:office:word" xmlns:w="http://schemas.openxmlformats.org/wordprocessingml/2006/main" xmlns:w14="http://schemas.microsoft.com/office/word/2010/wordml" xmlns:w15="http://schemas.microsoft.com/office/word/2012/wordml" xmlns:w16cex="http://schemas.microsoft.com/office/word/2018/wordml/cex" xmlns:w16cid="http://schemas.microsoft.com/office/word/2016/wordml/cid" xmlns:w16="http://schemas.microsoft.com/office/word/2018/wordml" xmlns:w16sdtdh="http://schemas.microsoft.com/office/word/2020/wordml/sdtdatahash" xmlns:w16se="http://schemas.microsoft.com/office/word/2015/wordml/symex" xmlns:wpg="http://schemas.microsoft.com/office/word/2010/wordprocessingGroup" xmlns:wpi="http://schemas.microsoft.com/office/word/2010/wordprocessingInk" xmlns:wne="http://schemas.microsoft.com/office/word/2006/wordml" xmlns:wps="http://schemas.microsoft.com/office/word/2010/wordprocessingShape" mc:Ignorable="w14 w15 w16se w16cid w16 w16cex w16sdtdh wp14">
+  <w:abstractNum w:abstractNumId="0" w15:restartNumberingAfterBreak="0">
     <w:nsid w:val="14F8135F"/>
     <w:multiLevelType w:val="hybridMultilevel"/>
     <w:tmpl w:val="92CAC396"/>
@@ -2399,7 +2904,7 @@
       </w:rPr>
     </w:lvl>
   </w:abstractNum>
-  <w:abstractNum w:abstractNumId="1" ns2:restartNumberingAfterBreak="0">
+  <w:abstractNum w:abstractNumId="1" w15:restartNumberingAfterBreak="0">
     <w:nsid w:val="26567C62"/>
     <w:multiLevelType w:val="multilevel"/>
     <w:tmpl w:val="F8A2FF56"/>
@@ -2427,9 +2932,9 @@
       <w:lvlJc w:val="left"/>
       <w:pPr>
         <w:tabs>
-          <w:tab w:val="num" w:pos="927"/>
+          <w:tab w:val="num" w:pos="567"/>
         </w:tabs>
-        <w:ind w:left="927" w:hanging="567"/>
+        <w:ind w:left="567" w:hanging="567"/>
       </w:pPr>
       <w:rPr>
         <w:rFonts w:hint="eastAsia"/>
@@ -2542,7 +3047,7 @@
       </w:rPr>
     </w:lvl>
   </w:abstractNum>
-  <w:abstractNum w:abstractNumId="2" ns2:restartNumberingAfterBreak="0">
+  <w:abstractNum w:abstractNumId="2" w15:restartNumberingAfterBreak="0">
     <w:nsid w:val="5C26754B"/>
     <w:multiLevelType w:val="hybridMultilevel"/>
     <w:tmpl w:val="9134E796"/>
@@ -2632,42 +3137,33 @@
       </w:pPr>
     </w:lvl>
   </w:abstractNum>
-  <w:num w:numId="1" ns3:durableId="501550381">
+  <w:num w:numId="1">
     <w:abstractNumId w:val="1"/>
   </w:num>
-  <w:num w:numId="2" ns3:durableId="2124231469">
+  <w:num w:numId="2">
     <w:abstractNumId w:val="1"/>
   </w:num>
-  <w:num w:numId="3" ns3:durableId="2059356491">
+  <w:num w:numId="3">
     <w:abstractNumId w:val="2"/>
   </w:num>
-  <w:num w:numId="4" ns3:durableId="977954558">
+  <w:num w:numId="4">
     <w:abstractNumId w:val="1"/>
   </w:num>
-  <w:num w:numId="5" ns3:durableId="437455103">
+  <w:num w:numId="5">
     <w:abstractNumId w:val="1"/>
   </w:num>
-  <w:num w:numId="6" ns3:durableId="299263367">
+  <w:num w:numId="6">
     <w:abstractNumId w:val="1"/>
   </w:num>
-  <w:num w:numId="7" ns3:durableId="467629131">
+  <w:num w:numId="7">
     <w:abstractNumId w:val="0"/>
-  </w:num>
-  <w:num w:numId="8" ns3:durableId="1890071837">
-    <w:abstractNumId w:val="1"/>
-  </w:num>
-  <w:num w:numId="9" ns3:durableId="1507549955">
-    <w:abstractNumId w:val="1"/>
-  </w:num>
-  <w:num w:numId="10" ns3:durableId="795413948">
-    <w:abstractNumId w:val="1"/>
   </w:num>
   <w:numIdMacAtCleanup w:val="3"/>
 </w:numbering>
 </file>
 
 <file path=word/styles.xml><?xml version="1.0" encoding="utf-8"?>
-<w:styles xmlns:ns1="http://schemas.openxmlformats.org/markup-compatibility/2006" xmlns:w="http://schemas.openxmlformats.org/wordprocessingml/2006/main" ns1:Ignorable="w14 w15 w16se w16cid w16 w16cex w16sdtdh w16sdtfl w16du">
+<w:styles xmlns:mc="http://schemas.openxmlformats.org/markup-compatibility/2006" xmlns:r="http://schemas.openxmlformats.org/officeDocument/2006/relationships" xmlns:w="http://schemas.openxmlformats.org/wordprocessingml/2006/main" xmlns:w14="http://schemas.microsoft.com/office/word/2010/wordml" xmlns:w15="http://schemas.microsoft.com/office/word/2012/wordml" xmlns:w16cex="http://schemas.microsoft.com/office/word/2018/wordml/cex" xmlns:w16cid="http://schemas.microsoft.com/office/word/2016/wordml/cid" xmlns:w16="http://schemas.microsoft.com/office/word/2018/wordml" xmlns:w16sdtdh="http://schemas.microsoft.com/office/word/2020/wordml/sdtdatahash" xmlns:w16se="http://schemas.microsoft.com/office/word/2015/wordml/symex" mc:Ignorable="w14 w15 w16se w16cid w16 w16cex w16sdtdh">
   <w:docDefaults>
     <w:rPrDefault>
       <w:rPr>
@@ -2709,7 +3205,7 @@
     <w:lsdException w:name="Normal Indent" w:semiHidden="1" w:unhideWhenUsed="1" w:qFormat="1"/>
     <w:lsdException w:name="footnote text" w:semiHidden="1" w:uiPriority="0" w:unhideWhenUsed="1"/>
     <w:lsdException w:name="annotation text" w:semiHidden="1" w:uiPriority="0" w:unhideWhenUsed="1"/>
-    <w:lsdException w:name="header" w:semiHidden="1" w:uiPriority="0" w:unhideWhenUsed="1"/>
+    <w:lsdException w:name="header" w:semiHidden="1" w:unhideWhenUsed="1" w:qFormat="1"/>
     <w:lsdException w:name="footer" w:semiHidden="1" w:unhideWhenUsed="1"/>
     <w:lsdException w:name="index heading" w:semiHidden="1" w:uiPriority="0" w:unhideWhenUsed="1"/>
     <w:lsdException w:name="caption" w:semiHidden="1" w:uiPriority="0" w:unhideWhenUsed="1" w:qFormat="1"/>
@@ -3107,7 +3603,12 @@
         <w:ilvl w:val="1"/>
         <w:numId w:val="2"/>
       </w:numPr>
+      <w:tabs>
+        <w:tab w:val="clear" w:pos="567"/>
+        <w:tab w:val="num" w:pos="927"/>
+      </w:tabs>
       <w:spacing w:before="240" w:after="240"/>
+      <w:ind w:left="927"/>
       <w:outlineLvl w:val="1"/>
     </w:pPr>
     <w:rPr>
@@ -3508,6 +4009,8 @@
     <w:name w:val="header"/>
     <w:basedOn w:val="a"/>
     <w:link w:val="afa"/>
+    <w:uiPriority w:val="99"/>
+    <w:qFormat/>
     <w:rsid w:val="004C39DC"/>
     <w:pPr>
       <w:pBdr>
@@ -3527,6 +4030,8 @@
   <w:style w:type="character" w:customStyle="1" w:styleId="afa">
     <w:name w:val="页眉 字符"/>
     <w:link w:val="af9"/>
+    <w:uiPriority w:val="99"/>
+    <w:qFormat/>
     <w:rsid w:val="004C39DC"/>
     <w:rPr>
       <w:rFonts w:ascii="Times New Roman" w:eastAsia="宋体" w:hAnsi="Times New Roman" w:cs="Times New Roman"/>
@@ -4376,7 +4881,7 @@
     <w:link w:val="affd"/>
     <w:qFormat/>
     <w:locked/>
-    <w:rsid w:val="00960E58"/>
+    <w:rsid w:val="00892B1E"/>
     <w:rPr>
       <w:rFonts w:asciiTheme="minorHAnsi" w:eastAsia="黑体" w:hAnsiTheme="minorHAnsi" w:cstheme="minorBidi"/>
       <w:kern w:val="44"/>
@@ -4389,7 +4894,7 @@
     <w:basedOn w:val="1"/>
     <w:link w:val="affc"/>
     <w:qFormat/>
-    <w:rsid w:val="00960E58"/>
+    <w:rsid w:val="00892B1E"/>
     <w:pPr>
       <w:keepNext/>
       <w:numPr>
@@ -4411,262 +4916,262 @@
 </file>
 
 <file path=word/theme/theme1.xml><?xml version="1.0" encoding="utf-8"?>
-<ns0:theme xmlns:ns0="http://schemas.openxmlformats.org/drawingml/2006/main" xmlns:ns1="http://schemas.microsoft.com/office/thememl/2012/main" name="Office 主题​​">
-  <ns0:themeElements>
-    <ns0:clrScheme name="Office">
-      <ns0:dk1>
-        <ns0:sysClr val="windowText" lastClr="000000"/>
-      </ns0:dk1>
-      <ns0:lt1>
-        <ns0:sysClr val="window" lastClr="FFFFFF"/>
-      </ns0:lt1>
-      <ns0:dk2>
-        <ns0:srgbClr val="44546A"/>
-      </ns0:dk2>
-      <ns0:lt2>
-        <ns0:srgbClr val="E7E6E6"/>
-      </ns0:lt2>
-      <ns0:accent1>
-        <ns0:srgbClr val="5B9BD5"/>
-      </ns0:accent1>
-      <ns0:accent2>
-        <ns0:srgbClr val="ED7D31"/>
-      </ns0:accent2>
-      <ns0:accent3>
-        <ns0:srgbClr val="A5A5A5"/>
-      </ns0:accent3>
-      <ns0:accent4>
-        <ns0:srgbClr val="FFC000"/>
-      </ns0:accent4>
-      <ns0:accent5>
-        <ns0:srgbClr val="4472C4"/>
-      </ns0:accent5>
-      <ns0:accent6>
-        <ns0:srgbClr val="70AD47"/>
-      </ns0:accent6>
-      <ns0:hlink>
-        <ns0:srgbClr val="0563C1"/>
-      </ns0:hlink>
-      <ns0:folHlink>
-        <ns0:srgbClr val="954F72"/>
-      </ns0:folHlink>
-    </ns0:clrScheme>
-    <ns0:fontScheme name="Office">
-      <ns0:majorFont>
-        <ns0:latin typeface="等线 Light" panose="020F0302020204030204"/>
-        <ns0:ea typeface=""/>
-        <ns0:cs typeface=""/>
-        <ns0:font script="Jpan" typeface="游ゴシック Light"/>
-        <ns0:font script="Hang" typeface="맑은 고딕"/>
-        <ns0:font script="Hans" typeface="等线 Light"/>
-        <ns0:font script="Hant" typeface="新細明體"/>
-        <ns0:font script="Arab" typeface="Times New Roman"/>
-        <ns0:font script="Hebr" typeface="Times New Roman"/>
-        <ns0:font script="Thai" typeface="Angsana New"/>
-        <ns0:font script="Ethi" typeface="Nyala"/>
-        <ns0:font script="Beng" typeface="Vrinda"/>
-        <ns0:font script="Gujr" typeface="Shruti"/>
-        <ns0:font script="Khmr" typeface="MoolBoran"/>
-        <ns0:font script="Knda" typeface="Tunga"/>
-        <ns0:font script="Guru" typeface="Raavi"/>
-        <ns0:font script="Cans" typeface="Euphemia"/>
-        <ns0:font script="Cher" typeface="Plantagenet Cherokee"/>
-        <ns0:font script="Yiii" typeface="Microsoft Yi Baiti"/>
-        <ns0:font script="Tibt" typeface="Microsoft Himalaya"/>
-        <ns0:font script="Thaa" typeface="MV Boli"/>
-        <ns0:font script="Deva" typeface="Mangal"/>
-        <ns0:font script="Telu" typeface="Gautami"/>
-        <ns0:font script="Taml" typeface="Latha"/>
-        <ns0:font script="Syrc" typeface="Estrangelo Edessa"/>
-        <ns0:font script="Orya" typeface="Kalinga"/>
-        <ns0:font script="Mlym" typeface="Kartika"/>
-        <ns0:font script="Laoo" typeface="DokChampa"/>
-        <ns0:font script="Sinh" typeface="Iskoola Pota"/>
-        <ns0:font script="Mong" typeface="Mongolian Baiti"/>
-        <ns0:font script="Viet" typeface="Times New Roman"/>
-        <ns0:font script="Uigh" typeface="Microsoft Uighur"/>
-        <ns0:font script="Geor" typeface="Sylfaen"/>
-      </ns0:majorFont>
-      <ns0:minorFont>
-        <ns0:latin typeface="等线" panose="020F0502020204030204"/>
-        <ns0:ea typeface=""/>
-        <ns0:cs typeface=""/>
-        <ns0:font script="Jpan" typeface="游明朝"/>
-        <ns0:font script="Hang" typeface="맑은 고딕"/>
-        <ns0:font script="Hans" typeface="等线"/>
-        <ns0:font script="Hant" typeface="新細明體"/>
-        <ns0:font script="Arab" typeface="Arial"/>
-        <ns0:font script="Hebr" typeface="Arial"/>
-        <ns0:font script="Thai" typeface="Cordia New"/>
-        <ns0:font script="Ethi" typeface="Nyala"/>
-        <ns0:font script="Beng" typeface="Vrinda"/>
-        <ns0:font script="Gujr" typeface="Shruti"/>
-        <ns0:font script="Khmr" typeface="DaunPenh"/>
-        <ns0:font script="Knda" typeface="Tunga"/>
-        <ns0:font script="Guru" typeface="Raavi"/>
-        <ns0:font script="Cans" typeface="Euphemia"/>
-        <ns0:font script="Cher" typeface="Plantagenet Cherokee"/>
-        <ns0:font script="Yiii" typeface="Microsoft Yi Baiti"/>
-        <ns0:font script="Tibt" typeface="Microsoft Himalaya"/>
-        <ns0:font script="Thaa" typeface="MV Boli"/>
-        <ns0:font script="Deva" typeface="Mangal"/>
-        <ns0:font script="Telu" typeface="Gautami"/>
-        <ns0:font script="Taml" typeface="Latha"/>
-        <ns0:font script="Syrc" typeface="Estrangelo Edessa"/>
-        <ns0:font script="Orya" typeface="Kalinga"/>
-        <ns0:font script="Mlym" typeface="Kartika"/>
-        <ns0:font script="Laoo" typeface="DokChampa"/>
-        <ns0:font script="Sinh" typeface="Iskoola Pota"/>
-        <ns0:font script="Mong" typeface="Mongolian Baiti"/>
-        <ns0:font script="Viet" typeface="Arial"/>
-        <ns0:font script="Uigh" typeface="Microsoft Uighur"/>
-        <ns0:font script="Geor" typeface="Sylfaen"/>
-      </ns0:minorFont>
-    </ns0:fontScheme>
-    <ns0:fmtScheme name="Office">
-      <ns0:fillStyleLst>
-        <ns0:solidFill>
-          <ns0:schemeClr val="phClr"/>
-        </ns0:solidFill>
-        <ns0:gradFill rotWithShape="1">
-          <ns0:gsLst>
-            <ns0:gs pos="0">
-              <ns0:schemeClr val="phClr">
-                <ns0:lumMod val="110000"/>
-                <ns0:satMod val="105000"/>
-                <ns0:tint val="67000"/>
-              </ns0:schemeClr>
-            </ns0:gs>
-            <ns0:gs pos="50000">
-              <ns0:schemeClr val="phClr">
-                <ns0:lumMod val="105000"/>
-                <ns0:satMod val="103000"/>
-                <ns0:tint val="73000"/>
-              </ns0:schemeClr>
-            </ns0:gs>
-            <ns0:gs pos="100000">
-              <ns0:schemeClr val="phClr">
-                <ns0:lumMod val="105000"/>
-                <ns0:satMod val="109000"/>
-                <ns0:tint val="81000"/>
-              </ns0:schemeClr>
-            </ns0:gs>
-          </ns0:gsLst>
-          <ns0:lin ang="5400000" scaled="0"/>
-        </ns0:gradFill>
-        <ns0:gradFill rotWithShape="1">
-          <ns0:gsLst>
-            <ns0:gs pos="0">
-              <ns0:schemeClr val="phClr">
-                <ns0:satMod val="103000"/>
-                <ns0:lumMod val="102000"/>
-                <ns0:tint val="94000"/>
-              </ns0:schemeClr>
-            </ns0:gs>
-            <ns0:gs pos="50000">
-              <ns0:schemeClr val="phClr">
-                <ns0:satMod val="110000"/>
-                <ns0:lumMod val="100000"/>
-                <ns0:shade val="100000"/>
-              </ns0:schemeClr>
-            </ns0:gs>
-            <ns0:gs pos="100000">
-              <ns0:schemeClr val="phClr">
-                <ns0:lumMod val="99000"/>
-                <ns0:satMod val="120000"/>
-                <ns0:shade val="78000"/>
-              </ns0:schemeClr>
-            </ns0:gs>
-          </ns0:gsLst>
-          <ns0:lin ang="5400000" scaled="0"/>
-        </ns0:gradFill>
-      </ns0:fillStyleLst>
-      <ns0:lnStyleLst>
-        <ns0:ln w="6350" cap="flat" cmpd="sng" algn="ctr">
-          <ns0:solidFill>
-            <ns0:schemeClr val="phClr"/>
-          </ns0:solidFill>
-          <ns0:prstDash val="solid"/>
-          <ns0:miter lim="800000"/>
-        </ns0:ln>
-        <ns0:ln w="12700" cap="flat" cmpd="sng" algn="ctr">
-          <ns0:solidFill>
-            <ns0:schemeClr val="phClr"/>
-          </ns0:solidFill>
-          <ns0:prstDash val="solid"/>
-          <ns0:miter lim="800000"/>
-        </ns0:ln>
-        <ns0:ln w="19050" cap="flat" cmpd="sng" algn="ctr">
-          <ns0:solidFill>
-            <ns0:schemeClr val="phClr"/>
-          </ns0:solidFill>
-          <ns0:prstDash val="solid"/>
-          <ns0:miter lim="800000"/>
-        </ns0:ln>
-      </ns0:lnStyleLst>
-      <ns0:effectStyleLst>
-        <ns0:effectStyle>
-          <ns0:effectLst/>
-        </ns0:effectStyle>
-        <ns0:effectStyle>
-          <ns0:effectLst/>
-        </ns0:effectStyle>
-        <ns0:effectStyle>
-          <ns0:effectLst>
-            <ns0:outerShdw blurRad="57150" dist="19050" dir="5400000" algn="ctr" rotWithShape="0">
-              <ns0:srgbClr val="000000">
-                <ns0:alpha val="63000"/>
-              </ns0:srgbClr>
-            </ns0:outerShdw>
-          </ns0:effectLst>
-        </ns0:effectStyle>
-      </ns0:effectStyleLst>
-      <ns0:bgFillStyleLst>
-        <ns0:solidFill>
-          <ns0:schemeClr val="phClr"/>
-        </ns0:solidFill>
-        <ns0:solidFill>
-          <ns0:schemeClr val="phClr">
-            <ns0:tint val="95000"/>
-            <ns0:satMod val="170000"/>
-          </ns0:schemeClr>
-        </ns0:solidFill>
-        <ns0:gradFill rotWithShape="1">
-          <ns0:gsLst>
-            <ns0:gs pos="0">
-              <ns0:schemeClr val="phClr">
-                <ns0:tint val="93000"/>
-                <ns0:satMod val="150000"/>
-                <ns0:shade val="98000"/>
-                <ns0:lumMod val="102000"/>
-              </ns0:schemeClr>
-            </ns0:gs>
-            <ns0:gs pos="50000">
-              <ns0:schemeClr val="phClr">
-                <ns0:tint val="98000"/>
-                <ns0:satMod val="130000"/>
-                <ns0:shade val="90000"/>
-                <ns0:lumMod val="103000"/>
-              </ns0:schemeClr>
-            </ns0:gs>
-            <ns0:gs pos="100000">
-              <ns0:schemeClr val="phClr">
-                <ns0:shade val="63000"/>
-                <ns0:satMod val="120000"/>
-              </ns0:schemeClr>
-            </ns0:gs>
-          </ns0:gsLst>
-          <ns0:lin ang="5400000" scaled="0"/>
-        </ns0:gradFill>
-      </ns0:bgFillStyleLst>
-    </ns0:fmtScheme>
-  </ns0:themeElements>
-  <ns0:objectDefaults/>
-  <ns0:extraClrSchemeLst/>
-  <ns0:extLst>
-    <ns0:ext uri="{05A4C25C-085E-4340-85A3-A5531E510DB2}">
-      <ns1:themeFamily name="Office Theme" id="{62F939B6-93AF-4DB8-9C6B-D6C7DFDC589F}" vid="{4A3C46E8-61CC-4603-A589-7422A47A8E4A}"/>
-    </ns0:ext>
-  </ns0:extLst>
-</ns0:theme>
+<a:theme xmlns:a="http://schemas.openxmlformats.org/drawingml/2006/main" name="Office 主题​​">
+  <a:themeElements>
+    <a:clrScheme name="Office">
+      <a:dk1>
+        <a:sysClr val="windowText" lastClr="000000"/>
+      </a:dk1>
+      <a:lt1>
+        <a:sysClr val="window" lastClr="FFFFFF"/>
+      </a:lt1>
+      <a:dk2>
+        <a:srgbClr val="44546A"/>
+      </a:dk2>
+      <a:lt2>
+        <a:srgbClr val="E7E6E6"/>
+      </a:lt2>
+      <a:accent1>
+        <a:srgbClr val="5B9BD5"/>
+      </a:accent1>
+      <a:accent2>
+        <a:srgbClr val="ED7D31"/>
+      </a:accent2>
+      <a:accent3>
+        <a:srgbClr val="A5A5A5"/>
+      </a:accent3>
+      <a:accent4>
+        <a:srgbClr val="FFC000"/>
+      </a:accent4>
+      <a:accent5>
+        <a:srgbClr val="4472C4"/>
+      </a:accent5>
+      <a:accent6>
+        <a:srgbClr val="70AD47"/>
+      </a:accent6>
+      <a:hlink>
+        <a:srgbClr val="0563C1"/>
+      </a:hlink>
+      <a:folHlink>
+        <a:srgbClr val="954F72"/>
+      </a:folHlink>
+    </a:clrScheme>
+    <a:fontScheme name="Office">
+      <a:majorFont>
+        <a:latin typeface="等线 Light" panose="020F0302020204030204"/>
+        <a:ea typeface=""/>
+        <a:cs typeface=""/>
+        <a:font script="Jpan" typeface="游ゴシック Light"/>
+        <a:font script="Hang" typeface="맑은 고딕"/>
+        <a:font script="Hans" typeface="等线 Light"/>
+        <a:font script="Hant" typeface="新細明體"/>
+        <a:font script="Arab" typeface="Times New Roman"/>
+        <a:font script="Hebr" typeface="Times New Roman"/>
+        <a:font script="Thai" typeface="Angsana New"/>
+        <a:font script="Ethi" typeface="Nyala"/>
+        <a:font script="Beng" typeface="Vrinda"/>
+        <a:font script="Gujr" typeface="Shruti"/>
+        <a:font script="Khmr" typeface="MoolBoran"/>
+        <a:font script="Knda" typeface="Tunga"/>
+        <a:font script="Guru" typeface="Raavi"/>
+        <a:font script="Cans" typeface="Euphemia"/>
+        <a:font script="Cher" typeface="Plantagenet Cherokee"/>
+        <a:font script="Yiii" typeface="Microsoft Yi Baiti"/>
+        <a:font script="Tibt" typeface="Microsoft Himalaya"/>
+        <a:font script="Thaa" typeface="MV Boli"/>
+        <a:font script="Deva" typeface="Mangal"/>
+        <a:font script="Telu" typeface="Gautami"/>
+        <a:font script="Taml" typeface="Latha"/>
+        <a:font script="Syrc" typeface="Estrangelo Edessa"/>
+        <a:font script="Orya" typeface="Kalinga"/>
+        <a:font script="Mlym" typeface="Kartika"/>
+        <a:font script="Laoo" typeface="DokChampa"/>
+        <a:font script="Sinh" typeface="Iskoola Pota"/>
+        <a:font script="Mong" typeface="Mongolian Baiti"/>
+        <a:font script="Viet" typeface="Times New Roman"/>
+        <a:font script="Uigh" typeface="Microsoft Uighur"/>
+        <a:font script="Geor" typeface="Sylfaen"/>
+      </a:majorFont>
+      <a:minorFont>
+        <a:latin typeface="等线" panose="020F0502020204030204"/>
+        <a:ea typeface=""/>
+        <a:cs typeface=""/>
+        <a:font script="Jpan" typeface="游明朝"/>
+        <a:font script="Hang" typeface="맑은 고딕"/>
+        <a:font script="Hans" typeface="等线"/>
+        <a:font script="Hant" typeface="新細明體"/>
+        <a:font script="Arab" typeface="Arial"/>
+        <a:font script="Hebr" typeface="Arial"/>
+        <a:font script="Thai" typeface="Cordia New"/>
+        <a:font script="Ethi" typeface="Nyala"/>
+        <a:font script="Beng" typeface="Vrinda"/>
+        <a:font script="Gujr" typeface="Shruti"/>
+        <a:font script="Khmr" typeface="DaunPenh"/>
+        <a:font script="Knda" typeface="Tunga"/>
+        <a:font script="Guru" typeface="Raavi"/>
+        <a:font script="Cans" typeface="Euphemia"/>
+        <a:font script="Cher" typeface="Plantagenet Cherokee"/>
+        <a:font script="Yiii" typeface="Microsoft Yi Baiti"/>
+        <a:font script="Tibt" typeface="Microsoft Himalaya"/>
+        <a:font script="Thaa" typeface="MV Boli"/>
+        <a:font script="Deva" typeface="Mangal"/>
+        <a:font script="Telu" typeface="Gautami"/>
+        <a:font script="Taml" typeface="Latha"/>
+        <a:font script="Syrc" typeface="Estrangelo Edessa"/>
+        <a:font script="Orya" typeface="Kalinga"/>
+        <a:font script="Mlym" typeface="Kartika"/>
+        <a:font script="Laoo" typeface="DokChampa"/>
+        <a:font script="Sinh" typeface="Iskoola Pota"/>
+        <a:font script="Mong" typeface="Mongolian Baiti"/>
+        <a:font script="Viet" typeface="Arial"/>
+        <a:font script="Uigh" typeface="Microsoft Uighur"/>
+        <a:font script="Geor" typeface="Sylfaen"/>
+      </a:minorFont>
+    </a:fontScheme>
+    <a:fmtScheme name="Office">
+      <a:fillStyleLst>
+        <a:solidFill>
+          <a:schemeClr val="phClr"/>
+        </a:solidFill>
+        <a:gradFill rotWithShape="1">
+          <a:gsLst>
+            <a:gs pos="0">
+              <a:schemeClr val="phClr">
+                <a:lumMod val="110000"/>
+                <a:satMod val="105000"/>
+                <a:tint val="67000"/>
+              </a:schemeClr>
+            </a:gs>
+            <a:gs pos="50000">
+              <a:schemeClr val="phClr">
+                <a:lumMod val="105000"/>
+                <a:satMod val="103000"/>
+                <a:tint val="73000"/>
+              </a:schemeClr>
+            </a:gs>
+            <a:gs pos="100000">
+              <a:schemeClr val="phClr">
+                <a:lumMod val="105000"/>
+                <a:satMod val="109000"/>
+                <a:tint val="81000"/>
+              </a:schemeClr>
+            </a:gs>
+          </a:gsLst>
+          <a:lin ang="5400000" scaled="0"/>
+        </a:gradFill>
+        <a:gradFill rotWithShape="1">
+          <a:gsLst>
+            <a:gs pos="0">
+              <a:schemeClr val="phClr">
+                <a:satMod val="103000"/>
+                <a:lumMod val="102000"/>
+                <a:tint val="94000"/>
+              </a:schemeClr>
+            </a:gs>
+            <a:gs pos="50000">
+              <a:schemeClr val="phClr">
+                <a:satMod val="110000"/>
+                <a:lumMod val="100000"/>
+                <a:shade val="100000"/>
+              </a:schemeClr>
+            </a:gs>
+            <a:gs pos="100000">
+              <a:schemeClr val="phClr">
+                <a:lumMod val="99000"/>
+                <a:satMod val="120000"/>
+                <a:shade val="78000"/>
+              </a:schemeClr>
+            </a:gs>
+          </a:gsLst>
+          <a:lin ang="5400000" scaled="0"/>
+        </a:gradFill>
+      </a:fillStyleLst>
+      <a:lnStyleLst>
+        <a:ln w="6350" cap="flat" cmpd="sng" algn="ctr">
+          <a:solidFill>
+            <a:schemeClr val="phClr"/>
+          </a:solidFill>
+          <a:prstDash val="solid"/>
+          <a:miter lim="800000"/>
+        </a:ln>
+        <a:ln w="12700" cap="flat" cmpd="sng" algn="ctr">
+          <a:solidFill>
+            <a:schemeClr val="phClr"/>
+          </a:solidFill>
+          <a:prstDash val="solid"/>
+          <a:miter lim="800000"/>
+        </a:ln>
+        <a:ln w="19050" cap="flat" cmpd="sng" algn="ctr">
+          <a:solidFill>
+            <a:schemeClr val="phClr"/>
+          </a:solidFill>
+          <a:prstDash val="solid"/>
+          <a:miter lim="800000"/>
+        </a:ln>
+      </a:lnStyleLst>
+      <a:effectStyleLst>
+        <a:effectStyle>
+          <a:effectLst/>
+        </a:effectStyle>
+        <a:effectStyle>
+          <a:effectLst/>
+        </a:effectStyle>
+        <a:effectStyle>
+          <a:effectLst>
+            <a:outerShdw blurRad="57150" dist="19050" dir="5400000" algn="ctr" rotWithShape="0">
+              <a:srgbClr val="000000">
+                <a:alpha val="63000"/>
+              </a:srgbClr>
+            </a:outerShdw>
+          </a:effectLst>
+        </a:effectStyle>
+      </a:effectStyleLst>
+      <a:bgFillStyleLst>
+        <a:solidFill>
+          <a:schemeClr val="phClr"/>
+        </a:solidFill>
+        <a:solidFill>
+          <a:schemeClr val="phClr">
+            <a:tint val="95000"/>
+            <a:satMod val="170000"/>
+          </a:schemeClr>
+        </a:solidFill>
+        <a:gradFill rotWithShape="1">
+          <a:gsLst>
+            <a:gs pos="0">
+              <a:schemeClr val="phClr">
+                <a:tint val="93000"/>
+                <a:satMod val="150000"/>
+                <a:shade val="98000"/>
+                <a:lumMod val="102000"/>
+              </a:schemeClr>
+            </a:gs>
+            <a:gs pos="50000">
+              <a:schemeClr val="phClr">
+                <a:tint val="98000"/>
+                <a:satMod val="130000"/>
+                <a:shade val="90000"/>
+                <a:lumMod val="103000"/>
+              </a:schemeClr>
+            </a:gs>
+            <a:gs pos="100000">
+              <a:schemeClr val="phClr">
+                <a:shade val="63000"/>
+                <a:satMod val="120000"/>
+              </a:schemeClr>
+            </a:gs>
+          </a:gsLst>
+          <a:lin ang="5400000" scaled="0"/>
+        </a:gradFill>
+      </a:bgFillStyleLst>
+    </a:fmtScheme>
+  </a:themeElements>
+  <a:objectDefaults/>
+  <a:extraClrSchemeLst/>
+  <a:extLst>
+    <a:ext uri="{05A4C25C-085E-4340-85A3-A5531E510DB2}">
+      <thm15:themeFamily xmlns:thm15="http://schemas.microsoft.com/office/thememl/2012/main" name="Office Theme" id="{62F939B6-93AF-4DB8-9C6B-D6C7DFDC589F}" vid="{4A3C46E8-61CC-4603-A589-7422A47A8E4A}"/>
+    </a:ext>
+  </a:extLst>
+</a:theme>
 </file>
</xml_diff>

<commit_message>
Update thesis templates with standardized title formatting and logo
</commit_message>
<xml_diff>
--- a/skills/thesis-literature-review-builder/assets/base-templates/literature-review-template.docx
+++ b/skills/thesis-literature-review-builder/assets/base-templates/literature-review-template.docx
@@ -1,13 +1,13 @@
 
 <file path=word/document.xml><?xml version="1.0" encoding="utf-8"?>
-<w:document xmlns:wpc="http://schemas.microsoft.com/office/word/2010/wordprocessingCanvas" xmlns:cx="http://schemas.microsoft.com/office/drawing/2014/chartex" xmlns:cx1="http://schemas.microsoft.com/office/drawing/2015/9/8/chartex" xmlns:cx2="http://schemas.microsoft.com/office/drawing/2015/10/21/chartex" xmlns:cx3="http://schemas.microsoft.com/office/drawing/2016/5/9/chartex" xmlns:cx4="http://schemas.microsoft.com/office/drawing/2016/5/10/chartex" xmlns:cx5="http://schemas.microsoft.com/office/drawing/2016/5/11/chartex" xmlns:cx6="http://schemas.microsoft.com/office/drawing/2016/5/12/chartex" xmlns:cx7="http://schemas.microsoft.com/office/drawing/2016/5/13/chartex" xmlns:cx8="http://schemas.microsoft.com/office/drawing/2016/5/14/chartex" xmlns:mc="http://schemas.openxmlformats.org/markup-compatibility/2006" xmlns:aink="http://schemas.microsoft.com/office/drawing/2016/ink" xmlns:am3d="http://schemas.microsoft.com/office/drawing/2017/model3d" xmlns:o="urn:schemas-microsoft-com:office:office" xmlns:r="http://schemas.openxmlformats.org/officeDocument/2006/relationships" xmlns:m="http://schemas.openxmlformats.org/officeDocument/2006/math" xmlns:v="urn:schemas-microsoft-com:vml" xmlns:wp14="http://schemas.microsoft.com/office/word/2010/wordprocessingDrawing" xmlns:wp="http://schemas.openxmlformats.org/drawingml/2006/wordprocessingDrawing" xmlns:w10="urn:schemas-microsoft-com:office:word" xmlns:w="http://schemas.openxmlformats.org/wordprocessingml/2006/main" xmlns:w14="http://schemas.microsoft.com/office/word/2010/wordml" xmlns:w15="http://schemas.microsoft.com/office/word/2012/wordml" xmlns:w16cex="http://schemas.microsoft.com/office/word/2018/wordml/cex" xmlns:w16cid="http://schemas.microsoft.com/office/word/2016/wordml/cid" xmlns:w16="http://schemas.microsoft.com/office/word/2018/wordml" xmlns:w16sdtdh="http://schemas.microsoft.com/office/word/2020/wordml/sdtdatahash" xmlns:w16se="http://schemas.microsoft.com/office/word/2015/wordml/symex" xmlns:wpg="http://schemas.microsoft.com/office/word/2010/wordprocessingGroup" xmlns:wpi="http://schemas.microsoft.com/office/word/2010/wordprocessingInk" xmlns:wne="http://schemas.microsoft.com/office/word/2006/wordml" xmlns:wps="http://schemas.microsoft.com/office/word/2010/wordprocessingShape" mc:Ignorable="w14 w15 w16se w16cid w16 w16cex w16sdtdh wp14">
+<w:document xmlns:wpc="http://schemas.microsoft.com/office/word/2010/wordprocessingCanvas" xmlns:cx="http://schemas.microsoft.com/office/drawing/2014/chartex" xmlns:cx1="http://schemas.microsoft.com/office/drawing/2015/9/8/chartex" xmlns:cx2="http://schemas.microsoft.com/office/drawing/2015/10/21/chartex" xmlns:cx3="http://schemas.microsoft.com/office/drawing/2016/5/9/chartex" xmlns:cx4="http://schemas.microsoft.com/office/drawing/2016/5/10/chartex" xmlns:cx5="http://schemas.microsoft.com/office/drawing/2016/5/11/chartex" xmlns:cx6="http://schemas.microsoft.com/office/drawing/2016/5/12/chartex" xmlns:cx7="http://schemas.microsoft.com/office/drawing/2016/5/13/chartex" xmlns:cx8="http://schemas.microsoft.com/office/drawing/2016/5/14/chartex" xmlns:mc="http://schemas.openxmlformats.org/markup-compatibility/2006" xmlns:aink="http://schemas.microsoft.com/office/drawing/2016/ink" xmlns:am3d="http://schemas.microsoft.com/office/drawing/2017/model3d" xmlns:o="urn:schemas-microsoft-com:office:office" xmlns:oel="http://schemas.microsoft.com/office/2019/extlst" xmlns:r="http://schemas.openxmlformats.org/officeDocument/2006/relationships" xmlns:m="http://schemas.openxmlformats.org/officeDocument/2006/math" xmlns:v="urn:schemas-microsoft-com:vml" xmlns:wp14="http://schemas.microsoft.com/office/word/2010/wordprocessingDrawing" xmlns:wp="http://schemas.openxmlformats.org/drawingml/2006/wordprocessingDrawing" xmlns:w10="urn:schemas-microsoft-com:office:word" xmlns:w="http://schemas.openxmlformats.org/wordprocessingml/2006/main" xmlns:w14="http://schemas.microsoft.com/office/word/2010/wordml" xmlns:w15="http://schemas.microsoft.com/office/word/2012/wordml" xmlns:w16cex="http://schemas.microsoft.com/office/word/2018/wordml/cex" xmlns:w16cid="http://schemas.microsoft.com/office/word/2016/wordml/cid" xmlns:w16="http://schemas.microsoft.com/office/word/2018/wordml" xmlns:w16du="http://schemas.microsoft.com/office/word/2023/wordml/word16du" xmlns:w16sdtdh="http://schemas.microsoft.com/office/word/2020/wordml/sdtdatahash" xmlns:w16sdtfl="http://schemas.microsoft.com/office/word/2024/wordml/sdtformatlock" xmlns:w16se="http://schemas.microsoft.com/office/word/2015/wordml/symex" xmlns:wpg="http://schemas.microsoft.com/office/word/2010/wordprocessingGroup" xmlns:wpi="http://schemas.microsoft.com/office/word/2010/wordprocessingInk" xmlns:wne="http://schemas.microsoft.com/office/word/2006/wordml" xmlns:wps="http://schemas.microsoft.com/office/word/2010/wordprocessingShape" mc:Ignorable="w14 w15 w16se w16cid w16 w16cex w16sdtdh w16sdtfl w16du wp14">
   <w:body>
     <w:p>
       <w:pPr>
         <w:spacing w:before="50" w:after="50" w:line="360" w:lineRule="auto"/>
         <w:jc w:val="left"/>
         <w:rPr>
-          <w:rFonts w:ascii="黑体" w:eastAsia="黑体" w:hAnsi="黑体"/>
+          <w:rFonts w:ascii="黑体" w:eastAsia="黑体" w:hAnsi="黑体" w:hint="eastAsia"/>
           <w:b/>
         </w:rPr>
       </w:pPr>
@@ -15,7 +15,7 @@
         <w:rPr>
           <w:position w:val="-4"/>
         </w:rPr>
-        <w:object w:dxaOrig="180" w:dyaOrig="279" w14:anchorId="350CDB52">
+        <w:pict w14:anchorId="350CDB52">
           <v:shapetype id="_x0000_t75" coordsize="21600,21600" o:spt="75" o:preferrelative="t" path="m@4@5l@4@11@9@11@9@5xe" filled="f" stroked="f">
             <v:stroke joinstyle="miter"/>
             <v:formulas>
@@ -35,10 +35,10 @@
             <v:path o:extrusionok="f" gradientshapeok="t" o:connecttype="rect"/>
             <o:lock v:ext="edit" aspectratio="t"/>
           </v:shapetype>
-          <v:shape id="_x0000_i1025" type="#_x0000_t75" style="width:9pt;height:13.5pt" o:ole="">
-            <v:imagedata r:id="rId8" o:title=""/>
+          <v:shape id="_x0000_i1025" type="#_x0000_t75" style="width:9.2pt;height:13.25pt">
+            <v:imagedata r:id="rId7" o:title=""/>
           </v:shape>
-        </w:object>
+        </w:pict>
       </w:r>
       <w:bookmarkStart w:id="0" w:name="_Hlk213750326"/>
     </w:p>
@@ -50,7 +50,7 @@
         <w:spacing w:before="50" w:after="50" w:line="360" w:lineRule="auto"/>
         <w:jc w:val="left"/>
         <w:rPr>
-          <w:rFonts w:ascii="黑体" w:eastAsia="黑体" w:hAnsi="黑体"/>
+          <w:rFonts w:ascii="黑体" w:eastAsia="黑体" w:hAnsi="黑体" w:hint="eastAsia"/>
           <w:b/>
         </w:rPr>
       </w:pPr>
@@ -153,7 +153,7 @@
                                 <w:sz w:val="96"/>
                                 <w:szCs w:val="96"/>
                               </w:rPr>
-                              <w:t>专业</w:t>
+                              <w:t>XX</w:t>
                             </w:r>
                             <w:r>
                               <w:rPr>
@@ -163,7 +163,7 @@
                                 <w:sz w:val="96"/>
                                 <w:szCs w:val="96"/>
                               </w:rPr>
-                              <w:t>博士学位论文开题报告</w:t>
+                              <w:t>学位论文开题报告</w:t>
                             </w:r>
                           </w:p>
                           <w:p>
@@ -198,7 +198,7 @@
                 <v:stroke joinstyle="miter"/>
                 <v:path gradientshapeok="t" o:connecttype="rect"/>
               </v:shapetype>
-              <v:shape id="文本框 4" o:spid="_x0000_s1026" type="#_x0000_t202" style="position:absolute;left:0;text-align:left;margin-left:-.75pt;margin-top:213pt;width:593.25pt;height:81.75pt;z-index:251659264;visibility:visible;mso-wrap-style:square;mso-width-percent:0;mso-height-percent:0;mso-wrap-distance-left:9pt;mso-wrap-distance-top:0;mso-wrap-distance-right:9pt;mso-wrap-distance-bottom:0;mso-position-horizontal:absolute;mso-position-horizontal-relative:page;mso-position-vertical:absolute;mso-position-vertical-relative:page;mso-width-percent:0;mso-height-percent:0;mso-width-relative:margin;mso-height-relative:margin;v-text-anchor:top" o:gfxdata="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" filled="f" stroked="f">
+              <v:shape id="文本框 4" o:spid="_x0000_s1026" type="#_x0000_t202" style="position:absolute;left:0;text-align:left;margin-left:-.75pt;margin-top:213pt;width:593.25pt;height:81.75pt;z-index:251659264;visibility:visible;mso-wrap-style:square;mso-width-percent:0;mso-height-percent:0;mso-wrap-distance-left:9pt;mso-wrap-distance-top:0;mso-wrap-distance-right:9pt;mso-wrap-distance-bottom:0;mso-position-horizontal:absolute;mso-position-horizontal-relative:page;mso-position-vertical:absolute;mso-position-vertical-relative:page;mso-width-percent:0;mso-height-percent:0;mso-width-relative:margin;mso-height-relative:margin;v-text-anchor:top" o:gfxdata="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" filled="f" stroked="f">
                 <v:textbox>
                   <w:txbxContent>
                     <w:p>
@@ -223,7 +223,7 @@
                           <w:sz w:val="96"/>
                           <w:szCs w:val="96"/>
                         </w:rPr>
-                        <w:t>专业</w:t>
+                        <w:t>XX</w:t>
                       </w:r>
                       <w:r>
                         <w:rPr>
@@ -233,7 +233,7 @@
                           <w:sz w:val="96"/>
                           <w:szCs w:val="96"/>
                         </w:rPr>
-                        <w:t>博士学位论文开题报告</w:t>
+                        <w:t>学位论文开题报告</w:t>
                       </w:r>
                     </w:p>
                     <w:p>
@@ -255,56 +255,39 @@
       </w:r>
       <w:r>
         <w:rPr>
+          <w:rFonts w:hint="eastAsia"/>
           <w:noProof/>
-        </w:rPr>
-        <w:drawing>
-          <wp:inline distT="0" distB="0" distL="0" distR="0" wp14:anchorId="04B74905" wp14:editId="0678E663">
-            <wp:extent cx="2726055" cy="363855"/>
-            <wp:effectExtent l="0" t="0" r="0" b="0"/>
-            <wp:docPr id="1" name="图片 1" descr="1"/>
-            <wp:cNvGraphicFramePr>
-              <a:graphicFrameLocks xmlns:a="http://schemas.openxmlformats.org/drawingml/2006/main" noChangeAspect="1"/>
-            </wp:cNvGraphicFramePr>
-            <a:graphic xmlns:a="http://schemas.openxmlformats.org/drawingml/2006/main">
-              <a:graphicData uri="http://schemas.openxmlformats.org/drawingml/2006/picture">
-                <pic:pic xmlns:pic="http://schemas.openxmlformats.org/drawingml/2006/picture">
-                  <pic:nvPicPr>
-                    <pic:cNvPr id="1" name="图片 1" descr="1"/>
-                    <pic:cNvPicPr>
-                      <a:picLocks noChangeAspect="1" noChangeArrowheads="1"/>
-                    </pic:cNvPicPr>
-                  </pic:nvPicPr>
-                  <pic:blipFill>
-                    <a:blip r:embed="rId10" cstate="print">
-                      <a:extLst>
-                        <a:ext uri="{28A0092B-C50C-407E-A947-70E740481C1C}">
-                          <a14:useLocalDpi xmlns:a14="http://schemas.microsoft.com/office/drawing/2010/main" val="0"/>
-                        </a:ext>
-                      </a:extLst>
-                    </a:blip>
-                    <a:srcRect/>
-                    <a:stretch>
-                      <a:fillRect/>
-                    </a:stretch>
-                  </pic:blipFill>
-                  <pic:spPr>
-                    <a:xfrm>
-                      <a:off x="0" y="0"/>
-                      <a:ext cx="2726055" cy="363855"/>
-                    </a:xfrm>
-                    <a:prstGeom prst="rect">
-                      <a:avLst/>
-                    </a:prstGeom>
-                    <a:noFill/>
-                    <a:ln>
-                      <a:noFill/>
-                    </a:ln>
-                  </pic:spPr>
-                </pic:pic>
-              </a:graphicData>
-            </a:graphic>
-          </wp:inline>
-        </w:drawing>
+          <w:sz w:val="32"/>
+          <w:szCs w:val="22"/>
+        </w:rPr>
+        <w:t xml:space="preserve"> </w:t>
+      </w:r>
+      <w:r>
+        <w:rPr>
+          <w:rFonts w:hint="eastAsia"/>
+          <w:noProof/>
+          <w:sz w:val="32"/>
+          <w:szCs w:val="22"/>
+        </w:rPr>
+        <w:t>XX</w:t>
+      </w:r>
+      <w:r>
+        <w:rPr>
+          <w:rFonts w:hint="eastAsia"/>
+          <w:noProof/>
+          <w:sz w:val="32"/>
+          <w:szCs w:val="22"/>
+        </w:rPr>
+        <w:t>大学</w:t>
+      </w:r>
+      <w:r>
+        <w:rPr>
+          <w:rFonts w:hint="eastAsia"/>
+          <w:noProof/>
+          <w:sz w:val="32"/>
+          <w:szCs w:val="22"/>
+        </w:rPr>
+        <w:t>LOGO</w:t>
       </w:r>
     </w:p>
     <w:p>
@@ -366,7 +349,7 @@
         <w:ind w:firstLineChars="800" w:firstLine="2240"/>
         <w:jc w:val="left"/>
         <w:rPr>
-          <w:rFonts w:ascii="黑体" w:eastAsia="黑体" w:hAnsi="黑体"/>
+          <w:rFonts w:ascii="黑体" w:eastAsia="黑体" w:hAnsi="黑体" w:hint="eastAsia"/>
           <w:sz w:val="28"/>
           <w:szCs w:val="28"/>
         </w:rPr>
@@ -413,7 +396,7 @@
         <w:ind w:firstLineChars="800" w:firstLine="2240"/>
         <w:jc w:val="left"/>
         <w:rPr>
-          <w:rFonts w:ascii="黑体" w:eastAsia="黑体" w:hAnsi="黑体"/>
+          <w:rFonts w:ascii="黑体" w:eastAsia="黑体" w:hAnsi="黑体" w:hint="eastAsia"/>
           <w:sz w:val="28"/>
           <w:szCs w:val="28"/>
         </w:rPr>
@@ -452,7 +435,7 @@
         <w:ind w:firstLineChars="800" w:firstLine="2240"/>
         <w:jc w:val="left"/>
         <w:rPr>
-          <w:rFonts w:ascii="黑体" w:eastAsia="黑体" w:hAnsi="黑体"/>
+          <w:rFonts w:ascii="黑体" w:eastAsia="黑体" w:hAnsi="黑体" w:hint="eastAsia"/>
           <w:sz w:val="28"/>
           <w:szCs w:val="28"/>
         </w:rPr>
@@ -512,8 +495,12 @@
           <w:szCs w:val="36"/>
         </w:rPr>
         <w:sectPr>
-          <w:headerReference w:type="even" r:id="rId11"/>
-          <w:headerReference w:type="default" r:id="rId12"/>
+          <w:headerReference w:type="even" r:id="rId8"/>
+          <w:headerReference w:type="default" r:id="rId9"/>
+          <w:footerReference w:type="even" r:id="rId10"/>
+          <w:footerReference w:type="default" r:id="rId11"/>
+          <w:headerReference w:type="first" r:id="rId12"/>
+          <w:footerReference w:type="first" r:id="rId13"/>
           <w:pgSz w:w="11906" w:h="16838"/>
           <w:pgMar w:top="1418" w:right="1418" w:bottom="1701" w:left="1418" w:header="851" w:footer="851" w:gutter="0"/>
           <w:pgNumType w:fmt="numberInDash"/>
@@ -584,6 +571,37 @@
       <w:pPr>
         <w:pStyle w:val="TOC1"/>
         <w:rPr>
+          <w:rFonts w:asciiTheme="minorHAnsi" w:eastAsiaTheme="minorEastAsia" w:hAnsiTheme="minorHAnsi" w:cstheme="minorBidi" w:hint="eastAsia"/>
+          <w:b w:val="0"/>
+          <w:bCs w:val="0"/>
+          <w:caps w:val="0"/>
+          <w:sz w:val="21"/>
+          <w:szCs w:val="22"/>
+        </w:rPr>
+      </w:pPr>
+      <w:r>
+        <w:rPr>
+          <w:szCs w:val="24"/>
+        </w:rPr>
+        <w:fldChar w:fldCharType="begin"/>
+      </w:r>
+      <w:r>
+        <w:rPr>
+          <w:szCs w:val="24"/>
+        </w:rPr>
+        <w:instrText xml:space="preserve"> TOC \o "1-4" </w:instrText>
+      </w:r>
+      <w:r>
+        <w:rPr>
+          <w:szCs w:val="24"/>
+        </w:rPr>
+        <w:fldChar w:fldCharType="separate"/>
+      </w:r>
+      <w:r>
+        <w:t>1</w:t>
+      </w:r>
+      <w:r>
+        <w:rPr>
           <w:rFonts w:asciiTheme="minorHAnsi" w:eastAsiaTheme="minorEastAsia" w:hAnsiTheme="minorHAnsi" w:cstheme="minorBidi"/>
           <w:b w:val="0"/>
           <w:bCs w:val="0"/>
@@ -591,27 +609,176 @@
           <w:sz w:val="21"/>
           <w:szCs w:val="22"/>
         </w:rPr>
-      </w:pPr>
-      <w:r>
-        <w:rPr>
-          <w:szCs w:val="24"/>
-        </w:rPr>
+        <w:tab/>
+      </w:r>
+      <w:r>
+        <w:t>论文选题依据</w:t>
+      </w:r>
+      <w:r>
+        <w:tab/>
+      </w:r>
+      <w:r>
         <w:fldChar w:fldCharType="begin"/>
       </w:r>
       <w:r>
-        <w:rPr>
-          <w:szCs w:val="24"/>
-        </w:rPr>
-        <w:instrText xml:space="preserve"> TOC \o "1-4" </w:instrText>
-      </w:r>
-      <w:r>
-        <w:rPr>
-          <w:szCs w:val="24"/>
-        </w:rPr>
+        <w:instrText xml:space="preserve"> PAGEREF _Toc213752070 \h </w:instrText>
+      </w:r>
+      <w:r>
         <w:fldChar w:fldCharType="separate"/>
       </w:r>
       <w:r>
         <w:t>1</w:t>
+      </w:r>
+      <w:r>
+        <w:fldChar w:fldCharType="end"/>
+      </w:r>
+    </w:p>
+    <w:p>
+      <w:pPr>
+        <w:pStyle w:val="TOC2"/>
+        <w:rPr>
+          <w:rFonts w:asciiTheme="minorHAnsi" w:eastAsiaTheme="minorEastAsia" w:hAnsiTheme="minorHAnsi" w:cstheme="minorBidi" w:hint="eastAsia"/>
+          <w:smallCaps w:val="0"/>
+          <w:sz w:val="21"/>
+          <w:szCs w:val="22"/>
+        </w:rPr>
+      </w:pPr>
+      <w:r>
+        <w:t>1.1</w:t>
+      </w:r>
+      <w:r>
+        <w:rPr>
+          <w:rFonts w:asciiTheme="minorHAnsi" w:eastAsiaTheme="minorEastAsia" w:hAnsiTheme="minorHAnsi" w:cstheme="minorBidi"/>
+          <w:smallCaps w:val="0"/>
+          <w:sz w:val="21"/>
+          <w:szCs w:val="22"/>
+        </w:rPr>
+        <w:tab/>
+      </w:r>
+      <w:r>
+        <w:t>论文选题背景与意义</w:t>
+      </w:r>
+      <w:r>
+        <w:tab/>
+      </w:r>
+      <w:r>
+        <w:fldChar w:fldCharType="begin"/>
+      </w:r>
+      <w:r>
+        <w:instrText xml:space="preserve"> PAGEREF _Toc213752071 \h </w:instrText>
+      </w:r>
+      <w:r>
+        <w:fldChar w:fldCharType="separate"/>
+      </w:r>
+      <w:r>
+        <w:t>1</w:t>
+      </w:r>
+      <w:r>
+        <w:fldChar w:fldCharType="end"/>
+      </w:r>
+    </w:p>
+    <w:p>
+      <w:pPr>
+        <w:pStyle w:val="TOC2"/>
+        <w:rPr>
+          <w:rFonts w:asciiTheme="minorHAnsi" w:eastAsiaTheme="minorEastAsia" w:hAnsiTheme="minorHAnsi" w:cstheme="minorBidi" w:hint="eastAsia"/>
+          <w:smallCaps w:val="0"/>
+          <w:sz w:val="21"/>
+          <w:szCs w:val="22"/>
+        </w:rPr>
+      </w:pPr>
+      <w:r>
+        <w:t>1.2</w:t>
+      </w:r>
+      <w:r>
+        <w:rPr>
+          <w:rFonts w:asciiTheme="minorHAnsi" w:eastAsiaTheme="minorEastAsia" w:hAnsiTheme="minorHAnsi" w:cstheme="minorBidi"/>
+          <w:smallCaps w:val="0"/>
+          <w:sz w:val="21"/>
+          <w:szCs w:val="22"/>
+        </w:rPr>
+        <w:tab/>
+      </w:r>
+      <w:r>
+        <w:t>国内外发展现状</w:t>
+      </w:r>
+      <w:r>
+        <w:tab/>
+      </w:r>
+      <w:r>
+        <w:fldChar w:fldCharType="begin"/>
+      </w:r>
+      <w:r>
+        <w:instrText xml:space="preserve"> PAGEREF _Toc213752072 \h </w:instrText>
+      </w:r>
+      <w:r>
+        <w:fldChar w:fldCharType="separate"/>
+      </w:r>
+      <w:r>
+        <w:t>1</w:t>
+      </w:r>
+      <w:r>
+        <w:fldChar w:fldCharType="end"/>
+      </w:r>
+    </w:p>
+    <w:p>
+      <w:pPr>
+        <w:pStyle w:val="TOC2"/>
+        <w:rPr>
+          <w:rFonts w:asciiTheme="minorHAnsi" w:eastAsiaTheme="minorEastAsia" w:hAnsiTheme="minorHAnsi" w:cstheme="minorBidi" w:hint="eastAsia"/>
+          <w:smallCaps w:val="0"/>
+          <w:sz w:val="21"/>
+          <w:szCs w:val="22"/>
+        </w:rPr>
+      </w:pPr>
+      <w:r>
+        <w:t>1.3</w:t>
+      </w:r>
+      <w:r>
+        <w:rPr>
+          <w:rFonts w:asciiTheme="minorHAnsi" w:eastAsiaTheme="minorEastAsia" w:hAnsiTheme="minorHAnsi" w:cstheme="minorBidi"/>
+          <w:smallCaps w:val="0"/>
+          <w:sz w:val="21"/>
+          <w:szCs w:val="22"/>
+        </w:rPr>
+        <w:tab/>
+      </w:r>
+      <w:r>
+        <w:t>存在的问题</w:t>
+      </w:r>
+      <w:r>
+        <w:tab/>
+      </w:r>
+      <w:r>
+        <w:fldChar w:fldCharType="begin"/>
+      </w:r>
+      <w:r>
+        <w:instrText xml:space="preserve"> PAGEREF _Toc213752073 \h </w:instrText>
+      </w:r>
+      <w:r>
+        <w:fldChar w:fldCharType="separate"/>
+      </w:r>
+      <w:r>
+        <w:t>1</w:t>
+      </w:r>
+      <w:r>
+        <w:fldChar w:fldCharType="end"/>
+      </w:r>
+    </w:p>
+    <w:p>
+      <w:pPr>
+        <w:pStyle w:val="TOC1"/>
+        <w:rPr>
+          <w:rFonts w:asciiTheme="minorHAnsi" w:eastAsiaTheme="minorEastAsia" w:hAnsiTheme="minorHAnsi" w:cstheme="minorBidi" w:hint="eastAsia"/>
+          <w:b w:val="0"/>
+          <w:bCs w:val="0"/>
+          <w:caps w:val="0"/>
+          <w:sz w:val="21"/>
+          <w:szCs w:val="22"/>
+        </w:rPr>
+      </w:pPr>
+      <w:r>
+        <w:t>2</w:t>
       </w:r>
       <w:r>
         <w:rPr>
@@ -625,7 +792,7 @@
         <w:tab/>
       </w:r>
       <w:r>
-        <w:t>论文选题依据</w:t>
+        <w:t>研究目标与研究内容、关键技术问题</w:t>
       </w:r>
       <w:r>
         <w:tab/>
@@ -634,7 +801,7 @@
         <w:fldChar w:fldCharType="begin"/>
       </w:r>
       <w:r>
-        <w:instrText xml:space="preserve"> PAGEREF _Toc213752070 \h </w:instrText>
+        <w:instrText xml:space="preserve"> PAGEREF _Toc213752074 \h </w:instrText>
       </w:r>
       <w:r>
         <w:fldChar w:fldCharType="separate"/>
@@ -649,15 +816,62 @@
     <w:p>
       <w:pPr>
         <w:pStyle w:val="TOC2"/>
+        <w:rPr>
+          <w:rFonts w:asciiTheme="minorHAnsi" w:eastAsiaTheme="minorEastAsia" w:hAnsiTheme="minorHAnsi" w:cstheme="minorBidi" w:hint="eastAsia"/>
+          <w:smallCaps w:val="0"/>
+          <w:sz w:val="21"/>
+          <w:szCs w:val="22"/>
+        </w:rPr>
+      </w:pPr>
+      <w:r>
+        <w:t>2.1</w:t>
+      </w:r>
+      <w:r>
         <w:rPr>
           <w:rFonts w:asciiTheme="minorHAnsi" w:eastAsiaTheme="minorEastAsia" w:hAnsiTheme="minorHAnsi" w:cstheme="minorBidi"/>
           <w:smallCaps w:val="0"/>
           <w:sz w:val="21"/>
           <w:szCs w:val="22"/>
         </w:rPr>
-      </w:pPr>
-      <w:r>
-        <w:t>1.1</w:t>
+        <w:tab/>
+      </w:r>
+      <w:r>
+        <w:t>研究目标：</w:t>
+      </w:r>
+      <w:r>
+        <w:t>xxxxxxxxx</w:t>
+      </w:r>
+      <w:r>
+        <w:tab/>
+      </w:r>
+      <w:r>
+        <w:fldChar w:fldCharType="begin"/>
+      </w:r>
+      <w:r>
+        <w:instrText xml:space="preserve"> PAGEREF _Toc213752075 \h </w:instrText>
+      </w:r>
+      <w:r>
+        <w:fldChar w:fldCharType="separate"/>
+      </w:r>
+      <w:r>
+        <w:t>1</w:t>
+      </w:r>
+      <w:r>
+        <w:fldChar w:fldCharType="end"/>
+      </w:r>
+    </w:p>
+    <w:p>
+      <w:pPr>
+        <w:pStyle w:val="TOC2"/>
+        <w:rPr>
+          <w:rFonts w:asciiTheme="minorHAnsi" w:eastAsiaTheme="minorEastAsia" w:hAnsiTheme="minorHAnsi" w:cstheme="minorBidi" w:hint="eastAsia"/>
+          <w:smallCaps w:val="0"/>
+          <w:sz w:val="21"/>
+          <w:szCs w:val="22"/>
+        </w:rPr>
+      </w:pPr>
+      <w:r>
+        <w:t>2.2</w:t>
       </w:r>
       <w:r>
         <w:rPr>
@@ -669,7 +883,10 @@
         <w:tab/>
       </w:r>
       <w:r>
-        <w:t>论文选题背景与意义</w:t>
+        <w:t>研究内容：</w:t>
+      </w:r>
+      <w:r>
+        <w:t>xxxxxxxxx</w:t>
       </w:r>
       <w:r>
         <w:tab/>
@@ -678,7 +895,7 @@
         <w:fldChar w:fldCharType="begin"/>
       </w:r>
       <w:r>
-        <w:instrText xml:space="preserve"> PAGEREF _Toc213752071 \h </w:instrText>
+        <w:instrText xml:space="preserve"> PAGEREF _Toc213752076 \h </w:instrText>
       </w:r>
       <w:r>
         <w:fldChar w:fldCharType="separate"/>
@@ -693,94 +910,66 @@
     <w:p>
       <w:pPr>
         <w:pStyle w:val="TOC2"/>
+        <w:rPr>
+          <w:rFonts w:asciiTheme="minorHAnsi" w:eastAsiaTheme="minorEastAsia" w:hAnsiTheme="minorHAnsi" w:cstheme="minorBidi" w:hint="eastAsia"/>
+          <w:smallCaps w:val="0"/>
+          <w:sz w:val="21"/>
+          <w:szCs w:val="22"/>
+        </w:rPr>
+      </w:pPr>
+      <w:r>
+        <w:t>2.3</w:t>
+      </w:r>
+      <w:r>
         <w:rPr>
           <w:rFonts w:asciiTheme="minorHAnsi" w:eastAsiaTheme="minorEastAsia" w:hAnsiTheme="minorHAnsi" w:cstheme="minorBidi"/>
           <w:smallCaps w:val="0"/>
           <w:sz w:val="21"/>
           <w:szCs w:val="22"/>
         </w:rPr>
-      </w:pPr>
-      <w:r>
-        <w:t>1.2</w:t>
-      </w:r>
-      <w:r>
-        <w:rPr>
-          <w:rFonts w:asciiTheme="minorHAnsi" w:eastAsiaTheme="minorEastAsia" w:hAnsiTheme="minorHAnsi" w:cstheme="minorBidi"/>
-          <w:smallCaps w:val="0"/>
+        <w:tab/>
+      </w:r>
+      <w:r>
+        <w:t>关键技术问题：</w:t>
+      </w:r>
+      <w:r>
+        <w:t>xxxxxxxxx</w:t>
+      </w:r>
+      <w:r>
+        <w:tab/>
+      </w:r>
+      <w:r>
+        <w:fldChar w:fldCharType="begin"/>
+      </w:r>
+      <w:r>
+        <w:instrText xml:space="preserve"> PAGEREF _Toc213752077 \h </w:instrText>
+      </w:r>
+      <w:r>
+        <w:fldChar w:fldCharType="separate"/>
+      </w:r>
+      <w:r>
+        <w:t>1</w:t>
+      </w:r>
+      <w:r>
+        <w:fldChar w:fldCharType="end"/>
+      </w:r>
+    </w:p>
+    <w:p>
+      <w:pPr>
+        <w:pStyle w:val="TOC1"/>
+        <w:rPr>
+          <w:rFonts w:asciiTheme="minorHAnsi" w:eastAsiaTheme="minorEastAsia" w:hAnsiTheme="minorHAnsi" w:cstheme="minorBidi" w:hint="eastAsia"/>
+          <w:b w:val="0"/>
+          <w:bCs w:val="0"/>
+          <w:caps w:val="0"/>
           <w:sz w:val="21"/>
           <w:szCs w:val="22"/>
         </w:rPr>
-        <w:tab/>
-      </w:r>
-      <w:r>
-        <w:t>国内外发展现状</w:t>
-      </w:r>
-      <w:r>
-        <w:tab/>
-      </w:r>
-      <w:r>
-        <w:fldChar w:fldCharType="begin"/>
-      </w:r>
-      <w:r>
-        <w:instrText xml:space="preserve"> PAGEREF _Toc213752072 \h </w:instrText>
-      </w:r>
-      <w:r>
-        <w:fldChar w:fldCharType="separate"/>
-      </w:r>
-      <w:r>
-        <w:t>1</w:t>
-      </w:r>
-      <w:r>
-        <w:fldChar w:fldCharType="end"/>
-      </w:r>
-    </w:p>
-    <w:p>
-      <w:pPr>
-        <w:pStyle w:val="TOC2"/>
-        <w:rPr>
-          <w:rFonts w:asciiTheme="minorHAnsi" w:eastAsiaTheme="minorEastAsia" w:hAnsiTheme="minorHAnsi" w:cstheme="minorBidi"/>
-          <w:smallCaps w:val="0"/>
-          <w:sz w:val="21"/>
-          <w:szCs w:val="22"/>
-        </w:rPr>
-      </w:pPr>
-      <w:r>
-        <w:t>1.3</w:t>
-      </w:r>
-      <w:r>
-        <w:rPr>
-          <w:rFonts w:asciiTheme="minorHAnsi" w:eastAsiaTheme="minorEastAsia" w:hAnsiTheme="minorHAnsi" w:cstheme="minorBidi"/>
-          <w:smallCaps w:val="0"/>
-          <w:sz w:val="21"/>
-          <w:szCs w:val="22"/>
-        </w:rPr>
-        <w:tab/>
-      </w:r>
-      <w:r>
-        <w:t>存在的问题</w:t>
-      </w:r>
-      <w:r>
-        <w:tab/>
-      </w:r>
-      <w:r>
-        <w:fldChar w:fldCharType="begin"/>
-      </w:r>
-      <w:r>
-        <w:instrText xml:space="preserve"> PAGEREF _Toc213752073 \h </w:instrText>
-      </w:r>
-      <w:r>
-        <w:fldChar w:fldCharType="separate"/>
-      </w:r>
-      <w:r>
-        <w:t>1</w:t>
-      </w:r>
-      <w:r>
-        <w:fldChar w:fldCharType="end"/>
-      </w:r>
-    </w:p>
-    <w:p>
-      <w:pPr>
-        <w:pStyle w:val="TOC1"/>
+      </w:pPr>
+      <w:r>
+        <w:t>3</w:t>
+      </w:r>
+      <w:r>
         <w:rPr>
           <w:rFonts w:asciiTheme="minorHAnsi" w:eastAsiaTheme="minorEastAsia" w:hAnsiTheme="minorHAnsi" w:cstheme="minorBidi"/>
           <w:b w:val="0"/>
@@ -789,9 +978,132 @@
           <w:sz w:val="21"/>
           <w:szCs w:val="22"/>
         </w:rPr>
-      </w:pPr>
-      <w:r>
-        <w:t>2</w:t>
+        <w:tab/>
+      </w:r>
+      <w:r>
+        <w:t>研究方案与技术路线以及可能的创新点</w:t>
+      </w:r>
+      <w:r>
+        <w:tab/>
+      </w:r>
+      <w:r>
+        <w:fldChar w:fldCharType="begin"/>
+      </w:r>
+      <w:r>
+        <w:instrText xml:space="preserve"> PAGEREF _Toc213752078 \h </w:instrText>
+      </w:r>
+      <w:r>
+        <w:fldChar w:fldCharType="separate"/>
+      </w:r>
+      <w:r>
+        <w:t>1</w:t>
+      </w:r>
+      <w:r>
+        <w:fldChar w:fldCharType="end"/>
+      </w:r>
+    </w:p>
+    <w:p>
+      <w:pPr>
+        <w:pStyle w:val="TOC2"/>
+        <w:rPr>
+          <w:rFonts w:asciiTheme="minorHAnsi" w:eastAsiaTheme="minorEastAsia" w:hAnsiTheme="minorHAnsi" w:cstheme="minorBidi" w:hint="eastAsia"/>
+          <w:smallCaps w:val="0"/>
+          <w:sz w:val="21"/>
+          <w:szCs w:val="22"/>
+        </w:rPr>
+      </w:pPr>
+      <w:r>
+        <w:t>3.1</w:t>
+      </w:r>
+      <w:r>
+        <w:rPr>
+          <w:rFonts w:asciiTheme="minorHAnsi" w:eastAsiaTheme="minorEastAsia" w:hAnsiTheme="minorHAnsi" w:cstheme="minorBidi"/>
+          <w:smallCaps w:val="0"/>
+          <w:sz w:val="21"/>
+          <w:szCs w:val="22"/>
+        </w:rPr>
+        <w:tab/>
+      </w:r>
+      <w:r>
+        <w:t>研究方案与技术路线</w:t>
+      </w:r>
+      <w:r>
+        <w:tab/>
+      </w:r>
+      <w:r>
+        <w:fldChar w:fldCharType="begin"/>
+      </w:r>
+      <w:r>
+        <w:instrText xml:space="preserve"> PAGEREF _Toc213752079 \h </w:instrText>
+      </w:r>
+      <w:r>
+        <w:fldChar w:fldCharType="separate"/>
+      </w:r>
+      <w:r>
+        <w:t>1</w:t>
+      </w:r>
+      <w:r>
+        <w:fldChar w:fldCharType="end"/>
+      </w:r>
+    </w:p>
+    <w:p>
+      <w:pPr>
+        <w:pStyle w:val="TOC2"/>
+        <w:rPr>
+          <w:rFonts w:asciiTheme="minorHAnsi" w:eastAsiaTheme="minorEastAsia" w:hAnsiTheme="minorHAnsi" w:cstheme="minorBidi" w:hint="eastAsia"/>
+          <w:smallCaps w:val="0"/>
+          <w:sz w:val="21"/>
+          <w:szCs w:val="22"/>
+        </w:rPr>
+      </w:pPr>
+      <w:r>
+        <w:t>3.2</w:t>
+      </w:r>
+      <w:r>
+        <w:rPr>
+          <w:rFonts w:asciiTheme="minorHAnsi" w:eastAsiaTheme="minorEastAsia" w:hAnsiTheme="minorHAnsi" w:cstheme="minorBidi"/>
+          <w:smallCaps w:val="0"/>
+          <w:sz w:val="21"/>
+          <w:szCs w:val="22"/>
+        </w:rPr>
+        <w:tab/>
+      </w:r>
+      <w:r>
+        <w:t>创新点</w:t>
+      </w:r>
+      <w:r>
+        <w:tab/>
+      </w:r>
+      <w:r>
+        <w:fldChar w:fldCharType="begin"/>
+      </w:r>
+      <w:r>
+        <w:instrText xml:space="preserve"> PAGEREF _Toc213752080 \h </w:instrText>
+      </w:r>
+      <w:r>
+        <w:fldChar w:fldCharType="separate"/>
+      </w:r>
+      <w:r>
+        <w:t>1</w:t>
+      </w:r>
+      <w:r>
+        <w:fldChar w:fldCharType="end"/>
+      </w:r>
+    </w:p>
+    <w:p>
+      <w:pPr>
+        <w:pStyle w:val="TOC1"/>
+        <w:rPr>
+          <w:rFonts w:asciiTheme="minorHAnsi" w:eastAsiaTheme="minorEastAsia" w:hAnsiTheme="minorHAnsi" w:cstheme="minorBidi" w:hint="eastAsia"/>
+          <w:b w:val="0"/>
+          <w:bCs w:val="0"/>
+          <w:caps w:val="0"/>
+          <w:sz w:val="21"/>
+          <w:szCs w:val="22"/>
+        </w:rPr>
+      </w:pPr>
+      <w:r>
+        <w:t>4</w:t>
       </w:r>
       <w:r>
         <w:rPr>
@@ -805,7 +1117,7 @@
         <w:tab/>
       </w:r>
       <w:r>
-        <w:t>研究目标与研究内容、关键技术问题</w:t>
+        <w:t>可行性分析</w:t>
       </w:r>
       <w:r>
         <w:tab/>
@@ -814,7 +1126,7 @@
         <w:fldChar w:fldCharType="begin"/>
       </w:r>
       <w:r>
-        <w:instrText xml:space="preserve"> PAGEREF _Toc213752074 \h </w:instrText>
+        <w:instrText xml:space="preserve"> PAGEREF _Toc213752081 \h </w:instrText>
       </w:r>
       <w:r>
         <w:fldChar w:fldCharType="separate"/>
@@ -828,148 +1140,20 @@
     </w:p>
     <w:p>
       <w:pPr>
-        <w:pStyle w:val="TOC2"/>
-        <w:rPr>
-          <w:rFonts w:asciiTheme="minorHAnsi" w:eastAsiaTheme="minorEastAsia" w:hAnsiTheme="minorHAnsi" w:cstheme="minorBidi"/>
-          <w:smallCaps w:val="0"/>
+        <w:pStyle w:val="TOC1"/>
+        <w:rPr>
+          <w:rFonts w:asciiTheme="minorHAnsi" w:eastAsiaTheme="minorEastAsia" w:hAnsiTheme="minorHAnsi" w:cstheme="minorBidi" w:hint="eastAsia"/>
+          <w:b w:val="0"/>
+          <w:bCs w:val="0"/>
+          <w:caps w:val="0"/>
           <w:sz w:val="21"/>
           <w:szCs w:val="22"/>
         </w:rPr>
       </w:pPr>
       <w:r>
-        <w:t>2.1</w:t>
-      </w:r>
-      <w:r>
-        <w:rPr>
-          <w:rFonts w:asciiTheme="minorHAnsi" w:eastAsiaTheme="minorEastAsia" w:hAnsiTheme="minorHAnsi" w:cstheme="minorBidi"/>
-          <w:smallCaps w:val="0"/>
-          <w:sz w:val="21"/>
-          <w:szCs w:val="22"/>
-        </w:rPr>
-        <w:tab/>
-      </w:r>
-      <w:r>
-        <w:t>研究目标：</w:t>
-      </w:r>
-      <w:r>
-        <w:t>xxxxxxxxx</w:t>
-      </w:r>
-      <w:r>
-        <w:tab/>
-      </w:r>
-      <w:r>
-        <w:fldChar w:fldCharType="begin"/>
-      </w:r>
-      <w:r>
-        <w:instrText xml:space="preserve"> PAGEREF _Toc213752075 \h </w:instrText>
-      </w:r>
-      <w:r>
-        <w:fldChar w:fldCharType="separate"/>
-      </w:r>
-      <w:r>
-        <w:t>1</w:t>
-      </w:r>
-      <w:r>
-        <w:fldChar w:fldCharType="end"/>
-      </w:r>
-    </w:p>
-    <w:p>
-      <w:pPr>
-        <w:pStyle w:val="TOC2"/>
-        <w:rPr>
-          <w:rFonts w:asciiTheme="minorHAnsi" w:eastAsiaTheme="minorEastAsia" w:hAnsiTheme="minorHAnsi" w:cstheme="minorBidi"/>
-          <w:smallCaps w:val="0"/>
-          <w:sz w:val="21"/>
-          <w:szCs w:val="22"/>
-        </w:rPr>
-      </w:pPr>
-      <w:r>
-        <w:t>2.2</w:t>
-      </w:r>
-      <w:r>
-        <w:rPr>
-          <w:rFonts w:asciiTheme="minorHAnsi" w:eastAsiaTheme="minorEastAsia" w:hAnsiTheme="minorHAnsi" w:cstheme="minorBidi"/>
-          <w:smallCaps w:val="0"/>
-          <w:sz w:val="21"/>
-          <w:szCs w:val="22"/>
-        </w:rPr>
-        <w:tab/>
-      </w:r>
-      <w:r>
-        <w:t>研究内容：</w:t>
-      </w:r>
-      <w:r>
-        <w:t>xxxxxxxxx</w:t>
-      </w:r>
-      <w:r>
-        <w:tab/>
-      </w:r>
-      <w:r>
-        <w:fldChar w:fldCharType="begin"/>
-      </w:r>
-      <w:r>
-        <w:instrText xml:space="preserve"> PAGEREF _Toc213752076 \h </w:instrText>
-      </w:r>
-      <w:r>
-        <w:fldChar w:fldCharType="separate"/>
-      </w:r>
-      <w:r>
-        <w:t>1</w:t>
-      </w:r>
-      <w:r>
-        <w:fldChar w:fldCharType="end"/>
-      </w:r>
-    </w:p>
-    <w:p>
-      <w:pPr>
-        <w:pStyle w:val="TOC2"/>
-        <w:rPr>
-          <w:rFonts w:asciiTheme="minorHAnsi" w:eastAsiaTheme="minorEastAsia" w:hAnsiTheme="minorHAnsi" w:cstheme="minorBidi"/>
-          <w:smallCaps w:val="0"/>
-          <w:sz w:val="21"/>
-          <w:szCs w:val="22"/>
-        </w:rPr>
-      </w:pPr>
-      <w:r>
-        <w:t>2.3</w:t>
-      </w:r>
-      <w:r>
-        <w:rPr>
-          <w:rFonts w:asciiTheme="minorHAnsi" w:eastAsiaTheme="minorEastAsia" w:hAnsiTheme="minorHAnsi" w:cstheme="minorBidi"/>
-          <w:smallCaps w:val="0"/>
-          <w:sz w:val="21"/>
-          <w:szCs w:val="22"/>
-        </w:rPr>
-        <w:tab/>
-      </w:r>
-      <w:r>
-        <w:t>关键技术问题：</w:t>
-      </w:r>
-      <w:r>
-        <w:t>xxxxxxxxx</w:t>
-      </w:r>
-      <w:r>
-        <w:tab/>
-      </w:r>
-      <w:r>
-        <w:fldChar w:fldCharType="begin"/>
-      </w:r>
-      <w:r>
-        <w:instrText xml:space="preserve"> PAGEREF _Toc213752077 \h </w:instrText>
-      </w:r>
-      <w:r>
-        <w:fldChar w:fldCharType="separate"/>
-      </w:r>
-      <w:r>
-        <w:t>1</w:t>
-      </w:r>
-      <w:r>
-        <w:fldChar w:fldCharType="end"/>
-      </w:r>
-    </w:p>
-    <w:p>
-      <w:pPr>
-        <w:pStyle w:val="TOC1"/>
+        <w:t>5</w:t>
+      </w:r>
+      <w:r>
         <w:rPr>
           <w:rFonts w:asciiTheme="minorHAnsi" w:eastAsiaTheme="minorEastAsia" w:hAnsiTheme="minorHAnsi" w:cstheme="minorBidi"/>
           <w:b w:val="0"/>
@@ -978,38 +1162,147 @@
           <w:sz w:val="21"/>
           <w:szCs w:val="22"/>
         </w:rPr>
-      </w:pPr>
-      <w:r>
-        <w:t>3</w:t>
+        <w:tab/>
+      </w:r>
+      <w:r>
+        <w:t>论文预期成果与计划安排</w:t>
+      </w:r>
+      <w:r>
+        <w:tab/>
+      </w:r>
+      <w:r>
+        <w:fldChar w:fldCharType="begin"/>
+      </w:r>
+      <w:r>
+        <w:instrText xml:space="preserve"> PAGEREF _Toc213752082 \h </w:instrText>
+      </w:r>
+      <w:r>
+        <w:fldChar w:fldCharType="separate"/>
+      </w:r>
+      <w:r>
+        <w:t>1</w:t>
+      </w:r>
+      <w:r>
+        <w:fldChar w:fldCharType="end"/>
+      </w:r>
+    </w:p>
+    <w:p>
+      <w:pPr>
+        <w:pStyle w:val="TOC2"/>
+        <w:rPr>
+          <w:rFonts w:asciiTheme="minorHAnsi" w:eastAsiaTheme="minorEastAsia" w:hAnsiTheme="minorHAnsi" w:cstheme="minorBidi" w:hint="eastAsia"/>
+          <w:smallCaps w:val="0"/>
+          <w:sz w:val="21"/>
+          <w:szCs w:val="22"/>
+        </w:rPr>
+      </w:pPr>
+      <w:r>
+        <w:t>5.1</w:t>
       </w:r>
       <w:r>
         <w:rPr>
           <w:rFonts w:asciiTheme="minorHAnsi" w:eastAsiaTheme="minorEastAsia" w:hAnsiTheme="minorHAnsi" w:cstheme="minorBidi"/>
+          <w:smallCaps w:val="0"/>
+          <w:sz w:val="21"/>
+          <w:szCs w:val="22"/>
+        </w:rPr>
+        <w:tab/>
+      </w:r>
+      <w:r>
+        <w:t>论文预期成果</w:t>
+      </w:r>
+      <w:r>
+        <w:tab/>
+      </w:r>
+      <w:r>
+        <w:fldChar w:fldCharType="begin"/>
+      </w:r>
+      <w:r>
+        <w:instrText xml:space="preserve"> PAGEREF _Toc213752083 \h </w:instrText>
+      </w:r>
+      <w:r>
+        <w:fldChar w:fldCharType="separate"/>
+      </w:r>
+      <w:r>
+        <w:t>2</w:t>
+      </w:r>
+      <w:r>
+        <w:fldChar w:fldCharType="end"/>
+      </w:r>
+    </w:p>
+    <w:p>
+      <w:pPr>
+        <w:pStyle w:val="TOC2"/>
+        <w:rPr>
+          <w:rFonts w:asciiTheme="minorHAnsi" w:eastAsiaTheme="minorEastAsia" w:hAnsiTheme="minorHAnsi" w:cstheme="minorBidi" w:hint="eastAsia"/>
+          <w:smallCaps w:val="0"/>
+          <w:sz w:val="21"/>
+          <w:szCs w:val="22"/>
+        </w:rPr>
+      </w:pPr>
+      <w:r>
+        <w:t>5.2</w:t>
+      </w:r>
+      <w:r>
+        <w:rPr>
+          <w:rFonts w:asciiTheme="minorHAnsi" w:eastAsiaTheme="minorEastAsia" w:hAnsiTheme="minorHAnsi" w:cstheme="minorBidi"/>
+          <w:smallCaps w:val="0"/>
+          <w:sz w:val="21"/>
+          <w:szCs w:val="22"/>
+        </w:rPr>
+        <w:tab/>
+      </w:r>
+      <w:r>
+        <w:t>论文计划安排</w:t>
+      </w:r>
+      <w:r>
+        <w:tab/>
+      </w:r>
+      <w:r>
+        <w:fldChar w:fldCharType="begin"/>
+      </w:r>
+      <w:r>
+        <w:instrText xml:space="preserve"> PAGEREF _Toc213752084 \h </w:instrText>
+      </w:r>
+      <w:r>
+        <w:fldChar w:fldCharType="separate"/>
+      </w:r>
+      <w:r>
+        <w:t>2</w:t>
+      </w:r>
+      <w:r>
+        <w:fldChar w:fldCharType="end"/>
+      </w:r>
+    </w:p>
+    <w:p>
+      <w:pPr>
+        <w:pStyle w:val="TOC1"/>
+        <w:rPr>
+          <w:rFonts w:asciiTheme="minorHAnsi" w:eastAsiaTheme="minorEastAsia" w:hAnsiTheme="minorHAnsi" w:cstheme="minorBidi" w:hint="eastAsia"/>
           <w:b w:val="0"/>
           <w:bCs w:val="0"/>
           <w:caps w:val="0"/>
           <w:sz w:val="21"/>
           <w:szCs w:val="22"/>
         </w:rPr>
+      </w:pPr>
+      <w:r>
+        <w:t>参考文献</w:t>
+      </w:r>
+      <w:r>
         <w:tab/>
       </w:r>
       <w:r>
-        <w:t>研究方案与技术路线以及可能的创新点</w:t>
-      </w:r>
-      <w:r>
-        <w:tab/>
-      </w:r>
-      <w:r>
         <w:fldChar w:fldCharType="begin"/>
       </w:r>
       <w:r>
-        <w:instrText xml:space="preserve"> PAGEREF _Toc213752078 \h </w:instrText>
+        <w:instrText xml:space="preserve"> PAGEREF _Toc213752085 \h </w:instrText>
       </w:r>
       <w:r>
         <w:fldChar w:fldCharType="separate"/>
       </w:r>
       <w:r>
-        <w:t>1</w:t>
+        <w:t>3</w:t>
       </w:r>
       <w:r>
         <w:fldChar w:fldCharType="end"/>
@@ -1017,313 +1310,10 @@
     </w:p>
     <w:p>
       <w:pPr>
-        <w:pStyle w:val="TOC2"/>
-        <w:rPr>
-          <w:rFonts w:asciiTheme="minorHAnsi" w:eastAsiaTheme="minorEastAsia" w:hAnsiTheme="minorHAnsi" w:cstheme="minorBidi"/>
-          <w:smallCaps w:val="0"/>
-          <w:sz w:val="21"/>
-          <w:szCs w:val="22"/>
-        </w:rPr>
-      </w:pPr>
-      <w:r>
-        <w:t>3.1</w:t>
-      </w:r>
-      <w:r>
-        <w:rPr>
-          <w:rFonts w:asciiTheme="minorHAnsi" w:eastAsiaTheme="minorEastAsia" w:hAnsiTheme="minorHAnsi" w:cstheme="minorBidi"/>
-          <w:smallCaps w:val="0"/>
-          <w:sz w:val="21"/>
-          <w:szCs w:val="22"/>
-        </w:rPr>
-        <w:tab/>
-      </w:r>
-      <w:r>
-        <w:t>研究方案与技术路线</w:t>
-      </w:r>
-      <w:r>
-        <w:tab/>
-      </w:r>
-      <w:r>
-        <w:fldChar w:fldCharType="begin"/>
-      </w:r>
-      <w:r>
-        <w:instrText xml:space="preserve"> PAGEREF _Toc213752079 \h </w:instrText>
-      </w:r>
-      <w:r>
-        <w:fldChar w:fldCharType="separate"/>
-      </w:r>
-      <w:r>
-        <w:t>1</w:t>
-      </w:r>
-      <w:r>
-        <w:fldChar w:fldCharType="end"/>
-      </w:r>
-    </w:p>
-    <w:p>
-      <w:pPr>
-        <w:pStyle w:val="TOC2"/>
-        <w:rPr>
-          <w:rFonts w:asciiTheme="minorHAnsi" w:eastAsiaTheme="minorEastAsia" w:hAnsiTheme="minorHAnsi" w:cstheme="minorBidi"/>
-          <w:smallCaps w:val="0"/>
-          <w:sz w:val="21"/>
-          <w:szCs w:val="22"/>
-        </w:rPr>
-      </w:pPr>
-      <w:r>
-        <w:t>3.2</w:t>
-      </w:r>
-      <w:r>
-        <w:rPr>
-          <w:rFonts w:asciiTheme="minorHAnsi" w:eastAsiaTheme="minorEastAsia" w:hAnsiTheme="minorHAnsi" w:cstheme="minorBidi"/>
-          <w:smallCaps w:val="0"/>
-          <w:sz w:val="21"/>
-          <w:szCs w:val="22"/>
-        </w:rPr>
-        <w:tab/>
-      </w:r>
-      <w:r>
-        <w:t>创新点</w:t>
-      </w:r>
-      <w:r>
-        <w:tab/>
-      </w:r>
-      <w:r>
-        <w:fldChar w:fldCharType="begin"/>
-      </w:r>
-      <w:r>
-        <w:instrText xml:space="preserve"> PAGEREF _Toc213752080 \h </w:instrText>
-      </w:r>
-      <w:r>
-        <w:fldChar w:fldCharType="separate"/>
-      </w:r>
-      <w:r>
-        <w:t>1</w:t>
-      </w:r>
-      <w:r>
-        <w:fldChar w:fldCharType="end"/>
-      </w:r>
-    </w:p>
-    <w:p>
-      <w:pPr>
         <w:pStyle w:val="TOC1"/>
         <w:rPr>
-          <w:rFonts w:asciiTheme="minorHAnsi" w:eastAsiaTheme="minorEastAsia" w:hAnsiTheme="minorHAnsi" w:cstheme="minorBidi"/>
-          <w:b w:val="0"/>
-          <w:bCs w:val="0"/>
-          <w:caps w:val="0"/>
-          <w:sz w:val="21"/>
-          <w:szCs w:val="22"/>
-        </w:rPr>
-      </w:pPr>
-      <w:r>
-        <w:t>4</w:t>
-      </w:r>
-      <w:r>
-        <w:rPr>
-          <w:rFonts w:asciiTheme="minorHAnsi" w:eastAsiaTheme="minorEastAsia" w:hAnsiTheme="minorHAnsi" w:cstheme="minorBidi"/>
-          <w:b w:val="0"/>
-          <w:bCs w:val="0"/>
-          <w:caps w:val="0"/>
-          <w:sz w:val="21"/>
-          <w:szCs w:val="22"/>
-        </w:rPr>
-        <w:tab/>
-      </w:r>
-      <w:r>
-        <w:t>可行性分析</w:t>
-      </w:r>
-      <w:r>
-        <w:tab/>
-      </w:r>
-      <w:r>
-        <w:fldChar w:fldCharType="begin"/>
-      </w:r>
-      <w:r>
-        <w:instrText xml:space="preserve"> PAGEREF _Toc213752081 \h </w:instrText>
-      </w:r>
-      <w:r>
-        <w:fldChar w:fldCharType="separate"/>
-      </w:r>
-      <w:r>
-        <w:t>1</w:t>
-      </w:r>
-      <w:r>
-        <w:fldChar w:fldCharType="end"/>
-      </w:r>
-    </w:p>
-    <w:p>
-      <w:pPr>
-        <w:pStyle w:val="TOC1"/>
-        <w:rPr>
-          <w:rFonts w:asciiTheme="minorHAnsi" w:eastAsiaTheme="minorEastAsia" w:hAnsiTheme="minorHAnsi" w:cstheme="minorBidi"/>
-          <w:b w:val="0"/>
-          <w:bCs w:val="0"/>
-          <w:caps w:val="0"/>
-          <w:sz w:val="21"/>
-          <w:szCs w:val="22"/>
-        </w:rPr>
-      </w:pPr>
-      <w:r>
-        <w:t>5</w:t>
-      </w:r>
-      <w:r>
-        <w:rPr>
-          <w:rFonts w:asciiTheme="minorHAnsi" w:eastAsiaTheme="minorEastAsia" w:hAnsiTheme="minorHAnsi" w:cstheme="minorBidi"/>
-          <w:b w:val="0"/>
-          <w:bCs w:val="0"/>
-          <w:caps w:val="0"/>
-          <w:sz w:val="21"/>
-          <w:szCs w:val="22"/>
-        </w:rPr>
-        <w:tab/>
-      </w:r>
-      <w:r>
-        <w:t>论文预期成果与计划安排</w:t>
-      </w:r>
-      <w:r>
-        <w:tab/>
-      </w:r>
-      <w:r>
-        <w:fldChar w:fldCharType="begin"/>
-      </w:r>
-      <w:r>
-        <w:instrText xml:space="preserve"> PAGEREF _Toc213752082 \h </w:instrText>
-      </w:r>
-      <w:r>
-        <w:fldChar w:fldCharType="separate"/>
-      </w:r>
-      <w:r>
-        <w:t>1</w:t>
-      </w:r>
-      <w:r>
-        <w:fldChar w:fldCharType="end"/>
-      </w:r>
-    </w:p>
-    <w:p>
-      <w:pPr>
-        <w:pStyle w:val="TOC2"/>
-        <w:rPr>
-          <w:rFonts w:asciiTheme="minorHAnsi" w:eastAsiaTheme="minorEastAsia" w:hAnsiTheme="minorHAnsi" w:cstheme="minorBidi"/>
-          <w:smallCaps w:val="0"/>
-          <w:sz w:val="21"/>
-          <w:szCs w:val="22"/>
-        </w:rPr>
-      </w:pPr>
-      <w:r>
-        <w:t>5.1</w:t>
-      </w:r>
-      <w:r>
-        <w:rPr>
-          <w:rFonts w:asciiTheme="minorHAnsi" w:eastAsiaTheme="minorEastAsia" w:hAnsiTheme="minorHAnsi" w:cstheme="minorBidi"/>
-          <w:smallCaps w:val="0"/>
-          <w:sz w:val="21"/>
-          <w:szCs w:val="22"/>
-        </w:rPr>
-        <w:tab/>
-      </w:r>
-      <w:r>
-        <w:t>论文预期成果</w:t>
-      </w:r>
-      <w:r>
-        <w:tab/>
-      </w:r>
-      <w:r>
-        <w:fldChar w:fldCharType="begin"/>
-      </w:r>
-      <w:r>
-        <w:instrText xml:space="preserve"> PAGEREF _Toc213752083 \h </w:instrText>
-      </w:r>
-      <w:r>
-        <w:fldChar w:fldCharType="separate"/>
-      </w:r>
-      <w:r>
-        <w:t>2</w:t>
-      </w:r>
-      <w:r>
-        <w:fldChar w:fldCharType="end"/>
-      </w:r>
-    </w:p>
-    <w:p>
-      <w:pPr>
-        <w:pStyle w:val="TOC2"/>
-        <w:rPr>
-          <w:rFonts w:asciiTheme="minorHAnsi" w:eastAsiaTheme="minorEastAsia" w:hAnsiTheme="minorHAnsi" w:cstheme="minorBidi"/>
-          <w:smallCaps w:val="0"/>
-          <w:sz w:val="21"/>
-          <w:szCs w:val="22"/>
-        </w:rPr>
-      </w:pPr>
-      <w:r>
-        <w:t>5.2</w:t>
-      </w:r>
-      <w:r>
-        <w:rPr>
-          <w:rFonts w:asciiTheme="minorHAnsi" w:eastAsiaTheme="minorEastAsia" w:hAnsiTheme="minorHAnsi" w:cstheme="minorBidi"/>
-          <w:smallCaps w:val="0"/>
-          <w:sz w:val="21"/>
-          <w:szCs w:val="22"/>
-        </w:rPr>
-        <w:tab/>
-      </w:r>
-      <w:r>
-        <w:t>论文计划安排</w:t>
-      </w:r>
-      <w:r>
-        <w:tab/>
-      </w:r>
-      <w:r>
-        <w:fldChar w:fldCharType="begin"/>
-      </w:r>
-      <w:r>
-        <w:instrText xml:space="preserve"> PAGEREF _Toc213752084 \h </w:instrText>
-      </w:r>
-      <w:r>
-        <w:fldChar w:fldCharType="separate"/>
-      </w:r>
-      <w:r>
-        <w:t>2</w:t>
-      </w:r>
-      <w:r>
-        <w:fldChar w:fldCharType="end"/>
-      </w:r>
-    </w:p>
-    <w:p>
-      <w:pPr>
-        <w:pStyle w:val="TOC1"/>
-        <w:rPr>
-          <w:rFonts w:asciiTheme="minorHAnsi" w:eastAsiaTheme="minorEastAsia" w:hAnsiTheme="minorHAnsi" w:cstheme="minorBidi"/>
-          <w:b w:val="0"/>
-          <w:bCs w:val="0"/>
-          <w:caps w:val="0"/>
-          <w:sz w:val="21"/>
-          <w:szCs w:val="22"/>
-        </w:rPr>
-      </w:pPr>
-      <w:r>
-        <w:t>参考文献</w:t>
-      </w:r>
-      <w:r>
-        <w:tab/>
-      </w:r>
-      <w:r>
-        <w:fldChar w:fldCharType="begin"/>
-      </w:r>
-      <w:r>
-        <w:instrText xml:space="preserve"> PAGEREF _Toc213752085 \h </w:instrText>
-      </w:r>
-      <w:r>
-        <w:fldChar w:fldCharType="separate"/>
-      </w:r>
-      <w:r>
-        <w:t>3</w:t>
-      </w:r>
-      <w:r>
-        <w:fldChar w:fldCharType="end"/>
-      </w:r>
-    </w:p>
-    <w:p>
-      <w:pPr>
-        <w:pStyle w:val="TOC1"/>
+          <w:rFonts w:hint="eastAsia"/>
+        </w:rPr>
       </w:pPr>
       <w:r>
         <w:fldChar w:fldCharType="end"/>
@@ -1335,7 +1325,7 @@
         <w:spacing w:line="240" w:lineRule="auto"/>
         <w:jc w:val="left"/>
         <w:rPr>
-          <w:rFonts w:ascii="宋体" w:hAnsi="宋体"/>
+          <w:rFonts w:ascii="宋体" w:hAnsi="宋体" w:hint="eastAsia"/>
           <w:b/>
           <w:bCs/>
           <w:caps/>
@@ -1350,7 +1340,7 @@
       <w:pPr>
         <w:pStyle w:val="TOC1"/>
         <w:rPr>
-          <w:rFonts w:ascii="黑体" w:eastAsia="黑体" w:hAnsi="黑体"/>
+          <w:rFonts w:ascii="黑体" w:eastAsia="黑体" w:hAnsi="黑体" w:hint="eastAsia"/>
           <w:sz w:val="36"/>
           <w:szCs w:val="36"/>
         </w:rPr>
@@ -1389,7 +1379,7 @@
           <w:tab w:val="right" w:leader="dot" w:pos="8302"/>
         </w:tabs>
         <w:rPr>
-          <w:rFonts w:asciiTheme="minorHAnsi" w:eastAsiaTheme="minorEastAsia" w:hAnsiTheme="minorHAnsi" w:cstheme="minorBidi"/>
+          <w:rFonts w:asciiTheme="minorHAnsi" w:eastAsiaTheme="minorEastAsia" w:hAnsiTheme="minorHAnsi" w:cstheme="minorBidi" w:hint="eastAsia"/>
           <w:noProof/>
           <w:sz w:val="21"/>
           <w:szCs w:val="22"/>
@@ -1501,10 +1491,10 @@
     <w:p>
       <w:pPr>
         <w:sectPr>
-          <w:headerReference w:type="default" r:id="rId13"/>
-          <w:footerReference w:type="default" r:id="rId14"/>
-          <w:headerReference w:type="first" r:id="rId15"/>
-          <w:footerReference w:type="first" r:id="rId16"/>
+          <w:headerReference w:type="default" r:id="rId14"/>
+          <w:footerReference w:type="default" r:id="rId15"/>
+          <w:headerReference w:type="first" r:id="rId16"/>
+          <w:footerReference w:type="first" r:id="rId17"/>
           <w:pgSz w:w="11906" w:h="16838" w:code="9"/>
           <w:pgMar w:top="1928" w:right="1797" w:bottom="1928" w:left="1797" w:header="1588" w:footer="1588" w:gutter="0"/>
           <w:pgNumType w:fmt="lowerRoman" w:start="1"/>
@@ -1592,13 +1582,7 @@
         <w:rPr>
           <w:rFonts w:hint="eastAsia"/>
         </w:rPr>
-        <w:t>研究</w:t>
-      </w:r>
-      <w:r>
-        <w:rPr>
-          <w:rFonts w:hint="eastAsia"/>
-        </w:rPr>
-        <w:t>目标与研究内容、关键技术问题</w:t>
+        <w:t>研究目标与研究内容、关键技术问题</w:t>
       </w:r>
       <w:bookmarkEnd w:id="7"/>
     </w:p>
@@ -1619,7 +1603,7 @@
           <w:color w:val="FF0000"/>
           <w:sz w:val="20"/>
         </w:rPr>
-        <w:t>（</w:t>
+        <w:t>（用一段文字</w:t>
       </w:r>
       <w:r>
         <w:rPr>
@@ -1628,7 +1612,7 @@
           <w:color w:val="FF0000"/>
           <w:sz w:val="20"/>
         </w:rPr>
-        <w:t>用一段文字</w:t>
+        <w:t>+</w:t>
       </w:r>
       <w:r>
         <w:rPr>
@@ -1637,34 +1621,7 @@
           <w:color w:val="FF0000"/>
           <w:sz w:val="20"/>
         </w:rPr>
-        <w:t>+</w:t>
-      </w:r>
-      <w:r>
-        <w:rPr>
-          <w:rFonts w:hint="eastAsia"/>
-          <w:b/>
-          <w:color w:val="FF0000"/>
-          <w:sz w:val="20"/>
-        </w:rPr>
-        <w:t>图说明论文研究内容的设置情况，以及研究内容间的逻辑关系。</w:t>
-      </w:r>
-      <w:r>
-        <w:rPr>
-          <w:rFonts w:hint="eastAsia"/>
-          <w:b/>
-          <w:color w:val="FF0000"/>
-          <w:sz w:val="20"/>
-        </w:rPr>
-        <w:t>逻辑关系可以是并列、先后，总分等</w:t>
-      </w:r>
-      <w:r>
-        <w:rPr>
-          <w:rFonts w:hint="eastAsia"/>
-          <w:b/>
-          <w:color w:val="FF0000"/>
-          <w:sz w:val="20"/>
-        </w:rPr>
-        <w:t>）</w:t>
+        <w:t>图说明论文研究内容的设置情况，以及研究内容间的逻辑关系。逻辑关系可以是并列、先后，总分等）</w:t>
       </w:r>
     </w:p>
     <w:p>
@@ -1712,13 +1669,7 @@
         <w:rPr>
           <w:rFonts w:hint="eastAsia"/>
         </w:rPr>
-        <w:t>所示。</w:t>
-      </w:r>
-      <w:r>
-        <w:rPr>
-          <w:rFonts w:hint="eastAsia"/>
-        </w:rPr>
-        <w:t>首先研究</w:t>
+        <w:t>所示。首先研究</w:t>
       </w:r>
       <w:r>
         <w:rPr>
@@ -1793,7 +1744,7 @@
                     </pic:cNvPicPr>
                   </pic:nvPicPr>
                   <pic:blipFill>
-                    <a:blip r:embed="rId17" cstate="print">
+                    <a:blip r:embed="rId18" cstate="print">
                       <a:extLst>
                         <a:ext uri="{28A0092B-C50C-407E-A947-70E740481C1C}">
                           <a14:useLocalDpi xmlns:a14="http://schemas.microsoft.com/office/drawing/2010/main" val="0"/>
@@ -1829,71 +1780,64 @@
       <w:pPr>
         <w:pStyle w:val="ac"/>
         <w:rPr>
+          <w:rFonts w:ascii="黑体" w:eastAsia="黑体" w:hAnsi="黑体" w:hint="eastAsia"/>
+          <w:sz w:val="20"/>
+        </w:rPr>
+      </w:pPr>
+      <w:bookmarkStart w:id="8" w:name="_Ref90039899"/>
+      <w:bookmarkStart w:id="9" w:name="_Toc213752086"/>
+      <w:r>
+        <w:rPr>
+          <w:rFonts w:hint="eastAsia"/>
+        </w:rPr>
+        <w:t>图</w:t>
+      </w:r>
+      <w:r>
+        <w:fldChar w:fldCharType="begin"/>
+      </w:r>
+      <w:r>
+        <w:instrText xml:space="preserve"> </w:instrText>
+      </w:r>
+      <w:r>
+        <w:rPr>
+          <w:rFonts w:hint="eastAsia"/>
+        </w:rPr>
+        <w:instrText xml:space="preserve">SEQ </w:instrText>
+      </w:r>
+      <w:r>
+        <w:rPr>
+          <w:rFonts w:hint="eastAsia"/>
+        </w:rPr>
+        <w:instrText>图</w:instrText>
+      </w:r>
+      <w:r>
+        <w:rPr>
+          <w:rFonts w:hint="eastAsia"/>
+        </w:rPr>
+        <w:instrText xml:space="preserve"> \* ARABIC</w:instrText>
+      </w:r>
+      <w:r>
+        <w:instrText xml:space="preserve"> </w:instrText>
+      </w:r>
+      <w:r>
+        <w:fldChar w:fldCharType="separate"/>
+      </w:r>
+      <w:r>
+        <w:rPr>
+          <w:noProof/>
+        </w:rPr>
+        <w:t>1</w:t>
+      </w:r>
+      <w:r>
+        <w:fldChar w:fldCharType="end"/>
+      </w:r>
+      <w:bookmarkEnd w:id="8"/>
+      <w:r>
+        <w:rPr>
           <w:rFonts w:ascii="黑体" w:eastAsia="黑体" w:hAnsi="黑体"/>
           <w:sz w:val="20"/>
         </w:rPr>
-      </w:pPr>
-      <w:bookmarkStart w:id="8" w:name="_Ref90039899"/>
-      <w:bookmarkStart w:id="9" w:name="_Toc213752086"/>
-      <w:r>
-        <w:rPr>
-          <w:rFonts w:hint="eastAsia"/>
-        </w:rPr>
-        <w:t>图</w:t>
-      </w:r>
-      <w:r>
-        <w:fldChar w:fldCharType="begin"/>
-      </w:r>
-      <w:r>
-        <w:instrText xml:space="preserve"> </w:instrText>
-      </w:r>
-      <w:r>
-        <w:rPr>
-          <w:rFonts w:hint="eastAsia"/>
-        </w:rPr>
-        <w:instrText xml:space="preserve">SEQ </w:instrText>
-      </w:r>
-      <w:r>
-        <w:rPr>
-          <w:rFonts w:hint="eastAsia"/>
-        </w:rPr>
-        <w:instrText>图</w:instrText>
-      </w:r>
-      <w:r>
-        <w:rPr>
-          <w:rFonts w:hint="eastAsia"/>
-        </w:rPr>
-        <w:instrText xml:space="preserve"> \* ARABIC</w:instrText>
-      </w:r>
-      <w:r>
-        <w:instrText xml:space="preserve"> </w:instrText>
-      </w:r>
-      <w:r>
-        <w:fldChar w:fldCharType="separate"/>
-      </w:r>
-      <w:r>
-        <w:rPr>
-          <w:noProof/>
-        </w:rPr>
-        <w:t>1</w:t>
-      </w:r>
-      <w:r>
-        <w:fldChar w:fldCharType="end"/>
-      </w:r>
-      <w:bookmarkEnd w:id="8"/>
-      <w:r>
-        <w:rPr>
-          <w:rFonts w:ascii="黑体" w:eastAsia="黑体" w:hAnsi="黑体"/>
-          <w:sz w:val="20"/>
-        </w:rPr>
-        <w:t xml:space="preserve"> </w:t>
-      </w:r>
-      <w:r>
-        <w:rPr>
-          <w:rFonts w:ascii="黑体" w:eastAsia="黑体" w:hAnsi="黑体"/>
-          <w:sz w:val="20"/>
-        </w:rPr>
-        <w:t xml:space="preserve"> </w:t>
+        <w:t xml:space="preserve">  </w:t>
       </w:r>
       <w:r>
         <w:rPr>
@@ -1921,25 +1865,7 @@
           <w:color w:val="FF0000"/>
           <w:sz w:val="20"/>
         </w:rPr>
-        <w:t>（</w:t>
-      </w:r>
-      <w:r>
-        <w:rPr>
-          <w:rFonts w:hint="eastAsia"/>
-          <w:b/>
-          <w:color w:val="FF0000"/>
-          <w:sz w:val="20"/>
-        </w:rPr>
-        <w:t>下面分别介绍每个研究内容</w:t>
-      </w:r>
-      <w:r>
-        <w:rPr>
-          <w:rFonts w:hint="eastAsia"/>
-          <w:b/>
-          <w:color w:val="FF0000"/>
-          <w:sz w:val="20"/>
-        </w:rPr>
-        <w:t>）</w:t>
+        <w:t>（下面分别介绍每个研究内容）</w:t>
       </w:r>
     </w:p>
     <w:p>
@@ -1953,19 +1879,7 @@
         <w:rPr>
           <w:rFonts w:hint="eastAsia"/>
         </w:rPr>
-        <w:t>研究</w:t>
-      </w:r>
-      <w:r>
-        <w:rPr>
-          <w:rFonts w:hint="eastAsia"/>
-        </w:rPr>
-        <w:t>目标</w:t>
-      </w:r>
-      <w:r>
-        <w:rPr>
-          <w:rFonts w:hint="eastAsia"/>
-        </w:rPr>
-        <w:t>：</w:t>
+        <w:t>研究目标：</w:t>
       </w:r>
       <w:r>
         <w:rPr>
@@ -2007,13 +1921,7 @@
         <w:rPr>
           <w:rFonts w:hint="eastAsia"/>
         </w:rPr>
-        <w:t>关键技术问题</w:t>
-      </w:r>
-      <w:r>
-        <w:rPr>
-          <w:rFonts w:hint="eastAsia"/>
-        </w:rPr>
-        <w:t>：</w:t>
+        <w:t>关键技术问题：</w:t>
       </w:r>
       <w:r>
         <w:rPr>
@@ -2183,6 +2091,7 @@
         <w:snapToGrid w:val="0"/>
         <w:spacing w:before="156" w:after="156"/>
         <w:rPr>
+          <w:rFonts w:hint="eastAsia"/>
           <w:b/>
           <w:bCs/>
         </w:rPr>
@@ -2309,40 +2218,13 @@
           <w:szCs w:val="21"/>
           <w:lang w:bidi="zh-CN"/>
         </w:rPr>
-        <w:t>[2</w:t>
-      </w:r>
-      <w:r>
-        <w:rPr>
-          <w:spacing w:val="-2"/>
-          <w:w w:val="99"/>
+        <w:t xml:space="preserve">[2]  </w:t>
+      </w:r>
+      <w:r>
+        <w:rPr>
           <w:szCs w:val="21"/>
-          <w:lang w:bidi="zh-CN"/>
-        </w:rPr>
-        <w:t xml:space="preserve">]  </w:t>
-      </w:r>
-      <w:r>
-        <w:rPr>
-          <w:szCs w:val="21"/>
-        </w:rPr>
-        <w:t>WEINSTEIN</w:t>
-      </w:r>
-      <w:r>
-        <w:rPr>
-          <w:szCs w:val="21"/>
-        </w:rPr>
-        <w:t xml:space="preserve"> L, SWERTZ M N. Pathogenic properties of invading micro-organism[M]//SODEMAN W A, Jr, SODEMAN W A. Pathologic physiology: mechanisms of disease. </w:t>
-      </w:r>
-      <w:r>
-        <w:rPr>
-          <w:szCs w:val="21"/>
-        </w:rPr>
-        <w:t>Philadephia</w:t>
-      </w:r>
-      <w:r>
-        <w:rPr>
-          <w:szCs w:val="21"/>
-        </w:rPr>
-        <w:t>: Saunders, 1974: 745-772.</w:t>
+        </w:rPr>
+        <w:t>WEINSTEIN L, SWERTZ M N. Pathogenic properties of invading micro-organism[M]//SODEMAN W A, Jr, SODEMAN W A. Pathologic physiology: mechanisms of disease. Philadephia: Saunders, 1974: 745-772.</w:t>
       </w:r>
     </w:p>
     <w:p>
@@ -2529,10 +2411,10 @@
       </w:pPr>
     </w:p>
     <w:sectPr>
-      <w:headerReference w:type="default" r:id="rId18"/>
-      <w:footerReference w:type="default" r:id="rId19"/>
-      <w:headerReference w:type="first" r:id="rId20"/>
-      <w:footerReference w:type="first" r:id="rId21"/>
+      <w:headerReference w:type="default" r:id="rId19"/>
+      <w:footerReference w:type="default" r:id="rId20"/>
+      <w:headerReference w:type="first" r:id="rId21"/>
+      <w:footerReference w:type="first" r:id="rId22"/>
       <w:pgSz w:w="11906" w:h="16838"/>
       <w:pgMar w:top="1440" w:right="1800" w:bottom="1440" w:left="1800" w:header="851" w:footer="992" w:gutter="0"/>
       <w:pgNumType w:start="1"/>
@@ -2544,7 +2426,7 @@
 </file>
 
 <file path=word/endnotes.xml><?xml version="1.0" encoding="utf-8"?>
-<w:endnotes xmlns:wpc="http://schemas.microsoft.com/office/word/2010/wordprocessingCanvas" xmlns:cx="http://schemas.microsoft.com/office/drawing/2014/chartex" xmlns:cx1="http://schemas.microsoft.com/office/drawing/2015/9/8/chartex" xmlns:cx2="http://schemas.microsoft.com/office/drawing/2015/10/21/chartex" xmlns:cx3="http://schemas.microsoft.com/office/drawing/2016/5/9/chartex" xmlns:cx4="http://schemas.microsoft.com/office/drawing/2016/5/10/chartex" xmlns:cx5="http://schemas.microsoft.com/office/drawing/2016/5/11/chartex" xmlns:cx6="http://schemas.microsoft.com/office/drawing/2016/5/12/chartex" xmlns:cx7="http://schemas.microsoft.com/office/drawing/2016/5/13/chartex" xmlns:cx8="http://schemas.microsoft.com/office/drawing/2016/5/14/chartex" xmlns:mc="http://schemas.openxmlformats.org/markup-compatibility/2006" xmlns:aink="http://schemas.microsoft.com/office/drawing/2016/ink" xmlns:am3d="http://schemas.microsoft.com/office/drawing/2017/model3d" xmlns:o="urn:schemas-microsoft-com:office:office" xmlns:r="http://schemas.openxmlformats.org/officeDocument/2006/relationships" xmlns:m="http://schemas.openxmlformats.org/officeDocument/2006/math" xmlns:v="urn:schemas-microsoft-com:vml" xmlns:wp14="http://schemas.microsoft.com/office/word/2010/wordprocessingDrawing" xmlns:wp="http://schemas.openxmlformats.org/drawingml/2006/wordprocessingDrawing" xmlns:w10="urn:schemas-microsoft-com:office:word" xmlns:w="http://schemas.openxmlformats.org/wordprocessingml/2006/main" xmlns:w14="http://schemas.microsoft.com/office/word/2010/wordml" xmlns:w15="http://schemas.microsoft.com/office/word/2012/wordml" xmlns:w16cex="http://schemas.microsoft.com/office/word/2018/wordml/cex" xmlns:w16cid="http://schemas.microsoft.com/office/word/2016/wordml/cid" xmlns:w16="http://schemas.microsoft.com/office/word/2018/wordml" xmlns:w16sdtdh="http://schemas.microsoft.com/office/word/2020/wordml/sdtdatahash" xmlns:w16se="http://schemas.microsoft.com/office/word/2015/wordml/symex" xmlns:wpg="http://schemas.microsoft.com/office/word/2010/wordprocessingGroup" xmlns:wpi="http://schemas.microsoft.com/office/word/2010/wordprocessingInk" xmlns:wne="http://schemas.microsoft.com/office/word/2006/wordml" xmlns:wps="http://schemas.microsoft.com/office/word/2010/wordprocessingShape" mc:Ignorable="w14 w15 w16se w16cid w16 w16cex w16sdtdh wp14">
+<w:endnotes xmlns:wpc="http://schemas.microsoft.com/office/word/2010/wordprocessingCanvas" xmlns:cx="http://schemas.microsoft.com/office/drawing/2014/chartex" xmlns:cx1="http://schemas.microsoft.com/office/drawing/2015/9/8/chartex" xmlns:cx2="http://schemas.microsoft.com/office/drawing/2015/10/21/chartex" xmlns:cx3="http://schemas.microsoft.com/office/drawing/2016/5/9/chartex" xmlns:cx4="http://schemas.microsoft.com/office/drawing/2016/5/10/chartex" xmlns:cx5="http://schemas.microsoft.com/office/drawing/2016/5/11/chartex" xmlns:cx6="http://schemas.microsoft.com/office/drawing/2016/5/12/chartex" xmlns:cx7="http://schemas.microsoft.com/office/drawing/2016/5/13/chartex" xmlns:cx8="http://schemas.microsoft.com/office/drawing/2016/5/14/chartex" xmlns:mc="http://schemas.openxmlformats.org/markup-compatibility/2006" xmlns:aink="http://schemas.microsoft.com/office/drawing/2016/ink" xmlns:am3d="http://schemas.microsoft.com/office/drawing/2017/model3d" xmlns:o="urn:schemas-microsoft-com:office:office" xmlns:oel="http://schemas.microsoft.com/office/2019/extlst" xmlns:r="http://schemas.openxmlformats.org/officeDocument/2006/relationships" xmlns:m="http://schemas.openxmlformats.org/officeDocument/2006/math" xmlns:v="urn:schemas-microsoft-com:vml" xmlns:wp14="http://schemas.microsoft.com/office/word/2010/wordprocessingDrawing" xmlns:wp="http://schemas.openxmlformats.org/drawingml/2006/wordprocessingDrawing" xmlns:w10="urn:schemas-microsoft-com:office:word" xmlns:w="http://schemas.openxmlformats.org/wordprocessingml/2006/main" xmlns:w14="http://schemas.microsoft.com/office/word/2010/wordml" xmlns:w15="http://schemas.microsoft.com/office/word/2012/wordml" xmlns:w16cex="http://schemas.microsoft.com/office/word/2018/wordml/cex" xmlns:w16cid="http://schemas.microsoft.com/office/word/2016/wordml/cid" xmlns:w16="http://schemas.microsoft.com/office/word/2018/wordml" xmlns:w16du="http://schemas.microsoft.com/office/word/2023/wordml/word16du" xmlns:w16sdtdh="http://schemas.microsoft.com/office/word/2020/wordml/sdtdatahash" xmlns:w16sdtfl="http://schemas.microsoft.com/office/word/2024/wordml/sdtformatlock" xmlns:w16se="http://schemas.microsoft.com/office/word/2015/wordml/symex" xmlns:wpg="http://schemas.microsoft.com/office/word/2010/wordprocessingGroup" xmlns:wpi="http://schemas.microsoft.com/office/word/2010/wordprocessingInk" xmlns:wne="http://schemas.microsoft.com/office/word/2006/wordml" xmlns:wps="http://schemas.microsoft.com/office/word/2010/wordprocessingShape" mc:Ignorable="w14 w15 w16se w16cid w16 w16cex w16sdtdh w16sdtfl w16du wp14">
   <w:endnote w:type="separator" w:id="-1">
     <w:p>
       <w:pPr>
@@ -2569,7 +2451,37 @@
 </file>
 
 <file path=word/footer1.xml><?xml version="1.0" encoding="utf-8"?>
-<w:ftr xmlns:wpc="http://schemas.microsoft.com/office/word/2010/wordprocessingCanvas" xmlns:cx="http://schemas.microsoft.com/office/drawing/2014/chartex" xmlns:cx1="http://schemas.microsoft.com/office/drawing/2015/9/8/chartex" xmlns:cx2="http://schemas.microsoft.com/office/drawing/2015/10/21/chartex" xmlns:cx3="http://schemas.microsoft.com/office/drawing/2016/5/9/chartex" xmlns:cx4="http://schemas.microsoft.com/office/drawing/2016/5/10/chartex" xmlns:cx5="http://schemas.microsoft.com/office/drawing/2016/5/11/chartex" xmlns:cx6="http://schemas.microsoft.com/office/drawing/2016/5/12/chartex" xmlns:cx7="http://schemas.microsoft.com/office/drawing/2016/5/13/chartex" xmlns:cx8="http://schemas.microsoft.com/office/drawing/2016/5/14/chartex" xmlns:mc="http://schemas.openxmlformats.org/markup-compatibility/2006" xmlns:aink="http://schemas.microsoft.com/office/drawing/2016/ink" xmlns:am3d="http://schemas.microsoft.com/office/drawing/2017/model3d" xmlns:o="urn:schemas-microsoft-com:office:office" xmlns:r="http://schemas.openxmlformats.org/officeDocument/2006/relationships" xmlns:m="http://schemas.openxmlformats.org/officeDocument/2006/math" xmlns:v="urn:schemas-microsoft-com:vml" xmlns:wp14="http://schemas.microsoft.com/office/word/2010/wordprocessingDrawing" xmlns:wp="http://schemas.openxmlformats.org/drawingml/2006/wordprocessingDrawing" xmlns:w10="urn:schemas-microsoft-com:office:word" xmlns:w="http://schemas.openxmlformats.org/wordprocessingml/2006/main" xmlns:w14="http://schemas.microsoft.com/office/word/2010/wordml" xmlns:w15="http://schemas.microsoft.com/office/word/2012/wordml" xmlns:w16cex="http://schemas.microsoft.com/office/word/2018/wordml/cex" xmlns:w16cid="http://schemas.microsoft.com/office/word/2016/wordml/cid" xmlns:w16="http://schemas.microsoft.com/office/word/2018/wordml" xmlns:w16sdtdh="http://schemas.microsoft.com/office/word/2020/wordml/sdtdatahash" xmlns:w16se="http://schemas.microsoft.com/office/word/2015/wordml/symex" xmlns:wpg="http://schemas.microsoft.com/office/word/2010/wordprocessingGroup" xmlns:wpi="http://schemas.microsoft.com/office/word/2010/wordprocessingInk" xmlns:wne="http://schemas.microsoft.com/office/word/2006/wordml" xmlns:wps="http://schemas.microsoft.com/office/word/2010/wordprocessingShape" mc:Ignorable="w14 w15 w16se w16cid w16 w16cex w16sdtdh wp14">
+<w:ftr xmlns:wpc="http://schemas.microsoft.com/office/word/2010/wordprocessingCanvas" xmlns:cx="http://schemas.microsoft.com/office/drawing/2014/chartex" xmlns:cx1="http://schemas.microsoft.com/office/drawing/2015/9/8/chartex" xmlns:cx2="http://schemas.microsoft.com/office/drawing/2015/10/21/chartex" xmlns:cx3="http://schemas.microsoft.com/office/drawing/2016/5/9/chartex" xmlns:cx4="http://schemas.microsoft.com/office/drawing/2016/5/10/chartex" xmlns:cx5="http://schemas.microsoft.com/office/drawing/2016/5/11/chartex" xmlns:cx6="http://schemas.microsoft.com/office/drawing/2016/5/12/chartex" xmlns:cx7="http://schemas.microsoft.com/office/drawing/2016/5/13/chartex" xmlns:cx8="http://schemas.microsoft.com/office/drawing/2016/5/14/chartex" xmlns:mc="http://schemas.openxmlformats.org/markup-compatibility/2006" xmlns:aink="http://schemas.microsoft.com/office/drawing/2016/ink" xmlns:am3d="http://schemas.microsoft.com/office/drawing/2017/model3d" xmlns:o="urn:schemas-microsoft-com:office:office" xmlns:oel="http://schemas.microsoft.com/office/2019/extlst" xmlns:r="http://schemas.openxmlformats.org/officeDocument/2006/relationships" xmlns:m="http://schemas.openxmlformats.org/officeDocument/2006/math" xmlns:v="urn:schemas-microsoft-com:vml" xmlns:wp14="http://schemas.microsoft.com/office/word/2010/wordprocessingDrawing" xmlns:wp="http://schemas.openxmlformats.org/drawingml/2006/wordprocessingDrawing" xmlns:w10="urn:schemas-microsoft-com:office:word" xmlns:w="http://schemas.openxmlformats.org/wordprocessingml/2006/main" xmlns:w14="http://schemas.microsoft.com/office/word/2010/wordml" xmlns:w15="http://schemas.microsoft.com/office/word/2012/wordml" xmlns:w16cex="http://schemas.microsoft.com/office/word/2018/wordml/cex" xmlns:w16cid="http://schemas.microsoft.com/office/word/2016/wordml/cid" xmlns:w16="http://schemas.microsoft.com/office/word/2018/wordml" xmlns:w16du="http://schemas.microsoft.com/office/word/2023/wordml/word16du" xmlns:w16sdtdh="http://schemas.microsoft.com/office/word/2020/wordml/sdtdatahash" xmlns:w16sdtfl="http://schemas.microsoft.com/office/word/2024/wordml/sdtformatlock" xmlns:w16se="http://schemas.microsoft.com/office/word/2015/wordml/symex" xmlns:wpg="http://schemas.microsoft.com/office/word/2010/wordprocessingGroup" xmlns:wpi="http://schemas.microsoft.com/office/word/2010/wordprocessingInk" xmlns:wne="http://schemas.microsoft.com/office/word/2006/wordml" xmlns:wps="http://schemas.microsoft.com/office/word/2010/wordprocessingShape" mc:Ignorable="w14 w15 w16se w16cid w16 w16cex w16sdtdh w16sdtfl w16du wp14">
+  <w:p>
+    <w:pPr>
+      <w:pStyle w:val="af4"/>
+    </w:pPr>
+  </w:p>
+</w:ftr>
+</file>
+
+<file path=word/footer2.xml><?xml version="1.0" encoding="utf-8"?>
+<w:ftr xmlns:wpc="http://schemas.microsoft.com/office/word/2010/wordprocessingCanvas" xmlns:cx="http://schemas.microsoft.com/office/drawing/2014/chartex" xmlns:cx1="http://schemas.microsoft.com/office/drawing/2015/9/8/chartex" xmlns:cx2="http://schemas.microsoft.com/office/drawing/2015/10/21/chartex" xmlns:cx3="http://schemas.microsoft.com/office/drawing/2016/5/9/chartex" xmlns:cx4="http://schemas.microsoft.com/office/drawing/2016/5/10/chartex" xmlns:cx5="http://schemas.microsoft.com/office/drawing/2016/5/11/chartex" xmlns:cx6="http://schemas.microsoft.com/office/drawing/2016/5/12/chartex" xmlns:cx7="http://schemas.microsoft.com/office/drawing/2016/5/13/chartex" xmlns:cx8="http://schemas.microsoft.com/office/drawing/2016/5/14/chartex" xmlns:mc="http://schemas.openxmlformats.org/markup-compatibility/2006" xmlns:aink="http://schemas.microsoft.com/office/drawing/2016/ink" xmlns:am3d="http://schemas.microsoft.com/office/drawing/2017/model3d" xmlns:o="urn:schemas-microsoft-com:office:office" xmlns:oel="http://schemas.microsoft.com/office/2019/extlst" xmlns:r="http://schemas.openxmlformats.org/officeDocument/2006/relationships" xmlns:m="http://schemas.openxmlformats.org/officeDocument/2006/math" xmlns:v="urn:schemas-microsoft-com:vml" xmlns:wp14="http://schemas.microsoft.com/office/word/2010/wordprocessingDrawing" xmlns:wp="http://schemas.openxmlformats.org/drawingml/2006/wordprocessingDrawing" xmlns:w10="urn:schemas-microsoft-com:office:word" xmlns:w="http://schemas.openxmlformats.org/wordprocessingml/2006/main" xmlns:w14="http://schemas.microsoft.com/office/word/2010/wordml" xmlns:w15="http://schemas.microsoft.com/office/word/2012/wordml" xmlns:w16cex="http://schemas.microsoft.com/office/word/2018/wordml/cex" xmlns:w16cid="http://schemas.microsoft.com/office/word/2016/wordml/cid" xmlns:w16="http://schemas.microsoft.com/office/word/2018/wordml" xmlns:w16du="http://schemas.microsoft.com/office/word/2023/wordml/word16du" xmlns:w16sdtdh="http://schemas.microsoft.com/office/word/2020/wordml/sdtdatahash" xmlns:w16sdtfl="http://schemas.microsoft.com/office/word/2024/wordml/sdtformatlock" xmlns:w16se="http://schemas.microsoft.com/office/word/2015/wordml/symex" xmlns:wpg="http://schemas.microsoft.com/office/word/2010/wordprocessingGroup" xmlns:wpi="http://schemas.microsoft.com/office/word/2010/wordprocessingInk" xmlns:wne="http://schemas.microsoft.com/office/word/2006/wordml" xmlns:wps="http://schemas.microsoft.com/office/word/2010/wordprocessingShape" mc:Ignorable="w14 w15 w16se w16cid w16 w16cex w16sdtdh w16sdtfl w16du wp14">
+  <w:p>
+    <w:pPr>
+      <w:pStyle w:val="af4"/>
+    </w:pPr>
+  </w:p>
+</w:ftr>
+</file>
+
+<file path=word/footer3.xml><?xml version="1.0" encoding="utf-8"?>
+<w:ftr xmlns:wpc="http://schemas.microsoft.com/office/word/2010/wordprocessingCanvas" xmlns:cx="http://schemas.microsoft.com/office/drawing/2014/chartex" xmlns:cx1="http://schemas.microsoft.com/office/drawing/2015/9/8/chartex" xmlns:cx2="http://schemas.microsoft.com/office/drawing/2015/10/21/chartex" xmlns:cx3="http://schemas.microsoft.com/office/drawing/2016/5/9/chartex" xmlns:cx4="http://schemas.microsoft.com/office/drawing/2016/5/10/chartex" xmlns:cx5="http://schemas.microsoft.com/office/drawing/2016/5/11/chartex" xmlns:cx6="http://schemas.microsoft.com/office/drawing/2016/5/12/chartex" xmlns:cx7="http://schemas.microsoft.com/office/drawing/2016/5/13/chartex" xmlns:cx8="http://schemas.microsoft.com/office/drawing/2016/5/14/chartex" xmlns:mc="http://schemas.openxmlformats.org/markup-compatibility/2006" xmlns:aink="http://schemas.microsoft.com/office/drawing/2016/ink" xmlns:am3d="http://schemas.microsoft.com/office/drawing/2017/model3d" xmlns:o="urn:schemas-microsoft-com:office:office" xmlns:oel="http://schemas.microsoft.com/office/2019/extlst" xmlns:r="http://schemas.openxmlformats.org/officeDocument/2006/relationships" xmlns:m="http://schemas.openxmlformats.org/officeDocument/2006/math" xmlns:v="urn:schemas-microsoft-com:vml" xmlns:wp14="http://schemas.microsoft.com/office/word/2010/wordprocessingDrawing" xmlns:wp="http://schemas.openxmlformats.org/drawingml/2006/wordprocessingDrawing" xmlns:w10="urn:schemas-microsoft-com:office:word" xmlns:w="http://schemas.openxmlformats.org/wordprocessingml/2006/main" xmlns:w14="http://schemas.microsoft.com/office/word/2010/wordml" xmlns:w15="http://schemas.microsoft.com/office/word/2012/wordml" xmlns:w16cex="http://schemas.microsoft.com/office/word/2018/wordml/cex" xmlns:w16cid="http://schemas.microsoft.com/office/word/2016/wordml/cid" xmlns:w16="http://schemas.microsoft.com/office/word/2018/wordml" xmlns:w16du="http://schemas.microsoft.com/office/word/2023/wordml/word16du" xmlns:w16sdtdh="http://schemas.microsoft.com/office/word/2020/wordml/sdtdatahash" xmlns:w16sdtfl="http://schemas.microsoft.com/office/word/2024/wordml/sdtformatlock" xmlns:w16se="http://schemas.microsoft.com/office/word/2015/wordml/symex" xmlns:wpg="http://schemas.microsoft.com/office/word/2010/wordprocessingGroup" xmlns:wpi="http://schemas.microsoft.com/office/word/2010/wordprocessingInk" xmlns:wne="http://schemas.microsoft.com/office/word/2006/wordml" xmlns:wps="http://schemas.microsoft.com/office/word/2010/wordprocessingShape" mc:Ignorable="w14 w15 w16se w16cid w16 w16cex w16sdtdh w16sdtfl w16du wp14">
+  <w:p>
+    <w:pPr>
+      <w:pStyle w:val="af4"/>
+    </w:pPr>
+  </w:p>
+</w:ftr>
+</file>
+
+<file path=word/footer4.xml><?xml version="1.0" encoding="utf-8"?>
+<w:ftr xmlns:wpc="http://schemas.microsoft.com/office/word/2010/wordprocessingCanvas" xmlns:cx="http://schemas.microsoft.com/office/drawing/2014/chartex" xmlns:cx1="http://schemas.microsoft.com/office/drawing/2015/9/8/chartex" xmlns:cx2="http://schemas.microsoft.com/office/drawing/2015/10/21/chartex" xmlns:cx3="http://schemas.microsoft.com/office/drawing/2016/5/9/chartex" xmlns:cx4="http://schemas.microsoft.com/office/drawing/2016/5/10/chartex" xmlns:cx5="http://schemas.microsoft.com/office/drawing/2016/5/11/chartex" xmlns:cx6="http://schemas.microsoft.com/office/drawing/2016/5/12/chartex" xmlns:cx7="http://schemas.microsoft.com/office/drawing/2016/5/13/chartex" xmlns:cx8="http://schemas.microsoft.com/office/drawing/2016/5/14/chartex" xmlns:mc="http://schemas.openxmlformats.org/markup-compatibility/2006" xmlns:aink="http://schemas.microsoft.com/office/drawing/2016/ink" xmlns:am3d="http://schemas.microsoft.com/office/drawing/2017/model3d" xmlns:o="urn:schemas-microsoft-com:office:office" xmlns:oel="http://schemas.microsoft.com/office/2019/extlst" xmlns:r="http://schemas.openxmlformats.org/officeDocument/2006/relationships" xmlns:m="http://schemas.openxmlformats.org/officeDocument/2006/math" xmlns:v="urn:schemas-microsoft-com:vml" xmlns:wp14="http://schemas.microsoft.com/office/word/2010/wordprocessingDrawing" xmlns:wp="http://schemas.openxmlformats.org/drawingml/2006/wordprocessingDrawing" xmlns:w10="urn:schemas-microsoft-com:office:word" xmlns:w="http://schemas.openxmlformats.org/wordprocessingml/2006/main" xmlns:w14="http://schemas.microsoft.com/office/word/2010/wordml" xmlns:w15="http://schemas.microsoft.com/office/word/2012/wordml" xmlns:w16cex="http://schemas.microsoft.com/office/word/2018/wordml/cex" xmlns:w16cid="http://schemas.microsoft.com/office/word/2016/wordml/cid" xmlns:w16="http://schemas.microsoft.com/office/word/2018/wordml" xmlns:w16du="http://schemas.microsoft.com/office/word/2023/wordml/word16du" xmlns:w16sdtdh="http://schemas.microsoft.com/office/word/2020/wordml/sdtdatahash" xmlns:w16sdtfl="http://schemas.microsoft.com/office/word/2024/wordml/sdtformatlock" xmlns:w16se="http://schemas.microsoft.com/office/word/2015/wordml/symex" xmlns:wpg="http://schemas.microsoft.com/office/word/2010/wordprocessingGroup" xmlns:wpi="http://schemas.microsoft.com/office/word/2010/wordprocessingInk" xmlns:wne="http://schemas.microsoft.com/office/word/2006/wordml" xmlns:wps="http://schemas.microsoft.com/office/word/2010/wordprocessingShape" mc:Ignorable="w14 w15 w16se w16cid w16 w16cex w16sdtdh w16sdtfl w16du wp14">
   <w:sdt>
     <w:sdtPr>
       <w:id w:val="457071166"/>
@@ -2583,9 +2495,6 @@
         <w:pPr>
           <w:pStyle w:val="af4"/>
           <w:jc w:val="center"/>
-          <w:rPr>
-            <w:rFonts w:hint="eastAsia"/>
-          </w:rPr>
         </w:pPr>
         <w:r>
           <w:fldChar w:fldCharType="begin"/>
@@ -2611,8 +2520,8 @@
 </w:ftr>
 </file>
 
-<file path=word/footer2.xml><?xml version="1.0" encoding="utf-8"?>
-<w:ftr xmlns:wpc="http://schemas.microsoft.com/office/word/2010/wordprocessingCanvas" xmlns:cx="http://schemas.microsoft.com/office/drawing/2014/chartex" xmlns:cx1="http://schemas.microsoft.com/office/drawing/2015/9/8/chartex" xmlns:cx2="http://schemas.microsoft.com/office/drawing/2015/10/21/chartex" xmlns:cx3="http://schemas.microsoft.com/office/drawing/2016/5/9/chartex" xmlns:cx4="http://schemas.microsoft.com/office/drawing/2016/5/10/chartex" xmlns:cx5="http://schemas.microsoft.com/office/drawing/2016/5/11/chartex" xmlns:cx6="http://schemas.microsoft.com/office/drawing/2016/5/12/chartex" xmlns:cx7="http://schemas.microsoft.com/office/drawing/2016/5/13/chartex" xmlns:cx8="http://schemas.microsoft.com/office/drawing/2016/5/14/chartex" xmlns:mc="http://schemas.openxmlformats.org/markup-compatibility/2006" xmlns:aink="http://schemas.microsoft.com/office/drawing/2016/ink" xmlns:am3d="http://schemas.microsoft.com/office/drawing/2017/model3d" xmlns:o="urn:schemas-microsoft-com:office:office" xmlns:r="http://schemas.openxmlformats.org/officeDocument/2006/relationships" xmlns:m="http://schemas.openxmlformats.org/officeDocument/2006/math" xmlns:v="urn:schemas-microsoft-com:vml" xmlns:wp14="http://schemas.microsoft.com/office/word/2010/wordprocessingDrawing" xmlns:wp="http://schemas.openxmlformats.org/drawingml/2006/wordprocessingDrawing" xmlns:w10="urn:schemas-microsoft-com:office:word" xmlns:w="http://schemas.openxmlformats.org/wordprocessingml/2006/main" xmlns:w14="http://schemas.microsoft.com/office/word/2010/wordml" xmlns:w15="http://schemas.microsoft.com/office/word/2012/wordml" xmlns:w16cex="http://schemas.microsoft.com/office/word/2018/wordml/cex" xmlns:w16cid="http://schemas.microsoft.com/office/word/2016/wordml/cid" xmlns:w16="http://schemas.microsoft.com/office/word/2018/wordml" xmlns:w16sdtdh="http://schemas.microsoft.com/office/word/2020/wordml/sdtdatahash" xmlns:w16se="http://schemas.microsoft.com/office/word/2015/wordml/symex" xmlns:wpg="http://schemas.microsoft.com/office/word/2010/wordprocessingGroup" xmlns:wpi="http://schemas.microsoft.com/office/word/2010/wordprocessingInk" xmlns:wne="http://schemas.microsoft.com/office/word/2006/wordml" xmlns:wps="http://schemas.microsoft.com/office/word/2010/wordprocessingShape" mc:Ignorable="w14 w15 w16se w16cid w16 w16cex w16sdtdh wp14">
+<file path=word/footer5.xml><?xml version="1.0" encoding="utf-8"?>
+<w:ftr xmlns:wpc="http://schemas.microsoft.com/office/word/2010/wordprocessingCanvas" xmlns:cx="http://schemas.microsoft.com/office/drawing/2014/chartex" xmlns:cx1="http://schemas.microsoft.com/office/drawing/2015/9/8/chartex" xmlns:cx2="http://schemas.microsoft.com/office/drawing/2015/10/21/chartex" xmlns:cx3="http://schemas.microsoft.com/office/drawing/2016/5/9/chartex" xmlns:cx4="http://schemas.microsoft.com/office/drawing/2016/5/10/chartex" xmlns:cx5="http://schemas.microsoft.com/office/drawing/2016/5/11/chartex" xmlns:cx6="http://schemas.microsoft.com/office/drawing/2016/5/12/chartex" xmlns:cx7="http://schemas.microsoft.com/office/drawing/2016/5/13/chartex" xmlns:cx8="http://schemas.microsoft.com/office/drawing/2016/5/14/chartex" xmlns:mc="http://schemas.openxmlformats.org/markup-compatibility/2006" xmlns:aink="http://schemas.microsoft.com/office/drawing/2016/ink" xmlns:am3d="http://schemas.microsoft.com/office/drawing/2017/model3d" xmlns:o="urn:schemas-microsoft-com:office:office" xmlns:oel="http://schemas.microsoft.com/office/2019/extlst" xmlns:r="http://schemas.openxmlformats.org/officeDocument/2006/relationships" xmlns:m="http://schemas.openxmlformats.org/officeDocument/2006/math" xmlns:v="urn:schemas-microsoft-com:vml" xmlns:wp14="http://schemas.microsoft.com/office/word/2010/wordprocessingDrawing" xmlns:wp="http://schemas.openxmlformats.org/drawingml/2006/wordprocessingDrawing" xmlns:w10="urn:schemas-microsoft-com:office:word" xmlns:w="http://schemas.openxmlformats.org/wordprocessingml/2006/main" xmlns:w14="http://schemas.microsoft.com/office/word/2010/wordml" xmlns:w15="http://schemas.microsoft.com/office/word/2012/wordml" xmlns:w16cex="http://schemas.microsoft.com/office/word/2018/wordml/cex" xmlns:w16cid="http://schemas.microsoft.com/office/word/2016/wordml/cid" xmlns:w16="http://schemas.microsoft.com/office/word/2018/wordml" xmlns:w16du="http://schemas.microsoft.com/office/word/2023/wordml/word16du" xmlns:w16sdtdh="http://schemas.microsoft.com/office/word/2020/wordml/sdtdatahash" xmlns:w16sdtfl="http://schemas.microsoft.com/office/word/2024/wordml/sdtformatlock" xmlns:w16se="http://schemas.microsoft.com/office/word/2015/wordml/symex" xmlns:wpg="http://schemas.microsoft.com/office/word/2010/wordprocessingGroup" xmlns:wpi="http://schemas.microsoft.com/office/word/2010/wordprocessingInk" xmlns:wne="http://schemas.microsoft.com/office/word/2006/wordml" xmlns:wps="http://schemas.microsoft.com/office/word/2010/wordprocessingShape" mc:Ignorable="w14 w15 w16se w16cid w16 w16cex w16sdtdh w16sdtfl w16du wp14">
   <w:p>
     <w:pPr>
       <w:pStyle w:val="af4"/>
@@ -2622,8 +2531,8 @@
 </w:ftr>
 </file>
 
-<file path=word/footer3.xml><?xml version="1.0" encoding="utf-8"?>
-<w:ftr xmlns:wpc="http://schemas.microsoft.com/office/word/2010/wordprocessingCanvas" xmlns:cx="http://schemas.microsoft.com/office/drawing/2014/chartex" xmlns:cx1="http://schemas.microsoft.com/office/drawing/2015/9/8/chartex" xmlns:cx2="http://schemas.microsoft.com/office/drawing/2015/10/21/chartex" xmlns:cx3="http://schemas.microsoft.com/office/drawing/2016/5/9/chartex" xmlns:cx4="http://schemas.microsoft.com/office/drawing/2016/5/10/chartex" xmlns:cx5="http://schemas.microsoft.com/office/drawing/2016/5/11/chartex" xmlns:cx6="http://schemas.microsoft.com/office/drawing/2016/5/12/chartex" xmlns:cx7="http://schemas.microsoft.com/office/drawing/2016/5/13/chartex" xmlns:cx8="http://schemas.microsoft.com/office/drawing/2016/5/14/chartex" xmlns:mc="http://schemas.openxmlformats.org/markup-compatibility/2006" xmlns:aink="http://schemas.microsoft.com/office/drawing/2016/ink" xmlns:am3d="http://schemas.microsoft.com/office/drawing/2017/model3d" xmlns:o="urn:schemas-microsoft-com:office:office" xmlns:r="http://schemas.openxmlformats.org/officeDocument/2006/relationships" xmlns:m="http://schemas.openxmlformats.org/officeDocument/2006/math" xmlns:v="urn:schemas-microsoft-com:vml" xmlns:wp14="http://schemas.microsoft.com/office/word/2010/wordprocessingDrawing" xmlns:wp="http://schemas.openxmlformats.org/drawingml/2006/wordprocessingDrawing" xmlns:w10="urn:schemas-microsoft-com:office:word" xmlns:w="http://schemas.openxmlformats.org/wordprocessingml/2006/main" xmlns:w14="http://schemas.microsoft.com/office/word/2010/wordml" xmlns:w15="http://schemas.microsoft.com/office/word/2012/wordml" xmlns:w16cex="http://schemas.microsoft.com/office/word/2018/wordml/cex" xmlns:w16cid="http://schemas.microsoft.com/office/word/2016/wordml/cid" xmlns:w16="http://schemas.microsoft.com/office/word/2018/wordml" xmlns:w16sdtdh="http://schemas.microsoft.com/office/word/2020/wordml/sdtdatahash" xmlns:w16se="http://schemas.microsoft.com/office/word/2015/wordml/symex" xmlns:wpg="http://schemas.microsoft.com/office/word/2010/wordprocessingGroup" xmlns:wpi="http://schemas.microsoft.com/office/word/2010/wordprocessingInk" xmlns:wne="http://schemas.microsoft.com/office/word/2006/wordml" xmlns:wps="http://schemas.microsoft.com/office/word/2010/wordprocessingShape" mc:Ignorable="w14 w15 w16se w16cid w16 w16cex w16sdtdh wp14">
+<file path=word/footer6.xml><?xml version="1.0" encoding="utf-8"?>
+<w:ftr xmlns:wpc="http://schemas.microsoft.com/office/word/2010/wordprocessingCanvas" xmlns:cx="http://schemas.microsoft.com/office/drawing/2014/chartex" xmlns:cx1="http://schemas.microsoft.com/office/drawing/2015/9/8/chartex" xmlns:cx2="http://schemas.microsoft.com/office/drawing/2015/10/21/chartex" xmlns:cx3="http://schemas.microsoft.com/office/drawing/2016/5/9/chartex" xmlns:cx4="http://schemas.microsoft.com/office/drawing/2016/5/10/chartex" xmlns:cx5="http://schemas.microsoft.com/office/drawing/2016/5/11/chartex" xmlns:cx6="http://schemas.microsoft.com/office/drawing/2016/5/12/chartex" xmlns:cx7="http://schemas.microsoft.com/office/drawing/2016/5/13/chartex" xmlns:cx8="http://schemas.microsoft.com/office/drawing/2016/5/14/chartex" xmlns:mc="http://schemas.openxmlformats.org/markup-compatibility/2006" xmlns:aink="http://schemas.microsoft.com/office/drawing/2016/ink" xmlns:am3d="http://schemas.microsoft.com/office/drawing/2017/model3d" xmlns:o="urn:schemas-microsoft-com:office:office" xmlns:oel="http://schemas.microsoft.com/office/2019/extlst" xmlns:r="http://schemas.openxmlformats.org/officeDocument/2006/relationships" xmlns:m="http://schemas.openxmlformats.org/officeDocument/2006/math" xmlns:v="urn:schemas-microsoft-com:vml" xmlns:wp14="http://schemas.microsoft.com/office/word/2010/wordprocessingDrawing" xmlns:wp="http://schemas.openxmlformats.org/drawingml/2006/wordprocessingDrawing" xmlns:w10="urn:schemas-microsoft-com:office:word" xmlns:w="http://schemas.openxmlformats.org/wordprocessingml/2006/main" xmlns:w14="http://schemas.microsoft.com/office/word/2010/wordml" xmlns:w15="http://schemas.microsoft.com/office/word/2012/wordml" xmlns:w16cex="http://schemas.microsoft.com/office/word/2018/wordml/cex" xmlns:w16cid="http://schemas.microsoft.com/office/word/2016/wordml/cid" xmlns:w16="http://schemas.microsoft.com/office/word/2018/wordml" xmlns:w16du="http://schemas.microsoft.com/office/word/2023/wordml/word16du" xmlns:w16sdtdh="http://schemas.microsoft.com/office/word/2020/wordml/sdtdatahash" xmlns:w16sdtfl="http://schemas.microsoft.com/office/word/2024/wordml/sdtformatlock" xmlns:w16se="http://schemas.microsoft.com/office/word/2015/wordml/symex" xmlns:wpg="http://schemas.microsoft.com/office/word/2010/wordprocessingGroup" xmlns:wpi="http://schemas.microsoft.com/office/word/2010/wordprocessingInk" xmlns:wne="http://schemas.microsoft.com/office/word/2006/wordml" xmlns:wps="http://schemas.microsoft.com/office/word/2010/wordprocessingShape" mc:Ignorable="w14 w15 w16se w16cid w16 w16cex w16sdtdh w16sdtfl w16du wp14">
   <w:sdt>
     <w:sdtPr>
       <w:id w:val="-921403694"/>
@@ -2637,9 +2546,6 @@
         <w:pPr>
           <w:pStyle w:val="af4"/>
           <w:jc w:val="center"/>
-          <w:rPr>
-            <w:rFonts w:hint="eastAsia"/>
-          </w:rPr>
         </w:pPr>
         <w:r>
           <w:fldChar w:fldCharType="begin"/>
@@ -2665,8 +2571,8 @@
 </w:ftr>
 </file>
 
-<file path=word/footer4.xml><?xml version="1.0" encoding="utf-8"?>
-<w:ftr xmlns:wpc="http://schemas.microsoft.com/office/word/2010/wordprocessingCanvas" xmlns:cx="http://schemas.microsoft.com/office/drawing/2014/chartex" xmlns:cx1="http://schemas.microsoft.com/office/drawing/2015/9/8/chartex" xmlns:cx2="http://schemas.microsoft.com/office/drawing/2015/10/21/chartex" xmlns:cx3="http://schemas.microsoft.com/office/drawing/2016/5/9/chartex" xmlns:cx4="http://schemas.microsoft.com/office/drawing/2016/5/10/chartex" xmlns:cx5="http://schemas.microsoft.com/office/drawing/2016/5/11/chartex" xmlns:cx6="http://schemas.microsoft.com/office/drawing/2016/5/12/chartex" xmlns:cx7="http://schemas.microsoft.com/office/drawing/2016/5/13/chartex" xmlns:cx8="http://schemas.microsoft.com/office/drawing/2016/5/14/chartex" xmlns:mc="http://schemas.openxmlformats.org/markup-compatibility/2006" xmlns:aink="http://schemas.microsoft.com/office/drawing/2016/ink" xmlns:am3d="http://schemas.microsoft.com/office/drawing/2017/model3d" xmlns:o="urn:schemas-microsoft-com:office:office" xmlns:r="http://schemas.openxmlformats.org/officeDocument/2006/relationships" xmlns:m="http://schemas.openxmlformats.org/officeDocument/2006/math" xmlns:v="urn:schemas-microsoft-com:vml" xmlns:wp14="http://schemas.microsoft.com/office/word/2010/wordprocessingDrawing" xmlns:wp="http://schemas.openxmlformats.org/drawingml/2006/wordprocessingDrawing" xmlns:w10="urn:schemas-microsoft-com:office:word" xmlns:w="http://schemas.openxmlformats.org/wordprocessingml/2006/main" xmlns:w14="http://schemas.microsoft.com/office/word/2010/wordml" xmlns:w15="http://schemas.microsoft.com/office/word/2012/wordml" xmlns:w16cex="http://schemas.microsoft.com/office/word/2018/wordml/cex" xmlns:w16cid="http://schemas.microsoft.com/office/word/2016/wordml/cid" xmlns:w16="http://schemas.microsoft.com/office/word/2018/wordml" xmlns:w16sdtdh="http://schemas.microsoft.com/office/word/2020/wordml/sdtdatahash" xmlns:w16se="http://schemas.microsoft.com/office/word/2015/wordml/symex" xmlns:wpg="http://schemas.microsoft.com/office/word/2010/wordprocessingGroup" xmlns:wpi="http://schemas.microsoft.com/office/word/2010/wordprocessingInk" xmlns:wne="http://schemas.microsoft.com/office/word/2006/wordml" xmlns:wps="http://schemas.microsoft.com/office/word/2010/wordprocessingShape" mc:Ignorable="w14 w15 w16se w16cid w16 w16cex w16sdtdh wp14">
+<file path=word/footer7.xml><?xml version="1.0" encoding="utf-8"?>
+<w:ftr xmlns:wpc="http://schemas.microsoft.com/office/word/2010/wordprocessingCanvas" xmlns:cx="http://schemas.microsoft.com/office/drawing/2014/chartex" xmlns:cx1="http://schemas.microsoft.com/office/drawing/2015/9/8/chartex" xmlns:cx2="http://schemas.microsoft.com/office/drawing/2015/10/21/chartex" xmlns:cx3="http://schemas.microsoft.com/office/drawing/2016/5/9/chartex" xmlns:cx4="http://schemas.microsoft.com/office/drawing/2016/5/10/chartex" xmlns:cx5="http://schemas.microsoft.com/office/drawing/2016/5/11/chartex" xmlns:cx6="http://schemas.microsoft.com/office/drawing/2016/5/12/chartex" xmlns:cx7="http://schemas.microsoft.com/office/drawing/2016/5/13/chartex" xmlns:cx8="http://schemas.microsoft.com/office/drawing/2016/5/14/chartex" xmlns:mc="http://schemas.openxmlformats.org/markup-compatibility/2006" xmlns:aink="http://schemas.microsoft.com/office/drawing/2016/ink" xmlns:am3d="http://schemas.microsoft.com/office/drawing/2017/model3d" xmlns:o="urn:schemas-microsoft-com:office:office" xmlns:oel="http://schemas.microsoft.com/office/2019/extlst" xmlns:r="http://schemas.openxmlformats.org/officeDocument/2006/relationships" xmlns:m="http://schemas.openxmlformats.org/officeDocument/2006/math" xmlns:v="urn:schemas-microsoft-com:vml" xmlns:wp14="http://schemas.microsoft.com/office/word/2010/wordprocessingDrawing" xmlns:wp="http://schemas.openxmlformats.org/drawingml/2006/wordprocessingDrawing" xmlns:w10="urn:schemas-microsoft-com:office:word" xmlns:w="http://schemas.openxmlformats.org/wordprocessingml/2006/main" xmlns:w14="http://schemas.microsoft.com/office/word/2010/wordml" xmlns:w15="http://schemas.microsoft.com/office/word/2012/wordml" xmlns:w16cex="http://schemas.microsoft.com/office/word/2018/wordml/cex" xmlns:w16cid="http://schemas.microsoft.com/office/word/2016/wordml/cid" xmlns:w16="http://schemas.microsoft.com/office/word/2018/wordml" xmlns:w16du="http://schemas.microsoft.com/office/word/2023/wordml/word16du" xmlns:w16sdtdh="http://schemas.microsoft.com/office/word/2020/wordml/sdtdatahash" xmlns:w16sdtfl="http://schemas.microsoft.com/office/word/2024/wordml/sdtformatlock" xmlns:w16se="http://schemas.microsoft.com/office/word/2015/wordml/symex" xmlns:wpg="http://schemas.microsoft.com/office/word/2010/wordprocessingGroup" xmlns:wpi="http://schemas.microsoft.com/office/word/2010/wordprocessingInk" xmlns:wne="http://schemas.microsoft.com/office/word/2006/wordml" xmlns:wps="http://schemas.microsoft.com/office/word/2010/wordprocessingShape" mc:Ignorable="w14 w15 w16se w16cid w16 w16cex w16sdtdh w16sdtfl w16du wp14">
   <w:p>
     <w:pPr>
       <w:pStyle w:val="af4"/>
@@ -2677,7 +2583,7 @@
 </file>
 
 <file path=word/footnotes.xml><?xml version="1.0" encoding="utf-8"?>
-<w:footnotes xmlns:wpc="http://schemas.microsoft.com/office/word/2010/wordprocessingCanvas" xmlns:cx="http://schemas.microsoft.com/office/drawing/2014/chartex" xmlns:cx1="http://schemas.microsoft.com/office/drawing/2015/9/8/chartex" xmlns:cx2="http://schemas.microsoft.com/office/drawing/2015/10/21/chartex" xmlns:cx3="http://schemas.microsoft.com/office/drawing/2016/5/9/chartex" xmlns:cx4="http://schemas.microsoft.com/office/drawing/2016/5/10/chartex" xmlns:cx5="http://schemas.microsoft.com/office/drawing/2016/5/11/chartex" xmlns:cx6="http://schemas.microsoft.com/office/drawing/2016/5/12/chartex" xmlns:cx7="http://schemas.microsoft.com/office/drawing/2016/5/13/chartex" xmlns:cx8="http://schemas.microsoft.com/office/drawing/2016/5/14/chartex" xmlns:mc="http://schemas.openxmlformats.org/markup-compatibility/2006" xmlns:aink="http://schemas.microsoft.com/office/drawing/2016/ink" xmlns:am3d="http://schemas.microsoft.com/office/drawing/2017/model3d" xmlns:o="urn:schemas-microsoft-com:office:office" xmlns:r="http://schemas.openxmlformats.org/officeDocument/2006/relationships" xmlns:m="http://schemas.openxmlformats.org/officeDocument/2006/math" xmlns:v="urn:schemas-microsoft-com:vml" xmlns:wp14="http://schemas.microsoft.com/office/word/2010/wordprocessingDrawing" xmlns:wp="http://schemas.openxmlformats.org/drawingml/2006/wordprocessingDrawing" xmlns:w10="urn:schemas-microsoft-com:office:word" xmlns:w="http://schemas.openxmlformats.org/wordprocessingml/2006/main" xmlns:w14="http://schemas.microsoft.com/office/word/2010/wordml" xmlns:w15="http://schemas.microsoft.com/office/word/2012/wordml" xmlns:w16cex="http://schemas.microsoft.com/office/word/2018/wordml/cex" xmlns:w16cid="http://schemas.microsoft.com/office/word/2016/wordml/cid" xmlns:w16="http://schemas.microsoft.com/office/word/2018/wordml" xmlns:w16sdtdh="http://schemas.microsoft.com/office/word/2020/wordml/sdtdatahash" xmlns:w16se="http://schemas.microsoft.com/office/word/2015/wordml/symex" xmlns:wpg="http://schemas.microsoft.com/office/word/2010/wordprocessingGroup" xmlns:wpi="http://schemas.microsoft.com/office/word/2010/wordprocessingInk" xmlns:wne="http://schemas.microsoft.com/office/word/2006/wordml" xmlns:wps="http://schemas.microsoft.com/office/word/2010/wordprocessingShape" mc:Ignorable="w14 w15 w16se w16cid w16 w16cex w16sdtdh wp14">
+<w:footnotes xmlns:wpc="http://schemas.microsoft.com/office/word/2010/wordprocessingCanvas" xmlns:cx="http://schemas.microsoft.com/office/drawing/2014/chartex" xmlns:cx1="http://schemas.microsoft.com/office/drawing/2015/9/8/chartex" xmlns:cx2="http://schemas.microsoft.com/office/drawing/2015/10/21/chartex" xmlns:cx3="http://schemas.microsoft.com/office/drawing/2016/5/9/chartex" xmlns:cx4="http://schemas.microsoft.com/office/drawing/2016/5/10/chartex" xmlns:cx5="http://schemas.microsoft.com/office/drawing/2016/5/11/chartex" xmlns:cx6="http://schemas.microsoft.com/office/drawing/2016/5/12/chartex" xmlns:cx7="http://schemas.microsoft.com/office/drawing/2016/5/13/chartex" xmlns:cx8="http://schemas.microsoft.com/office/drawing/2016/5/14/chartex" xmlns:mc="http://schemas.openxmlformats.org/markup-compatibility/2006" xmlns:aink="http://schemas.microsoft.com/office/drawing/2016/ink" xmlns:am3d="http://schemas.microsoft.com/office/drawing/2017/model3d" xmlns:o="urn:schemas-microsoft-com:office:office" xmlns:oel="http://schemas.microsoft.com/office/2019/extlst" xmlns:r="http://schemas.openxmlformats.org/officeDocument/2006/relationships" xmlns:m="http://schemas.openxmlformats.org/officeDocument/2006/math" xmlns:v="urn:schemas-microsoft-com:vml" xmlns:wp14="http://schemas.microsoft.com/office/word/2010/wordprocessingDrawing" xmlns:wp="http://schemas.openxmlformats.org/drawingml/2006/wordprocessingDrawing" xmlns:w10="urn:schemas-microsoft-com:office:word" xmlns:w="http://schemas.openxmlformats.org/wordprocessingml/2006/main" xmlns:w14="http://schemas.microsoft.com/office/word/2010/wordml" xmlns:w15="http://schemas.microsoft.com/office/word/2012/wordml" xmlns:w16cex="http://schemas.microsoft.com/office/word/2018/wordml/cex" xmlns:w16cid="http://schemas.microsoft.com/office/word/2016/wordml/cid" xmlns:w16="http://schemas.microsoft.com/office/word/2018/wordml" xmlns:w16du="http://schemas.microsoft.com/office/word/2023/wordml/word16du" xmlns:w16sdtdh="http://schemas.microsoft.com/office/word/2020/wordml/sdtdatahash" xmlns:w16sdtfl="http://schemas.microsoft.com/office/word/2024/wordml/sdtformatlock" xmlns:w16se="http://schemas.microsoft.com/office/word/2015/wordml/symex" xmlns:wpg="http://schemas.microsoft.com/office/word/2010/wordprocessingGroup" xmlns:wpi="http://schemas.microsoft.com/office/word/2010/wordprocessingInk" xmlns:wne="http://schemas.microsoft.com/office/word/2006/wordml" xmlns:wps="http://schemas.microsoft.com/office/word/2010/wordprocessingShape" mc:Ignorable="w14 w15 w16se w16cid w16 w16cex w16sdtdh w16sdtfl w16du wp14">
   <w:footnote w:type="separator" w:id="-1">
     <w:p>
       <w:pPr>
@@ -2702,7 +2608,7 @@
 </file>
 
 <file path=word/header1.xml><?xml version="1.0" encoding="utf-8"?>
-<w:hdr xmlns:wpc="http://schemas.microsoft.com/office/word/2010/wordprocessingCanvas" xmlns:cx="http://schemas.microsoft.com/office/drawing/2014/chartex" xmlns:cx1="http://schemas.microsoft.com/office/drawing/2015/9/8/chartex" xmlns:cx2="http://schemas.microsoft.com/office/drawing/2015/10/21/chartex" xmlns:cx3="http://schemas.microsoft.com/office/drawing/2016/5/9/chartex" xmlns:cx4="http://schemas.microsoft.com/office/drawing/2016/5/10/chartex" xmlns:cx5="http://schemas.microsoft.com/office/drawing/2016/5/11/chartex" xmlns:cx6="http://schemas.microsoft.com/office/drawing/2016/5/12/chartex" xmlns:cx7="http://schemas.microsoft.com/office/drawing/2016/5/13/chartex" xmlns:cx8="http://schemas.microsoft.com/office/drawing/2016/5/14/chartex" xmlns:mc="http://schemas.openxmlformats.org/markup-compatibility/2006" xmlns:aink="http://schemas.microsoft.com/office/drawing/2016/ink" xmlns:am3d="http://schemas.microsoft.com/office/drawing/2017/model3d" xmlns:o="urn:schemas-microsoft-com:office:office" xmlns:r="http://schemas.openxmlformats.org/officeDocument/2006/relationships" xmlns:m="http://schemas.openxmlformats.org/officeDocument/2006/math" xmlns:v="urn:schemas-microsoft-com:vml" xmlns:wp14="http://schemas.microsoft.com/office/word/2010/wordprocessingDrawing" xmlns:wp="http://schemas.openxmlformats.org/drawingml/2006/wordprocessingDrawing" xmlns:w10="urn:schemas-microsoft-com:office:word" xmlns:w="http://schemas.openxmlformats.org/wordprocessingml/2006/main" xmlns:w14="http://schemas.microsoft.com/office/word/2010/wordml" xmlns:w15="http://schemas.microsoft.com/office/word/2012/wordml" xmlns:w16cex="http://schemas.microsoft.com/office/word/2018/wordml/cex" xmlns:w16cid="http://schemas.microsoft.com/office/word/2016/wordml/cid" xmlns:w16="http://schemas.microsoft.com/office/word/2018/wordml" xmlns:w16sdtdh="http://schemas.microsoft.com/office/word/2020/wordml/sdtdatahash" xmlns:w16se="http://schemas.microsoft.com/office/word/2015/wordml/symex" xmlns:wpg="http://schemas.microsoft.com/office/word/2010/wordprocessingGroup" xmlns:wpi="http://schemas.microsoft.com/office/word/2010/wordprocessingInk" xmlns:wne="http://schemas.microsoft.com/office/word/2006/wordml" xmlns:wps="http://schemas.microsoft.com/office/word/2010/wordprocessingShape" mc:Ignorable="w14 w15 w16se w16cid w16 w16cex w16sdtdh wp14">
+<w:hdr xmlns:wpc="http://schemas.microsoft.com/office/word/2010/wordprocessingCanvas" xmlns:cx="http://schemas.microsoft.com/office/drawing/2014/chartex" xmlns:cx1="http://schemas.microsoft.com/office/drawing/2015/9/8/chartex" xmlns:cx2="http://schemas.microsoft.com/office/drawing/2015/10/21/chartex" xmlns:cx3="http://schemas.microsoft.com/office/drawing/2016/5/9/chartex" xmlns:cx4="http://schemas.microsoft.com/office/drawing/2016/5/10/chartex" xmlns:cx5="http://schemas.microsoft.com/office/drawing/2016/5/11/chartex" xmlns:cx6="http://schemas.microsoft.com/office/drawing/2016/5/12/chartex" xmlns:cx7="http://schemas.microsoft.com/office/drawing/2016/5/13/chartex" xmlns:cx8="http://schemas.microsoft.com/office/drawing/2016/5/14/chartex" xmlns:mc="http://schemas.openxmlformats.org/markup-compatibility/2006" xmlns:aink="http://schemas.microsoft.com/office/drawing/2016/ink" xmlns:am3d="http://schemas.microsoft.com/office/drawing/2017/model3d" xmlns:o="urn:schemas-microsoft-com:office:office" xmlns:oel="http://schemas.microsoft.com/office/2019/extlst" xmlns:r="http://schemas.openxmlformats.org/officeDocument/2006/relationships" xmlns:m="http://schemas.openxmlformats.org/officeDocument/2006/math" xmlns:v="urn:schemas-microsoft-com:vml" xmlns:wp14="http://schemas.microsoft.com/office/word/2010/wordprocessingDrawing" xmlns:wp="http://schemas.openxmlformats.org/drawingml/2006/wordprocessingDrawing" xmlns:w10="urn:schemas-microsoft-com:office:word" xmlns:w="http://schemas.openxmlformats.org/wordprocessingml/2006/main" xmlns:w14="http://schemas.microsoft.com/office/word/2010/wordml" xmlns:w15="http://schemas.microsoft.com/office/word/2012/wordml" xmlns:w16cex="http://schemas.microsoft.com/office/word/2018/wordml/cex" xmlns:w16cid="http://schemas.microsoft.com/office/word/2016/wordml/cid" xmlns:w16="http://schemas.microsoft.com/office/word/2018/wordml" xmlns:w16du="http://schemas.microsoft.com/office/word/2023/wordml/word16du" xmlns:w16sdtdh="http://schemas.microsoft.com/office/word/2020/wordml/sdtdatahash" xmlns:w16sdtfl="http://schemas.microsoft.com/office/word/2024/wordml/sdtformatlock" xmlns:w16se="http://schemas.microsoft.com/office/word/2015/wordml/symex" xmlns:wpg="http://schemas.microsoft.com/office/word/2010/wordprocessingGroup" xmlns:wpi="http://schemas.microsoft.com/office/word/2010/wordprocessingInk" xmlns:wne="http://schemas.microsoft.com/office/word/2006/wordml" xmlns:wps="http://schemas.microsoft.com/office/word/2010/wordprocessingShape" mc:Ignorable="w14 w15 w16se w16cid w16 w16cex w16sdtdh w16sdtfl w16du wp14">
   <w:p>
     <w:pPr>
       <w:pStyle w:val="af9"/>
@@ -2715,7 +2621,7 @@
 </file>
 
 <file path=word/header2.xml><?xml version="1.0" encoding="utf-8"?>
-<w:hdr xmlns:wpc="http://schemas.microsoft.com/office/word/2010/wordprocessingCanvas" xmlns:cx="http://schemas.microsoft.com/office/drawing/2014/chartex" xmlns:cx1="http://schemas.microsoft.com/office/drawing/2015/9/8/chartex" xmlns:cx2="http://schemas.microsoft.com/office/drawing/2015/10/21/chartex" xmlns:cx3="http://schemas.microsoft.com/office/drawing/2016/5/9/chartex" xmlns:cx4="http://schemas.microsoft.com/office/drawing/2016/5/10/chartex" xmlns:cx5="http://schemas.microsoft.com/office/drawing/2016/5/11/chartex" xmlns:cx6="http://schemas.microsoft.com/office/drawing/2016/5/12/chartex" xmlns:cx7="http://schemas.microsoft.com/office/drawing/2016/5/13/chartex" xmlns:cx8="http://schemas.microsoft.com/office/drawing/2016/5/14/chartex" xmlns:mc="http://schemas.openxmlformats.org/markup-compatibility/2006" xmlns:aink="http://schemas.microsoft.com/office/drawing/2016/ink" xmlns:am3d="http://schemas.microsoft.com/office/drawing/2017/model3d" xmlns:o="urn:schemas-microsoft-com:office:office" xmlns:r="http://schemas.openxmlformats.org/officeDocument/2006/relationships" xmlns:m="http://schemas.openxmlformats.org/officeDocument/2006/math" xmlns:v="urn:schemas-microsoft-com:vml" xmlns:wp14="http://schemas.microsoft.com/office/word/2010/wordprocessingDrawing" xmlns:wp="http://schemas.openxmlformats.org/drawingml/2006/wordprocessingDrawing" xmlns:w10="urn:schemas-microsoft-com:office:word" xmlns:w="http://schemas.openxmlformats.org/wordprocessingml/2006/main" xmlns:w14="http://schemas.microsoft.com/office/word/2010/wordml" xmlns:w15="http://schemas.microsoft.com/office/word/2012/wordml" xmlns:w16cex="http://schemas.microsoft.com/office/word/2018/wordml/cex" xmlns:w16cid="http://schemas.microsoft.com/office/word/2016/wordml/cid" xmlns:w16="http://schemas.microsoft.com/office/word/2018/wordml" xmlns:w16sdtdh="http://schemas.microsoft.com/office/word/2020/wordml/sdtdatahash" xmlns:w16se="http://schemas.microsoft.com/office/word/2015/wordml/symex" xmlns:wpg="http://schemas.microsoft.com/office/word/2010/wordprocessingGroup" xmlns:wpi="http://schemas.microsoft.com/office/word/2010/wordprocessingInk" xmlns:wne="http://schemas.microsoft.com/office/word/2006/wordml" xmlns:wps="http://schemas.microsoft.com/office/word/2010/wordprocessingShape" mc:Ignorable="w14 w15 w16se w16cid w16 w16cex w16sdtdh wp14">
+<w:hdr xmlns:wpc="http://schemas.microsoft.com/office/word/2010/wordprocessingCanvas" xmlns:cx="http://schemas.microsoft.com/office/drawing/2014/chartex" xmlns:cx1="http://schemas.microsoft.com/office/drawing/2015/9/8/chartex" xmlns:cx2="http://schemas.microsoft.com/office/drawing/2015/10/21/chartex" xmlns:cx3="http://schemas.microsoft.com/office/drawing/2016/5/9/chartex" xmlns:cx4="http://schemas.microsoft.com/office/drawing/2016/5/10/chartex" xmlns:cx5="http://schemas.microsoft.com/office/drawing/2016/5/11/chartex" xmlns:cx6="http://schemas.microsoft.com/office/drawing/2016/5/12/chartex" xmlns:cx7="http://schemas.microsoft.com/office/drawing/2016/5/13/chartex" xmlns:cx8="http://schemas.microsoft.com/office/drawing/2016/5/14/chartex" xmlns:mc="http://schemas.openxmlformats.org/markup-compatibility/2006" xmlns:aink="http://schemas.microsoft.com/office/drawing/2016/ink" xmlns:am3d="http://schemas.microsoft.com/office/drawing/2017/model3d" xmlns:o="urn:schemas-microsoft-com:office:office" xmlns:oel="http://schemas.microsoft.com/office/2019/extlst" xmlns:r="http://schemas.openxmlformats.org/officeDocument/2006/relationships" xmlns:m="http://schemas.openxmlformats.org/officeDocument/2006/math" xmlns:v="urn:schemas-microsoft-com:vml" xmlns:wp14="http://schemas.microsoft.com/office/word/2010/wordprocessingDrawing" xmlns:wp="http://schemas.openxmlformats.org/drawingml/2006/wordprocessingDrawing" xmlns:w10="urn:schemas-microsoft-com:office:word" xmlns:w="http://schemas.openxmlformats.org/wordprocessingml/2006/main" xmlns:w14="http://schemas.microsoft.com/office/word/2010/wordml" xmlns:w15="http://schemas.microsoft.com/office/word/2012/wordml" xmlns:w16cex="http://schemas.microsoft.com/office/word/2018/wordml/cex" xmlns:w16cid="http://schemas.microsoft.com/office/word/2016/wordml/cid" xmlns:w16="http://schemas.microsoft.com/office/word/2018/wordml" xmlns:w16du="http://schemas.microsoft.com/office/word/2023/wordml/word16du" xmlns:w16sdtdh="http://schemas.microsoft.com/office/word/2020/wordml/sdtdatahash" xmlns:w16sdtfl="http://schemas.microsoft.com/office/word/2024/wordml/sdtformatlock" xmlns:w16se="http://schemas.microsoft.com/office/word/2015/wordml/symex" xmlns:wpg="http://schemas.microsoft.com/office/word/2010/wordprocessingGroup" xmlns:wpi="http://schemas.microsoft.com/office/word/2010/wordprocessingInk" xmlns:wne="http://schemas.microsoft.com/office/word/2006/wordml" xmlns:wps="http://schemas.microsoft.com/office/word/2010/wordprocessingShape" mc:Ignorable="w14 w15 w16se w16cid w16 w16cex w16sdtdh w16sdtfl w16du wp14">
   <w:p>
     <w:pPr>
       <w:pStyle w:val="af9"/>
@@ -2728,7 +2634,17 @@
 </file>
 
 <file path=word/header3.xml><?xml version="1.0" encoding="utf-8"?>
-<w:hdr xmlns:wpc="http://schemas.microsoft.com/office/word/2010/wordprocessingCanvas" xmlns:cx="http://schemas.microsoft.com/office/drawing/2014/chartex" xmlns:cx1="http://schemas.microsoft.com/office/drawing/2015/9/8/chartex" xmlns:cx2="http://schemas.microsoft.com/office/drawing/2015/10/21/chartex" xmlns:cx3="http://schemas.microsoft.com/office/drawing/2016/5/9/chartex" xmlns:cx4="http://schemas.microsoft.com/office/drawing/2016/5/10/chartex" xmlns:cx5="http://schemas.microsoft.com/office/drawing/2016/5/11/chartex" xmlns:cx6="http://schemas.microsoft.com/office/drawing/2016/5/12/chartex" xmlns:cx7="http://schemas.microsoft.com/office/drawing/2016/5/13/chartex" xmlns:cx8="http://schemas.microsoft.com/office/drawing/2016/5/14/chartex" xmlns:mc="http://schemas.openxmlformats.org/markup-compatibility/2006" xmlns:aink="http://schemas.microsoft.com/office/drawing/2016/ink" xmlns:am3d="http://schemas.microsoft.com/office/drawing/2017/model3d" xmlns:o="urn:schemas-microsoft-com:office:office" xmlns:r="http://schemas.openxmlformats.org/officeDocument/2006/relationships" xmlns:m="http://schemas.openxmlformats.org/officeDocument/2006/math" xmlns:v="urn:schemas-microsoft-com:vml" xmlns:wp14="http://schemas.microsoft.com/office/word/2010/wordprocessingDrawing" xmlns:wp="http://schemas.openxmlformats.org/drawingml/2006/wordprocessingDrawing" xmlns:w10="urn:schemas-microsoft-com:office:word" xmlns:w="http://schemas.openxmlformats.org/wordprocessingml/2006/main" xmlns:w14="http://schemas.microsoft.com/office/word/2010/wordml" xmlns:w15="http://schemas.microsoft.com/office/word/2012/wordml" xmlns:w16cex="http://schemas.microsoft.com/office/word/2018/wordml/cex" xmlns:w16cid="http://schemas.microsoft.com/office/word/2016/wordml/cid" xmlns:w16="http://schemas.microsoft.com/office/word/2018/wordml" xmlns:w16sdtdh="http://schemas.microsoft.com/office/word/2020/wordml/sdtdatahash" xmlns:w16se="http://schemas.microsoft.com/office/word/2015/wordml/symex" xmlns:wpg="http://schemas.microsoft.com/office/word/2010/wordprocessingGroup" xmlns:wpi="http://schemas.microsoft.com/office/word/2010/wordprocessingInk" xmlns:wne="http://schemas.microsoft.com/office/word/2006/wordml" xmlns:wps="http://schemas.microsoft.com/office/word/2010/wordprocessingShape" mc:Ignorable="w14 w15 w16se w16cid w16 w16cex w16sdtdh wp14">
+<w:hdr xmlns:wpc="http://schemas.microsoft.com/office/word/2010/wordprocessingCanvas" xmlns:cx="http://schemas.microsoft.com/office/drawing/2014/chartex" xmlns:cx1="http://schemas.microsoft.com/office/drawing/2015/9/8/chartex" xmlns:cx2="http://schemas.microsoft.com/office/drawing/2015/10/21/chartex" xmlns:cx3="http://schemas.microsoft.com/office/drawing/2016/5/9/chartex" xmlns:cx4="http://schemas.microsoft.com/office/drawing/2016/5/10/chartex" xmlns:cx5="http://schemas.microsoft.com/office/drawing/2016/5/11/chartex" xmlns:cx6="http://schemas.microsoft.com/office/drawing/2016/5/12/chartex" xmlns:cx7="http://schemas.microsoft.com/office/drawing/2016/5/13/chartex" xmlns:cx8="http://schemas.microsoft.com/office/drawing/2016/5/14/chartex" xmlns:mc="http://schemas.openxmlformats.org/markup-compatibility/2006" xmlns:aink="http://schemas.microsoft.com/office/drawing/2016/ink" xmlns:am3d="http://schemas.microsoft.com/office/drawing/2017/model3d" xmlns:o="urn:schemas-microsoft-com:office:office" xmlns:oel="http://schemas.microsoft.com/office/2019/extlst" xmlns:r="http://schemas.openxmlformats.org/officeDocument/2006/relationships" xmlns:m="http://schemas.openxmlformats.org/officeDocument/2006/math" xmlns:v="urn:schemas-microsoft-com:vml" xmlns:wp14="http://schemas.microsoft.com/office/word/2010/wordprocessingDrawing" xmlns:wp="http://schemas.openxmlformats.org/drawingml/2006/wordprocessingDrawing" xmlns:w10="urn:schemas-microsoft-com:office:word" xmlns:w="http://schemas.openxmlformats.org/wordprocessingml/2006/main" xmlns:w14="http://schemas.microsoft.com/office/word/2010/wordml" xmlns:w15="http://schemas.microsoft.com/office/word/2012/wordml" xmlns:w16cex="http://schemas.microsoft.com/office/word/2018/wordml/cex" xmlns:w16cid="http://schemas.microsoft.com/office/word/2016/wordml/cid" xmlns:w16="http://schemas.microsoft.com/office/word/2018/wordml" xmlns:w16du="http://schemas.microsoft.com/office/word/2023/wordml/word16du" xmlns:w16sdtdh="http://schemas.microsoft.com/office/word/2020/wordml/sdtdatahash" xmlns:w16sdtfl="http://schemas.microsoft.com/office/word/2024/wordml/sdtformatlock" xmlns:w16se="http://schemas.microsoft.com/office/word/2015/wordml/symex" xmlns:wpg="http://schemas.microsoft.com/office/word/2010/wordprocessingGroup" xmlns:wpi="http://schemas.microsoft.com/office/word/2010/wordprocessingInk" xmlns:wne="http://schemas.microsoft.com/office/word/2006/wordml" xmlns:wps="http://schemas.microsoft.com/office/word/2010/wordprocessingShape" mc:Ignorable="w14 w15 w16se w16cid w16 w16cex w16sdtdh w16sdtfl w16du wp14">
+  <w:p>
+    <w:pPr>
+      <w:pStyle w:val="af9"/>
+    </w:pPr>
+  </w:p>
+</w:hdr>
+</file>
+
+<file path=word/header4.xml><?xml version="1.0" encoding="utf-8"?>
+<w:hdr xmlns:wpc="http://schemas.microsoft.com/office/word/2010/wordprocessingCanvas" xmlns:cx="http://schemas.microsoft.com/office/drawing/2014/chartex" xmlns:cx1="http://schemas.microsoft.com/office/drawing/2015/9/8/chartex" xmlns:cx2="http://schemas.microsoft.com/office/drawing/2015/10/21/chartex" xmlns:cx3="http://schemas.microsoft.com/office/drawing/2016/5/9/chartex" xmlns:cx4="http://schemas.microsoft.com/office/drawing/2016/5/10/chartex" xmlns:cx5="http://schemas.microsoft.com/office/drawing/2016/5/11/chartex" xmlns:cx6="http://schemas.microsoft.com/office/drawing/2016/5/12/chartex" xmlns:cx7="http://schemas.microsoft.com/office/drawing/2016/5/13/chartex" xmlns:cx8="http://schemas.microsoft.com/office/drawing/2016/5/14/chartex" xmlns:mc="http://schemas.openxmlformats.org/markup-compatibility/2006" xmlns:aink="http://schemas.microsoft.com/office/drawing/2016/ink" xmlns:am3d="http://schemas.microsoft.com/office/drawing/2017/model3d" xmlns:o="urn:schemas-microsoft-com:office:office" xmlns:oel="http://schemas.microsoft.com/office/2019/extlst" xmlns:r="http://schemas.openxmlformats.org/officeDocument/2006/relationships" xmlns:m="http://schemas.openxmlformats.org/officeDocument/2006/math" xmlns:v="urn:schemas-microsoft-com:vml" xmlns:wp14="http://schemas.microsoft.com/office/word/2010/wordprocessingDrawing" xmlns:wp="http://schemas.openxmlformats.org/drawingml/2006/wordprocessingDrawing" xmlns:w10="urn:schemas-microsoft-com:office:word" xmlns:w="http://schemas.openxmlformats.org/wordprocessingml/2006/main" xmlns:w14="http://schemas.microsoft.com/office/word/2010/wordml" xmlns:w15="http://schemas.microsoft.com/office/word/2012/wordml" xmlns:w16cex="http://schemas.microsoft.com/office/word/2018/wordml/cex" xmlns:w16cid="http://schemas.microsoft.com/office/word/2016/wordml/cid" xmlns:w16="http://schemas.microsoft.com/office/word/2018/wordml" xmlns:w16du="http://schemas.microsoft.com/office/word/2023/wordml/word16du" xmlns:w16sdtdh="http://schemas.microsoft.com/office/word/2020/wordml/sdtdatahash" xmlns:w16sdtfl="http://schemas.microsoft.com/office/word/2024/wordml/sdtformatlock" xmlns:w16se="http://schemas.microsoft.com/office/word/2015/wordml/symex" xmlns:wpg="http://schemas.microsoft.com/office/word/2010/wordprocessingGroup" xmlns:wpi="http://schemas.microsoft.com/office/word/2010/wordprocessingInk" xmlns:wne="http://schemas.microsoft.com/office/word/2006/wordml" xmlns:wps="http://schemas.microsoft.com/office/word/2010/wordprocessingShape" mc:Ignorable="w14 w15 w16se w16cid w16 w16cex w16sdtdh w16sdtfl w16du wp14">
   <w:p>
     <w:pPr>
       <w:pStyle w:val="af9"/>
@@ -2745,8 +2661,8 @@
 </w:hdr>
 </file>
 
-<file path=word/header4.xml><?xml version="1.0" encoding="utf-8"?>
-<w:hdr xmlns:wpc="http://schemas.microsoft.com/office/word/2010/wordprocessingCanvas" xmlns:cx="http://schemas.microsoft.com/office/drawing/2014/chartex" xmlns:cx1="http://schemas.microsoft.com/office/drawing/2015/9/8/chartex" xmlns:cx2="http://schemas.microsoft.com/office/drawing/2015/10/21/chartex" xmlns:cx3="http://schemas.microsoft.com/office/drawing/2016/5/9/chartex" xmlns:cx4="http://schemas.microsoft.com/office/drawing/2016/5/10/chartex" xmlns:cx5="http://schemas.microsoft.com/office/drawing/2016/5/11/chartex" xmlns:cx6="http://schemas.microsoft.com/office/drawing/2016/5/12/chartex" xmlns:cx7="http://schemas.microsoft.com/office/drawing/2016/5/13/chartex" xmlns:cx8="http://schemas.microsoft.com/office/drawing/2016/5/14/chartex" xmlns:mc="http://schemas.openxmlformats.org/markup-compatibility/2006" xmlns:aink="http://schemas.microsoft.com/office/drawing/2016/ink" xmlns:am3d="http://schemas.microsoft.com/office/drawing/2017/model3d" xmlns:o="urn:schemas-microsoft-com:office:office" xmlns:r="http://schemas.openxmlformats.org/officeDocument/2006/relationships" xmlns:m="http://schemas.openxmlformats.org/officeDocument/2006/math" xmlns:v="urn:schemas-microsoft-com:vml" xmlns:wp14="http://schemas.microsoft.com/office/word/2010/wordprocessingDrawing" xmlns:wp="http://schemas.openxmlformats.org/drawingml/2006/wordprocessingDrawing" xmlns:w10="urn:schemas-microsoft-com:office:word" xmlns:w="http://schemas.openxmlformats.org/wordprocessingml/2006/main" xmlns:w14="http://schemas.microsoft.com/office/word/2010/wordml" xmlns:w15="http://schemas.microsoft.com/office/word/2012/wordml" xmlns:w16cex="http://schemas.microsoft.com/office/word/2018/wordml/cex" xmlns:w16cid="http://schemas.microsoft.com/office/word/2016/wordml/cid" xmlns:w16="http://schemas.microsoft.com/office/word/2018/wordml" xmlns:w16sdtdh="http://schemas.microsoft.com/office/word/2020/wordml/sdtdatahash" xmlns:w16se="http://schemas.microsoft.com/office/word/2015/wordml/symex" xmlns:wpg="http://schemas.microsoft.com/office/word/2010/wordprocessingGroup" xmlns:wpi="http://schemas.microsoft.com/office/word/2010/wordprocessingInk" xmlns:wne="http://schemas.microsoft.com/office/word/2006/wordml" xmlns:wps="http://schemas.microsoft.com/office/word/2010/wordprocessingShape" mc:Ignorable="w14 w15 w16se w16cid w16 w16cex w16sdtdh wp14">
+<file path=word/header5.xml><?xml version="1.0" encoding="utf-8"?>
+<w:hdr xmlns:wpc="http://schemas.microsoft.com/office/word/2010/wordprocessingCanvas" xmlns:cx="http://schemas.microsoft.com/office/drawing/2014/chartex" xmlns:cx1="http://schemas.microsoft.com/office/drawing/2015/9/8/chartex" xmlns:cx2="http://schemas.microsoft.com/office/drawing/2015/10/21/chartex" xmlns:cx3="http://schemas.microsoft.com/office/drawing/2016/5/9/chartex" xmlns:cx4="http://schemas.microsoft.com/office/drawing/2016/5/10/chartex" xmlns:cx5="http://schemas.microsoft.com/office/drawing/2016/5/11/chartex" xmlns:cx6="http://schemas.microsoft.com/office/drawing/2016/5/12/chartex" xmlns:cx7="http://schemas.microsoft.com/office/drawing/2016/5/13/chartex" xmlns:cx8="http://schemas.microsoft.com/office/drawing/2016/5/14/chartex" xmlns:mc="http://schemas.openxmlformats.org/markup-compatibility/2006" xmlns:aink="http://schemas.microsoft.com/office/drawing/2016/ink" xmlns:am3d="http://schemas.microsoft.com/office/drawing/2017/model3d" xmlns:o="urn:schemas-microsoft-com:office:office" xmlns:oel="http://schemas.microsoft.com/office/2019/extlst" xmlns:r="http://schemas.openxmlformats.org/officeDocument/2006/relationships" xmlns:m="http://schemas.openxmlformats.org/officeDocument/2006/math" xmlns:v="urn:schemas-microsoft-com:vml" xmlns:wp14="http://schemas.microsoft.com/office/word/2010/wordprocessingDrawing" xmlns:wp="http://schemas.openxmlformats.org/drawingml/2006/wordprocessingDrawing" xmlns:w10="urn:schemas-microsoft-com:office:word" xmlns:w="http://schemas.openxmlformats.org/wordprocessingml/2006/main" xmlns:w14="http://schemas.microsoft.com/office/word/2010/wordml" xmlns:w15="http://schemas.microsoft.com/office/word/2012/wordml" xmlns:w16cex="http://schemas.microsoft.com/office/word/2018/wordml/cex" xmlns:w16cid="http://schemas.microsoft.com/office/word/2016/wordml/cid" xmlns:w16="http://schemas.microsoft.com/office/word/2018/wordml" xmlns:w16du="http://schemas.microsoft.com/office/word/2023/wordml/word16du" xmlns:w16sdtdh="http://schemas.microsoft.com/office/word/2020/wordml/sdtdatahash" xmlns:w16sdtfl="http://schemas.microsoft.com/office/word/2024/wordml/sdtformatlock" xmlns:w16se="http://schemas.microsoft.com/office/word/2015/wordml/symex" xmlns:wpg="http://schemas.microsoft.com/office/word/2010/wordprocessingGroup" xmlns:wpi="http://schemas.microsoft.com/office/word/2010/wordprocessingInk" xmlns:wne="http://schemas.microsoft.com/office/word/2006/wordml" xmlns:wps="http://schemas.microsoft.com/office/word/2010/wordprocessingShape" mc:Ignorable="w14 w15 w16se w16cid w16 w16cex w16sdtdh w16sdtfl w16du wp14">
   <w:p>
     <w:pPr>
       <w:jc w:val="center"/>
@@ -2755,8 +2671,8 @@
 </w:hdr>
 </file>
 
-<file path=word/header5.xml><?xml version="1.0" encoding="utf-8"?>
-<w:hdr xmlns:wpc="http://schemas.microsoft.com/office/word/2010/wordprocessingCanvas" xmlns:cx="http://schemas.microsoft.com/office/drawing/2014/chartex" xmlns:cx1="http://schemas.microsoft.com/office/drawing/2015/9/8/chartex" xmlns:cx2="http://schemas.microsoft.com/office/drawing/2015/10/21/chartex" xmlns:cx3="http://schemas.microsoft.com/office/drawing/2016/5/9/chartex" xmlns:cx4="http://schemas.microsoft.com/office/drawing/2016/5/10/chartex" xmlns:cx5="http://schemas.microsoft.com/office/drawing/2016/5/11/chartex" xmlns:cx6="http://schemas.microsoft.com/office/drawing/2016/5/12/chartex" xmlns:cx7="http://schemas.microsoft.com/office/drawing/2016/5/13/chartex" xmlns:cx8="http://schemas.microsoft.com/office/drawing/2016/5/14/chartex" xmlns:mc="http://schemas.openxmlformats.org/markup-compatibility/2006" xmlns:aink="http://schemas.microsoft.com/office/drawing/2016/ink" xmlns:am3d="http://schemas.microsoft.com/office/drawing/2017/model3d" xmlns:o="urn:schemas-microsoft-com:office:office" xmlns:r="http://schemas.openxmlformats.org/officeDocument/2006/relationships" xmlns:m="http://schemas.openxmlformats.org/officeDocument/2006/math" xmlns:v="urn:schemas-microsoft-com:vml" xmlns:wp14="http://schemas.microsoft.com/office/word/2010/wordprocessingDrawing" xmlns:wp="http://schemas.openxmlformats.org/drawingml/2006/wordprocessingDrawing" xmlns:w10="urn:schemas-microsoft-com:office:word" xmlns:w="http://schemas.openxmlformats.org/wordprocessingml/2006/main" xmlns:w14="http://schemas.microsoft.com/office/word/2010/wordml" xmlns:w15="http://schemas.microsoft.com/office/word/2012/wordml" xmlns:w16cex="http://schemas.microsoft.com/office/word/2018/wordml/cex" xmlns:w16cid="http://schemas.microsoft.com/office/word/2016/wordml/cid" xmlns:w16="http://schemas.microsoft.com/office/word/2018/wordml" xmlns:w16sdtdh="http://schemas.microsoft.com/office/word/2020/wordml/sdtdatahash" xmlns:w16se="http://schemas.microsoft.com/office/word/2015/wordml/symex" xmlns:wpg="http://schemas.microsoft.com/office/word/2010/wordprocessingGroup" xmlns:wpi="http://schemas.microsoft.com/office/word/2010/wordprocessingInk" xmlns:wne="http://schemas.microsoft.com/office/word/2006/wordml" xmlns:wps="http://schemas.microsoft.com/office/word/2010/wordprocessingShape" mc:Ignorable="w14 w15 w16se w16cid w16 w16cex w16sdtdh wp14">
+<file path=word/header6.xml><?xml version="1.0" encoding="utf-8"?>
+<w:hdr xmlns:wpc="http://schemas.microsoft.com/office/word/2010/wordprocessingCanvas" xmlns:cx="http://schemas.microsoft.com/office/drawing/2014/chartex" xmlns:cx1="http://schemas.microsoft.com/office/drawing/2015/9/8/chartex" xmlns:cx2="http://schemas.microsoft.com/office/drawing/2015/10/21/chartex" xmlns:cx3="http://schemas.microsoft.com/office/drawing/2016/5/9/chartex" xmlns:cx4="http://schemas.microsoft.com/office/drawing/2016/5/10/chartex" xmlns:cx5="http://schemas.microsoft.com/office/drawing/2016/5/11/chartex" xmlns:cx6="http://schemas.microsoft.com/office/drawing/2016/5/12/chartex" xmlns:cx7="http://schemas.microsoft.com/office/drawing/2016/5/13/chartex" xmlns:cx8="http://schemas.microsoft.com/office/drawing/2016/5/14/chartex" xmlns:mc="http://schemas.openxmlformats.org/markup-compatibility/2006" xmlns:aink="http://schemas.microsoft.com/office/drawing/2016/ink" xmlns:am3d="http://schemas.microsoft.com/office/drawing/2017/model3d" xmlns:o="urn:schemas-microsoft-com:office:office" xmlns:oel="http://schemas.microsoft.com/office/2019/extlst" xmlns:r="http://schemas.openxmlformats.org/officeDocument/2006/relationships" xmlns:m="http://schemas.openxmlformats.org/officeDocument/2006/math" xmlns:v="urn:schemas-microsoft-com:vml" xmlns:wp14="http://schemas.microsoft.com/office/word/2010/wordprocessingDrawing" xmlns:wp="http://schemas.openxmlformats.org/drawingml/2006/wordprocessingDrawing" xmlns:w10="urn:schemas-microsoft-com:office:word" xmlns:w="http://schemas.openxmlformats.org/wordprocessingml/2006/main" xmlns:w14="http://schemas.microsoft.com/office/word/2010/wordml" xmlns:w15="http://schemas.microsoft.com/office/word/2012/wordml" xmlns:w16cex="http://schemas.microsoft.com/office/word/2018/wordml/cex" xmlns:w16cid="http://schemas.microsoft.com/office/word/2016/wordml/cid" xmlns:w16="http://schemas.microsoft.com/office/word/2018/wordml" xmlns:w16du="http://schemas.microsoft.com/office/word/2023/wordml/word16du" xmlns:w16sdtdh="http://schemas.microsoft.com/office/word/2020/wordml/sdtdatahash" xmlns:w16sdtfl="http://schemas.microsoft.com/office/word/2024/wordml/sdtformatlock" xmlns:w16se="http://schemas.microsoft.com/office/word/2015/wordml/symex" xmlns:wpg="http://schemas.microsoft.com/office/word/2010/wordprocessingGroup" xmlns:wpi="http://schemas.microsoft.com/office/word/2010/wordprocessingInk" xmlns:wne="http://schemas.microsoft.com/office/word/2006/wordml" xmlns:wps="http://schemas.microsoft.com/office/word/2010/wordprocessingShape" mc:Ignorable="w14 w15 w16se w16cid w16 w16cex w16sdtdh w16sdtfl w16du wp14">
   <w:p>
     <w:pPr>
       <w:pStyle w:val="af9"/>
@@ -2766,21 +2682,14 @@
         <w:rFonts w:ascii="楷体_GB2312" w:eastAsia="楷体_GB2312" w:hint="eastAsia"/>
         <w:szCs w:val="18"/>
       </w:rPr>
-      <w:t>XX</w:t>
-    </w:r>
-    <w:r>
-      <w:rPr>
-        <w:rFonts w:ascii="楷体_GB2312" w:eastAsia="楷体_GB2312" w:hint="eastAsia"/>
-        <w:szCs w:val="18"/>
-      </w:rPr>
-      <w:t>博士学位论文开题报告</w:t>
+      <w:t>XX学位论文开题报告</w:t>
     </w:r>
   </w:p>
 </w:hdr>
 </file>
 
-<file path=word/header6.xml><?xml version="1.0" encoding="utf-8"?>
-<w:hdr xmlns:wpc="http://schemas.microsoft.com/office/word/2010/wordprocessingCanvas" xmlns:cx="http://schemas.microsoft.com/office/drawing/2014/chartex" xmlns:cx1="http://schemas.microsoft.com/office/drawing/2015/9/8/chartex" xmlns:cx2="http://schemas.microsoft.com/office/drawing/2015/10/21/chartex" xmlns:cx3="http://schemas.microsoft.com/office/drawing/2016/5/9/chartex" xmlns:cx4="http://schemas.microsoft.com/office/drawing/2016/5/10/chartex" xmlns:cx5="http://schemas.microsoft.com/office/drawing/2016/5/11/chartex" xmlns:cx6="http://schemas.microsoft.com/office/drawing/2016/5/12/chartex" xmlns:cx7="http://schemas.microsoft.com/office/drawing/2016/5/13/chartex" xmlns:cx8="http://schemas.microsoft.com/office/drawing/2016/5/14/chartex" xmlns:mc="http://schemas.openxmlformats.org/markup-compatibility/2006" xmlns:aink="http://schemas.microsoft.com/office/drawing/2016/ink" xmlns:am3d="http://schemas.microsoft.com/office/drawing/2017/model3d" xmlns:o="urn:schemas-microsoft-com:office:office" xmlns:r="http://schemas.openxmlformats.org/officeDocument/2006/relationships" xmlns:m="http://schemas.openxmlformats.org/officeDocument/2006/math" xmlns:v="urn:schemas-microsoft-com:vml" xmlns:wp14="http://schemas.microsoft.com/office/word/2010/wordprocessingDrawing" xmlns:wp="http://schemas.openxmlformats.org/drawingml/2006/wordprocessingDrawing" xmlns:w10="urn:schemas-microsoft-com:office:word" xmlns:w="http://schemas.openxmlformats.org/wordprocessingml/2006/main" xmlns:w14="http://schemas.microsoft.com/office/word/2010/wordml" xmlns:w15="http://schemas.microsoft.com/office/word/2012/wordml" xmlns:w16cex="http://schemas.microsoft.com/office/word/2018/wordml/cex" xmlns:w16cid="http://schemas.microsoft.com/office/word/2016/wordml/cid" xmlns:w16="http://schemas.microsoft.com/office/word/2018/wordml" xmlns:w16sdtdh="http://schemas.microsoft.com/office/word/2020/wordml/sdtdatahash" xmlns:w16se="http://schemas.microsoft.com/office/word/2015/wordml/symex" xmlns:wpg="http://schemas.microsoft.com/office/word/2010/wordprocessingGroup" xmlns:wpi="http://schemas.microsoft.com/office/word/2010/wordprocessingInk" xmlns:wne="http://schemas.microsoft.com/office/word/2006/wordml" xmlns:wps="http://schemas.microsoft.com/office/word/2010/wordprocessingShape" mc:Ignorable="w14 w15 w16se w16cid w16 w16cex w16sdtdh wp14">
+<file path=word/header7.xml><?xml version="1.0" encoding="utf-8"?>
+<w:hdr xmlns:wpc="http://schemas.microsoft.com/office/word/2010/wordprocessingCanvas" xmlns:cx="http://schemas.microsoft.com/office/drawing/2014/chartex" xmlns:cx1="http://schemas.microsoft.com/office/drawing/2015/9/8/chartex" xmlns:cx2="http://schemas.microsoft.com/office/drawing/2015/10/21/chartex" xmlns:cx3="http://schemas.microsoft.com/office/drawing/2016/5/9/chartex" xmlns:cx4="http://schemas.microsoft.com/office/drawing/2016/5/10/chartex" xmlns:cx5="http://schemas.microsoft.com/office/drawing/2016/5/11/chartex" xmlns:cx6="http://schemas.microsoft.com/office/drawing/2016/5/12/chartex" xmlns:cx7="http://schemas.microsoft.com/office/drawing/2016/5/13/chartex" xmlns:cx8="http://schemas.microsoft.com/office/drawing/2016/5/14/chartex" xmlns:mc="http://schemas.openxmlformats.org/markup-compatibility/2006" xmlns:aink="http://schemas.microsoft.com/office/drawing/2016/ink" xmlns:am3d="http://schemas.microsoft.com/office/drawing/2017/model3d" xmlns:o="urn:schemas-microsoft-com:office:office" xmlns:oel="http://schemas.microsoft.com/office/2019/extlst" xmlns:r="http://schemas.openxmlformats.org/officeDocument/2006/relationships" xmlns:m="http://schemas.openxmlformats.org/officeDocument/2006/math" xmlns:v="urn:schemas-microsoft-com:vml" xmlns:wp14="http://schemas.microsoft.com/office/word/2010/wordprocessingDrawing" xmlns:wp="http://schemas.openxmlformats.org/drawingml/2006/wordprocessingDrawing" xmlns:w10="urn:schemas-microsoft-com:office:word" xmlns:w="http://schemas.openxmlformats.org/wordprocessingml/2006/main" xmlns:w14="http://schemas.microsoft.com/office/word/2010/wordml" xmlns:w15="http://schemas.microsoft.com/office/word/2012/wordml" xmlns:w16cex="http://schemas.microsoft.com/office/word/2018/wordml/cex" xmlns:w16cid="http://schemas.microsoft.com/office/word/2016/wordml/cid" xmlns:w16="http://schemas.microsoft.com/office/word/2018/wordml" xmlns:w16du="http://schemas.microsoft.com/office/word/2023/wordml/word16du" xmlns:w16sdtdh="http://schemas.microsoft.com/office/word/2020/wordml/sdtdatahash" xmlns:w16sdtfl="http://schemas.microsoft.com/office/word/2024/wordml/sdtformatlock" xmlns:w16se="http://schemas.microsoft.com/office/word/2015/wordml/symex" xmlns:wpg="http://schemas.microsoft.com/office/word/2010/wordprocessingGroup" xmlns:wpi="http://schemas.microsoft.com/office/word/2010/wordprocessingInk" xmlns:wne="http://schemas.microsoft.com/office/word/2006/wordml" xmlns:wps="http://schemas.microsoft.com/office/word/2010/wordprocessingShape" mc:Ignorable="w14 w15 w16se w16cid w16 w16cex w16sdtdh w16sdtfl w16du wp14">
   <w:p>
     <w:pPr>
       <w:jc w:val="center"/>
@@ -2790,7 +2699,7 @@
 </file>
 
 <file path=word/numbering.xml><?xml version="1.0" encoding="utf-8"?>
-<w:numbering xmlns:wpc="http://schemas.microsoft.com/office/word/2010/wordprocessingCanvas" xmlns:cx="http://schemas.microsoft.com/office/drawing/2014/chartex" xmlns:cx1="http://schemas.microsoft.com/office/drawing/2015/9/8/chartex" xmlns:cx2="http://schemas.microsoft.com/office/drawing/2015/10/21/chartex" xmlns:cx3="http://schemas.microsoft.com/office/drawing/2016/5/9/chartex" xmlns:cx4="http://schemas.microsoft.com/office/drawing/2016/5/10/chartex" xmlns:cx5="http://schemas.microsoft.com/office/drawing/2016/5/11/chartex" xmlns:cx6="http://schemas.microsoft.com/office/drawing/2016/5/12/chartex" xmlns:cx7="http://schemas.microsoft.com/office/drawing/2016/5/13/chartex" xmlns:cx8="http://schemas.microsoft.com/office/drawing/2016/5/14/chartex" xmlns:mc="http://schemas.openxmlformats.org/markup-compatibility/2006" xmlns:aink="http://schemas.microsoft.com/office/drawing/2016/ink" xmlns:am3d="http://schemas.microsoft.com/office/drawing/2017/model3d" xmlns:o="urn:schemas-microsoft-com:office:office" xmlns:r="http://schemas.openxmlformats.org/officeDocument/2006/relationships" xmlns:m="http://schemas.openxmlformats.org/officeDocument/2006/math" xmlns:v="urn:schemas-microsoft-com:vml" xmlns:wp14="http://schemas.microsoft.com/office/word/2010/wordprocessingDrawing" xmlns:wp="http://schemas.openxmlformats.org/drawingml/2006/wordprocessingDrawing" xmlns:w10="urn:schemas-microsoft-com:office:word" xmlns:w="http://schemas.openxmlformats.org/wordprocessingml/2006/main" xmlns:w14="http://schemas.microsoft.com/office/word/2010/wordml" xmlns:w15="http://schemas.microsoft.com/office/word/2012/wordml" xmlns:w16cex="http://schemas.microsoft.com/office/word/2018/wordml/cex" xmlns:w16cid="http://schemas.microsoft.com/office/word/2016/wordml/cid" xmlns:w16="http://schemas.microsoft.com/office/word/2018/wordml" xmlns:w16sdtdh="http://schemas.microsoft.com/office/word/2020/wordml/sdtdatahash" xmlns:w16se="http://schemas.microsoft.com/office/word/2015/wordml/symex" xmlns:wpg="http://schemas.microsoft.com/office/word/2010/wordprocessingGroup" xmlns:wpi="http://schemas.microsoft.com/office/word/2010/wordprocessingInk" xmlns:wne="http://schemas.microsoft.com/office/word/2006/wordml" xmlns:wps="http://schemas.microsoft.com/office/word/2010/wordprocessingShape" mc:Ignorable="w14 w15 w16se w16cid w16 w16cex w16sdtdh wp14">
+<w:numbering xmlns:wpc="http://schemas.microsoft.com/office/word/2010/wordprocessingCanvas" xmlns:cx="http://schemas.microsoft.com/office/drawing/2014/chartex" xmlns:cx1="http://schemas.microsoft.com/office/drawing/2015/9/8/chartex" xmlns:cx2="http://schemas.microsoft.com/office/drawing/2015/10/21/chartex" xmlns:cx3="http://schemas.microsoft.com/office/drawing/2016/5/9/chartex" xmlns:cx4="http://schemas.microsoft.com/office/drawing/2016/5/10/chartex" xmlns:cx5="http://schemas.microsoft.com/office/drawing/2016/5/11/chartex" xmlns:cx6="http://schemas.microsoft.com/office/drawing/2016/5/12/chartex" xmlns:cx7="http://schemas.microsoft.com/office/drawing/2016/5/13/chartex" xmlns:cx8="http://schemas.microsoft.com/office/drawing/2016/5/14/chartex" xmlns:mc="http://schemas.openxmlformats.org/markup-compatibility/2006" xmlns:aink="http://schemas.microsoft.com/office/drawing/2016/ink" xmlns:am3d="http://schemas.microsoft.com/office/drawing/2017/model3d" xmlns:o="urn:schemas-microsoft-com:office:office" xmlns:oel="http://schemas.microsoft.com/office/2019/extlst" xmlns:r="http://schemas.openxmlformats.org/officeDocument/2006/relationships" xmlns:m="http://schemas.openxmlformats.org/officeDocument/2006/math" xmlns:v="urn:schemas-microsoft-com:vml" xmlns:wp14="http://schemas.microsoft.com/office/word/2010/wordprocessingDrawing" xmlns:wp="http://schemas.openxmlformats.org/drawingml/2006/wordprocessingDrawing" xmlns:w10="urn:schemas-microsoft-com:office:word" xmlns:w="http://schemas.openxmlformats.org/wordprocessingml/2006/main" xmlns:w14="http://schemas.microsoft.com/office/word/2010/wordml" xmlns:w15="http://schemas.microsoft.com/office/word/2012/wordml" xmlns:w16cex="http://schemas.microsoft.com/office/word/2018/wordml/cex" xmlns:w16cid="http://schemas.microsoft.com/office/word/2016/wordml/cid" xmlns:w16="http://schemas.microsoft.com/office/word/2018/wordml" xmlns:w16du="http://schemas.microsoft.com/office/word/2023/wordml/word16du" xmlns:w16sdtdh="http://schemas.microsoft.com/office/word/2020/wordml/sdtdatahash" xmlns:w16sdtfl="http://schemas.microsoft.com/office/word/2024/wordml/sdtformatlock" xmlns:w16se="http://schemas.microsoft.com/office/word/2015/wordml/symex" xmlns:wpg="http://schemas.microsoft.com/office/word/2010/wordprocessingGroup" xmlns:wpi="http://schemas.microsoft.com/office/word/2010/wordprocessingInk" xmlns:wne="http://schemas.microsoft.com/office/word/2006/wordml" xmlns:wps="http://schemas.microsoft.com/office/word/2010/wordprocessingShape" mc:Ignorable="w14 w15 w16se w16cid w16 w16cex w16sdtdh w16sdtfl w16du wp14">
   <w:abstractNum w:abstractNumId="0" w15:restartNumberingAfterBreak="0">
     <w:nsid w:val="14F8135F"/>
     <w:multiLevelType w:val="hybridMultilevel"/>
@@ -3137,25 +3046,25 @@
       </w:pPr>
     </w:lvl>
   </w:abstractNum>
-  <w:num w:numId="1">
+  <w:num w:numId="1" w16cid:durableId="1808890765">
     <w:abstractNumId w:val="1"/>
   </w:num>
-  <w:num w:numId="2">
+  <w:num w:numId="2" w16cid:durableId="1474560166">
     <w:abstractNumId w:val="1"/>
   </w:num>
-  <w:num w:numId="3">
+  <w:num w:numId="3" w16cid:durableId="1785610453">
     <w:abstractNumId w:val="2"/>
   </w:num>
-  <w:num w:numId="4">
+  <w:num w:numId="4" w16cid:durableId="1857311061">
     <w:abstractNumId w:val="1"/>
   </w:num>
-  <w:num w:numId="5">
+  <w:num w:numId="5" w16cid:durableId="625309601">
     <w:abstractNumId w:val="1"/>
   </w:num>
-  <w:num w:numId="6">
+  <w:num w:numId="6" w16cid:durableId="1647320732">
     <w:abstractNumId w:val="1"/>
   </w:num>
-  <w:num w:numId="7">
+  <w:num w:numId="7" w16cid:durableId="1154680384">
     <w:abstractNumId w:val="0"/>
   </w:num>
   <w:numIdMacAtCleanup w:val="3"/>
@@ -3163,7 +3072,7 @@
 </file>
 
 <file path=word/styles.xml><?xml version="1.0" encoding="utf-8"?>
-<w:styles xmlns:mc="http://schemas.openxmlformats.org/markup-compatibility/2006" xmlns:r="http://schemas.openxmlformats.org/officeDocument/2006/relationships" xmlns:w="http://schemas.openxmlformats.org/wordprocessingml/2006/main" xmlns:w14="http://schemas.microsoft.com/office/word/2010/wordml" xmlns:w15="http://schemas.microsoft.com/office/word/2012/wordml" xmlns:w16cex="http://schemas.microsoft.com/office/word/2018/wordml/cex" xmlns:w16cid="http://schemas.microsoft.com/office/word/2016/wordml/cid" xmlns:w16="http://schemas.microsoft.com/office/word/2018/wordml" xmlns:w16sdtdh="http://schemas.microsoft.com/office/word/2020/wordml/sdtdatahash" xmlns:w16se="http://schemas.microsoft.com/office/word/2015/wordml/symex" mc:Ignorable="w14 w15 w16se w16cid w16 w16cex w16sdtdh">
+<w:styles xmlns:mc="http://schemas.openxmlformats.org/markup-compatibility/2006" xmlns:r="http://schemas.openxmlformats.org/officeDocument/2006/relationships" xmlns:w="http://schemas.openxmlformats.org/wordprocessingml/2006/main" xmlns:w14="http://schemas.microsoft.com/office/word/2010/wordml" xmlns:w15="http://schemas.microsoft.com/office/word/2012/wordml" xmlns:w16cex="http://schemas.microsoft.com/office/word/2018/wordml/cex" xmlns:w16cid="http://schemas.microsoft.com/office/word/2016/wordml/cid" xmlns:w16="http://schemas.microsoft.com/office/word/2018/wordml" xmlns:w16du="http://schemas.microsoft.com/office/word/2023/wordml/word16du" xmlns:w16sdtdh="http://schemas.microsoft.com/office/word/2020/wordml/sdtdatahash" xmlns:w16sdtfl="http://schemas.microsoft.com/office/word/2024/wordml/sdtformatlock" xmlns:w16se="http://schemas.microsoft.com/office/word/2015/wordml/symex" mc:Ignorable="w14 w15 w16se w16cid w16 w16cex w16sdtdh w16sdtfl w16du">
   <w:docDefaults>
     <w:rPrDefault>
       <w:rPr>

</xml_diff>

<commit_message>
Update literature review template for improved formatting and structure
</commit_message>
<xml_diff>
--- a/skills/thesis-literature-review-builder/assets/base-templates/literature-review-template.docx
+++ b/skills/thesis-literature-review-builder/assets/base-templates/literature-review-template.docx
@@ -153,17 +153,7 @@
                                 <w:sz w:val="96"/>
                                 <w:szCs w:val="96"/>
                               </w:rPr>
-                              <w:t>XX</w:t>
-                            </w:r>
-                            <w:r>
-                              <w:rPr>
-                                <w:rFonts w:ascii="华文行楷" w:eastAsia="华文行楷" w:hAnsi="Proxy 7" w:hint="eastAsia"/>
-                                <w:bCs/>
-                                <w:color w:val="000000"/>
-                                <w:sz w:val="96"/>
-                                <w:szCs w:val="96"/>
-                              </w:rPr>
-                              <w:t>学位论文开题报告</w:t>
+                              <w:t>XX学位论文开题报告</w:t>
                             </w:r>
                           </w:p>
                           <w:p>
@@ -417,6 +407,7 @@
         </w:rPr>
         <w:tab/>
       </w:r>
+      <w:proofErr w:type="spellStart"/>
       <w:r>
         <w:rPr>
           <w:rFonts w:eastAsia="黑体" w:hint="eastAsia"/>
@@ -425,6 +416,7 @@
         </w:rPr>
         <w:t>xxxxxx</w:t>
       </w:r>
+      <w:proofErr w:type="spellEnd"/>
     </w:p>
     <w:p>
       <w:pPr>
@@ -1722,59 +1714,6 @@
         <w:spacing w:line="360" w:lineRule="auto"/>
         <w:jc w:val="center"/>
       </w:pPr>
-      <w:r>
-        <w:rPr>
-          <w:noProof/>
-        </w:rPr>
-        <w:drawing>
-          <wp:inline distT="0" distB="0" distL="0" distR="0" wp14:anchorId="4946AFEE" wp14:editId="37D820D1">
-            <wp:extent cx="2286000" cy="850900"/>
-            <wp:effectExtent l="0" t="0" r="0" b="0"/>
-            <wp:docPr id="2" name="图片 22"/>
-            <wp:cNvGraphicFramePr>
-              <a:graphicFrameLocks xmlns:a="http://schemas.openxmlformats.org/drawingml/2006/main" noChangeAspect="1"/>
-            </wp:cNvGraphicFramePr>
-            <a:graphic xmlns:a="http://schemas.openxmlformats.org/drawingml/2006/main">
-              <a:graphicData uri="http://schemas.openxmlformats.org/drawingml/2006/picture">
-                <pic:pic xmlns:pic="http://schemas.openxmlformats.org/drawingml/2006/picture">
-                  <pic:nvPicPr>
-                    <pic:cNvPr id="0" name="图片 22"/>
-                    <pic:cNvPicPr>
-                      <a:picLocks noChangeAspect="1" noChangeArrowheads="1"/>
-                    </pic:cNvPicPr>
-                  </pic:nvPicPr>
-                  <pic:blipFill>
-                    <a:blip r:embed="rId18" cstate="print">
-                      <a:extLst>
-                        <a:ext uri="{28A0092B-C50C-407E-A947-70E740481C1C}">
-                          <a14:useLocalDpi xmlns:a14="http://schemas.microsoft.com/office/drawing/2010/main" val="0"/>
-                        </a:ext>
-                      </a:extLst>
-                    </a:blip>
-                    <a:srcRect/>
-                    <a:stretch>
-                      <a:fillRect/>
-                    </a:stretch>
-                  </pic:blipFill>
-                  <pic:spPr bwMode="auto">
-                    <a:xfrm>
-                      <a:off x="0" y="0"/>
-                      <a:ext cx="2286000" cy="850900"/>
-                    </a:xfrm>
-                    <a:prstGeom prst="rect">
-                      <a:avLst/>
-                    </a:prstGeom>
-                    <a:noFill/>
-                    <a:ln>
-                      <a:noFill/>
-                    </a:ln>
-                  </pic:spPr>
-                </pic:pic>
-              </a:graphicData>
-            </a:graphic>
-          </wp:inline>
-        </w:drawing>
-      </w:r>
     </w:p>
     <w:p>
       <w:pPr>
@@ -1881,6 +1820,7 @@
         </w:rPr>
         <w:t>研究目标：</w:t>
       </w:r>
+      <w:proofErr w:type="spellStart"/>
       <w:r>
         <w:rPr>
           <w:rFonts w:hint="eastAsia"/>
@@ -1888,6 +1828,7 @@
         <w:t>xxxxxxxxx</w:t>
       </w:r>
       <w:bookmarkEnd w:id="10"/>
+      <w:proofErr w:type="spellEnd"/>
     </w:p>
     <w:p>
       <w:pPr>
@@ -1902,6 +1843,7 @@
         </w:rPr>
         <w:t>研究内容：</w:t>
       </w:r>
+      <w:proofErr w:type="spellStart"/>
       <w:r>
         <w:rPr>
           <w:rFonts w:hint="eastAsia"/>
@@ -1909,6 +1851,7 @@
         <w:t>xxxxxxxxx</w:t>
       </w:r>
       <w:bookmarkEnd w:id="11"/>
+      <w:proofErr w:type="spellEnd"/>
     </w:p>
     <w:p>
       <w:pPr>
@@ -1923,6 +1866,7 @@
         </w:rPr>
         <w:t>关键技术问题：</w:t>
       </w:r>
+      <w:proofErr w:type="spellStart"/>
       <w:r>
         <w:rPr>
           <w:rFonts w:hint="eastAsia"/>
@@ -1930,6 +1874,7 @@
         <w:t>xxxxxxxxx</w:t>
       </w:r>
       <w:bookmarkEnd w:id="12"/>
+      <w:proofErr w:type="spellEnd"/>
     </w:p>
     <w:p>
       <w:pPr>
@@ -2035,7 +1980,6 @@
         <w:rPr>
           <w:rFonts w:hint="eastAsia"/>
         </w:rPr>
-        <w:lastRenderedPageBreak/>
         <w:t>论文预期成果</w:t>
       </w:r>
       <w:bookmarkEnd w:id="28"/>
@@ -2224,7 +2168,21 @@
         <w:rPr>
           <w:szCs w:val="21"/>
         </w:rPr>
-        <w:t>WEINSTEIN L, SWERTZ M N. Pathogenic properties of invading micro-organism[M]//SODEMAN W A, Jr, SODEMAN W A. Pathologic physiology: mechanisms of disease. Philadephia: Saunders, 1974: 745-772.</w:t>
+        <w:t xml:space="preserve">WEINSTEIN L, SWERTZ M N. Pathogenic properties of invading micro-organism[M]//SODEMAN W A, Jr, SODEMAN W A. Pathologic physiology: mechanisms of disease. </w:t>
+      </w:r>
+      <w:proofErr w:type="spellStart"/>
+      <w:r>
+        <w:rPr>
+          <w:szCs w:val="21"/>
+        </w:rPr>
+        <w:t>Philadephia</w:t>
+      </w:r>
+      <w:proofErr w:type="spellEnd"/>
+      <w:r>
+        <w:rPr>
+          <w:szCs w:val="21"/>
+        </w:rPr>
+        <w:t>: Saunders, 1974: 745-772.</w:t>
       </w:r>
     </w:p>
     <w:p>
@@ -2411,10 +2369,10 @@
       </w:pPr>
     </w:p>
     <w:sectPr>
-      <w:headerReference w:type="default" r:id="rId19"/>
-      <w:footerReference w:type="default" r:id="rId20"/>
-      <w:headerReference w:type="first" r:id="rId21"/>
-      <w:footerReference w:type="first" r:id="rId22"/>
+      <w:headerReference w:type="default" r:id="rId18"/>
+      <w:footerReference w:type="default" r:id="rId19"/>
+      <w:headerReference w:type="first" r:id="rId20"/>
+      <w:footerReference w:type="first" r:id="rId21"/>
       <w:pgSz w:w="11906" w:h="16838"/>
       <w:pgMar w:top="1440" w:right="1800" w:bottom="1440" w:left="1800" w:header="851" w:footer="992" w:gutter="0"/>
       <w:pgNumType w:start="1"/>
@@ -2682,7 +2640,14 @@
         <w:rFonts w:ascii="楷体_GB2312" w:eastAsia="楷体_GB2312" w:hint="eastAsia"/>
         <w:szCs w:val="18"/>
       </w:rPr>
-      <w:t>XX学位论文开题报告</w:t>
+      <w:t>XX</w:t>
+    </w:r>
+    <w:r>
+      <w:rPr>
+        <w:rFonts w:ascii="楷体_GB2312" w:eastAsia="楷体_GB2312" w:hint="eastAsia"/>
+        <w:szCs w:val="18"/>
+      </w:rPr>
+      <w:t>学位论文开题报告</w:t>
     </w:r>
   </w:p>
 </w:hdr>

</xml_diff>